<commit_message>
Sincronizar requisitos y manuales con el sistema publicado
</commit_message>
<xml_diff>
--- a/docs/Sprint_1_Sistema_Prestamos.docx
+++ b/docs/Sprint_1_Sistema_Prestamos.docx
@@ -12,7 +12,7 @@
     </w:p>
     <w:p>
       <w:r>
-        <w:t xml:space="preserve">El incremento permite verificar al cliente, registrar préstamos con TEA del 30 %, entregar el cronograma y registrar el pago de cuotas en cualquiera de las cinco agencias. La cartera se consulta por agencia y la condición de pago del cliente se obtiene automáticamente de sus obligaciones pendientes.</w:t>
+        <w:t>El incremento permite verificar al cliente, registrar préstamos con TEA del 30 %, entregar el cronograma y registrar el pago de cuotas en cualquiera de las cinco agencias. La cartera se consulta por agencia y la condición de pago del cliente se obtiene automáticamente de sus obligaciones pendientes.</w:t>
       </w:r>
     </w:p>
     <w:p>
@@ -25,7 +25,7 @@
     </w:p>
     <w:p>
       <w:r>
-        <w:t xml:space="preserve">El negocio ofrece préstamos de libre disponibilidad en Chimbote, Trujillo, Chiclayo, Piura y Tumbes. La atención es presencial y el sistema es utilizado por los trabajadores. Un préstamo conserva su agencia de origen aunque el cliente pague una cuota en otra agencia.</w:t>
+        <w:t>El negocio ofrece préstamos de libre disponibilidad en Chimbote, Trujillo, Chiclayo, Piura y Tumbes. La atención es presencial y el sistema es utilizado por los trabajadores. Un préstamo conserva su agencia de origen aunque el cliente pague una cuota en otra agencia.</w:t>
       </w:r>
     </w:p>
     <w:p>
@@ -38,7 +38,7 @@
     </w:p>
     <w:p>
       <w:r>
-        <w:t xml:space="preserve">El registro en hojas de cálculo provoca errores de identidad y dificulta conocer las cuotas pendientes. El sistema debe conservar datos confiables, distinguir la cartera de cada agencia y registrar los pagos para evitar cobros duplicados y nuevos préstamos a clientes con mora.</w:t>
+        <w:t>El registro en hojas de cálculo provoca errores de identidad y dificulta conocer las cuotas pendientes. El sistema debe conservar datos confiables, distinguir la cartera de cada agencia y registrar los pagos para evitar cobros duplicados y nuevos préstamos a clientes con mora.</w:t>
       </w:r>
     </w:p>
     <w:p>
@@ -95,7 +95,7 @@
                 <w:b/>
                 <w:sz w:val="22"/>
               </w:rPr>
-              <w:t xml:space="preserve">Usuario</w:t>
+              <w:t>Usuario</w:t>
             </w:r>
           </w:p>
         </w:tc>
@@ -119,7 +119,7 @@
                 <w:b/>
                 <w:sz w:val="22"/>
               </w:rPr>
-              <w:t xml:space="preserve">Función</w:t>
+              <w:t>Función</w:t>
             </w:r>
           </w:p>
         </w:tc>
@@ -148,7 +148,7 @@
               <w:rPr>
                 <w:sz w:val="22"/>
               </w:rPr>
-              <w:t xml:space="preserve">Asesor de ventas</w:t>
+              <w:t>Asesor de ventas</w:t>
             </w:r>
           </w:p>
         </w:tc>
@@ -171,7 +171,7 @@
               <w:rPr>
                 <w:sz w:val="22"/>
               </w:rPr>
-              <w:t xml:space="preserve">Verifica clientes, registra préstamos y cobra cuotas desde su agencia asignada.</w:t>
+              <w:t>Verifica clientes, registra préstamos y cobra cuotas desde su agencia asignada.</w:t>
             </w:r>
           </w:p>
         </w:tc>
@@ -200,7 +200,7 @@
               <w:rPr>
                 <w:sz w:val="22"/>
               </w:rPr>
-              <w:t xml:space="preserve">Gerente</w:t>
+              <w:t>Gerente</w:t>
             </w:r>
           </w:p>
         </w:tc>
@@ -223,7 +223,7 @@
               <w:rPr>
                 <w:sz w:val="22"/>
               </w:rPr>
-              <w:t xml:space="preserve">Consulta la situación general en una entrega posterior; no tiene panel en este sprint.</w:t>
+              <w:t>Consulta la situación general en una entrega posterior; no tiene panel en este sprint.</w:t>
             </w:r>
           </w:p>
         </w:tc>
@@ -288,7 +288,7 @@
                 <w:b/>
                 <w:sz w:val="22"/>
               </w:rPr>
-              <w:t xml:space="preserve">Aspecto</w:t>
+              <w:t>Aspecto</w:t>
             </w:r>
           </w:p>
         </w:tc>
@@ -312,7 +312,7 @@
                 <w:b/>
                 <w:sz w:val="22"/>
               </w:rPr>
-              <w:t xml:space="preserve">Regla</w:t>
+              <w:t>Regla</w:t>
             </w:r>
           </w:p>
         </w:tc>
@@ -341,7 +341,7 @@
               <w:rPr>
                 <w:sz w:val="22"/>
               </w:rPr>
-              <w:t xml:space="preserve">Agencias</w:t>
+              <w:t>Agencias</w:t>
             </w:r>
           </w:p>
         </w:tc>
@@ -364,7 +364,7 @@
               <w:rPr>
                 <w:sz w:val="22"/>
               </w:rPr>
-              <w:t xml:space="preserve">Solo Chimbote, Trujillo, Chiclayo, Piura y Tumbes. Cada cuenta tiene una agencia asignada.</w:t>
+              <w:t>Solo Chimbote, Trujillo, Chiclayo, Piura y Tumbes. Cada cuenta tiene una agencia asignada.</w:t>
             </w:r>
           </w:p>
         </w:tc>
@@ -393,7 +393,7 @@
               <w:rPr>
                 <w:sz w:val="22"/>
               </w:rPr>
-              <w:t xml:space="preserve">Préstamo</w:t>
+              <w:t>Préstamo</w:t>
             </w:r>
           </w:p>
         </w:tc>
@@ -416,7 +416,7 @@
               <w:rPr>
                 <w:sz w:val="22"/>
               </w:rPr>
-              <w:t xml:space="preserve">Cliente, fecha de operación, monto positivo en soles y plazo entero de 1 a 60 meses. Sin monto mínimo adicional para las pruebas.</w:t>
+              <w:t>Cliente, fecha de operación, monto positivo en soles y plazo entero de 1 a 60 meses. Sin monto mínimo adicional para las pruebas.</w:t>
             </w:r>
           </w:p>
         </w:tc>
@@ -445,7 +445,7 @@
               <w:rPr>
                 <w:sz w:val="22"/>
               </w:rPr>
-              <w:t xml:space="preserve">Interés</w:t>
+              <w:t>Interés</w:t>
             </w:r>
           </w:p>
         </w:tc>
@@ -468,7 +468,7 @@
               <w:rPr>
                 <w:sz w:val="22"/>
               </w:rPr>
-              <w:t xml:space="preserve">TEA fija del 30 %. Sistema francés y tasa efectiva mensual equivalente.</w:t>
+              <w:t>TEA fija del 30 %. Sistema francés y tasa efectiva mensual equivalente.</w:t>
             </w:r>
           </w:p>
         </w:tc>
@@ -497,7 +497,7 @@
               <w:rPr>
                 <w:sz w:val="22"/>
               </w:rPr>
-              <w:t xml:space="preserve">Vencimientos</w:t>
+              <w:t>Vencimientos</w:t>
             </w:r>
           </w:p>
         </w:tc>
@@ -520,7 +520,7 @@
               <w:rPr>
                 <w:sz w:val="22"/>
               </w:rPr>
-              <w:t xml:space="preserve">Mensuales, en el día original del préstamo. Si no existe en un mes, se utiliza el último día de ese mes, considerando años bisiestos.</w:t>
+              <w:t>Mensuales, en el día original del préstamo. Si no existe en un mes, se utiliza el último día de ese mes, considerando años bisiestos.</w:t>
             </w:r>
           </w:p>
         </w:tc>
@@ -549,7 +549,7 @@
               <w:rPr>
                 <w:sz w:val="22"/>
               </w:rPr>
-              <w:t xml:space="preserve">Capital máximo</w:t>
+              <w:t>Capital máximo</w:t>
             </w:r>
           </w:p>
         </w:tc>
@@ -601,7 +601,7 @@
               <w:rPr>
                 <w:sz w:val="22"/>
               </w:rPr>
-              <w:t xml:space="preserve">Elegibilidad</w:t>
+              <w:t>Elegibilidad</w:t>
             </w:r>
           </w:p>
         </w:tc>
@@ -653,7 +653,7 @@
               <w:rPr>
                 <w:sz w:val="22"/>
               </w:rPr>
-              <w:t xml:space="preserve">Cobranza</w:t>
+              <w:t>Cobranza</w:t>
             </w:r>
           </w:p>
         </w:tc>
@@ -676,7 +676,7 @@
               <w:rPr>
                 <w:sz w:val="22"/>
               </w:rPr>
-              <w:t xml:space="preserve">Se pueden pagar cuotas de un préstamo en otra agencia. Se atienden primero las cuotas pendientes más antiguas del préstamo seleccionado.</w:t>
+              <w:t>Se pueden pagar cuotas de un préstamo en otra agencia. Se atienden primero las cuotas pendientes más antiguas del préstamo seleccionado.</w:t>
             </w:r>
           </w:p>
         </w:tc>
@@ -697,7 +697,7 @@
     </w:p>
     <w:p>
       <w:r>
-        <w:t>Se atiende a personas naturales con DNI, personas naturales con negocio (RUC 10) y empresas (RUC 20). DNI y RUC 10 comparten ficha; la empresa conserva titular propio y se vincula al propietario responsable del límite global. Clientes lista solo a quienes fueron registrados en la agencia actual o recibieron un préstamo allí; Préstamos lista solo operaciones originadas en esa agencia. Sus búsquedas respetan estos límites. La verificación y los saldos globales se reutilizan para evaluar nuevos préstamos, sin habilitar la consulta ordinaria de carteras ajenas.</w:t>
+        <w:t>Se atiende a personas naturales con DNI, personas naturales con negocio (RUC 10) y empresas (RUC 20). DNI y RUC 10 comparten ficha; la empresa conserva titular propio y se vincula al propietario responsable del límite global. Clientes lista solo a los titulares con préstamos confirmados en la agencia actual, incluidos los ya pagados; Préstamos lista solo operaciones originadas en esa agencia. Sus búsquedas respetan estos límites. La verificación y los saldos globales se reutilizan para evaluar nuevos préstamos, sin habilitar la consulta ordinaria de carteras ajenas.</w:t>
       </w:r>
     </w:p>
     <w:tbl>
@@ -747,7 +747,7 @@
                 <w:b/>
                 <w:sz w:val="22"/>
               </w:rPr>
-              <w:t xml:space="preserve">Área</w:t>
+              <w:t>Área</w:t>
             </w:r>
           </w:p>
         </w:tc>
@@ -771,7 +771,7 @@
                 <w:b/>
                 <w:sz w:val="22"/>
               </w:rPr>
-              <w:t xml:space="preserve">En esta entrega</w:t>
+              <w:t>En esta entrega</w:t>
             </w:r>
           </w:p>
         </w:tc>
@@ -795,7 +795,7 @@
                 <w:b/>
                 <w:sz w:val="22"/>
               </w:rPr>
-              <w:t xml:space="preserve">Para después</w:t>
+              <w:t>Para después</w:t>
             </w:r>
           </w:p>
         </w:tc>
@@ -824,7 +824,7 @@
               <w:rPr>
                 <w:sz w:val="22"/>
               </w:rPr>
-              <w:t xml:space="preserve">Acceso</w:t>
+              <w:t>Acceso</w:t>
             </w:r>
           </w:p>
         </w:tc>
@@ -847,7 +847,7 @@
               <w:rPr>
                 <w:sz w:val="22"/>
               </w:rPr>
-              <w:t xml:space="preserve">Iniciar y cerrar sesión sin cuentas de demostración visibles.</w:t>
+              <w:t>Iniciar y cerrar sesión, controlar 15 minutos de inactividad y mantener una sesión por cuenta, sin credenciales de demostración visibles.</w:t>
             </w:r>
           </w:p>
         </w:tc>
@@ -870,7 +870,7 @@
               <w:rPr>
                 <w:sz w:val="22"/>
               </w:rPr>
-              <w:t xml:space="preserve">Administrar cuentas y recuperar contraseñas.</w:t>
+              <w:t>Administrar cuentas y recuperar contraseñas.</w:t>
             </w:r>
           </w:p>
         </w:tc>
@@ -899,7 +899,7 @@
               <w:rPr>
                 <w:sz w:val="22"/>
               </w:rPr>
-              <w:t xml:space="preserve">Clientes</w:t>
+              <w:t>Clientes</w:t>
             </w:r>
           </w:p>
         </w:tc>
@@ -922,7 +922,7 @@
               <w:rPr>
                 <w:sz w:val="22"/>
               </w:rPr>
-              <w:t xml:space="preserve">Consultar ficha e historial de verificación; registrar o revalidar desde el flujo del préstamo.</w:t>
+              <w:t>Consultar ficha e historial de verificación; registrar o revalidar desde el flujo del préstamo.</w:t>
             </w:r>
           </w:p>
         </w:tc>
@@ -974,7 +974,7 @@
               <w:rPr>
                 <w:sz w:val="22"/>
               </w:rPr>
-              <w:t xml:space="preserve">Préstamos</w:t>
+              <w:t>Préstamos</w:t>
             </w:r>
           </w:p>
         </w:tc>
@@ -997,7 +997,7 @@
               <w:rPr>
                 <w:sz w:val="22"/>
               </w:rPr>
-              <w:t xml:space="preserve">Registrar, controlar el capital pendiente y consultar cartera propia.</w:t>
+              <w:t>Registrar, controlar el capital pendiente y consultar cartera propia.</w:t>
             </w:r>
           </w:p>
         </w:tc>
@@ -1020,7 +1020,7 @@
               <w:rPr>
                 <w:sz w:val="22"/>
               </w:rPr>
-              <w:t xml:space="preserve">Editar, anular o refinanciar préstamos confirmados.</w:t>
+              <w:t>Editar, anular o refinanciar préstamos confirmados.</w:t>
             </w:r>
           </w:p>
         </w:tc>
@@ -1049,7 +1049,7 @@
               <w:rPr>
                 <w:sz w:val="22"/>
               </w:rPr>
-              <w:t xml:space="preserve">Cronograma</w:t>
+              <w:t>Cronograma</w:t>
             </w:r>
           </w:p>
         </w:tc>
@@ -1072,7 +1072,7 @@
               <w:rPr>
                 <w:sz w:val="22"/>
               </w:rPr>
-              <w:t xml:space="preserve">Cuotas mensuales, desglose de interés y capital, guardado y PDF.</w:t>
+              <w:t>Cuotas mensuales, desglose de interés y capital, guardado y PDF.</w:t>
             </w:r>
           </w:p>
         </w:tc>
@@ -1095,7 +1095,7 @@
               <w:rPr>
                 <w:sz w:val="22"/>
               </w:rPr>
-              <w:t xml:space="preserve">Reprogramaciones y amortización extraordinaria.</w:t>
+              <w:t>Reprogramaciones y amortización extraordinaria.</w:t>
             </w:r>
           </w:p>
         </w:tc>
@@ -1124,7 +1124,7 @@
               <w:rPr>
                 <w:sz w:val="22"/>
               </w:rPr>
-              <w:t xml:space="preserve">Pagos</w:t>
+              <w:t>Pagos</w:t>
             </w:r>
           </w:p>
         </w:tc>
@@ -1147,7 +1147,7 @@
               <w:rPr>
                 <w:sz w:val="22"/>
               </w:rPr>
-              <w:t xml:space="preserve">Registrar cuotas completas, incluso de otra agencia, y emitir constancia.</w:t>
+              <w:t>Registrar cuotas completas, incluso de otra agencia, y emitir constancia.</w:t>
             </w:r>
           </w:p>
         </w:tc>
@@ -1170,7 +1170,7 @@
               <w:rPr>
                 <w:sz w:val="22"/>
               </w:rPr>
-              <w:t xml:space="preserve">Abonos parciales, devoluciones y pasarelas de pago.</w:t>
+              <w:t>Abonos parciales, devoluciones y pasarelas de pago.</w:t>
             </w:r>
           </w:p>
         </w:tc>
@@ -1199,7 +1199,7 @@
               <w:rPr>
                 <w:sz w:val="22"/>
               </w:rPr>
-              <w:t xml:space="preserve">Estados</w:t>
+              <w:t>Estados</w:t>
             </w:r>
           </w:p>
         </w:tc>
@@ -1222,7 +1222,7 @@
               <w:rPr>
                 <w:sz w:val="22"/>
               </w:rPr>
-              <w:t xml:space="preserve">Actualizar deuda y condición de pago automáticamente.</w:t>
+              <w:t>Actualizar deuda y condición de pago automáticamente.</w:t>
             </w:r>
           </w:p>
         </w:tc>
@@ -1245,7 +1245,7 @@
               <w:rPr>
                 <w:sz w:val="22"/>
               </w:rPr>
-              <w:t xml:space="preserve">Reportes gerenciales y gestión jurídica de cobranza.</w:t>
+              <w:t>Reportes gerenciales y gestión jurídica de cobranza.</w:t>
             </w:r>
           </w:p>
         </w:tc>
@@ -1266,7 +1266,7 @@
     </w:p>
     <w:p>
       <w:r>
-        <w:t xml:space="preserve">Las observaciones del profesor establecen la consulta por agencia, el pago entre agencias y la condición automática de moroso o extrajudicial. Para que estas reglas sean implementables, se adoptan las siguientes precisiones del proyecto, que se revisarán con el profesor si indica otro criterio.</w:t>
+        <w:t>Las observaciones del profesor establecen la consulta por agencia, el pago entre agencias y la condición automática de moroso o extrajudicial. Para que estas reglas sean implementables, se adoptan las siguientes precisiones del proyecto, que se revisarán con el profesor si indica otro criterio.</w:t>
       </w:r>
     </w:p>
     <w:tbl>
@@ -1315,7 +1315,7 @@
                 <w:b/>
                 <w:sz w:val="22"/>
               </w:rPr>
-              <w:t xml:space="preserve">Decisión</w:t>
+              <w:t>Decisión</w:t>
             </w:r>
           </w:p>
         </w:tc>
@@ -1339,7 +1339,7 @@
                 <w:b/>
                 <w:sz w:val="22"/>
               </w:rPr>
-              <w:t xml:space="preserve">Criterio operativo propuesto</w:t>
+              <w:t>Criterio operativo propuesto</w:t>
             </w:r>
           </w:p>
         </w:tc>
@@ -1368,7 +1368,7 @@
               <w:rPr>
                 <w:sz w:val="22"/>
               </w:rPr>
-              <w:t xml:space="preserve">Inicio de mora</w:t>
+              <w:t>Inicio de mora</w:t>
             </w:r>
           </w:p>
         </w:tc>
@@ -1391,7 +1391,7 @@
               <w:rPr>
                 <w:sz w:val="22"/>
               </w:rPr>
-              <w:t xml:space="preserve">Desde el día siguiente al vencimiento de una cuota que conserve saldo impago; no se espera al fin del mes.</w:t>
+              <w:t>Desde el día siguiente al vencimiento de una cuota que conserve saldo impago; no se espera al fin del mes.</w:t>
             </w:r>
           </w:p>
         </w:tc>
@@ -1420,7 +1420,7 @@
               <w:rPr>
                 <w:sz w:val="22"/>
               </w:rPr>
-              <w:t xml:space="preserve">Un año de atraso</w:t>
+              <w:t>Un año de atraso</w:t>
             </w:r>
           </w:p>
         </w:tc>
@@ -1443,7 +1443,7 @@
               <w:rPr>
                 <w:sz w:val="22"/>
               </w:rPr>
-              <w:t xml:space="preserve">Doce meses calendario desde el vencimiento de la cuota impaga más antigua. El día inexistente se ajusta al último del mes.</w:t>
+              <w:t>Doce meses calendario desde el vencimiento de la cuota impaga más antigua. El día inexistente se ajusta al último del mes.</w:t>
             </w:r>
           </w:p>
         </w:tc>
@@ -1472,7 +1472,7 @@
               <w:rPr>
                 <w:sz w:val="22"/>
               </w:rPr>
-              <w:t xml:space="preserve">Cobro mínimo</w:t>
+              <w:t>Cobro mínimo</w:t>
             </w:r>
           </w:p>
         </w:tc>
@@ -1495,7 +1495,7 @@
               <w:rPr>
                 <w:sz w:val="22"/>
               </w:rPr>
-              <w:t xml:space="preserve">Registro interno por el asesor de una o varias cuotas completas consecutivas del préstamo seleccionado; no integra un banco ni una pasarela.</w:t>
+              <w:t>Registro interno por el asesor de una o varias cuotas completas consecutivas del préstamo seleccionado; no integra un banco ni una pasarela.</w:t>
             </w:r>
           </w:p>
         </w:tc>
@@ -1524,7 +1524,7 @@
               <w:rPr>
                 <w:sz w:val="22"/>
               </w:rPr>
-              <w:t xml:space="preserve">Orden del pago</w:t>
+              <w:t>Orden del pago</w:t>
             </w:r>
           </w:p>
         </w:tc>
@@ -1547,7 +1547,7 @@
               <w:rPr>
                 <w:sz w:val="22"/>
               </w:rPr>
-              <w:t xml:space="preserve">Primero la cuota pendiente más antigua del préstamo elegido. La condición del cliente considera todos sus préstamos en las cinco agencias.</w:t>
+              <w:t>Primero la cuota pendiente más antigua del préstamo elegido. La condición del cliente considera todos sus préstamos en las cinco agencias.</w:t>
             </w:r>
           </w:p>
         </w:tc>
@@ -1576,7 +1576,7 @@
               <w:rPr>
                 <w:sz w:val="22"/>
               </w:rPr>
-              <w:t xml:space="preserve">Cálculo mensual</w:t>
+              <w:t>Cálculo mensual</w:t>
             </w:r>
           </w:p>
         </w:tc>
@@ -1620,12 +1620,12 @@
     </w:p>
     <w:p>
       <w:r>
-        <w:t xml:space="preserve">Las cuentas y las cinco agencias están preconfiguradas. Se retiran del entorno operativo la agencia General y la cuenta Ana Morales. La depuración respeta las referencias y la trazabilidad de operaciones existentes; no borra préstamos ni pagos históricos. Un registro ficticio sin referencias puede eliminarse; si tiene referencias, se regulariza antes de retirarlo y se bloquea su acceso.</w:t>
+        <w:t>Las cuentas y las cinco agencias están preconfiguradas. Se retiran del entorno operativo la agencia General y la cuenta Ana Morales. La depuración respeta las referencias y la trazabilidad de operaciones existentes; no borra préstamos ni pagos históricos. Un registro ficticio sin referencias puede eliminarse; si tiene referencias, se regulariza antes de retirarlo y se bloquea su acceso.</w:t>
       </w:r>
     </w:p>
     <w:p>
       <w:r>
-        <w:t xml:space="preserve">Los préstamos anteriores requieren capital, cronograma y pagos conciliados. La falta de un pago histórico no demuestra por sí sola que exista mora. Un cliente con historial incompleto queda identificado como pendiente de conciliación y no obtiene nuevos préstamos hasta regularizar los datos.</w:t>
+        <w:t>Los préstamos anteriores requieren capital, cronograma y pagos conciliados. La falta de un pago histórico no demuestra por sí sola que exista mora. Un cliente con historial incompleto queda identificado como pendiente de conciliación y no obtiene nuevos préstamos hasta regularizar los datos.</w:t>
       </w:r>
     </w:p>
     <w:p>
@@ -1682,7 +1682,7 @@
                 <w:b/>
                 <w:sz w:val="22"/>
               </w:rPr>
-              <w:t xml:space="preserve">Pantalla</w:t>
+              <w:t>Pantalla</w:t>
             </w:r>
           </w:p>
         </w:tc>
@@ -1706,7 +1706,7 @@
                 <w:b/>
                 <w:sz w:val="22"/>
               </w:rPr>
-              <w:t xml:space="preserve">Contenido y acciones</w:t>
+              <w:t>Contenido y acciones</w:t>
             </w:r>
           </w:p>
         </w:tc>
@@ -1735,7 +1735,7 @@
               <w:rPr>
                 <w:sz w:val="22"/>
               </w:rPr>
-              <w:t xml:space="preserve">Inicio de sesión</w:t>
+              <w:t>Inicio de sesión</w:t>
             </w:r>
           </w:p>
         </w:tc>
@@ -1758,7 +1758,7 @@
               <w:rPr>
                 <w:sz w:val="22"/>
               </w:rPr>
-              <w:t xml:space="preserve">Correo, contraseña y acceso. Sin panel, botones ni credenciales de demostración. La agencia proviene de la cuenta.</w:t>
+              <w:t>Correo, contraseña y acceso. Sin credenciales de demostración. La agencia proviene de la cuenta. La sesión anterior se reemplaza al iniciar en otro navegador; la cabecera muestra el tiempo restante sin actividad.</w:t>
             </w:r>
           </w:p>
         </w:tc>
@@ -1787,7 +1787,7 @@
               <w:rPr>
                 <w:sz w:val="22"/>
               </w:rPr>
-              <w:t xml:space="preserve">Préstamos</w:t>
+              <w:t>Préstamos</w:t>
             </w:r>
           </w:p>
         </w:tc>
@@ -1810,7 +1810,7 @@
               <w:rPr>
                 <w:sz w:val="22"/>
               </w:rPr>
-              <w:t>Solo cartera de la agencia actual. Activos por defecto y filtro Activos, Cancelados o Todos. Código, DNI, cliente, fecha, monto original, plazo, estado y Ver detalle; sin columna Deuda pendiente ni botón Nuevo préstamo. Selector DNI exacto, RUC exacto o Código de préstamo con validación de formato.</w:t>
+              <w:t>Solo cartera de la agencia actual. Activos por defecto y filtro Activos, Cancelados o Todos. Código, documento del titular, cliente o razón social, fecha, monto original, plazo, estado y Ver detalle; sin columna Deuda pendiente ni botón Nuevo préstamo. Selector DNI exacto, RUC exacto o Código de préstamo con validación de formato.</w:t>
             </w:r>
           </w:p>
         </w:tc>
@@ -1839,7 +1839,7 @@
               <w:rPr>
                 <w:sz w:val="22"/>
               </w:rPr>
-              <w:t xml:space="preserve">Clientes</w:t>
+              <w:t>Clientes</w:t>
             </w:r>
           </w:p>
         </w:tc>
@@ -1862,7 +1862,7 @@
               <w:rPr>
                 <w:sz w:val="22"/>
               </w:rPr>
-              <w:t>Listado y búsqueda limitados a clientes registrados en la agencia actual o con préstamos otorgados allí. Muestra DNI, nombre, verificación y condición de pago. Cobrar un préstamo ajeno no incorpora al cliente al listado. Sin botón Validar cliente ni búsqueda global.</w:t>
+              <w:t>Listado y búsqueda limitados a titulares con préstamos confirmados en la agencia actual, incluidos los ya pagados. Filtros Todos, Personas y Empresas; DNI para personas y RUC para empresas, nombre, verificación y condición de pago. Cobrar un préstamo ajeno no incorpora al cliente al listado. Sin botón Validar cliente ni búsqueda global.</w:t>
             </w:r>
           </w:p>
         </w:tc>
@@ -1891,7 +1891,7 @@
               <w:rPr>
                 <w:sz w:val="22"/>
               </w:rPr>
-              <w:t xml:space="preserve">Ficha del cliente</w:t>
+              <w:t>Ficha del cliente</w:t>
             </w:r>
           </w:p>
         </w:tc>
@@ -1914,7 +1914,7 @@
               <w:rPr>
                 <w:sz w:val="22"/>
               </w:rPr>
-              <w:t xml:space="preserve">Identidad, caducidad, evidencia e historial de revisión, condición de pago y capital global. Sin selector manual de condición. Permite iniciar Solicitar préstamo o Revalidar DNI en el flujo correspondiente.</w:t>
+              <w:t>Identidad compartida, datos SUNAT cuando corresponda, condición de pago, capital global y personas y empresas vinculadas. Solicitar préstamo y Revalidar datos ofrecen DNI/RUC 10 en la misma ficha. Consultar para pagar abre el grupo; Ver historial abre las revisiones en una página aparte. No contiene la tabla Préstamos en tu agencia ni selectores manuales de condición.</w:t>
             </w:r>
           </w:p>
         </w:tc>
@@ -1943,7 +1943,7 @@
               <w:rPr>
                 <w:sz w:val="22"/>
               </w:rPr>
-              <w:t xml:space="preserve">Nuevo préstamo</w:t>
+              <w:t>Nuevo préstamo</w:t>
             </w:r>
           </w:p>
         </w:tc>
@@ -1966,7 +1966,7 @@
               <w:rPr>
                 <w:sz w:val="22"/>
               </w:rPr>
-              <w:t>Paso 1: comprobar DNI; reutilizar ficha vigente, revalidar al existente o preparar borrador del nuevo. Paso 2: monto y plazo. Paso 3: confirmar conjuntamente cliente nuevo, evidencia, préstamo y cronograma. La revalidación del existente se guarda aparte, con aviso explícito, aunque no concluya el préstamo.</w:t>
+              <w:t>Paso 1: elegir DNI o RUC 10/20, comprobar identidad y representación, reutilizar ficha vigente o preparar borrador del nuevo. El tipo queda fijo en los pasos 2 y 3. Paso 2: monto y plazo. Paso 3: confirmar conjuntamente cliente nuevo, evidencia, préstamo y cronograma. La revalidación del existente se guarda aparte aunque no concluya el préstamo.</w:t>
             </w:r>
           </w:p>
         </w:tc>
@@ -1995,7 +1995,7 @@
               <w:rPr>
                 <w:sz w:val="22"/>
               </w:rPr>
-              <w:t xml:space="preserve">Detalle del préstamo</w:t>
+              <w:t>Detalle del préstamo</w:t>
             </w:r>
           </w:p>
         </w:tc>
@@ -2047,7 +2047,7 @@
               <w:rPr>
                 <w:sz w:val="22"/>
               </w:rPr>
-              <w:t xml:space="preserve">Pagos</w:t>
+              <w:t>Pagos</w:t>
             </w:r>
           </w:p>
         </w:tc>
@@ -2070,7 +2070,7 @@
               <w:rPr>
                 <w:sz w:val="22"/>
               </w:rPr>
-              <w:t>Selector DNI exacto, RUC exacto o Código de préstamo para cobrar en cualquiera de las cinco agencias. DNI de ocho números; código con prefijo PR- fijo y ocho caracteres hexadecimales. Por DNI se elige entre préstamos con saldo; por código se carga uno. Conserva agencia de origen y registra agencia de cobro, sin listado global.</w:t>
+              <w:t>Selector DNI exacto, RUC exacto o Código de préstamo para cobrar en cualquiera de las cinco agencias. DNI de ocho números; código con prefijo PR- fijo y ocho caracteres hexadecimales. Por DNI o RUC se reúne el grupo del propietario y sus empresas entre agencias; por código se carga un préstamo. Desde ficha el documento queda fijo; desde detalle quedan fijos el código y el préstamo. Conserva agencia de origen y registra agencia de cobro, sin ofrecer una cartera completa sin búsqueda dirigida.</w:t>
             </w:r>
           </w:p>
         </w:tc>
@@ -2083,7 +2083,7 @@
     </w:p>
     <w:p>
       <w:r>
-        <w:t xml:space="preserve">El menú del asesor contiene Préstamos, Clientes, Nuevo préstamo, Pagos y Cerrar sesión. Los accesos desde ficha o detalle llevan a esos mismos procesos, sin formularios de negocio duplicados.</w:t>
+        <w:t>El menú del asesor contiene Préstamos, Clientes, Nuevo préstamo, Pagos y Cerrar sesión. Configuración aparece solo a quien tiene el permiso específico de mora. Los accesos desde ficha o detalle llevan a esos mismos procesos, sin formularios de negocio duplicados.</w:t>
       </w:r>
     </w:p>
     <w:p>
@@ -2096,7 +2096,7 @@
     </w:p>
     <w:p>
       <w:r>
-        <w:t>Nuevo préstamo: ingresar DNI → comprobar si existe en las cinco agencias → reutilizar ficha vigente, revalidar al existente o preparar datos del nuevo → completar monto y plazo → revisar cronograma → confirmar. El nuevo permanece como borrador en memoria hasta el paso 3: no se registra ni aparece en Clientes antes de confirmar. La detección por DNI no es un buscador global y una identidad vigente no repite consulta externa por cambiar de agencia.</w:t>
+        <w:t>Nuevo préstamo: elegir DNI o RUC → comprobar si existe en las cinco agencias → reutilizar ficha vigente, revalidar al existente o preparar datos del nuevo → completar monto y plazo → revisar cronograma → confirmar. El nuevo permanece como borrador en memoria hasta el paso 3: no se registra ni aparece en Clientes antes de confirmar. La detección por DNI no es un buscador global y una identidad vigente no repite consulta externa por cambiar de agencia.</w:t>
       </w:r>
     </w:p>
     <w:p>
@@ -2163,7 +2163,7 @@
                 <w:b/>
                 <w:sz w:val="22"/>
               </w:rPr>
-              <w:t xml:space="preserve">Concepto</w:t>
+              <w:t>Concepto</w:t>
             </w:r>
           </w:p>
         </w:tc>
@@ -2187,7 +2187,7 @@
                 <w:b/>
                 <w:sz w:val="22"/>
               </w:rPr>
-              <w:t xml:space="preserve">Estados y regla</w:t>
+              <w:t>Estados y regla</w:t>
             </w:r>
           </w:p>
         </w:tc>
@@ -2216,7 +2216,7 @@
               <w:rPr>
                 <w:sz w:val="22"/>
               </w:rPr>
-              <w:t xml:space="preserve">Verificación de identidad</w:t>
+              <w:t>Verificación de identidad</w:t>
             </w:r>
           </w:p>
         </w:tc>
@@ -2239,7 +2239,7 @@
               <w:rPr>
                 <w:sz w:val="22"/>
               </w:rPr>
-              <w:t xml:space="preserve">Pendiente, Aprobada, Caducada o Rechazada. Aprobada exige identidad confiable, documento vigente y evidencia suficiente de las condiciones exigidas.</w:t>
+              <w:t>Pendiente, Aprobada, Caducada o Rechazada. Aprobada exige identidad confiable, documento vigente y evidencia suficiente de las condiciones exigidas.</w:t>
             </w:r>
           </w:p>
         </w:tc>
@@ -2268,7 +2268,7 @@
               <w:rPr>
                 <w:sz w:val="22"/>
               </w:rPr>
-              <w:t xml:space="preserve">Condición de pago del cliente</w:t>
+              <w:t>Condición de pago del cliente</w:t>
             </w:r>
           </w:p>
         </w:tc>
@@ -2291,7 +2291,7 @@
               <w:rPr>
                 <w:sz w:val="22"/>
               </w:rPr>
-              <w:t xml:space="preserve">Habilitado si no tiene cuotas vencidas impagas; Moroso si tiene atraso menor de 12 meses; Extrajudicial si al menos una cuota impaga cumple 12 meses de atraso. Son estados automáticos, con prioridad de Extrajudicial sobre Moroso.</w:t>
+              <w:t>Sin atrasos (valor interno habilitado) si no tiene cuotas vencidas impagas; Moroso si tiene atraso menor de 12 meses; Extrajudicial si al menos una cuota impaga cumple 12 meses de atraso. Son estados automáticos del grupo, con prioridad de Extrajudicial sobre Moroso; un historial incompleto se identifica como Pendiente de conciliación.</w:t>
             </w:r>
           </w:p>
         </w:tc>
@@ -2320,7 +2320,7 @@
               <w:rPr>
                 <w:sz w:val="22"/>
               </w:rPr>
-              <w:t xml:space="preserve">Préstamo</w:t>
+              <w:t>Préstamo</w:t>
             </w:r>
           </w:p>
         </w:tc>
@@ -2343,7 +2343,7 @@
               <w:rPr>
                 <w:sz w:val="22"/>
               </w:rPr>
-              <w:t xml:space="preserve">Activo mientras quede deuda contractual pendiente; Cancelado por pago total cuando todas sus cuotas estén pagadas. Cancelado no significa anulado.</w:t>
+              <w:t>Activo mientras quede deuda contractual pendiente; Cancelado por pago total cuando todas sus cuotas estén pagadas. Cancelado no significa anulado.</w:t>
             </w:r>
           </w:p>
         </w:tc>
@@ -2372,7 +2372,7 @@
               <w:rPr>
                 <w:sz w:val="22"/>
               </w:rPr>
-              <w:t xml:space="preserve">Cuota</w:t>
+              <w:t>Cuota</w:t>
             </w:r>
           </w:p>
         </w:tc>
@@ -2395,7 +2395,7 @@
               <w:rPr>
                 <w:sz w:val="22"/>
               </w:rPr>
-              <w:t xml:space="preserve">Pendiente antes de vencer o durante su fecha de vencimiento; Vencida desde el día siguiente si no está pagada; Pagada únicamente si existe un cobro confirmado que la cubra.</w:t>
+              <w:t>Pendiente antes de vencer o durante su fecha de vencimiento; Vencida desde el día siguiente si no está pagada; Pagada únicamente si existe un cobro confirmado que la cubra.</w:t>
             </w:r>
           </w:p>
         </w:tc>
@@ -2408,12 +2408,12 @@
     </w:p>
     <w:p>
       <w:r>
-        <w:t xml:space="preserve">La condición de pago no cambia la verificación de identidad. Un cliente puede tener verificación Aprobada y condición Moroso, o condición Habilitado y DNI Caducado. En ambos casos se bloquea un nuevo préstamo. Cambiar un saldo nunca borra la fecha, la fuente o la evidencia de una verificación.</w:t>
+        <w:t>La condición de pago no cambia la verificación de identidad. Un cliente puede tener verificación Aprobada y condición Moroso, o condición Sin atrasos y DNI Caducado. En ambos casos se bloquea un nuevo préstamo. Cambiar un saldo nunca borra la fecha, la fuente o la evidencia de una verificación.</w:t>
       </w:r>
     </w:p>
     <w:p>
       <w:r>
-        <w:t xml:space="preserve">Fallecido deja de ser una opción editable de condición financiera. La información acreditada sobre fallecimiento pertenece a la verificación de identidad y bloquea nuevos préstamos; el asesor no declara ni revierte ese hecho mediante un selector. La revisión de un DNI físico, por sí sola, no acredita la condición de no fallecido.</w:t>
+        <w:t>Fallecido deja de ser una opción editable de condición financiera. La información acreditada sobre fallecimiento pertenece a la verificación de identidad y bloquea nuevos préstamos; el asesor no declara ni revierte ese hecho mediante un selector. La revisión de un DNI físico, por sí sola, no acredita la condición de no fallecido.</w:t>
       </w:r>
     </w:p>
     <w:p>
@@ -2470,7 +2470,7 @@
                 <w:b/>
                 <w:sz w:val="22"/>
               </w:rPr>
-              <w:t xml:space="preserve">Registro</w:t>
+              <w:t>Registro</w:t>
             </w:r>
           </w:p>
         </w:tc>
@@ -2494,7 +2494,7 @@
                 <w:b/>
                 <w:sz w:val="22"/>
               </w:rPr>
-              <w:t xml:space="preserve">Información que conserva</w:t>
+              <w:t>Información que conserva</w:t>
             </w:r>
           </w:p>
         </w:tc>
@@ -2523,7 +2523,7 @@
               <w:rPr>
                 <w:sz w:val="22"/>
               </w:rPr>
-              <w:t xml:space="preserve">Cliente y verificación</w:t>
+              <w:t>Cliente y verificación</w:t>
             </w:r>
           </w:p>
         </w:tc>
@@ -2575,7 +2575,7 @@
               <w:rPr>
                 <w:sz w:val="22"/>
               </w:rPr>
-              <w:t xml:space="preserve">Préstamo y cronograma</w:t>
+              <w:t>Préstamo y cronograma</w:t>
             </w:r>
           </w:p>
         </w:tc>
@@ -2598,7 +2598,7 @@
               <w:rPr>
                 <w:sz w:val="22"/>
               </w:rPr>
-              <w:t xml:space="preserve">Identificador único, cliente, agencia de origen, asesor, fecha, monto, plazo, TEA, tasa mensual y cuotas originales con interés, amortización y saldo programado.</w:t>
+              <w:t>Identificador único, cliente, agencia de origen, asesor, fecha, monto, plazo, TEA, tasa mensual y cuotas originales con interés, amortización y saldo programado.</w:t>
             </w:r>
           </w:p>
         </w:tc>
@@ -2627,7 +2627,7 @@
               <w:rPr>
                 <w:sz w:val="22"/>
               </w:rPr>
-              <w:t xml:space="preserve">Pago y aplicación</w:t>
+              <w:t>Pago y aplicación</w:t>
             </w:r>
           </w:p>
         </w:tc>
@@ -2650,7 +2650,7 @@
               <w:rPr>
                 <w:sz w:val="22"/>
               </w:rPr>
-              <w:t xml:space="preserve">Identificador único, préstamo, cuotas cubiertas, importe, fecha y hora, asesor y agencia de cobro. La aplicación distingue capital e interés según el cronograma guardado.</w:t>
+              <w:t>Identificador único, préstamo, cuotas cubiertas, importe, fecha y hora, asesor y agencia de cobro. La aplicación distingue capital e interés según el cronograma guardado.</w:t>
             </w:r>
           </w:p>
         </w:tc>
@@ -2679,7 +2679,7 @@
               <w:rPr>
                 <w:sz w:val="22"/>
               </w:rPr>
-              <w:t xml:space="preserve">Situación vigente</w:t>
+              <w:t>Situación vigente</w:t>
             </w:r>
           </w:p>
         </w:tc>
@@ -2702,7 +2702,7 @@
               <w:rPr>
                 <w:sz w:val="22"/>
               </w:rPr>
-              <w:t xml:space="preserve">Total pagado, deuda contractual pendiente, capital pendiente, cuotas vencidas, antigüedad de la mora y fecha de actualización. Se derivan de datos conciliados y pagos confirmados.</w:t>
+              <w:t>Total pagado, deuda contractual pendiente, capital pendiente, cuotas vencidas, antigüedad de la mora y fecha de actualización. Se derivan de datos conciliados y pagos confirmados.</w:t>
             </w:r>
           </w:p>
         </w:tc>
@@ -2715,7 +2715,7 @@
     </w:p>
     <w:p>
       <w:r>
-        <w:t xml:space="preserve">La fecha de operación y el corte diario se interpretan en la zona horaria de Perú. Los estados se actualizan al cambiar el día y después de un pago; también se verifican al consultar y antes de autorizar un nuevo préstamo, aunque nadie haya abierto el sistema durante varios días.</w:t>
+        <w:t>La fecha de operación y el corte diario se interpretan en la zona horaria de Perú. Los estados se actualizan al cambiar el día y después de un pago; también se verifican al consultar y antes de autorizar un nuevo préstamo, aunque nadie haya abierto el sistema durante varios días.</w:t>
       </w:r>
     </w:p>
     <w:p>
@@ -2772,7 +2772,7 @@
                 <w:b/>
                 <w:sz w:val="22"/>
               </w:rPr>
-              <w:t xml:space="preserve">Parámetro</w:t>
+              <w:t>Parámetro</w:t>
             </w:r>
           </w:p>
         </w:tc>
@@ -2796,7 +2796,7 @@
                 <w:b/>
                 <w:sz w:val="22"/>
               </w:rPr>
-              <w:t xml:space="preserve">Criterio adoptado</w:t>
+              <w:t>Criterio adoptado</w:t>
             </w:r>
           </w:p>
         </w:tc>
@@ -2825,7 +2825,7 @@
               <w:rPr>
                 <w:sz w:val="22"/>
               </w:rPr>
-              <w:t xml:space="preserve">TEA</w:t>
+              <w:t>TEA</w:t>
             </w:r>
           </w:p>
         </w:tc>
@@ -2848,7 +2848,7 @@
               <w:rPr>
                 <w:sz w:val="22"/>
               </w:rPr>
-              <w:t xml:space="preserve">30 % efectiva anual, fija y no editable.</w:t>
+              <w:t>30 % efectiva anual, fija y no editable.</w:t>
             </w:r>
           </w:p>
         </w:tc>
@@ -2877,7 +2877,7 @@
               <w:rPr>
                 <w:sz w:val="22"/>
               </w:rPr>
-              <w:t xml:space="preserve">Tasa mensual</w:t>
+              <w:t>Tasa mensual</w:t>
             </w:r>
           </w:p>
         </w:tc>
@@ -2900,7 +2900,7 @@
               <w:rPr>
                 <w:sz w:val="22"/>
               </w:rPr>
-              <w:t xml:space="preserve">TEM = (1 + 0,30)^(1/12) − 1 = 2,210445 % aproximadamente. Equivale a (1 + 0,30)^(30/360) − 1 bajo la base convencional de 360 días adoptada.</w:t>
+              <w:t>TEM = (1 + 0,30)^(1/12) − 1 = 2,210445 % aproximadamente. Equivale a (1 + 0,30)^(30/360) − 1 bajo la base convencional de 360 días adoptada.</w:t>
             </w:r>
           </w:p>
         </w:tc>
@@ -2929,7 +2929,7 @@
               <w:rPr>
                 <w:sz w:val="22"/>
               </w:rPr>
-              <w:t xml:space="preserve">Amortización</w:t>
+              <w:t>Amortización</w:t>
             </w:r>
           </w:p>
         </w:tc>
@@ -2952,7 +2952,7 @@
               <w:rPr>
                 <w:sz w:val="22"/>
               </w:rPr>
-              <w:t xml:space="preserve">Sistema francés con cuota mensual constante. Interés del mes = capital anterior × TEM; amortización = cuota − interés. La última cuota ajusta los redondeos.</w:t>
+              <w:t>Sistema francés con cuota mensual constante. Interés del mes = capital anterior × TEM; amortización = cuota − interés. La última cuota ajusta los redondeos.</w:t>
             </w:r>
           </w:p>
         </w:tc>
@@ -2981,7 +2981,7 @@
               <w:rPr>
                 <w:sz w:val="22"/>
               </w:rPr>
-              <w:t xml:space="preserve">Vencimientos</w:t>
+              <w:t>Vencimientos</w:t>
             </w:r>
           </w:p>
         </w:tc>
@@ -3004,7 +3004,7 @@
               <w:rPr>
                 <w:sz w:val="22"/>
               </w:rPr>
-              <w:t xml:space="preserve">Meses calendario desde la fecha original, sin sumar intervalos fijos de 30 días. Un vencimiento ajustado a febrero no cambia el día de los meses siguientes.</w:t>
+              <w:t>Meses calendario desde la fecha original, sin sumar intervalos fijos de 30 días. Un vencimiento ajustado a febrero no cambia el día de los meses siguientes.</w:t>
             </w:r>
           </w:p>
         </w:tc>
@@ -3033,7 +3033,7 @@
               <w:rPr>
                 <w:sz w:val="22"/>
               </w:rPr>
-              <w:t xml:space="preserve">Bisiestos</w:t>
+              <w:t>Bisiestos</w:t>
             </w:r>
           </w:p>
         </w:tc>
@@ -3056,7 +3056,7 @@
               <w:rPr>
                 <w:sz w:val="22"/>
               </w:rPr>
-              <w:t xml:space="preserve">Un préstamo del 31/01/2028 vence primero el 29/02/2028 y después el 31/03/2028. Del 12/05/2026 al 12/06/2026 hay 31 días y sigue siendo una cuota mensual.</w:t>
+              <w:t>Un préstamo del 31/01/2028 vence primero el 29/02/2028 y después el 31/03/2028. Del 12/05/2026 al 12/06/2026 hay 31 días y sigue siendo una cuota mensual.</w:t>
             </w:r>
           </w:p>
         </w:tc>
@@ -3085,7 +3085,7 @@
               <w:rPr>
                 <w:sz w:val="22"/>
               </w:rPr>
-              <w:t xml:space="preserve">Convención</w:t>
+              <w:t>Convención</w:t>
             </w:r>
           </w:p>
         </w:tc>
@@ -3108,7 +3108,7 @@
               <w:rPr>
                 <w:sz w:val="22"/>
               </w:rPr>
-              <w:t xml:space="preserve">La base 360 sustenta la equivalencia mensual elegida; no obliga a que todas las fechas estén separadas por 30 días. No se ajustan fines de semana en este alcance.</w:t>
+              <w:t>La base 360 sustenta la equivalencia mensual elegida; no obliga a que todas las fechas estén separadas por 30 días. No se ajustan fines de semana en este alcance.</w:t>
             </w:r>
           </w:p>
         </w:tc>
@@ -3137,7 +3137,7 @@
               <w:rPr>
                 <w:sz w:val="22"/>
               </w:rPr>
-              <w:t xml:space="preserve">Redondeo y cargos</w:t>
+              <w:t>Redondeo y cargos</w:t>
             </w:r>
           </w:p>
         </w:tc>
@@ -3189,7 +3189,7 @@
               <w:rPr>
                 <w:sz w:val="22"/>
               </w:rPr>
-              <w:t xml:space="preserve">Importes informativos</w:t>
+              <w:t>Importes informativos</w:t>
             </w:r>
           </w:p>
         </w:tc>
@@ -3212,7 +3212,7 @@
               <w:rPr>
                 <w:sz w:val="22"/>
               </w:rPr>
-              <w:t xml:space="preserve">Interés total programado = suma de intereses; total programado = suma de cuotas; deuda pendiente = total programado menos cobros confirmados. El capital pendiente excluye intereses futuros.</w:t>
+              <w:t>Interés total programado = suma de intereses; total programado = suma de cuotas; deuda pendiente = total programado menos cobros confirmados. El capital pendiente excluye intereses futuros.</w:t>
             </w:r>
           </w:p>
         </w:tc>
@@ -3278,7 +3278,7 @@
               <w:rPr>
                 <w:b/>
               </w:rPr>
-              <w:t xml:space="preserve">Sprint N.º 1: Acceso, préstamos y pago básico de cuotas.</w:t>
+              <w:t>Sprint N.º 1: Acceso, préstamos y pago básico de cuotas.</w:t>
             </w:r>
           </w:p>
         </w:tc>
@@ -3332,7 +3332,7 @@
               <w:rPr>
                 <w:sz w:val="22"/>
               </w:rPr>
-              <w:t xml:space="preserve">atender al cliente desde su verificación hasta el préstamo y el cobro de cuotas, con consulta por agencia, control de capital global y actualización automática de la condición de pago.</w:t>
+              <w:t>atender al cliente desde su verificación hasta el préstamo y el cobro de cuotas, con consulta por agencia, control de capital global y actualización automática de la condición de pago.</w:t>
             </w:r>
           </w:p>
         </w:tc>
@@ -3386,7 +3386,7 @@
               <w:rPr>
                 <w:sz w:val="22"/>
               </w:rPr>
-              <w:t xml:space="preserve">préstamos y cronogramas recuperables, pagos trazables entre agencias y bloqueo de nuevas colocaciones cuando existe mora, documento vencido o verificación insuficiente.</w:t>
+              <w:t>préstamos y cronogramas recuperables, pagos trazables entre agencias y bloqueo de nuevas colocaciones cuando existe mora, documento vencido o verificación insuficiente.</w:t>
             </w:r>
           </w:p>
         </w:tc>
@@ -3415,7 +3415,7 @@
                 <w:b/>
                 <w:sz w:val="22"/>
               </w:rPr>
-              <w:t xml:space="preserve">N.º</w:t>
+              <w:t>N.º</w:t>
             </w:r>
           </w:p>
         </w:tc>
@@ -3439,7 +3439,7 @@
                 <w:b/>
                 <w:sz w:val="22"/>
               </w:rPr>
-              <w:t xml:space="preserve">HU</w:t>
+              <w:t>HU</w:t>
             </w:r>
           </w:p>
         </w:tc>
@@ -3463,7 +3463,7 @@
                 <w:b/>
                 <w:sz w:val="22"/>
               </w:rPr>
-              <w:t xml:space="preserve">Historia de usuario</w:t>
+              <w:t>Historia de usuario</w:t>
             </w:r>
           </w:p>
         </w:tc>
@@ -3487,7 +3487,7 @@
                 <w:b/>
                 <w:sz w:val="22"/>
               </w:rPr>
-              <w:t xml:space="preserve">Dependencia</w:t>
+              <w:t>Dependencia</w:t>
             </w:r>
           </w:p>
         </w:tc>
@@ -3516,7 +3516,7 @@
               <w:rPr>
                 <w:sz w:val="22"/>
               </w:rPr>
-              <w:t xml:space="preserve">1</w:t>
+              <w:t>1</w:t>
             </w:r>
           </w:p>
         </w:tc>
@@ -3540,7 +3540,7 @@
               <w:rPr>
                 <w:sz w:val="22"/>
               </w:rPr>
-              <w:t xml:space="preserve">HU-01</w:t>
+              <w:t>HU-01</w:t>
             </w:r>
           </w:p>
         </w:tc>
@@ -3563,7 +3563,7 @@
               <w:rPr>
                 <w:sz w:val="22"/>
               </w:rPr>
-              <w:t xml:space="preserve">Iniciar sesión</w:t>
+              <w:t>Iniciar sesión</w:t>
             </w:r>
           </w:p>
         </w:tc>
@@ -3586,7 +3586,7 @@
               <w:rPr>
                 <w:sz w:val="22"/>
               </w:rPr>
-              <w:t xml:space="preserve">Identifica asesor y agencia.</w:t>
+              <w:t>Identifica asesor y agencia.</w:t>
             </w:r>
           </w:p>
         </w:tc>
@@ -3615,7 +3615,7 @@
               <w:rPr>
                 <w:sz w:val="22"/>
               </w:rPr>
-              <w:t xml:space="preserve">2</w:t>
+              <w:t>2</w:t>
             </w:r>
           </w:p>
         </w:tc>
@@ -3639,7 +3639,7 @@
               <w:rPr>
                 <w:sz w:val="22"/>
               </w:rPr>
-              <w:t xml:space="preserve">HU-02</w:t>
+              <w:t>HU-02</w:t>
             </w:r>
           </w:p>
         </w:tc>
@@ -3662,7 +3662,7 @@
               <w:rPr>
                 <w:sz w:val="22"/>
               </w:rPr>
-              <w:t xml:space="preserve">Cerrar sesión</w:t>
+              <w:t>Cerrar sesión</w:t>
             </w:r>
           </w:p>
         </w:tc>
@@ -3685,7 +3685,7 @@
               <w:rPr>
                 <w:sz w:val="22"/>
               </w:rPr>
-              <w:t xml:space="preserve">Protege el acceso y los borradores.</w:t>
+              <w:t>Protege el acceso y los borradores.</w:t>
             </w:r>
           </w:p>
         </w:tc>
@@ -3714,7 +3714,7 @@
               <w:rPr>
                 <w:sz w:val="22"/>
               </w:rPr>
-              <w:t xml:space="preserve">3</w:t>
+              <w:t>3</w:t>
             </w:r>
           </w:p>
         </w:tc>
@@ -3738,7 +3738,7 @@
               <w:rPr>
                 <w:sz w:val="22"/>
               </w:rPr>
-              <w:t xml:space="preserve">HU-03</w:t>
+              <w:t>HU-03</w:t>
             </w:r>
           </w:p>
         </w:tc>
@@ -3761,7 +3761,7 @@
               <w:rPr>
                 <w:sz w:val="22"/>
               </w:rPr>
-              <w:t xml:space="preserve">Validar y registrar cliente</w:t>
+              <w:t>Validar y registrar cliente</w:t>
             </w:r>
           </w:p>
         </w:tc>
@@ -3784,7 +3784,7 @@
               <w:rPr>
                 <w:sz w:val="22"/>
               </w:rPr>
-              <w:t xml:space="preserve">Define identidad y vigencia.</w:t>
+              <w:t>Define identidad y vigencia.</w:t>
             </w:r>
           </w:p>
         </w:tc>
@@ -3813,7 +3813,7 @@
               <w:rPr>
                 <w:sz w:val="22"/>
               </w:rPr>
-              <w:t xml:space="preserve">4</w:t>
+              <w:t>4</w:t>
             </w:r>
           </w:p>
         </w:tc>
@@ -3837,7 +3837,7 @@
               <w:rPr>
                 <w:sz w:val="22"/>
               </w:rPr>
-              <w:t xml:space="preserve">HU-04</w:t>
+              <w:t>HU-04</w:t>
             </w:r>
           </w:p>
         </w:tc>
@@ -3860,7 +3860,7 @@
               <w:rPr>
                 <w:sz w:val="22"/>
               </w:rPr>
-              <w:t xml:space="preserve">Registrar préstamo</w:t>
+              <w:t>Registrar préstamo</w:t>
             </w:r>
           </w:p>
         </w:tc>
@@ -3883,7 +3883,7 @@
               <w:rPr>
                 <w:sz w:val="22"/>
               </w:rPr>
-              <w:t xml:space="preserve">Requiere cliente elegible y capital disponible.</w:t>
+              <w:t>Requiere cliente elegible y capital disponible.</w:t>
             </w:r>
           </w:p>
         </w:tc>
@@ -3912,7 +3912,7 @@
               <w:rPr>
                 <w:sz w:val="22"/>
               </w:rPr>
-              <w:t xml:space="preserve">5</w:t>
+              <w:t>5</w:t>
             </w:r>
           </w:p>
         </w:tc>
@@ -3936,7 +3936,7 @@
               <w:rPr>
                 <w:sz w:val="22"/>
               </w:rPr>
-              <w:t xml:space="preserve">HU-05</w:t>
+              <w:t>HU-05</w:t>
             </w:r>
           </w:p>
         </w:tc>
@@ -3959,7 +3959,7 @@
               <w:rPr>
                 <w:sz w:val="22"/>
               </w:rPr>
-              <w:t xml:space="preserve">Generar y entregar cronograma</w:t>
+              <w:t>Generar y entregar cronograma</w:t>
             </w:r>
           </w:p>
         </w:tc>
@@ -3982,7 +3982,7 @@
               <w:rPr>
                 <w:sz w:val="22"/>
               </w:rPr>
-              <w:t xml:space="preserve">Se confirma junto con el préstamo.</w:t>
+              <w:t>Se confirma junto con el préstamo.</w:t>
             </w:r>
           </w:p>
         </w:tc>
@@ -4011,7 +4011,7 @@
               <w:rPr>
                 <w:sz w:val="22"/>
               </w:rPr>
-              <w:t xml:space="preserve">6</w:t>
+              <w:t>6</w:t>
             </w:r>
           </w:p>
         </w:tc>
@@ -4035,7 +4035,7 @@
               <w:rPr>
                 <w:sz w:val="22"/>
               </w:rPr>
-              <w:t xml:space="preserve">HU-06</w:t>
+              <w:t>HU-06</w:t>
             </w:r>
           </w:p>
         </w:tc>
@@ -4058,7 +4058,7 @@
               <w:rPr>
                 <w:sz w:val="22"/>
               </w:rPr>
-              <w:t xml:space="preserve">Consultar clientes y cartera propia</w:t>
+              <w:t>Consultar clientes y cartera propia</w:t>
             </w:r>
           </w:p>
         </w:tc>
@@ -4081,7 +4081,7 @@
               <w:rPr>
                 <w:sz w:val="22"/>
               </w:rPr>
-              <w:t xml:space="preserve">Recupera fichas y cronogramas.</w:t>
+              <w:t>Recupera fichas y cronogramas.</w:t>
             </w:r>
           </w:p>
         </w:tc>
@@ -4110,7 +4110,7 @@
               <w:rPr>
                 <w:sz w:val="22"/>
               </w:rPr>
-              <w:t xml:space="preserve">7</w:t>
+              <w:t>7</w:t>
             </w:r>
           </w:p>
         </w:tc>
@@ -4134,7 +4134,7 @@
               <w:rPr>
                 <w:sz w:val="22"/>
               </w:rPr>
-              <w:t xml:space="preserve">HU-07</w:t>
+              <w:t>HU-07</w:t>
             </w:r>
           </w:p>
         </w:tc>
@@ -4157,7 +4157,7 @@
               <w:rPr>
                 <w:sz w:val="22"/>
               </w:rPr>
-              <w:t xml:space="preserve">Registrar pago de cuotas</w:t>
+              <w:t>Registrar pago de cuotas</w:t>
             </w:r>
           </w:p>
         </w:tc>
@@ -4180,7 +4180,7 @@
               <w:rPr>
                 <w:sz w:val="22"/>
               </w:rPr>
-              <w:t xml:space="preserve">Requiere préstamo y cronograma confirmados.</w:t>
+              <w:t>Requiere préstamo y cronograma confirmados.</w:t>
             </w:r>
           </w:p>
         </w:tc>
@@ -4209,7 +4209,7 @@
               <w:rPr>
                 <w:sz w:val="22"/>
               </w:rPr>
-              <w:t xml:space="preserve">8</w:t>
+              <w:t>8</w:t>
             </w:r>
           </w:p>
         </w:tc>
@@ -4233,7 +4233,7 @@
               <w:rPr>
                 <w:sz w:val="22"/>
               </w:rPr>
-              <w:t xml:space="preserve">HU-08</w:t>
+              <w:t>HU-08</w:t>
             </w:r>
           </w:p>
         </w:tc>
@@ -4256,7 +4256,7 @@
               <w:rPr>
                 <w:sz w:val="22"/>
               </w:rPr>
-              <w:t xml:space="preserve">Actualizar estados automáticamente</w:t>
+              <w:t>Actualizar estados automáticamente</w:t>
             </w:r>
           </w:p>
         </w:tc>
@@ -4279,7 +4279,7 @@
               <w:rPr>
                 <w:sz w:val="22"/>
               </w:rPr>
-              <w:t xml:space="preserve">Integra vencimientos, pagos y elegibilidad.</w:t>
+              <w:t>Integra vencimientos, pagos y elegibilidad.</w:t>
             </w:r>
           </w:p>
         </w:tc>
@@ -4292,7 +4292,7 @@
     </w:p>
     <w:p>
       <w:r>
-        <w:t xml:space="preserve">Días 1 y 2: ajustar acceso, permisos por agencia, identidad y datos. Días 3 y 4: integrar cronograma, pagos y estados automáticos. Día 5: probar el flujo completo, desplegar y preparar la demostración. Los cobros y estados automáticos amplían el alcance anterior y se incorporan como HU-07 y HU-08.</w:t>
+        <w:t>Días 1 y 2: ajustar acceso, permisos por agencia, identidad y datos. Días 3 y 4: integrar cronograma, pagos y estados automáticos. Día 5: probar el flujo completo, desplegar y preparar la demostración. Los cobros y estados automáticos amplían el alcance anterior y se incorporan como HU-07 y HU-08.</w:t>
       </w:r>
     </w:p>
     <w:p>
@@ -4310,7 +4310,7 @@
     </w:p>
     <w:p>
       <w:r>
-        <w:t xml:space="preserve">Permitir el acceso exclusivo de asesores autorizados con una de las cinco agencias asignadas. La creación de cuentas y recuperación de contraseñas quedan fuera del sprint.</w:t>
+        <w:t>Permitir el acceso exclusivo de asesores autorizados con una de las cinco agencias asignadas. La creación de cuentas y recuperación de contraseñas quedan fuera del sprint.</w:t>
       </w:r>
     </w:p>
     <w:tbl>
@@ -4405,7 +4405,7 @@
               <w:spacing w:before="40" w:after="40" w:line="240" w:lineRule="auto"/>
             </w:pPr>
             <w:r>
-              <w:t xml:space="preserve">Como asesor de ventas, quiero iniciar sesión con mi cuenta autorizada, para operar desde la agencia que tengo asignada.</w:t>
+              <w:t>Como asesor de ventas, quiero iniciar sesión con mi cuenta autorizada, para operar desde la agencia que tengo asignada.</w:t>
             </w:r>
           </w:p>
         </w:tc>
@@ -4426,114 +4426,176 @@
             <w:pPr>
               <w:spacing w:before="60" w:after="80" w:line="240" w:lineRule="auto"/>
               <w:ind w:left="216" w:hanging="216"/>
+              <w:keepNext w:val="0"/>
               <w:keepLines/>
             </w:pPr>
             <w:r>
               <w:rPr>
                 <w:b/>
-              </w:rPr>
-              <w:t>• CA01. Credenciales obligatorias:</w:t>
+                <w:sz w:val="20"/>
+              </w:rPr>
+              <w:t xml:space="preserve">• CA01. Credenciales obligatorias: </w:t>
             </w:r>
             <w:r>
               <w:rPr>
                 <w:b w:val="0"/>
-              </w:rPr>
-              <w:t xml:space="preserve"> Se solicita correo y contraseña; los campos vacíos impiden continuar.</w:t>
+                <w:sz w:val="20"/>
+              </w:rPr>
+              <w:t>Se solicita correo y contraseña; los campos vacíos impiden continuar.</w:t>
             </w:r>
           </w:p>
           <w:p>
             <w:pPr>
               <w:spacing w:before="60" w:after="80" w:line="240" w:lineRule="auto"/>
               <w:ind w:left="216" w:hanging="216"/>
+              <w:keepNext w:val="0"/>
               <w:keepLines/>
             </w:pPr>
             <w:r>
               <w:rPr>
                 <w:b/>
-              </w:rPr>
-              <w:t>• CA02. Acceso autorizado:</w:t>
+                <w:sz w:val="20"/>
+              </w:rPr>
+              <w:t xml:space="preserve">• CA02. Acceso autorizado: </w:t>
             </w:r>
             <w:r>
               <w:rPr>
                 <w:b w:val="0"/>
-              </w:rPr>
-              <w:t xml:space="preserve"> Solo ingresa una cuenta válida y activa. El mensaje de rechazo no revela cuál credencial falló.</w:t>
+                <w:sz w:val="20"/>
+              </w:rPr>
+              <w:t>Solo ingresa una cuenta válida y activa. El mensaje de rechazo no revela cuál credencial falló.</w:t>
             </w:r>
           </w:p>
           <w:p>
             <w:pPr>
               <w:spacing w:before="60" w:after="80" w:line="240" w:lineRule="auto"/>
               <w:ind w:left="216" w:hanging="216"/>
+              <w:keepNext w:val="0"/>
               <w:keepLines/>
             </w:pPr>
             <w:r>
               <w:rPr>
                 <w:b/>
-              </w:rPr>
-              <w:t>• CA03. Agencia de sesión:</w:t>
+                <w:sz w:val="20"/>
+              </w:rPr>
+              <w:t xml:space="preserve">• CA03. Agencia de sesión: </w:t>
             </w:r>
             <w:r>
               <w:rPr>
                 <w:b w:val="0"/>
-              </w:rPr>
-              <w:t xml:space="preserve"> El sistema obtiene asesor y agencia de la cuenta. No permite elegir otra agencia ni operar con General.</w:t>
+                <w:sz w:val="20"/>
+              </w:rPr>
+              <w:t>El sistema obtiene asesor y agencia de la cuenta. No permite elegir otra agencia ni operar con General.</w:t>
             </w:r>
           </w:p>
           <w:p>
             <w:pPr>
               <w:spacing w:before="60" w:after="80" w:line="240" w:lineRule="auto"/>
               <w:ind w:left="216" w:hanging="216"/>
+              <w:keepNext w:val="0"/>
               <w:keepLines/>
             </w:pPr>
             <w:r>
               <w:rPr>
                 <w:b/>
-              </w:rPr>
-              <w:t>• CA04. Protección efectiva:</w:t>
+                <w:sz w:val="20"/>
+              </w:rPr>
+              <w:t xml:space="preserve">• CA04. Protección efectiva: </w:t>
             </w:r>
             <w:r>
               <w:rPr>
                 <w:b w:val="0"/>
-              </w:rPr>
-              <w:t xml:space="preserve"> Pantallas, consultas y operaciones requieren sesión y permisos. Abrir una dirección o alterar una solicitud no permite consultar carteras ajenas.</w:t>
+                <w:sz w:val="20"/>
+              </w:rPr>
+              <w:t>Pantallas, consultas y operaciones requieren sesión y permisos. Abrir una dirección o alterar una solicitud no permite consultar carteras ajenas.</w:t>
             </w:r>
           </w:p>
           <w:p>
             <w:pPr>
               <w:spacing w:before="60" w:after="80" w:line="240" w:lineRule="auto"/>
               <w:ind w:left="216" w:hanging="216"/>
+              <w:keepNext w:val="0"/>
               <w:keepLines/>
             </w:pPr>
             <w:r>
               <w:rPr>
                 <w:b/>
-              </w:rPr>
-              <w:t>• CA05. Login limpio:</w:t>
+                <w:sz w:val="20"/>
+              </w:rPr>
+              <w:t xml:space="preserve">• CA05. Login limpio: </w:t>
             </w:r>
             <w:r>
               <w:rPr>
                 <w:b w:val="0"/>
-              </w:rPr>
-              <w:t xml:space="preserve"> Se eliminan el panel y los accesos rápidos de cuentas de demostración. No se muestran ni precargan contraseñas de prueba.</w:t>
+                <w:sz w:val="20"/>
+              </w:rPr>
+              <w:t>Se eliminan el panel y los accesos rápidos de cuentas de demostración. No se muestran ni precargan contraseñas de prueba.</w:t>
             </w:r>
           </w:p>
           <w:p>
             <w:pPr>
               <w:spacing w:before="60" w:after="80" w:line="240" w:lineRule="auto"/>
               <w:ind w:left="216" w:hanging="216"/>
+              <w:keepNext w:val="0"/>
               <w:keepLines/>
             </w:pPr>
             <w:r>
               <w:rPr>
                 <w:b/>
-              </w:rPr>
-              <w:t>• CA06. Resultado:</w:t>
+                <w:sz w:val="20"/>
+              </w:rPr>
+              <w:t xml:space="preserve">• CA06. Resultado: </w:t>
             </w:r>
             <w:r>
               <w:rPr>
                 <w:b w:val="0"/>
-              </w:rPr>
-              <w:t xml:space="preserve"> Se abre Préstamos con la cartera propia, el asesor y su agencia identificados. Las contraseñas no se conservan en texto plano.</w:t>
+                <w:sz w:val="20"/>
+              </w:rPr>
+              <w:t>Se abre Préstamos con la cartera propia. La cabecera identifica nombre y rol, agencia, fecha de Perú y tiempo restante de sesión, en ese orden. Las contraseñas no se conservan en texto plano.</w:t>
+            </w:r>
+          </w:p>
+          <w:p>
+            <w:pPr>
+              <w:spacing w:before="60" w:after="80" w:line="240" w:lineRule="auto"/>
+              <w:ind w:left="216" w:hanging="216"/>
+              <w:keepNext w:val="0"/>
+              <w:keepLines/>
+            </w:pPr>
+            <w:r>
+              <w:rPr>
+                <w:b/>
+                <w:sz w:val="20"/>
+              </w:rPr>
+              <w:t xml:space="preserve">• CA07. Sesión única: </w:t>
+            </w:r>
+            <w:r>
+              <w:rPr>
+                <w:b w:val="0"/>
+                <w:sz w:val="20"/>
+              </w:rPr>
+              <w:t>Un nuevo inicio válido reemplaza al anterior de esa cuenta. La base rechaza operaciones de la sesión anterior y la interfaz la detecta en el siguiente control, hasta 15 segundos con conexión. Varias pestañas del mismo navegador comparten sesión.</w:t>
+            </w:r>
+          </w:p>
+          <w:p>
+            <w:pPr>
+              <w:spacing w:before="60" w:after="80" w:line="240" w:lineRule="auto"/>
+              <w:ind w:left="216" w:hanging="216"/>
+              <w:keepNext w:val="0"/>
+              <w:keepLines/>
+            </w:pPr>
+            <w:r>
+              <w:rPr>
+                <w:b/>
+                <w:sz w:val="20"/>
+              </w:rPr>
+              <w:t xml:space="preserve">• CA08. Inactividad: </w:t>
+            </w:r>
+            <w:r>
+              <w:rPr>
+                <w:b w:val="0"/>
+                <w:sz w:val="20"/>
+              </w:rPr>
+              <w:t>El tiempo máximo es 15 minutos sin interacción. Teclado, puntero y desplazamiento renuevan la actividad con envíos limitados; las consultas automáticas no la renuevan. El contador usa la referencia del servidor y una sesión vencida no se reactiva con el mismo identificador.</w:t>
             </w:r>
           </w:p>
         </w:tc>
@@ -4636,7 +4698,7 @@
               <w:spacing w:before="40" w:after="40" w:line="240" w:lineRule="auto"/>
             </w:pPr>
             <w:r>
-              <w:t xml:space="preserve">Como asesor de ventas, quiero cerrar mi sesión, para impedir que otra persona opere con mi cuenta.</w:t>
+              <w:t>Como asesor de ventas, quiero cerrar mi sesión, para impedir que otra persona opere con mi cuenta.</w:t>
             </w:r>
           </w:p>
         </w:tc>
@@ -4657,70 +4719,119 @@
             <w:pPr>
               <w:spacing w:before="60" w:after="80" w:line="240" w:lineRule="auto"/>
               <w:ind w:left="216" w:hanging="216"/>
+              <w:keepNext w:val="0"/>
               <w:keepLines/>
             </w:pPr>
             <w:r>
               <w:rPr>
                 <w:b/>
-              </w:rPr>
-              <w:t>• CA01. Opción disponible:</w:t>
+                <w:sz w:val="20"/>
+              </w:rPr>
+              <w:t xml:space="preserve">• CA01. Opción disponible: </w:t>
             </w:r>
             <w:r>
               <w:rPr>
                 <w:b w:val="0"/>
-              </w:rPr>
-              <w:t xml:space="preserve"> Cerrar sesión está visible durante una sesión activa.</w:t>
+                <w:sz w:val="20"/>
+              </w:rPr>
+              <w:t>Cerrar sesión está visible durante una sesión activa.</w:t>
             </w:r>
           </w:p>
           <w:p>
             <w:pPr>
               <w:spacing w:before="60" w:after="80" w:line="240" w:lineRule="auto"/>
               <w:ind w:left="216" w:hanging="216"/>
+              <w:keepNext w:val="0"/>
               <w:keepLines/>
             </w:pPr>
             <w:r>
               <w:rPr>
                 <w:b/>
-              </w:rPr>
-              <w:t>• CA02. Finalización:</w:t>
+                <w:sz w:val="20"/>
+              </w:rPr>
+              <w:t xml:space="preserve">• CA02. Finalización: </w:t>
             </w:r>
             <w:r>
               <w:rPr>
                 <w:b w:val="0"/>
-              </w:rPr>
-              <w:t xml:space="preserve"> La sesión se invalida y se vuelve al acceso. Volver atrás o entrar a una ruta protegida exige autenticarse otra vez.</w:t>
+                <w:sz w:val="20"/>
+              </w:rPr>
+              <w:t>Se invalida la sesión actual y se vuelve al acceso. Volver atrás o abrir una ruta protegida exige autenticarse otra vez. Cerrar una sesión antigua no revoca una sesión posterior en otra computadora.</w:t>
             </w:r>
           </w:p>
           <w:p>
             <w:pPr>
               <w:spacing w:before="60" w:after="80" w:line="240" w:lineRule="auto"/>
               <w:ind w:left="216" w:hanging="216"/>
+              <w:keepNext w:val="0"/>
               <w:keepLines/>
             </w:pPr>
             <w:r>
               <w:rPr>
                 <w:b/>
-              </w:rPr>
-              <w:t>• CA03. Borradores:</w:t>
+                <w:sz w:val="20"/>
+              </w:rPr>
+              <w:t xml:space="preserve">• CA03. Borradores: </w:t>
             </w:r>
             <w:r>
               <w:rPr>
                 <w:b w:val="0"/>
-              </w:rPr>
-              <w:t xml:space="preserve"> Se advierte antes de salir, recargar o cerrar sesión con datos sin confirmar. El cliente nuevo en borrador se descarta al abandonar y no aparece en Clientes. Una revalidación existente ya guardada y las operaciones confirmadas permanecen.</w:t>
+                <w:sz w:val="20"/>
+              </w:rPr>
+              <w:t>Se advierte antes de abandonar o cerrar manualmente con datos sin confirmar. Al vencer la sesión o ser reemplazada, el cierre es obligatorio y los borradores se pierden. Las verificaciones ya guardadas y las operaciones confirmadas permanecen.</w:t>
+            </w:r>
+          </w:p>
+          <w:p>
+            <w:pPr>
+              <w:spacing w:before="60" w:after="80" w:line="240" w:lineRule="auto"/>
+              <w:ind w:left="216" w:hanging="216"/>
+              <w:keepNext w:val="0"/>
+              <w:keepLines/>
+            </w:pPr>
+            <w:r>
+              <w:rPr>
+                <w:b/>
+                <w:sz w:val="20"/>
+              </w:rPr>
+              <w:t xml:space="preserve">• CA04. Aviso de vencimiento: </w:t>
+            </w:r>
+            <w:r>
+              <w:rPr>
+                <w:b w:val="0"/>
+                <w:sz w:val="20"/>
+              </w:rPr>
+              <w:t>El contador se vuelve ámbar en los últimos dos minutos y rojo en el último. Durante el último minuto se ofrece Continuar sesión o Cerrar sesión. Continuar solo renueva una sesión que siga válida.</w:t>
+            </w:r>
+          </w:p>
+          <w:p>
+            <w:pPr>
+              <w:spacing w:before="60" w:after="80" w:line="240" w:lineRule="auto"/>
+              <w:ind w:left="216" w:hanging="216"/>
+              <w:keepNext w:val="0"/>
+              <w:keepLines/>
+            </w:pPr>
+            <w:r>
+              <w:rPr>
+                <w:b/>
+                <w:sz w:val="20"/>
+              </w:rPr>
+              <w:t xml:space="preserve">• CA05. Cierre obligatorio: </w:t>
+            </w:r>
+            <w:r>
+              <w:rPr>
+                <w:b w:val="0"/>
+                <w:sz w:val="20"/>
+              </w:rPr>
+              <w:t>La inactividad, una sesión reemplazada o una cuenta sin acceso bloquean las operaciones y devuelven al inicio con su motivo.</w:t>
             </w:r>
           </w:p>
         </w:tc>
       </w:tr>
     </w:tbl>
     <w:p>
-      <w:r>
-        <w:br w:type="page"/>
-      </w:r>
-    </w:p>
-    <w:p>
       <w:pPr>
         <w:pStyle w:val="Ttulo1"/>
+        <w:pageBreakBefore/>
       </w:pPr>
       <w:r>
         <w:t xml:space="preserve">Épica Gestionar préstamos y cobranza</w:t>
@@ -4728,7 +4839,7 @@
     </w:p>
     <w:p>
       <w:r>
-        <w:t xml:space="preserve">Las HU-03 a HU-08 comparten identidad, préstamos, cronogramas y pagos. La condición financiera se deriva de las obligaciones del cliente y no se cambia manualmente. Los datos contractuales confirmados permanecen sin edición; los pagos se registran como nuevas operaciones.</w:t>
+        <w:t>Las HU-03 a HU-08 comparten identidad, préstamos, cronogramas y pagos. La condición financiera se deriva de las obligaciones del cliente y no se cambia manualmente. Los datos contractuales confirmados permanecen sin edición; los pagos se registran como nuevas operaciones.</w:t>
       </w:r>
     </w:p>
     <w:tbl>
@@ -4823,7 +4934,7 @@
               <w:spacing w:before="40" w:after="40" w:line="240" w:lineRule="auto"/>
             </w:pPr>
             <w:r>
-              <w:t xml:space="preserve">Como asesor de ventas, quiero verificar la identidad y vigencia del DNI, para registrar un cliente confiable o revalidar su ficha antes de un nuevo préstamo.</w:t>
+              <w:t>Como asesor de ventas, quiero verificar la identidad y vigencia del DNI, para registrar un cliente confiable o revalidar su ficha antes de un nuevo préstamo.</w:t>
             </w:r>
           </w:p>
         </w:tc>
@@ -4844,152 +4955,220 @@
             <w:pPr>
               <w:spacing w:before="60" w:after="80" w:line="240" w:lineRule="auto"/>
               <w:ind w:left="216" w:hanging="216"/>
+              <w:keepNext w:val="0"/>
               <w:keepLines/>
             </w:pPr>
             <w:r>
               <w:rPr>
                 <w:b/>
-              </w:rPr>
-              <w:t>• CA01. Documento admitido:</w:t>
+                <w:sz w:val="20"/>
+              </w:rPr>
+              <w:t xml:space="preserve">• CA01. Documento admitido: </w:t>
             </w:r>
             <w:r>
               <w:rPr>
                 <w:b w:val="0"/>
-              </w:rPr>
-              <w:t xml:space="preserve"> DNI de exactamente ocho dígitos numéricos para una persona natural peruana. Se conservan ceros iniciales; letras, signos e ingreso incompleto impiden consultar. Se valida en pantalla y servidor. RUC 10 y RUC 20 se admiten con validación de formato, dígito verificador y consulta externa firmada. Extranjería queda fuera del incremento.</w:t>
+                <w:sz w:val="20"/>
+              </w:rPr>
+              <w:t>DNI de exactamente ocho dígitos numéricos para una persona natural peruana. Se conservan ceros iniciales; letras, signos e ingreso incompleto impiden consultar. Se valida en pantalla y servidor. RUC 10 y RUC 20 se admiten con validación de formato, dígito verificador y consulta externa firmada. Extranjería queda fuera del incremento.</w:t>
             </w:r>
           </w:p>
           <w:p>
             <w:pPr>
               <w:spacing w:before="60" w:after="80" w:line="240" w:lineRule="auto"/>
               <w:ind w:left="216" w:hanging="216"/>
+              <w:keepNext w:val="0"/>
               <w:keepLines/>
             </w:pPr>
             <w:r>
               <w:rPr>
                 <w:b/>
-              </w:rPr>
-              <w:t>• CA02. Entrada y borrador:</w:t>
+                <w:sz w:val="20"/>
+              </w:rPr>
+              <w:t xml:space="preserve">• CA02. Entrada y borrador: </w:t>
             </w:r>
             <w:r>
               <w:rPr>
                 <w:b w:val="0"/>
-              </w:rPr>
-              <w:t xml:space="preserve"> Nuevo préstamo comprueba el DNI en las cinco agencias. Reutiliza la ficha aprobada y vigente sin duplicar ni repetir consulta externa; revalida la pendiente, incompleta o caducada. El nuevo conserva identidad y evidencia solo en memoria al continuar al paso 2; se registra al confirmar el paso 3. Abandonar o recargar descarta el borrador.</w:t>
+                <w:sz w:val="20"/>
+              </w:rPr>
+              <w:t>Nuevo préstamo comprueba el DNI en las cinco agencias. Reutiliza la ficha aprobada y vigente sin duplicar ni repetir consulta externa; revalida la pendiente, incompleta o caducada. El nuevo conserva identidad y evidencia solo en memoria al continuar al paso 2; se registra al confirmar el paso 3. Abandonar o recargar descarta el borrador.</w:t>
             </w:r>
           </w:p>
           <w:p>
             <w:pPr>
               <w:spacing w:before="60" w:after="80" w:line="240" w:lineRule="auto"/>
               <w:ind w:left="216" w:hanging="216"/>
+              <w:keepNext w:val="0"/>
               <w:keepLines/>
             </w:pPr>
             <w:r>
               <w:rPr>
                 <w:b/>
-              </w:rPr>
-              <w:t>• CA03. Identidad exacta:</w:t>
+                <w:sz w:val="20"/>
+              </w:rPr>
+              <w:t xml:space="preserve">• CA03. Identidad exacta: </w:t>
             </w:r>
             <w:r>
               <w:rPr>
                 <w:b w:val="0"/>
-              </w:rPr>
-              <w:t xml:space="preserve"> Para el registro nuevo o la revalidación necesaria se consulta la fuente de identidad seleccionada. Se conservan nombres y apellidos originales, incluidas tildes, sin edición manual. Corregir el DNI exige repetir la comprobación interna y, si corresponde, la consulta de identidad.</w:t>
+                <w:sz w:val="20"/>
+              </w:rPr>
+              <w:t>Para el registro nuevo o la revalidación necesaria se consulta la fuente de identidad seleccionada. Se conservan nombres y apellidos originales, incluidas tildes, sin edición manual. Corregir el DNI exige repetir la comprobación interna y, si corresponde, la consulta de identidad.</w:t>
             </w:r>
           </w:p>
           <w:p>
             <w:pPr>
               <w:spacing w:before="60" w:after="80" w:line="240" w:lineRule="auto"/>
               <w:ind w:left="216" w:hanging="216"/>
+              <w:keepNext w:val="0"/>
               <w:keepLines/>
             </w:pPr>
             <w:r>
               <w:rPr>
                 <w:b/>
-              </w:rPr>
-              <w:t>• CA04. Vigencia acreditada:</w:t>
+                <w:sz w:val="20"/>
+              </w:rPr>
+              <w:t xml:space="preserve">• CA04. Vigencia acreditada: </w:t>
             </w:r>
             <w:r>
               <w:rPr>
                 <w:b w:val="0"/>
-              </w:rPr>
-              <w:t xml:space="preserve"> Se registra la fecha de caducidad y la revisión del DNI original. Si la fuente no acredita vigencia o ausencia de fallecimiento, se registra evidencia oficial suficiente para cada condición antes de aprobar. No se inventan datos ausentes de la API.</w:t>
+                <w:sz w:val="20"/>
+              </w:rPr>
+              <w:t>Se registra la fecha de caducidad y la revisión del DNI original. El asesor confirma mediante dos casillas la revisión del DNI original y la presencia física del cliente. Las referencias se generan automáticamente y describen esa revisión presencial; no acreditan una consulta oficial de fallecimiento ni inventan datos ausentes de la API.</w:t>
             </w:r>
           </w:p>
           <w:p>
             <w:pPr>
               <w:spacing w:before="60" w:after="80" w:line="240" w:lineRule="auto"/>
               <w:ind w:left="216" w:hanging="216"/>
+              <w:keepNext w:val="0"/>
               <w:keepLines/>
             </w:pPr>
             <w:r>
               <w:rPr>
                 <w:b/>
-              </w:rPr>
-              <w:t>• CA05. Estados separados:</w:t>
+                <w:sz w:val="20"/>
+              </w:rPr>
+              <w:t xml:space="preserve">• CA05. Estados separados: </w:t>
             </w:r>
             <w:r>
               <w:rPr>
                 <w:b w:val="0"/>
-              </w:rPr>
-              <w:t xml:space="preserve"> La verificación puede estar Pendiente, Aprobada, Caducada o Rechazada. No depende de que el cliente tenga mora. Fallecido no es una condición financiera seleccionable por el asesor.</w:t>
+                <w:sz w:val="20"/>
+              </w:rPr>
+              <w:t>La verificación puede estar Pendiente, Aprobada, Caducada o Rechazada. No depende de que el cliente tenga mora. Fallecido no es una condición financiera seleccionable por el asesor.</w:t>
             </w:r>
           </w:p>
           <w:p>
             <w:pPr>
               <w:spacing w:before="60" w:after="80" w:line="240" w:lineRule="auto"/>
               <w:ind w:left="216" w:hanging="216"/>
+              <w:keepNext w:val="0"/>
               <w:keepLines/>
             </w:pPr>
             <w:r>
               <w:rPr>
                 <w:b/>
-              </w:rPr>
-              <w:t>• CA06. Caducidad automática:</w:t>
+                <w:sz w:val="20"/>
+              </w:rPr>
+              <w:t xml:space="preserve">• CA06. Caducidad automática: </w:t>
             </w:r>
             <w:r>
               <w:rPr>
                 <w:b w:val="0"/>
-              </w:rPr>
-              <w:t xml:space="preserve"> El DNI es vigente hasta su fecha de caducidad inclusive; desde el día siguiente se bloquea un nuevo préstamo. Una revalidación requiere evidencia del documento renovado, no solo pulsar Habilitar.</w:t>
+                <w:sz w:val="20"/>
+              </w:rPr>
+              <w:t>El DNI es vigente hasta su fecha de caducidad inclusive; desde el día siguiente se bloquea un nuevo préstamo. Una revalidación requiere evidencia del documento renovado, no solo pulsar Habilitar.</w:t>
             </w:r>
           </w:p>
           <w:p>
             <w:pPr>
               <w:spacing w:before="60" w:after="80" w:line="240" w:lineRule="auto"/>
               <w:ind w:left="216" w:hanging="216"/>
+              <w:keepNext w:val="0"/>
               <w:keepLines/>
             </w:pPr>
             <w:r>
               <w:rPr>
                 <w:b/>
-              </w:rPr>
-              <w:t>• CA07. Fallo o rechazo:</w:t>
+                <w:sz w:val="20"/>
+              </w:rPr>
+              <w:t xml:space="preserve">• CA07. Fallo o rechazo: </w:t>
             </w:r>
             <w:r>
               <w:rPr>
                 <w:b w:val="0"/>
-              </w:rPr>
-              <w:t xml:space="preserve"> Un DNI inexistente, una condición no admisible o una consulta inconclusa impiden aprobar. Se informa el motivo y se permite reintentar, sin dar por válida una identidad por el solo formato.</w:t>
+                <w:sz w:val="20"/>
+              </w:rPr>
+              <w:t>Un documento inexistente o una consulta inconclusa impiden completar esa verificación. Un error técnico o de disponibilidad no se guarda como rechazo de identidad. Se permite reintentar; el formato por sí solo no acredita identidad.</w:t>
             </w:r>
           </w:p>
           <w:p>
             <w:pPr>
               <w:spacing w:before="60" w:after="80" w:line="240" w:lineRule="auto"/>
               <w:ind w:left="216" w:hanging="216"/>
+              <w:keepNext w:val="0"/>
               <w:keepLines/>
             </w:pPr>
             <w:r>
               <w:rPr>
                 <w:b/>
-              </w:rPr>
-              <w:t>• CA08. Revalidación independiente:</w:t>
+                <w:sz w:val="20"/>
+              </w:rPr>
+              <w:t xml:space="preserve">• CA08. Revalidación independiente: </w:t>
             </w:r>
             <w:r>
               <w:rPr>
                 <w:b w:val="0"/>
-              </w:rPr>
-              <w:t xml:space="preserve"> Guardar verificación y continuar actualiza al cliente existente aunque no finalice otro préstamo, con aviso previo. Se conservan fuente, resultado, caducidad, evidencia, fecha, asesor y agencia; el cambio se comparte entre las cinco agencias sin borrar historial ni eliminar mora. Pagar no exige renovar DNI.</w:t>
+                <w:sz w:val="20"/>
+              </w:rPr>
+              <w:t>Guardar una verificación existente actualiza la misma ficha y conserva historial, fuente, evidencia, fecha, asesor y agencia aunque no finalice otro préstamo. Desde ficha se consulta automáticamente el documento fijo y se vuelve a la ficha al guardar. La acción sigue disponible con datos vigentes; no elimina mora ni requiere crear un préstamo.</w:t>
+            </w:r>
+          </w:p>
+          <w:p>
+            <w:pPr>
+              <w:spacing w:before="60" w:after="80" w:line="240" w:lineRule="auto"/>
+              <w:ind w:left="216" w:hanging="216"/>
+              <w:keepNext w:val="0"/>
+              <w:keepLines/>
+            </w:pPr>
+            <w:r>
+              <w:rPr>
+                <w:b/>
+                <w:sz w:val="20"/>
+              </w:rPr>
+              <w:t xml:space="preserve">• CA09. SUNAT y alcance: </w:t>
+            </w:r>
+            <w:r>
+              <w:rPr>
+                <w:b w:val="0"/>
+                <w:sz w:val="20"/>
+              </w:rPr>
+              <w:t>Actualizar datos SUNAT compara nombre o razón social, estado, condición y domicilio con lo guardado. Permite guardar una consulta firmada aunque no haya cambios o el RUC esté observado; conserva fecha e historial. Los datos del proveedor no se editan manualmente. No equivale a revalidar DNI, propiedad ni facultades.</w:t>
+            </w:r>
+          </w:p>
+          <w:p>
+            <w:pPr>
+              <w:spacing w:before="60" w:after="80" w:line="240" w:lineRule="auto"/>
+              <w:ind w:left="216" w:hanging="216"/>
+              <w:keepNext w:val="0"/>
+              <w:keepLines/>
+            </w:pPr>
+            <w:r>
+              <w:rPr>
+                <w:b/>
+                <w:sz w:val="20"/>
+              </w:rPr>
+              <w:t xml:space="preserve">• CA10. Representación: </w:t>
+            </w:r>
+            <w:r>
+              <w:rPr>
+                <w:b w:val="0"/>
+                <w:sz w:val="20"/>
+              </w:rPr>
+              <w:t>En RUC 20 el propietario puede firmar si tiene facultades, o puede acudir otro representante. El propietario ausente debe tener identidad previa aprobada y vigente; no recibe verificación presencial nueva. El firmante debe estar presente. Se revisan propiedad/designación y facultades con tipo y referencia breve; un mismo documento puede acreditar ambas, con dos confirmaciones separadas.</w:t>
             </w:r>
           </w:p>
         </w:tc>
@@ -5092,7 +5271,7 @@
               <w:spacing w:before="40" w:after="40" w:line="240" w:lineRule="auto"/>
             </w:pPr>
             <w:r>
-              <w:t xml:space="preserve">Como asesor de ventas, quiero registrar el monto y plazo de un cliente elegible, para formalizar su préstamo sin superar el capital permitido.</w:t>
+              <w:t>Como asesor de ventas, quiero registrar el monto y plazo de un cliente elegible, para formalizar su préstamo sin superar el capital permitido.</w:t>
             </w:r>
           </w:p>
         </w:tc>
@@ -5113,171 +5292,200 @@
             <w:pPr>
               <w:spacing w:before="60" w:after="80" w:line="240" w:lineRule="auto"/>
               <w:ind w:left="216" w:hanging="216"/>
+              <w:keepNext w:val="0"/>
               <w:keepLines/>
             </w:pPr>
             <w:r>
               <w:rPr>
                 <w:b/>
               </w:rPr>
-              <w:t>• CA01. Cliente previo:</w:t>
+              <w:t xml:space="preserve">• CA01. Cliente previo: </w:t>
             </w:r>
             <w:r>
               <w:rPr>
                 <w:b w:val="0"/>
               </w:rPr>
-              <w:t xml:space="preserve"> Se reutiliza el cliente de HU-03 o de su ficha. No se vuelven a escribir DNI y nombre ni se abre un buscador general dentro del formulario del préstamo.</w:t>
+              <w:t>Se reutiliza el cliente de HU-03 o de su ficha. No se vuelven a escribir DNI y nombre ni se abre un buscador general dentro del formulario del préstamo.</w:t>
             </w:r>
           </w:p>
           <w:p>
             <w:pPr>
               <w:spacing w:before="60" w:after="80" w:line="240" w:lineRule="auto"/>
               <w:ind w:left="216" w:hanging="216"/>
+              <w:keepNext w:val="0"/>
               <w:keepLines/>
             </w:pPr>
             <w:r>
               <w:rPr>
                 <w:b/>
               </w:rPr>
-              <w:t>• CA02. Elegibilidad automática:</w:t>
+              <w:t xml:space="preserve">• CA02. Elegibilidad automática: </w:t>
             </w:r>
             <w:r>
               <w:rPr>
                 <w:b w:val="0"/>
               </w:rPr>
-              <w:t xml:space="preserve"> Al iniciar y al confirmar se exige verificación Aprobada, DNI vigente, sin fallecimiento acreditado, sin mora ni estado extrajudicial y con historial conciliado. El asesor no puede anular estos bloqueos manualmente.</w:t>
+              <w:t>Al iniciar y confirmar se exige identidad aprobada y vigente, ausencia de mora, historial conciliado y capital disponible. El antecedente extrajudicial requiere autorización registrada. La modalidad DNI no exige ACTIVO/HABIDO de un RUC 10 asociado; solicitar por RUC sí exige consulta válida ACTIVO/HABIDO y, en empresa, identidad y facultades del propietario y firmante.</w:t>
             </w:r>
           </w:p>
           <w:p>
             <w:pPr>
               <w:spacing w:before="60" w:after="80" w:line="240" w:lineRule="auto"/>
               <w:ind w:left="216" w:hanging="216"/>
+              <w:keepNext w:val="0"/>
               <w:keepLines/>
             </w:pPr>
             <w:r>
               <w:rPr>
                 <w:b/>
               </w:rPr>
-              <w:t>• CA03. Datos de sesión:</w:t>
+              <w:t xml:space="preserve">• CA03. Datos de sesión: </w:t>
             </w:r>
             <w:r>
               <w:rPr>
                 <w:b w:val="0"/>
               </w:rPr>
-              <w:t xml:space="preserve"> La fecha es la del día de operación en Perú. Agencia de origen y asesor se obtienen de la sesión y no son editables.</w:t>
+              <w:t>La fecha es la del día de operación en Perú. Agencia de origen y asesor se obtienen de la sesión y no son editables.</w:t>
             </w:r>
           </w:p>
           <w:p>
             <w:pPr>
               <w:spacing w:before="60" w:after="80" w:line="240" w:lineRule="auto"/>
               <w:ind w:left="216" w:hanging="216"/>
+              <w:keepNext w:val="0"/>
               <w:keepLines/>
             </w:pPr>
             <w:r>
               <w:rPr>
                 <w:b/>
               </w:rPr>
-              <w:t>• CA04. Monto:</w:t>
+              <w:t xml:space="preserve">• CA04. Monto: </w:t>
             </w:r>
             <w:r>
               <w:rPr>
                 <w:b w:val="0"/>
               </w:rPr>
-              <w:t xml:space="preserve"> Valor numérico positivo, con hasta dos decimales. Se admite menos de S/ 1 000 para pruebas; no se permite cero ni un monto negativo.</w:t>
+              <w:t>Campo inicial 0.00 con soles y centavos separados por un punto fijo. Solo admite dígitos; mínimo S/ 0.01 y máximo el capital disponible del propietario, hasta S/ 10 000. No acepta signos, letras ni más de dos cifras de centavos; cero impide continuar. El servidor repite la validación.</w:t>
             </w:r>
           </w:p>
           <w:p>
             <w:pPr>
               <w:spacing w:before="60" w:after="80" w:line="240" w:lineRule="auto"/>
               <w:ind w:left="216" w:hanging="216"/>
+              <w:keepNext w:val="0"/>
               <w:keepLines/>
             </w:pPr>
             <w:r>
               <w:rPr>
                 <w:b/>
               </w:rPr>
-              <w:t>• CA05. Capital global:</w:t>
+              <w:t xml:space="preserve">• CA05. Capital global: </w:t>
             </w:r>
             <w:r>
               <w:rPr>
                 <w:b w:val="0"/>
               </w:rPr>
-              <w:t xml:space="preserve"> El capital pendiente de todos los préstamos del cliente en las cinco agencias más el monto solicitado no supera S/ 10 000. Se descuenta solo la amortización de capital efectivamente pagada; no todo el importe cobrado. No se suman los montos originales como si nunca se amortizaran.</w:t>
+              <w:t>El capital pendiente del propietario y todas sus empresas vinculadas entre agencias más la nueva solicitud no supera S/ 10 000. Solo la amortización efectivamente pagada libera cupo; los intereses no lo liberan. Un representante sin vínculo de propiedad no aporta su límite al grupo.</w:t>
             </w:r>
           </w:p>
           <w:p>
             <w:pPr>
               <w:spacing w:before="60" w:after="80" w:line="240" w:lineRule="auto"/>
               <w:ind w:left="216" w:hanging="216"/>
+              <w:keepNext w:val="0"/>
               <w:keepLines/>
             </w:pPr>
             <w:r>
               <w:rPr>
                 <w:b/>
               </w:rPr>
-              <w:t>• CA06. Concurrencia:</w:t>
+              <w:t xml:space="preserve">• CA06. Concurrencia: </w:t>
             </w:r>
             <w:r>
               <w:rPr>
                 <w:b w:val="0"/>
               </w:rPr>
-              <w:t xml:space="preserve"> La validación de elegibilidad y capital se repite al confirmar mediante una operación indivisible que evita exceder el límite con solicitudes simultáneas.</w:t>
+              <w:t>La validación de elegibilidad y capital se repite al confirmar mediante una operación indivisible que evita exceder el límite con solicitudes simultáneas.</w:t>
             </w:r>
           </w:p>
           <w:p>
             <w:pPr>
               <w:spacing w:before="60" w:after="80" w:line="240" w:lineRule="auto"/>
               <w:ind w:left="216" w:hanging="216"/>
+              <w:keepNext w:val="0"/>
               <w:keepLines/>
             </w:pPr>
             <w:r>
               <w:rPr>
                 <w:b/>
               </w:rPr>
-              <w:t>• CA07. Plazo y tasa:</w:t>
+              <w:t xml:space="preserve">• CA07. Plazo y tasa: </w:t>
             </w:r>
             <w:r>
               <w:rPr>
                 <w:b w:val="0"/>
               </w:rPr>
-              <w:t xml:space="preserve"> Plazo entero de 1 a 60 meses y TEA fija del 30 % visible. No se acepta un plazo decimal ni se agrega 30 % fijo a cualquier duración.</w:t>
+              <w:t>Campo inicial 0 y entrada solo de dígitos enteros hasta 60. Para continuar se exige de 1 a 60 meses; no se admiten signos ni decimales. La TEA fija del 30 % es visible y no se suma como un porcentaje plano a cualquier duración.</w:t>
             </w:r>
           </w:p>
           <w:p>
             <w:pPr>
               <w:spacing w:before="60" w:after="80" w:line="240" w:lineRule="auto"/>
               <w:ind w:left="216" w:hanging="216"/>
+              <w:keepNext w:val="0"/>
               <w:keepLines/>
             </w:pPr>
             <w:r>
               <w:rPr>
                 <w:b/>
               </w:rPr>
-              <w:t>• CA08. Confirmación conjunta:</w:t>
+              <w:t xml:space="preserve">• CA08. Confirmación conjunta: </w:t>
             </w:r>
             <w:r>
               <w:rPr>
                 <w:b w:val="0"/>
               </w:rPr>
-              <w:t xml:space="preserve"> Revisar el paso 3 no guarda datos. Al confirmar se guardan cliente nuevo, verificación, préstamo y cuotas en una sola transacción; cualquier fallo revierte todo. En el existente se conserva su ficha y la revalidación ya guardada. La clave de operación evita duplicados por doble clic o reintentos. Si la consulta firmada del nuevo supera 30 minutos, se exige volver al paso 1.</w:t>
+              <w:t>Revisar el paso 3 no guarda datos. Al confirmar se guardan cliente nuevo, verificación, préstamo y cuotas en una sola transacción; cualquier fallo revierte todo. En el existente se conserva su ficha y la revalidación ya guardada. La clave de operación evita duplicados por doble clic o reintentos. Si la consulta firmada del nuevo supera 30 minutos, se exige volver al paso 1.</w:t>
             </w:r>
           </w:p>
           <w:p>
             <w:pPr>
               <w:spacing w:before="60" w:after="80" w:line="240" w:lineRule="auto"/>
               <w:ind w:left="216" w:hanging="216"/>
+              <w:keepNext w:val="0"/>
               <w:keepLines/>
             </w:pPr>
             <w:r>
               <w:rPr>
                 <w:b/>
               </w:rPr>
-              <w:t>• CA09. Resultado protegido:</w:t>
+              <w:t xml:space="preserve">• CA09. Resultado protegido: </w:t>
             </w:r>
             <w:r>
               <w:rPr>
                 <w:b w:val="0"/>
               </w:rPr>
-              <w:t xml:space="preserve"> El préstamo confirmado pertenece a la agencia de la sesión y solo se consulta por acceso ordinario desde ella. El cliente aparece también en su listado de Clientes, sin duplicar la ficha ni trasladar préstamos anteriores. No se editan o anulan condiciones en este sprint; los pagos se registran por HU-07.</w:t>
+              <w:t>El préstamo confirmado pertenece a la agencia de la sesión y solo se consulta por acceso ordinario desde ella. El cliente aparece también en su listado de Clientes, sin duplicar la ficha ni trasladar préstamos anteriores. No se editan o anulan condiciones en este sprint; los pagos se registran por HU-07.</w:t>
+            </w:r>
+          </w:p>
+          <w:p>
+            <w:pPr>
+              <w:spacing w:before="60" w:after="80" w:line="240" w:lineRule="auto"/>
+              <w:ind w:left="216" w:hanging="216"/>
+              <w:keepNext w:val="0"/>
+              <w:keepLines/>
+            </w:pPr>
+            <w:r>
+              <w:rPr>
+                <w:b/>
+              </w:rPr>
+              <w:t xml:space="preserve">• CA10. Pasos y regreso: </w:t>
+            </w:r>
+            <w:r>
+              <w:rPr>
+                <w:b w:val="0"/>
+              </w:rPr>
+              <w:t>El tipo de cliente se elige solo en el paso 1, que no muestra Volver. En los pasos 2 y 3 queda fijo. Volver del cronograma conserva condiciones; volver desde condiciones a identificación requiere confirmar el descarte cuando corresponde. Hay una sola acción Continuar a condiciones y no se añade Consultar clientes dentro del flujo.</w:t>
             </w:r>
           </w:p>
         </w:tc>
@@ -5380,7 +5588,7 @@
               <w:spacing w:before="40" w:after="40" w:line="240" w:lineRule="auto"/>
             </w:pPr>
             <w:r>
-              <w:t xml:space="preserve">Como asesor de ventas, quiero generar y entregar el cronograma, para que el cliente conozca sus cuotas mensuales, intereses y vencimientos.</w:t>
+              <w:t>Como asesor de ventas, quiero generar y entregar el cronograma, para que el cliente conozca sus cuotas mensuales, intereses y vencimientos.</w:t>
             </w:r>
           </w:p>
         </w:tc>
@@ -5401,171 +5609,180 @@
             <w:pPr>
               <w:spacing w:before="60" w:after="80" w:line="240" w:lineRule="auto"/>
               <w:ind w:left="216" w:hanging="216"/>
+              <w:keepNext w:val="0"/>
               <w:keepLines/>
             </w:pPr>
             <w:r>
               <w:rPr>
                 <w:b/>
               </w:rPr>
-              <w:t>• CA01. Entradas:</w:t>
+              <w:t xml:space="preserve">• CA01. Entradas: </w:t>
             </w:r>
             <w:r>
               <w:rPr>
                 <w:b w:val="0"/>
               </w:rPr>
-              <w:t xml:space="preserve"> Se utilizan monto, fecha, plazo y TEA de HU-04. Se genera una cuota por mes del plazo.</w:t>
+              <w:t>Se utilizan monto, fecha, plazo y TEA de HU-04. Se genera una cuota por mes del plazo.</w:t>
             </w:r>
           </w:p>
           <w:p>
             <w:pPr>
               <w:spacing w:before="60" w:after="80" w:line="240" w:lineRule="auto"/>
               <w:ind w:left="216" w:hanging="216"/>
+              <w:keepNext w:val="0"/>
               <w:keepLines/>
             </w:pPr>
             <w:r>
               <w:rPr>
                 <w:b/>
               </w:rPr>
-              <w:t>• CA02. Cálculo:</w:t>
+              <w:t xml:space="preserve">• CA02. Cálculo: </w:t>
             </w:r>
             <w:r>
               <w:rPr>
                 <w:b w:val="0"/>
               </w:rPr>
-              <w:t xml:space="preserve"> TEM = (1 + 0,30)^(1/12) − 1, aproximadamente 2,210445 %. Se aplica amortización francesa: interés sobre capital pendiente y amortización como diferencia entre cuota e interés. La base convencional de 360 días no convierte las fechas en intervalos fijos de 30 días.</w:t>
+              <w:t>TEM = (1 + 0,30)^(1/12) − 1, aproximadamente 2,210445 %. Se aplica amortización francesa: interés sobre capital pendiente y amortización como diferencia entre cuota e interés. La base convencional de 360 días no convierte las fechas en intervalos fijos de 30 días.</w:t>
             </w:r>
           </w:p>
           <w:p>
             <w:pPr>
               <w:spacing w:before="60" w:after="80" w:line="240" w:lineRule="auto"/>
               <w:ind w:left="216" w:hanging="216"/>
+              <w:keepNext w:val="0"/>
               <w:keepLines/>
             </w:pPr>
             <w:r>
               <w:rPr>
                 <w:b/>
               </w:rPr>
-              <w:t>• CA03. Fechas mensuales:</w:t>
+              <w:t xml:space="preserve">• CA03. Fechas mensuales: </w:t>
             </w:r>
             <w:r>
               <w:rPr>
                 <w:b w:val="0"/>
               </w:rPr>
-              <w:t xml:space="preserve"> Cada fecha se obtiene sumando meses a la fecha original del préstamo. Se conserva el día original; si falta, se toma el último día del mes. Se consideran bisiestos y no se desplaza por fines de semana.</w:t>
+              <w:t>Cada fecha se obtiene sumando meses a la fecha original del préstamo. Se conserva el día original; si falta, se toma el último día del mes. Se consideran bisiestos y no se desplaza por fines de semana.</w:t>
             </w:r>
           </w:p>
           <w:p>
             <w:pPr>
               <w:spacing w:before="60" w:after="80" w:line="240" w:lineRule="auto"/>
               <w:ind w:left="216" w:hanging="216"/>
+              <w:keepNext w:val="0"/>
               <w:keepLines/>
             </w:pPr>
             <w:r>
               <w:rPr>
                 <w:b/>
               </w:rPr>
-              <w:t>• CA04. Detalle:</w:t>
+              <w:t xml:space="preserve">• CA04. Detalle: </w:t>
             </w:r>
             <w:r>
               <w:rPr>
                 <w:b w:val="0"/>
               </w:rPr>
-              <w:t xml:space="preserve"> Número, vencimiento, cuota, interés, amortización y saldo de capital programado. Se identifican cliente, código, agencia de origen, monto, plazo, TEA, TEM, total de intereses y total de cuotas.</w:t>
+              <w:t>Número, vencimiento, cuota, interés, amortización y saldo de capital programado. Se identifican cliente, código, agencia de origen, monto, plazo, TEA, TEM, total de intereses y total de cuotas.</w:t>
             </w:r>
           </w:p>
           <w:p>
             <w:pPr>
               <w:spacing w:before="60" w:after="80" w:line="240" w:lineRule="auto"/>
               <w:ind w:left="216" w:hanging="216"/>
+              <w:keepNext w:val="0"/>
               <w:keepLines/>
             </w:pPr>
             <w:r>
               <w:rPr>
                 <w:b/>
               </w:rPr>
-              <w:t>• CA05. Redondeo y cargos:</w:t>
+              <w:t xml:space="preserve">• CA05. Redondeo y cargos: </w:t>
             </w:r>
             <w:r>
               <w:rPr>
                 <w:b w:val="0"/>
               </w:rPr>
-              <w:t xml:space="preserve"> Dos decimales; última cuota ajustada para saldo final S/ 0,00. Sin comisiones, seguros ni penalidades. La mora pactada se calcula por separado del cronograma.</w:t>
+              <w:t>Dos decimales; última cuota ajustada para saldo final S/ 0,00. Sin comisiones, seguros ni penalidades. La mora pactada se calcula por separado del cronograma.</w:t>
             </w:r>
           </w:p>
           <w:p>
             <w:pPr>
               <w:spacing w:before="60" w:after="80" w:line="240" w:lineRule="auto"/>
               <w:ind w:left="216" w:hanging="216"/>
+              <w:keepNext w:val="0"/>
               <w:keepLines/>
             </w:pPr>
             <w:r>
               <w:rPr>
                 <w:b/>
               </w:rPr>
-              <w:t>• CA06. Consistencia:</w:t>
+              <w:t xml:space="preserve">• CA06. Consistencia: </w:t>
             </w:r>
             <w:r>
               <w:rPr>
                 <w:b w:val="0"/>
               </w:rPr>
-              <w:t xml:space="preserve"> Se guarda el cronograma mostrado junto con el préstamo. Consultarlo o registrar pagos no lo recalcula con otra tasa o fecha; el estado de cobro se muestra por separado.</w:t>
+              <w:t>Se guarda el cronograma mostrado junto con el préstamo. Consultarlo o registrar pagos no lo recalcula con otra tasa o fecha; el estado de cobro se muestra por separado.</w:t>
             </w:r>
           </w:p>
           <w:p>
             <w:pPr>
               <w:spacing w:before="60" w:after="80" w:line="240" w:lineRule="auto"/>
               <w:ind w:left="216" w:hanging="216"/>
+              <w:keepNext w:val="0"/>
               <w:keepLines/>
             </w:pPr>
             <w:r>
               <w:rPr>
                 <w:b/>
               </w:rPr>
-              <w:t>• CA07. PDF:</w:t>
+              <w:t xml:space="preserve">• CA07. Descarga e impresión: </w:t>
             </w:r>
             <w:r>
               <w:rPr>
                 <w:b w:val="0"/>
               </w:rPr>
-              <w:t xml:space="preserve"> Después de confirmar se descarga un PDF legible con identificación, parámetros y todas las cuotas. Reintentar una descarga fallida no genera otro préstamo.</w:t>
+              <w:t>Después de confirmar, Cronograma ofrece descargar PDF o imprimir desde una vista protegida. Contrato ofrece Word o impresión y guardado como PDF desde el navegador. Reintentar una descarga no crea otro préstamo.</w:t>
             </w:r>
           </w:p>
           <w:p>
             <w:pPr>
               <w:spacing w:before="60" w:after="80" w:line="240" w:lineRule="auto"/>
               <w:ind w:left="216" w:hanging="216"/>
+              <w:keepNext w:val="0"/>
               <w:keepLines/>
             </w:pPr>
             <w:r>
               <w:rPr>
                 <w:b/>
               </w:rPr>
-              <w:t>• CA08. Caso financiero:</w:t>
+              <w:t xml:space="preserve">• CA08. Caso financiero: </w:t>
             </w:r>
             <w:r>
               <w:rPr>
                 <w:b w:val="0"/>
               </w:rPr>
-              <w:t xml:space="preserve"> Para S/ 1 000 a seis meses con la TEM definida, las primeras cinco cuotas son S/ 179,80 y la última S/ 179,77. Capital amortizado S/ 1 000, interés total S/ 78,77 y total programado S/ 1 078,77.</w:t>
+              <w:t>Para S/ 1 000 a seis meses con la TEM definida, las primeras cinco cuotas son S/ 179,80 y la última S/ 179,77. Capital amortizado S/ 1 000, interés total S/ 78,77 y total programado S/ 1 078,77.</w:t>
             </w:r>
           </w:p>
           <w:p>
             <w:pPr>
               <w:spacing w:before="60" w:after="80" w:line="240" w:lineRule="auto"/>
               <w:ind w:left="216" w:hanging="216"/>
+              <w:keepNext w:val="0"/>
               <w:keepLines/>
             </w:pPr>
             <w:r>
               <w:rPr>
                 <w:b/>
               </w:rPr>
-              <w:t>• CA09. Caso de calendario:</w:t>
+              <w:t xml:space="preserve">• CA09. Caso de calendario: </w:t>
             </w:r>
             <w:r>
               <w:rPr>
                 <w:b w:val="0"/>
               </w:rPr>
-              <w:t xml:space="preserve"> 12/05/2026 → 12/06/2026. Para 31/01/2028, los siguientes vencimientos son 29/02/2028 y 31/03/2028. Estos ajustes no cambian la TEM mensual adoptada.</w:t>
+              <w:t>12/05/2026 → 12/06/2026. Para 31/01/2028, los siguientes vencimientos son 29/02/2028 y 31/03/2028. Estos ajustes no cambian la TEM mensual adoptada.</w:t>
             </w:r>
           </w:p>
         </w:tc>
@@ -5668,7 +5885,7 @@
               <w:spacing w:before="40" w:after="40" w:line="240" w:lineRule="auto"/>
             </w:pPr>
             <w:r>
-              <w:t xml:space="preserve">Como asesor de ventas, quiero consultar clientes y la cartera de mi agencia, para conocer su situación y recuperar los cronogramas autorizados.</w:t>
+              <w:t>Como asesor de ventas, quiero consultar clientes y la cartera de mi agencia, para conocer su situación y recuperar los cronogramas autorizados.</w:t>
             </w:r>
           </w:p>
         </w:tc>
@@ -5689,6 +5906,7 @@
             <w:pPr>
               <w:spacing w:before="0" w:after="40" w:line="240" w:lineRule="auto"/>
               <w:ind w:left="216" w:hanging="216"/>
+              <w:keepNext w:val="0"/>
               <w:keepLines/>
             </w:pPr>
             <w:r>
@@ -5696,20 +5914,21 @@
                 <w:b/>
                 <w:sz w:val="20"/>
               </w:rPr>
-              <w:t>• CA01. Cartera propia:</w:t>
+              <w:t xml:space="preserve">• CA01. Cartera propia: </w:t>
             </w:r>
             <w:r>
               <w:rPr>
                 <w:b w:val="0"/>
                 <w:sz w:val="20"/>
               </w:rPr>
-              <w:t xml:space="preserve"> Préstamos muestra exclusivamente operaciones originadas en la agencia de la sesión, de más recientes a más antiguas. El control también se aplica en el acceso directo al detalle y en las consultas al servidor.</w:t>
+              <w:t>Préstamos muestra exclusivamente operaciones originadas en la agencia de la sesión, de más recientes a más antiguas. El control también se aplica en el acceso directo al detalle y en las consultas al servidor.</w:t>
             </w:r>
           </w:p>
           <w:p>
             <w:pPr>
               <w:spacing w:before="0" w:after="40" w:line="240" w:lineRule="auto"/>
               <w:ind w:left="216" w:hanging="216"/>
+              <w:keepNext w:val="0"/>
               <w:keepLines/>
             </w:pPr>
             <w:r>
@@ -5717,20 +5936,21 @@
                 <w:b/>
                 <w:sz w:val="20"/>
               </w:rPr>
-              <w:t>• CA02. Listado y filtros:</w:t>
+              <w:t xml:space="preserve">• CA02. Listado y filtros: </w:t>
             </w:r>
             <w:r>
               <w:rPr>
                 <w:b w:val="0"/>
                 <w:sz w:val="20"/>
               </w:rPr>
-              <w:t xml:space="preserve"> Activos por defecto; filtros Activos, Cancelados o Todos. Búsqueda por selector DNI exacto, RUC exacto o Código de préstamo, limitada a la cartera propia. Columnas: código, DNI, cliente, fecha, monto original, plazo, estado Activo o Cancelado y Ver detalle. Sin columna Deuda pendiente ni botón Nuevo préstamo.</w:t>
+              <w:t>Activos por defecto; filtros Activos, Cancelados o Todos y tipo Todos, Personas o Empresas. Búsqueda por DNI exacto, RUC exacto o Código de préstamo en la cartera propia. Documento muestra DNI en personas y RUC en empresas; se conservan fecha, monto original, plazo, estado y Ver detalle, sin columna Deuda pendiente.</w:t>
             </w:r>
           </w:p>
           <w:p>
             <w:pPr>
               <w:spacing w:before="0" w:after="40" w:line="240" w:lineRule="auto"/>
               <w:ind w:left="216" w:hanging="216"/>
+              <w:keepNext w:val="0"/>
               <w:keepLines/>
             </w:pPr>
             <w:r>
@@ -5738,20 +5958,21 @@
                 <w:b/>
                 <w:sz w:val="20"/>
               </w:rPr>
-              <w:t>• CA03. Clientes de la agencia:</w:t>
+              <w:t xml:space="preserve">• CA03. Clientes de la agencia: </w:t>
             </w:r>
             <w:r>
               <w:rPr>
                 <w:b w:val="0"/>
                 <w:sz w:val="20"/>
               </w:rPr>
-              <w:t xml:space="preserve"> El listado y su búsqueda muestran solo clientes registrados en la agencia actual o con algún préstamo otorgado allí, conservando el vínculo aunque el préstamo se cancele. Muestra DNI, nombre, verificación y condición de pago, sin Validar cliente ni edición manual. Haber pagado aquí un préstamo ajeno no incorpora al cliente al listado; no hay búsqueda global de clientes en esta pantalla.</w:t>
+              <w:t>Listado y búsqueda muestran solo titulares con algún préstamo confirmado en la agencia, incluidos los ya pagados. Un registro sin préstamo local, una empresa vinculada sin cartera local o un representante sin préstamo propio no se incorporan por ese motivo. Cobrar un préstamo ajeno tampoco incorpora al titular.</w:t>
             </w:r>
           </w:p>
           <w:p>
             <w:pPr>
               <w:spacing w:before="0" w:after="40" w:line="240" w:lineRule="auto"/>
               <w:ind w:left="216" w:hanging="216"/>
+              <w:keepNext w:val="0"/>
               <w:keepLines/>
             </w:pPr>
             <w:r>
@@ -5759,20 +5980,21 @@
                 <w:b/>
                 <w:sz w:val="20"/>
               </w:rPr>
-              <w:t>• CA04. Ficha y privacidad de cartera:</w:t>
+              <w:t xml:space="preserve">• CA04. Ficha y privacidad de cartera: </w:t>
             </w:r>
             <w:r>
               <w:rPr>
                 <w:b w:val="0"/>
                 <w:sz w:val="20"/>
               </w:rPr>
-              <w:t xml:space="preserve"> Solo se abre ordinariamente la ficha de un cliente vinculado a la agencia. La ficha única muestra vigencia del DNI, historial de verificación, condición de pago y capital pendiente y disponible globales. El detalle de préstamos sigue limitado a la agencia propia. Nuevo préstamo recupera por DNI la ficha ajena solo para atender esa solicitud; los saldos globales no permiten explorar carteras ajenas.</w:t>
+              <w:t>DNI y RUC 10 comparten una ficha; cada RUC 20 conserva ficha propia vinculada al propietario. Las agencias con acceso al grupo ven identidad y vínculos compartidos, sin ampliar su cartera de préstamos. La ficha resumida muestra identificación, condición de pago, capital y vínculos; los historiales se abren aparte. No incluye la tabla Préstamos en tu agencia.</w:t>
             </w:r>
           </w:p>
           <w:p>
             <w:pPr>
               <w:spacing w:before="0" w:after="40" w:line="240" w:lineRule="auto"/>
               <w:ind w:left="216" w:hanging="216"/>
+              <w:keepNext w:val="0"/>
               <w:keepLines/>
             </w:pPr>
             <w:r>
@@ -5780,20 +6002,21 @@
                 <w:b/>
                 <w:sz w:val="20"/>
               </w:rPr>
-              <w:t>• CA05. Continuar atención:</w:t>
+              <w:t xml:space="preserve">• CA05. Continuar atención: </w:t>
             </w:r>
             <w:r>
               <w:rPr>
                 <w:b w:val="0"/>
                 <w:sz w:val="20"/>
               </w:rPr>
-              <w:t xml:space="preserve"> Solicitar préstamo lleva a HU-04 con ese cliente. Si corresponde revalidar, se abre HU-03 conservando el contexto. Estas acciones son accesos al flujo de atención, no edición de la ficha desde el listado.</w:t>
+              <w:t>Solicitar préstamo despliega Personal DNI y Negocio RUC 10 cuando existen ambos documentos; con una sola modalidad entra directamente. Sin capital o elegibilidad queda bloqueado. Revalidar datos ofrece DNI o RUC 10 en la ficha; RUC 20 abre SUNAT. Consultar para pagar conserva el titular y Ver historial ofrece DNI/RUC según corresponda.</w:t>
             </w:r>
           </w:p>
           <w:p>
             <w:pPr>
               <w:spacing w:before="0" w:after="40" w:line="240" w:lineRule="auto"/>
               <w:ind w:left="216" w:hanging="216"/>
+              <w:keepNext w:val="0"/>
               <w:keepLines/>
             </w:pPr>
             <w:r>
@@ -5801,20 +6024,21 @@
                 <w:b/>
                 <w:sz w:val="20"/>
               </w:rPr>
-              <w:t>• CA06. Resumen del detalle:</w:t>
+              <w:t xml:space="preserve">• CA06. Resumen del detalle: </w:t>
             </w:r>
             <w:r>
               <w:rPr>
                 <w:b w:val="0"/>
                 <w:sz w:val="20"/>
               </w:rPr>
-              <w:t xml:space="preserve"> Tres cuadros principales: Total a pagar (cuotas originales y mora pactada), Total pagado (cobros confirmados) y Saldo por pagar (diferencia). Se presentan en una fila en escritorio y se adaptan en móvil. El estado va junto al título; TEA, TEM e interés total programado en Datos del préstamo. El capital pendiente se consulta en el resumen del cliente. El interés no se suma otra vez como cargo adicional.</w:t>
+              <w:t>Tres cuadros principales: Total a pagar (cuotas originales y mora pactada), Total pagado (cobros confirmados) y Saldo por pagar (diferencia). Se presentan en una fila en escritorio y se adaptan en móvil. El estado va junto al título; TEA, TEM e interés total programado en Datos del préstamo. El capital pendiente se consulta en el resumen del cliente. El interés no se suma otra vez como cargo adicional.</w:t>
             </w:r>
           </w:p>
           <w:p>
             <w:pPr>
               <w:spacing w:before="0" w:after="40" w:line="240" w:lineRule="auto"/>
               <w:ind w:left="216" w:hanging="216"/>
+              <w:keepNext w:val="0"/>
               <w:keepLines/>
             </w:pPr>
             <w:r>
@@ -5822,20 +6046,21 @@
                 <w:b/>
                 <w:sz w:val="20"/>
               </w:rPr>
-              <w:t>• CA07. Cuotas y acceso al cobro:</w:t>
+              <w:t xml:space="preserve">• CA07. Cuotas y acceso al cobro: </w:t>
             </w:r>
             <w:r>
               <w:rPr>
                 <w:b w:val="0"/>
                 <w:sz w:val="20"/>
               </w:rPr>
-              <w:t xml:space="preserve"> Cada cuota muestra importe, interés, capital, vencimiento y estado. El historial identifica fecha, importe, asesor y agencia de cobro. Registrar pago abre HU-07 con el préstamo y las cuotas cargados automáticamente, sin pulsar Consultar cuotas. La carga no confirma un pago; no se marca Pagada o No pagada sin una operación.</w:t>
+              <w:t>Cada cuota muestra importe, interés, capital, vencimiento y estado. Registrar pago abre Pagos con el préstamo y sus cuotas cargados automáticamente, con código y tipo fijos y regreso al mismo detalle. Se desplaza al titular seleccionado; la carga no confirma el cobro.</w:t>
             </w:r>
           </w:p>
           <w:p>
             <w:pPr>
               <w:spacing w:before="0" w:after="40" w:line="240" w:lineRule="auto"/>
               <w:ind w:left="216" w:hanging="216"/>
+              <w:keepNext w:val="0"/>
               <w:keepLines/>
             </w:pPr>
             <w:r>
@@ -5843,20 +6068,21 @@
                 <w:b/>
                 <w:sz w:val="20"/>
               </w:rPr>
-              <w:t>• CA08. Cobro entre agencias:</w:t>
+              <w:t xml:space="preserve">• CA08. Cobro entre agencias: </w:t>
             </w:r>
             <w:r>
               <w:rPr>
                 <w:b w:val="0"/>
                 <w:sz w:val="20"/>
               </w:rPr>
-              <w:t xml:space="preserve"> Un préstamo ajeno no aparece en la cartera ni se abre por acceso ordinario. Se localiza específicamente en Pagos por DNI o código, con los datos necesarios para cobrar y conservando su agencia de origen.</w:t>
+              <w:t>Un préstamo ajeno no aparece en la cartera local ni se abre por su detalle ordinario. Pagos lo localiza por DNI, RUC o código para cobrar, conserva su agencia de origen y muestra las obligaciones del grupo del propietario cuando se consulta por documento.</w:t>
             </w:r>
           </w:p>
           <w:p>
             <w:pPr>
               <w:spacing w:before="0" w:after="40" w:line="240" w:lineRule="auto"/>
               <w:ind w:left="216" w:hanging="216"/>
+              <w:keepNext w:val="0"/>
               <w:keepLines/>
             </w:pPr>
             <w:r>
@@ -5864,20 +6090,21 @@
                 <w:b/>
                 <w:sz w:val="20"/>
               </w:rPr>
-              <w:t>• CA09. Documento y resultados vacíos:</w:t>
+              <w:t xml:space="preserve">• CA09. Documento y resultados vacíos: </w:t>
             </w:r>
             <w:r>
               <w:rPr>
                 <w:b w:val="0"/>
                 <w:sz w:val="20"/>
               </w:rPr>
-              <w:t xml:space="preserve"> Se recupera el PDF guardado sin alterar el préstamo. Una búsqueda sin coincidencias informa el resultado sin mostrar otros clientes ni registros ajenos a los permisos.</w:t>
+              <w:t>Se recupera el PDF guardado sin alterar el préstamo. Una búsqueda sin coincidencias informa el resultado sin mostrar otros clientes ni registros ajenos a los permisos.</w:t>
             </w:r>
           </w:p>
           <w:p>
             <w:pPr>
               <w:spacing w:before="0" w:after="40" w:line="240" w:lineRule="auto"/>
               <w:ind w:left="216" w:hanging="216"/>
+              <w:keepNext w:val="0"/>
               <w:keepLines/>
             </w:pPr>
             <w:r>
@@ -5885,14 +6112,14 @@
                 <w:b/>
                 <w:sz w:val="20"/>
               </w:rPr>
-              <w:t>• CA10. Formato de búsqueda:</w:t>
+              <w:t xml:space="preserve">• CA10. Formato de búsqueda: </w:t>
             </w:r>
             <w:r>
               <w:rPr>
                 <w:b w:val="0"/>
                 <w:sz w:val="20"/>
               </w:rPr>
-              <w:t xml:space="preserve"> DNI exacto acepta solo ocho dígitos numéricos y conserva ceros iniciales. Código de préstamo muestra PR- fijo y exige ocho caracteres hexadecimales (0 a 9 y A a F), convertidos a mayúsculas. Pegar el código completo no duplica el prefijo. Un valor incompleto o inválido impide consultar y muestra el motivo. Se valida en pantalla y servidor sin ampliar permisos.</w:t>
+              <w:t>DNI exacto acepta solo ocho dígitos numéricos y conserva ceros iniciales. Código de préstamo muestra PR- fijo y exige ocho caracteres hexadecimales (0 a 9 y A a F), convertidos a mayúsculas. Pegar el código completo no duplica el prefijo. Un valor incompleto o inválido impide consultar y muestra el motivo. Se valida en pantalla y servidor sin ampliar permisos.</w:t>
             </w:r>
           </w:p>
         </w:tc>
@@ -6001,7 +6228,7 @@
               <w:spacing w:before="40" w:after="40" w:line="240" w:lineRule="auto"/>
             </w:pPr>
             <w:r>
-              <w:t xml:space="preserve">Como asesor de ventas, quiero registrar el pago de cuotas de un préstamo, incluso de otra agencia, para actualizar la deuda y entregar constancia del cobro.</w:t>
+              <w:t>Como asesor de ventas, quiero registrar el pago de cuotas de un préstamo, incluso de otra agencia, para actualizar la deuda y entregar constancia del cobro.</w:t>
             </w:r>
           </w:p>
         </w:tc>
@@ -6022,190 +6249,264 @@
             <w:pPr>
               <w:spacing w:before="60" w:after="80" w:line="240" w:lineRule="auto"/>
               <w:ind w:left="216" w:hanging="216"/>
+              <w:keepNext w:val="0"/>
               <w:keepLines/>
             </w:pPr>
             <w:r>
               <w:rPr>
                 <w:b/>
-              </w:rPr>
-              <w:t>• CA01. Localización:</w:t>
+                <w:sz w:val="22"/>
+              </w:rPr>
+              <w:t xml:space="preserve">• CA01. Localización: </w:t>
             </w:r>
             <w:r>
               <w:rPr>
                 <w:b w:val="0"/>
-              </w:rPr>
-              <w:t xml:space="preserve"> Pagos ofrece el selector DNI exacto, RUC exacto o Código de préstamo y el botón Consultar cuotas. Consulta obligaciones de cualquiera de las cinco agencias: por DNI muestra préstamos con saldo de ese cliente para elegir uno; por código carga el préstamo específico, identificando su agencia de origen. No ofrece cartera global para explorar. Desde Registrar pago en el detalle ejecuta la consulta automáticamente y conserva el buscador disponible.</w:t>
+                <w:sz w:val="22"/>
+              </w:rPr>
+              <w:t>Pagos general permite DNI, RUC o código. DNI, RUC 10 o RUC 20 consultan las obligaciones del mismo propietario y sus empresas entre agencias; el representante por sí solo no une grupos. Desde ficha el documento queda fijo y desde detalle el préstamo queda fijo por su UUID autorizado. Ambos consultan automáticamente y ofrecen regreso al origen, sin Cambiar cliente.</w:t>
             </w:r>
           </w:p>
           <w:p>
             <w:pPr>
               <w:spacing w:before="60" w:after="80" w:line="240" w:lineRule="auto"/>
               <w:ind w:left="216" w:hanging="216"/>
+              <w:keepNext w:val="0"/>
               <w:keepLines/>
             </w:pPr>
             <w:r>
               <w:rPr>
                 <w:b/>
-              </w:rPr>
-              <w:t>• CA02. Datos de revisión:</w:t>
+                <w:sz w:val="22"/>
+              </w:rPr>
+              <w:t xml:space="preserve">• CA02. Datos de revisión: </w:t>
             </w:r>
             <w:r>
               <w:rPr>
                 <w:b w:val="0"/>
-              </w:rPr>
-              <w:t xml:space="preserve"> Se muestran titular, código, agencia de origen, deuda y cuotas pendientes del préstamo. No se exige DNI vigente ni ausencia de mora para aceptar el pago de una obligación existente.</w:t>
+                <w:sz w:val="22"/>
+              </w:rPr>
+              <w:t>Se muestran titular, código, agencia de origen, deuda y cuotas pendientes del préstamo. No se exige DNI vigente ni ausencia de mora para aceptar el pago de una obligación existente.</w:t>
             </w:r>
           </w:p>
           <w:p>
             <w:pPr>
               <w:spacing w:before="60" w:after="80" w:line="240" w:lineRule="auto"/>
               <w:ind w:left="216" w:hanging="216"/>
+              <w:keepNext w:val="0"/>
               <w:keepLines/>
             </w:pPr>
             <w:r>
               <w:rPr>
                 <w:b/>
-              </w:rPr>
-              <w:t>• CA03. Selección:</w:t>
+                <w:sz w:val="22"/>
+              </w:rPr>
+              <w:t xml:space="preserve">• CA03. Selección: </w:t>
             </w:r>
             <w:r>
               <w:rPr>
                 <w:b w:val="0"/>
-              </w:rPr>
-              <w:t xml:space="preserve"> Se selecciona una o varias cuotas completas consecutivas, comenzando por la pendiente más antigua del préstamo. Se admite cubrir la próxima cuota programada sin recalcularla; no se omiten cuotas anteriores. No se incluyen abonos parciales ni pagos extraordinarios a capital.</w:t>
+                <w:sz w:val="22"/>
+              </w:rPr>
+              <w:t>Se selecciona una o varias cuotas completas consecutivas, comenzando por la pendiente más antigua del préstamo. Se admite cubrir la próxima cuota programada sin recalcularla; no se omiten cuotas anteriores. No se incluyen abonos parciales ni pagos extraordinarios a capital.</w:t>
             </w:r>
           </w:p>
           <w:p>
             <w:pPr>
               <w:spacing w:before="60" w:after="80" w:line="240" w:lineRule="auto"/>
               <w:ind w:left="216" w:hanging="216"/>
+              <w:keepNext w:val="0"/>
               <w:keepLines/>
             </w:pPr>
             <w:r>
               <w:rPr>
                 <w:b/>
-              </w:rPr>
-              <w:t>• CA04. Importe y confirmación:</w:t>
+                <w:sz w:val="22"/>
+              </w:rPr>
+              <w:t xml:space="preserve">• CA04. Importe y confirmación: </w:t>
             </w:r>
             <w:r>
               <w:rPr>
                 <w:b w:val="0"/>
-              </w:rPr>
-              <w:t xml:space="preserve"> El importe se obtiene sumando las cuotas seleccionadas y su mora pactada calculada a la fecha de Perú y no se escribe libremente. Se revisa el resumen y se confirma solo cuando el asesor ha recibido el dinero. No es una integración bancaria ni una casilla reversible.</w:t>
+                <w:sz w:val="22"/>
+              </w:rPr>
+              <w:t>El importe se obtiene sumando las cuotas seleccionadas y su mora pactada calculada a la fecha de Perú y no se escribe libremente. Se revisa el resumen y se confirma solo cuando el asesor ha recibido el dinero. No es una integración bancaria ni una casilla reversible.</w:t>
             </w:r>
           </w:p>
           <w:p>
             <w:pPr>
               <w:spacing w:before="60" w:after="80" w:line="240" w:lineRule="auto"/>
               <w:ind w:left="216" w:hanging="216"/>
+              <w:keepNext w:val="0"/>
               <w:keepLines/>
             </w:pPr>
             <w:r>
               <w:rPr>
                 <w:b/>
-              </w:rPr>
-              <w:t>• CA05. Trazabilidad:</w:t>
+                <w:sz w:val="22"/>
+              </w:rPr>
+              <w:t xml:space="preserve">• CA05. Trazabilidad: </w:t>
             </w:r>
             <w:r>
               <w:rPr>
                 <w:b w:val="0"/>
-              </w:rPr>
-              <w:t xml:space="preserve"> Se genera identificador de pago y se guardan importe, fecha y hora, asesor, agencia de cobro, préstamo y aplicación por cuota. La agencia de origen permanece inalterada. Se emite una constancia recuperable del pago registrado.</w:t>
+                <w:sz w:val="22"/>
+              </w:rPr>
+              <w:t>Se genera identificador de pago y se guardan importe, fecha y hora, asesor, agencia de cobro, préstamo y aplicación por cuota. La agencia de origen permanece inalterada. Se emite una constancia recuperable del pago registrado.</w:t>
             </w:r>
           </w:p>
           <w:p>
             <w:pPr>
               <w:spacing w:before="60" w:after="80" w:line="240" w:lineRule="auto"/>
               <w:ind w:left="216" w:hanging="216"/>
+              <w:keepNext w:val="0"/>
               <w:keepLines/>
             </w:pPr>
             <w:r>
               <w:rPr>
                 <w:b/>
-              </w:rPr>
-              <w:t>• CA06. Registro consistente:</w:t>
+                <w:sz w:val="22"/>
+              </w:rPr>
+              <w:t xml:space="preserve">• CA06. Registro consistente: </w:t>
             </w:r>
             <w:r>
               <w:rPr>
                 <w:b w:val="0"/>
-              </w:rPr>
-              <w:t xml:space="preserve"> Pago, aplicación y saldos se actualizan conjuntamente. El doble clic, el reintento o dos agencias cobrando la misma cuota no duplican el cobro; si falla la operación no queda un pago parcialmente aplicado.</w:t>
+                <w:sz w:val="22"/>
+              </w:rPr>
+              <w:t>Pago, aplicación y saldos se actualizan conjuntamente. El doble clic, el reintento o dos agencias cobrando la misma cuota no duplican el cobro; si falla la operación no queda un pago parcialmente aplicado.</w:t>
             </w:r>
           </w:p>
           <w:p>
             <w:pPr>
               <w:spacing w:before="60" w:after="80" w:line="240" w:lineRule="auto"/>
               <w:ind w:left="216" w:hanging="216"/>
+              <w:keepNext w:val="0"/>
               <w:keepLines/>
             </w:pPr>
             <w:r>
               <w:rPr>
                 <w:b/>
-              </w:rPr>
-              <w:t>• CA07. Efectos:</w:t>
+                <w:sz w:val="22"/>
+              </w:rPr>
+              <w:t xml:space="preserve">• CA07. Efectos: </w:t>
             </w:r>
             <w:r>
               <w:rPr>
                 <w:b w:val="0"/>
-              </w:rPr>
-              <w:t xml:space="preserve"> Las cuotas cubiertas pasan a Pagada, disminuyen deuda y capital pendiente según su amortización y se recalcula la condición del cliente. Si todas las cuotas están pagadas, el préstamo pasa a Cancelado por pago total.</w:t>
+                <w:sz w:val="22"/>
+              </w:rPr>
+              <w:t>Las cuotas cubiertas pasan a Pagada, disminuyen deuda y capital pendiente según su amortización y se recalcula la condición del cliente. Si todas las cuotas están pagadas, el préstamo pasa a Cancelado por pago total.</w:t>
             </w:r>
           </w:p>
           <w:p>
             <w:pPr>
               <w:spacing w:before="60" w:after="80" w:line="240" w:lineRule="auto"/>
               <w:ind w:left="216" w:hanging="216"/>
+              <w:keepNext w:val="0"/>
               <w:keepLines/>
             </w:pPr>
             <w:r>
               <w:rPr>
                 <w:b/>
-              </w:rPr>
-              <w:t>• CA08. Conservación:</w:t>
+                <w:sz w:val="22"/>
+              </w:rPr>
+              <w:t xml:space="preserve">• CA08. Conservación: </w:t>
             </w:r>
             <w:r>
               <w:rPr>
                 <w:b w:val="0"/>
-              </w:rPr>
-              <w:t xml:space="preserve"> No se sobrescribe el cronograma original ni se desmarca un pago confirmado. Reversos, devoluciones o correcciones de cobros quedan fuera de este sprint; la constancia no se presenta como comprobante tributario.</w:t>
+                <w:sz w:val="22"/>
+              </w:rPr>
+              <w:t>No se sobrescribe el cronograma original ni se desmarca un pago confirmado. Reversos, devoluciones o correcciones de cobros quedan fuera de este sprint; la constancia no se presenta como comprobante tributario.</w:t>
             </w:r>
           </w:p>
           <w:p>
             <w:pPr>
               <w:spacing w:before="60" w:after="80" w:line="240" w:lineRule="auto"/>
               <w:ind w:left="216" w:hanging="216"/>
+              <w:keepNext w:val="0"/>
               <w:keepLines/>
             </w:pPr>
             <w:r>
               <w:rPr>
                 <w:b/>
-              </w:rPr>
-              <w:t>• CA09. Validación de búsqueda:</w:t>
+                <w:sz w:val="22"/>
+              </w:rPr>
+              <w:t xml:space="preserve">• CA09. Validación de búsqueda: </w:t>
             </w:r>
             <w:r>
               <w:rPr>
                 <w:b w:val="0"/>
-              </w:rPr>
-              <w:t xml:space="preserve"> Se aplican las mismas reglas que en HU-06 CA10: DNI de ocho dígitos, RUC válido de once dígitos o PR- fijo más ocho caracteres hexadecimales. Se admite pegar el código completo sin duplicar el prefijo. Se valida en pantalla y servidor antes de consultar; un error no muestra otros registros.</w:t>
+                <w:sz w:val="22"/>
+              </w:rPr>
+              <w:t>Se aplican las mismas reglas que en HU-06 CA10: DNI de ocho dígitos, RUC válido de once dígitos o PR- fijo más ocho caracteres hexadecimales. Se admite pegar el código completo sin duplicar el prefijo. Se valida en pantalla y servidor antes de consultar; un error no muestra otros registros.</w:t>
             </w:r>
           </w:p>
           <w:p>
             <w:pPr>
               <w:spacing w:before="60" w:after="80" w:line="240" w:lineRule="auto"/>
               <w:ind w:left="216" w:hanging="216"/>
+              <w:keepNext w:val="0"/>
               <w:keepLines/>
             </w:pPr>
             <w:r>
               <w:rPr>
                 <w:b/>
-              </w:rPr>
-              <w:t>• CA10. Relación con la agencia:</w:t>
+                <w:sz w:val="22"/>
+              </w:rPr>
+              <w:t xml:space="preserve">• CA10. Relación con la agencia: </w:t>
             </w:r>
             <w:r>
               <w:rPr>
                 <w:b w:val="0"/>
-              </w:rPr>
-              <w:t xml:space="preserve"> Cobrar un préstamo de otra agencia registra la agencia que recibió el dinero, pero no cambia la agencia de origen ni incorpora por sí solo al cliente al listado de Clientes de la agencia de cobro.</w:t>
+                <w:sz w:val="22"/>
+              </w:rPr>
+              <w:t>Cobrar un préstamo de otra agencia registra la agencia que recibió el dinero, pero no cambia la agencia de origen ni incorpora por sí solo al cliente al listado de Clientes de la agencia de cobro.</w:t>
+            </w:r>
+          </w:p>
+          <w:p>
+            <w:pPr>
+              <w:spacing w:before="60" w:after="80" w:line="240" w:lineRule="auto"/>
+              <w:ind w:left="216" w:hanging="216"/>
+              <w:keepNext w:val="0"/>
+              <w:keepLines/>
+            </w:pPr>
+            <w:r>
+              <w:rPr>
+                <w:b/>
+                <w:sz w:val="22"/>
+              </w:rPr>
+              <w:t xml:space="preserve">• CA11. Cambio de consulta: </w:t>
+            </w:r>
+            <w:r>
+              <w:rPr>
+                <w:b w:val="0"/>
+                <w:sz w:val="22"/>
+              </w:rPr>
+              <w:t>Solo Pagos general permite editar documento o tipo. Cualquier cambio limpia resultados, selección de préstamo, cuotas y confirmación de dinero recibido; las respuestas antiguas se descartan. Desde ficha o detalle se conservan los campos fijos y el enlace de regreso al mismo origen.</w:t>
+            </w:r>
+          </w:p>
+          <w:p>
+            <w:pPr>
+              <w:spacing w:before="60" w:after="80" w:line="240" w:lineRule="auto"/>
+              <w:ind w:left="216" w:hanging="216"/>
+              <w:keepNext w:val="0"/>
+              <w:keepLines/>
+            </w:pPr>
+            <w:r>
+              <w:rPr>
+                <w:b/>
+                <w:sz w:val="22"/>
+              </w:rPr>
+              <w:t xml:space="preserve">• CA12. Desplazamiento y revisión: </w:t>
+            </w:r>
+            <w:r>
+              <w:rPr>
+                <w:b w:val="0"/>
+                <w:sz w:val="22"/>
+              </w:rPr>
+              <w:t>Elegir préstamo o cargar un resultado único desplaza y enfoca el recuadro del titular con margen superior de 8 px. La lista con varios resultados no fuerza el desplazamiento. Cambiar cantidad de cuotas no repite el movimiento; se respeta reducir animaciones y permanecen los indicadores de foco de controles.</w:t>
             </w:r>
           </w:p>
         </w:tc>
@@ -6308,7 +6609,7 @@
               <w:spacing w:before="40" w:after="40" w:line="240" w:lineRule="auto"/>
             </w:pPr>
             <w:r>
-              <w:t xml:space="preserve">Como asesor de ventas, quiero que el sistema determine la deuda y condición del cliente, para impedir nuevos préstamos cuando tenga cuotas atrasadas sin cambiar estados manualmente.</w:t>
+              <w:t>Como asesor de ventas, quiero que el sistema determine la deuda y condición del cliente, para impedir nuevos préstamos cuando tenga cuotas atrasadas sin cambiar estados manualmente.</w:t>
             </w:r>
           </w:p>
         </w:tc>
@@ -6329,171 +6630,180 @@
             <w:pPr>
               <w:spacing w:before="60" w:after="80" w:line="240" w:lineRule="auto"/>
               <w:ind w:left="216" w:hanging="216"/>
+              <w:keepNext w:val="0"/>
               <w:keepLines/>
             </w:pPr>
             <w:r>
               <w:rPr>
                 <w:b/>
               </w:rPr>
-              <w:t>• CA01. Fecha de referencia:</w:t>
+              <w:t xml:space="preserve">• CA01. Fecha de referencia: </w:t>
             </w:r>
             <w:r>
               <w:rPr>
                 <w:b w:val="0"/>
               </w:rPr>
-              <w:t xml:space="preserve"> Se usa la fecha de Perú. Una cuota impaga con vencimiento de hoy aún no está vencida; entra en mora al día siguiente.</w:t>
+              <w:t>Se usa la fecha de Perú. Una cuota impaga con vencimiento de hoy aún no está vencida; entra en mora al día siguiente.</w:t>
             </w:r>
           </w:p>
           <w:p>
             <w:pPr>
               <w:spacing w:before="60" w:after="80" w:line="240" w:lineRule="auto"/>
               <w:ind w:left="216" w:hanging="216"/>
+              <w:keepNext w:val="0"/>
               <w:keepLines/>
             </w:pPr>
             <w:r>
               <w:rPr>
                 <w:b/>
               </w:rPr>
-              <w:t>• CA02. Condición global:</w:t>
+              <w:t xml:space="preserve">• CA02. Condición global: </w:t>
             </w:r>
             <w:r>
               <w:rPr>
                 <w:b w:val="0"/>
               </w:rPr>
-              <w:t xml:space="preserve"> Se consideran los préstamos del cliente en las cinco agencias. Extrajudicial tiene prioridad si alguna cuota impaga cumple 12 meses desde su vencimiento; en otro caso, con alguna cuota vencida es Moroso; sin cuotas vencidas es Habilitado financieramente.</w:t>
+              <w:t>Se consideran la persona y sus empresas vinculadas entre agencias. Extrajudicial tiene prioridad a los doce meses de la cuota impaga más antigua; con atrasos menores es Moroso y sin cuotas vencidas se muestra Sin atrasos, cuyo valor interno es habilitado. Un historial incompleto se identifica como Pendiente de conciliación.</w:t>
             </w:r>
           </w:p>
           <w:p>
             <w:pPr>
               <w:spacing w:before="60" w:after="80" w:line="240" w:lineRule="auto"/>
               <w:ind w:left="216" w:hanging="216"/>
+              <w:keepNext w:val="0"/>
               <w:keepLines/>
             </w:pPr>
             <w:r>
               <w:rPr>
                 <w:b/>
               </w:rPr>
-              <w:t>• CA03. Alcance de la etiqueta:</w:t>
+              <w:t xml:space="preserve">• CA03. Alcance de la etiqueta: </w:t>
             </w:r>
             <w:r>
               <w:rPr>
                 <w:b w:val="0"/>
               </w:rPr>
-              <w:t xml:space="preserve"> Extrajudicial es la clasificación automática del caso académico; no inicia un trámite jurídico. No se necesita registrar manualmente un mes sin pago ni seleccionar el estado.</w:t>
+              <w:t>Extrajudicial es la clasificación automática del caso académico; no inicia un trámite jurídico. No se necesita registrar manualmente un mes sin pago ni seleccionar el estado.</w:t>
             </w:r>
           </w:p>
           <w:p>
             <w:pPr>
               <w:spacing w:before="60" w:after="80" w:line="240" w:lineRule="auto"/>
               <w:ind w:left="216" w:hanging="216"/>
+              <w:keepNext w:val="0"/>
               <w:keepLines/>
             </w:pPr>
             <w:r>
               <w:rPr>
                 <w:b/>
               </w:rPr>
-              <w:t>• CA04. Actualización efectiva:</w:t>
+              <w:t xml:space="preserve">• CA04. Actualización efectiva: </w:t>
             </w:r>
             <w:r>
               <w:rPr>
                 <w:b w:val="0"/>
               </w:rPr>
-              <w:t xml:space="preserve"> El cálculo se realiza después de cada pago y en el cambio diario de fecha. Consultar o confirmar un préstamo revalida la situación actual aunque la tarea diaria no se haya ejecutado todavía.</w:t>
+              <w:t>El cálculo se realiza después de cada pago y en el cambio diario de fecha. Consultar o confirmar un préstamo revalida la situación actual aunque la tarea diaria no se haya ejecutado todavía.</w:t>
             </w:r>
           </w:p>
           <w:p>
             <w:pPr>
               <w:spacing w:before="60" w:after="80" w:line="240" w:lineRule="auto"/>
               <w:ind w:left="216" w:hanging="216"/>
+              <w:keepNext w:val="0"/>
               <w:keepLines/>
             </w:pPr>
             <w:r>
               <w:rPr>
                 <w:b/>
               </w:rPr>
-              <w:t>• CA05. Regularización:</w:t>
+              <w:t xml:space="preserve">• CA05. Regularización: </w:t>
             </w:r>
             <w:r>
               <w:rPr>
                 <w:b w:val="0"/>
               </w:rPr>
-              <w:t xml:space="preserve"> Pagar una cuota recalcula el estado con las que continúen impagas. Puede pasar de Extrajudicial a Moroso o a Habilitado según corresponda. El antecedente extrajudicial se conserva y exige autorización registrada para nuevos préstamos. Se conserva la trazabilidad del atraso y del pago; no se borra la evidencia de identidad.</w:t>
+              <w:t>Pagar una cuota recalcula el estado con las que continúen impagas. Puede pasar de Extrajudicial a Moroso o a Sin atrasos según corresponda. El antecedente extrajudicial se conserva y exige autorización registrada para nuevos préstamos. Se conserva la trazabilidad del atraso y del pago; no se borra la evidencia de identidad.</w:t>
             </w:r>
           </w:p>
           <w:p>
             <w:pPr>
               <w:spacing w:before="60" w:after="80" w:line="240" w:lineRule="auto"/>
               <w:ind w:left="216" w:hanging="216"/>
+              <w:keepNext w:val="0"/>
               <w:keepLines/>
             </w:pPr>
             <w:r>
               <w:rPr>
                 <w:b/>
               </w:rPr>
-              <w:t>• CA06. Independencia de identidad:</w:t>
+              <w:t xml:space="preserve">• CA06. Independencia de identidad: </w:t>
             </w:r>
             <w:r>
               <w:rPr>
                 <w:b w:val="0"/>
               </w:rPr>
-              <w:t xml:space="preserve"> La condición financiera no cambia el resultado de verificación. Al regularizarse la deuda, una identidad aprobada y vigente sigue aprobada. Si el DNI caducó, continúa bloqueado para nuevas colocaciones hasta revalidar.</w:t>
+              <w:t>La condición financiera no cambia el resultado de verificación. Al regularizarse la deuda, una identidad aprobada y vigente sigue aprobada. Si el DNI caducó, continúa bloqueado para nuevas colocaciones hasta revalidar.</w:t>
             </w:r>
           </w:p>
           <w:p>
             <w:pPr>
               <w:spacing w:before="60" w:after="80" w:line="240" w:lineRule="auto"/>
               <w:ind w:left="216" w:hanging="216"/>
+              <w:keepNext w:val="0"/>
               <w:keepLines/>
             </w:pPr>
             <w:r>
               <w:rPr>
                 <w:b/>
               </w:rPr>
-              <w:t>• CA07. Capital y cierre:</w:t>
+              <w:t xml:space="preserve">• CA07. Capital y cierre: </w:t>
             </w:r>
             <w:r>
               <w:rPr>
                 <w:b w:val="0"/>
               </w:rPr>
-              <w:t xml:space="preserve"> El capital disponible se obtiene del límite menos el capital pendiente global. Los intereses cobrados no liberan capital. Un préstamo queda Cancelado únicamente por pago completo; terminar el plazo no equivale a cancelar deuda.</w:t>
+              <w:t>El capital disponible se obtiene del límite menos el capital pendiente global. Los intereses cobrados no liberan capital. Un préstamo queda Cancelado únicamente por pago completo; terminar el plazo no equivale a cancelar deuda.</w:t>
             </w:r>
           </w:p>
           <w:p>
             <w:pPr>
               <w:spacing w:before="60" w:after="80" w:line="240" w:lineRule="auto"/>
               <w:ind w:left="216" w:hanging="216"/>
+              <w:keepNext w:val="0"/>
               <w:keepLines/>
             </w:pPr>
             <w:r>
               <w:rPr>
                 <w:b/>
               </w:rPr>
-              <w:t>• CA08. Caso de umbral:</w:t>
+              <w:t xml:space="preserve">• CA08. Caso de umbral: </w:t>
             </w:r>
             <w:r>
               <w:rPr>
                 <w:b w:val="0"/>
               </w:rPr>
-              <w:t xml:space="preserve"> Cuota impaga del 15/10/2026: Pendiente ese día, Vencida y cliente Moroso el 16/10/2026; si sigue impaga, Extrajudicial el 15/10/2027. Con otras obligaciones, manda el atraso impago más antiguo.</w:t>
+              <w:t>Cuota impaga del 15/10/2026: Pendiente ese día, Vencida y cliente Moroso el 16/10/2026; si sigue impaga, Extrajudicial el 15/10/2027. Con otras obligaciones, manda el atraso impago más antiguo.</w:t>
             </w:r>
           </w:p>
           <w:p>
             <w:pPr>
               <w:spacing w:before="60" w:after="80" w:line="240" w:lineRule="auto"/>
               <w:ind w:left="216" w:hanging="216"/>
+              <w:keepNext w:val="0"/>
               <w:keepLines/>
             </w:pPr>
             <w:r>
               <w:rPr>
                 <w:b/>
               </w:rPr>
-              <w:t>• CA09. Datos incompletos:</w:t>
+              <w:t xml:space="preserve">• CA09. Datos incompletos: </w:t>
             </w:r>
             <w:r>
               <w:rPr>
                 <w:b w:val="0"/>
               </w:rPr>
-              <w:t xml:space="preserve"> Los préstamos históricos sin conciliación no generan estados ficticios de pago. Se identifican como pendientes de conciliación y bloquean una nueva colocación hasta completar el historial.</w:t>
+              <w:t>Los préstamos históricos sin conciliación no generan estados ficticios de pago. Se identifican como pendientes de conciliación y bloquean una nueva colocación hasta completar el historial.</w:t>
             </w:r>
           </w:p>
         </w:tc>
@@ -6514,7 +6824,7 @@
     </w:p>
     <w:p>
       <w:r>
-        <w:t>Las ocho HU cumplen sus criterios y el flujo integrado conserva los datos al cerrar sesión. El despliegue debe verificarse con la versión integrada antes de declarar completada la entrega. Todos los integrantes pueden demostrar registro, consulta por agencia, cobro entre agencias y actualización automática de estados. No se presentan como implementadas funciones que solo estén descritas en este documento.</w:t>
+        <w:t>Las ocho HU describen el incremento integrado y sus comprobaciones. Al cerrar sesión se conservan los datos confirmados, no los borradores. El despliegue debe verificarse con la versión integrada antes de declarar completada la entrega. Todos los integrantes pueden demostrar registro, consulta por agencia, cobro entre agencias y actualización automática de estados. No se presentan como implementadas funciones que solo estén descritas en este documento.</w:t>
       </w:r>
     </w:p>
     <w:p>
@@ -6571,7 +6881,7 @@
                 <w:b/>
                 <w:sz w:val="22"/>
               </w:rPr>
-              <w:t xml:space="preserve">Caso</w:t>
+              <w:t>Caso</w:t>
             </w:r>
           </w:p>
         </w:tc>
@@ -6595,7 +6905,7 @@
                 <w:b/>
                 <w:sz w:val="22"/>
               </w:rPr>
-              <w:t xml:space="preserve">Resultado esperado</w:t>
+              <w:t>Resultado esperado</w:t>
             </w:r>
           </w:p>
         </w:tc>
@@ -6624,7 +6934,7 @@
               <w:rPr>
                 <w:sz w:val="22"/>
               </w:rPr>
-              <w:t xml:space="preserve">Acceso y depuración</w:t>
+              <w:t>Acceso y depuración</w:t>
             </w:r>
           </w:p>
         </w:tc>
@@ -6647,7 +6957,7 @@
               <w:rPr>
                 <w:sz w:val="22"/>
               </w:rPr>
-              <w:t xml:space="preserve">Login sin cuentas rápidas. General y Ana Morales fuera de operación, sin pérdida de datos históricos.</w:t>
+              <w:t>Login sin cuentas rápidas. General y Ana Morales fuera de operación, sin pérdida de datos históricos.</w:t>
             </w:r>
           </w:p>
         </w:tc>
@@ -6676,7 +6986,7 @@
               <w:rPr>
                 <w:sz w:val="22"/>
               </w:rPr>
-              <w:t xml:space="preserve">Separación por agencia</w:t>
+              <w:t>Separación por agencia</w:t>
             </w:r>
           </w:p>
         </w:tc>
@@ -6699,7 +7009,7 @@
               <w:rPr>
                 <w:sz w:val="22"/>
               </w:rPr>
-              <w:t xml:space="preserve">Un asesor de Chimbote no lista ni abre por URL ordinaria un préstamo de Trujillo. La ficha compartida no permite eludir esta restricción.</w:t>
+              <w:t>Un asesor de Chimbote no lista ni abre por URL ordinaria un préstamo de Trujillo. La ficha compartida no permite eludir esta restricción.</w:t>
             </w:r>
           </w:p>
         </w:tc>
@@ -6728,7 +7038,7 @@
               <w:rPr>
                 <w:sz w:val="22"/>
               </w:rPr>
-              <w:t xml:space="preserve">Cliente nuevo y existente</w:t>
+              <w:t>Cliente nuevo y existente</w:t>
             </w:r>
           </w:p>
         </w:tc>
@@ -6780,7 +7090,7 @@
               <w:rPr>
                 <w:sz w:val="22"/>
               </w:rPr>
-              <w:t xml:space="preserve">Identidad independiente</w:t>
+              <w:t>Identidad independiente</w:t>
             </w:r>
           </w:p>
         </w:tc>
@@ -6803,7 +7113,7 @@
               <w:rPr>
                 <w:sz w:val="22"/>
               </w:rPr>
-              <w:t xml:space="preserve">Un cliente con identidad aprobada entra en mora y luego paga: no se pierde su verificación. Si el DNI ya venció, requiere nueva evidencia antes de otro préstamo.</w:t>
+              <w:t>Un cliente con identidad aprobada entra en mora y luego paga: no se pierde su verificación. Si el DNI ya venció, requiere nueva evidencia antes de otro préstamo.</w:t>
             </w:r>
           </w:p>
         </w:tc>
@@ -6832,7 +7142,7 @@
               <w:rPr>
                 <w:sz w:val="22"/>
               </w:rPr>
-              <w:t xml:space="preserve">DNI vencido y cobro</w:t>
+              <w:t>DNI vencido y cobro</w:t>
             </w:r>
           </w:p>
         </w:tc>
@@ -6855,7 +7165,7 @@
               <w:rPr>
                 <w:sz w:val="22"/>
               </w:rPr>
-              <w:t xml:space="preserve">Se rechaza el nuevo préstamo y se permite pagar una cuota existente.</w:t>
+              <w:t>Se rechaza el nuevo préstamo y se permite pagar una cuota existente.</w:t>
             </w:r>
           </w:p>
         </w:tc>
@@ -6884,7 +7194,7 @@
               <w:rPr>
                 <w:sz w:val="22"/>
               </w:rPr>
-              <w:t xml:space="preserve">Capital y plazo</w:t>
+              <w:t>Capital y plazo</w:t>
             </w:r>
           </w:p>
         </w:tc>
@@ -6907,7 +7217,7 @@
               <w:rPr>
                 <w:sz w:val="22"/>
               </w:rPr>
-              <w:t xml:space="preserve">Se rechazan montos que excedan S/ 10 000 de capital global, cero, negativos, plazos decimales y plazos fuera de 1 a 60 meses.</w:t>
+              <w:t>Se rechazan montos que excedan S/ 10 000 de capital global, cero, negativos, plazos decimales y plazos fuera de 1 a 60 meses.</w:t>
             </w:r>
           </w:p>
         </w:tc>
@@ -6936,7 +7246,7 @@
               <w:rPr>
                 <w:sz w:val="22"/>
               </w:rPr>
-              <w:t xml:space="preserve">Cálculo y calendario</w:t>
+              <w:t>Cálculo y calendario</w:t>
             </w:r>
           </w:p>
         </w:tc>
@@ -6959,7 +7269,7 @@
               <w:rPr>
                 <w:sz w:val="22"/>
               </w:rPr>
-              <w:t xml:space="preserve">Se comprueba HU-05 con S/ 1 000 a seis meses, meses de 28, 29, 30 y 31 días, y recuperación del mismo PDF.</w:t>
+              <w:t>Se comprueba HU-05 con S/ 1 000 a seis meses, meses de 28, 29, 30 y 31 días, y recuperación del mismo PDF.</w:t>
             </w:r>
           </w:p>
         </w:tc>
@@ -6988,7 +7298,7 @@
               <w:rPr>
                 <w:sz w:val="22"/>
               </w:rPr>
-              <w:t xml:space="preserve">Cobranza entre agencias</w:t>
+              <w:t>Cobranza entre agencias</w:t>
             </w:r>
           </w:p>
         </w:tc>
@@ -7040,7 +7350,7 @@
               <w:rPr>
                 <w:sz w:val="22"/>
               </w:rPr>
-              <w:t xml:space="preserve">Concurrencia y reintento</w:t>
+              <w:t>Concurrencia y reintento</w:t>
             </w:r>
           </w:p>
         </w:tc>
@@ -7063,7 +7373,7 @@
               <w:rPr>
                 <w:sz w:val="22"/>
               </w:rPr>
-              <w:t xml:space="preserve">Dos confirmaciones no exceden capital disponible ni cobran dos veces una misma cuota. Un fallo no deja operaciones incompletas.</w:t>
+              <w:t>Dos confirmaciones no exceden capital disponible ni cobran dos veces una misma cuota. Un fallo no deja operaciones incompletas.</w:t>
             </w:r>
           </w:p>
         </w:tc>
@@ -7092,7 +7402,7 @@
               <w:rPr>
                 <w:sz w:val="22"/>
               </w:rPr>
-              <w:t xml:space="preserve">Estados y cierre</w:t>
+              <w:t>Estados y cierre</w:t>
             </w:r>
           </w:p>
         </w:tc>
@@ -7115,7 +7425,7 @@
               <w:rPr>
                 <w:sz w:val="22"/>
               </w:rPr>
-              <w:t xml:space="preserve">Se prueban el día del vencimiento, el día siguiente y los 12 meses de atraso. Al pagar todas las cuotas, se cierra la deuda y queda historial consultable.</w:t>
+              <w:t>Se prueban el día del vencimiento, el día siguiente y los 12 meses de atraso. Al pagar todas las cuotas, se cierra la deuda y queda historial consultable.</w:t>
             </w:r>
           </w:p>
         </w:tc>
@@ -7144,7 +7454,7 @@
               <w:rPr>
                 <w:sz w:val="22"/>
               </w:rPr>
-              <w:t xml:space="preserve">Capital amortizado</w:t>
+              <w:t>Capital amortizado</w:t>
             </w:r>
           </w:p>
         </w:tc>
@@ -7167,7 +7477,7 @@
               <w:rPr>
                 <w:sz w:val="22"/>
               </w:rPr>
-              <w:t xml:space="preserve">Al pagar una cuota, el cupo aumenta solo por su capital. Se distinguen saldo de capital, intereses y deuda total pendiente.</w:t>
+              <w:t>Al pagar una cuota, el cupo aumenta solo por su capital. Se distinguen saldo de capital, intereses y deuda total pendiente.</w:t>
             </w:r>
           </w:p>
         </w:tc>
@@ -7196,7 +7506,7 @@
               <w:rPr>
                 <w:sz w:val="22"/>
               </w:rPr>
-              <w:t xml:space="preserve">Constancias y conciliación</w:t>
+              <w:t>Constancias y conciliación</w:t>
             </w:r>
           </w:p>
         </w:tc>
@@ -7219,7 +7529,7 @@
               <w:rPr>
                 <w:sz w:val="22"/>
               </w:rPr>
-              <w:t xml:space="preserve">La constancia puede recuperarse; un historial incompleto no se declara pagado o moroso sin conciliar.</w:t>
+              <w:t>La constancia puede recuperarse; un historial incompleto no se declara pagado o moroso sin conciliar.</w:t>
             </w:r>
           </w:p>
         </w:tc>
@@ -7584,6 +7894,266 @@
                 <w:sz w:val="22"/>
               </w:rPr>
               <w:t>Repetir la confirmación devuelve el mismo préstamo. Si otro asesor registró ese DNI durante el borrador, se reutiliza la ficha vigente sin sobrescribir evidencia; de necesitar revisión, se vuelve al paso 1.</w:t>
+            </w:r>
+          </w:p>
+        </w:tc>
+      </w:tr>
+      <w:tr>
+        <w:trPr>
+          <w:cantSplit/>
+          <w:cantSplit/>
+        </w:trPr>
+        <w:tc>
+          <w:tcPr>
+            <w:tcW w:w="2494" w:type="dxa"/>
+            <w:tcMar>
+              <w:top w:w="60" w:type="dxa"/>
+              <w:left w:w="90" w:type="dxa"/>
+              <w:bottom w:w="60" w:type="dxa"/>
+              <w:right w:w="90" w:type="dxa"/>
+            </w:tcMar>
+            <w:vAlign w:val="center"/>
+          </w:tcPr>
+          <w:p>
+            <w:pPr>
+              <w:spacing w:before="20" w:after="20" w:line="240" w:lineRule="auto"/>
+            </w:pPr>
+            <w:r>
+              <w:rPr>
+                <w:sz w:val="22"/>
+              </w:rPr>
+              <w:t>Sesión e inactividad</w:t>
+            </w:r>
+          </w:p>
+        </w:tc>
+        <w:tc>
+          <w:tcPr>
+            <w:tcW w:w="6860" w:type="dxa"/>
+            <w:tcMar>
+              <w:top w:w="60" w:type="dxa"/>
+              <w:left w:w="90" w:type="dxa"/>
+              <w:bottom w:w="60" w:type="dxa"/>
+              <w:right w:w="90" w:type="dxa"/>
+            </w:tcMar>
+            <w:vAlign w:val="center"/>
+          </w:tcPr>
+          <w:p>
+            <w:pPr>
+              <w:spacing w:before="20" w:after="20" w:line="240" w:lineRule="auto"/>
+            </w:pPr>
+            <w:r>
+              <w:rPr>
+                <w:sz w:val="22"/>
+              </w:rPr>
+              <w:t>El contador aparece después de la fecha; el aviso surge en el último minuto, Continuar renueva una sesión válida y a los 15 minutos sin actividad se exige nuevo ingreso.</w:t>
+            </w:r>
+          </w:p>
+        </w:tc>
+      </w:tr>
+      <w:tr>
+        <w:trPr>
+          <w:cantSplit/>
+          <w:cantSplit/>
+        </w:trPr>
+        <w:tc>
+          <w:tcPr>
+            <w:tcW w:w="2494" w:type="dxa"/>
+            <w:tcMar>
+              <w:top w:w="60" w:type="dxa"/>
+              <w:left w:w="90" w:type="dxa"/>
+              <w:bottom w:w="60" w:type="dxa"/>
+              <w:right w:w="90" w:type="dxa"/>
+            </w:tcMar>
+            <w:vAlign w:val="center"/>
+          </w:tcPr>
+          <w:p>
+            <w:pPr>
+              <w:spacing w:before="20" w:after="20" w:line="240" w:lineRule="auto"/>
+            </w:pPr>
+            <w:r>
+              <w:rPr>
+                <w:sz w:val="22"/>
+              </w:rPr>
+              <w:t>Sesión reemplazada</w:t>
+            </w:r>
+          </w:p>
+        </w:tc>
+        <w:tc>
+          <w:tcPr>
+            <w:tcW w:w="6860" w:type="dxa"/>
+            <w:tcMar>
+              <w:top w:w="60" w:type="dxa"/>
+              <w:left w:w="90" w:type="dxa"/>
+              <w:bottom w:w="60" w:type="dxa"/>
+              <w:right w:w="90" w:type="dxa"/>
+            </w:tcMar>
+            <w:vAlign w:val="center"/>
+          </w:tcPr>
+          <w:p>
+            <w:pPr>
+              <w:spacing w:before="20" w:after="20" w:line="240" w:lineRule="auto"/>
+            </w:pPr>
+            <w:r>
+              <w:rPr>
+                <w:sz w:val="22"/>
+              </w:rPr>
+              <w:t>Iniciar la misma cuenta en otro navegador bloquea al anterior; cerrar el anterior no cierra al nuevo.</w:t>
+            </w:r>
+          </w:p>
+        </w:tc>
+      </w:tr>
+      <w:tr>
+        <w:trPr>
+          <w:cantSplit/>
+          <w:cantSplit/>
+        </w:trPr>
+        <w:tc>
+          <w:tcPr>
+            <w:tcW w:w="2494" w:type="dxa"/>
+            <w:tcMar>
+              <w:top w:w="60" w:type="dxa"/>
+              <w:left w:w="90" w:type="dxa"/>
+              <w:bottom w:w="60" w:type="dxa"/>
+              <w:right w:w="90" w:type="dxa"/>
+            </w:tcMar>
+            <w:vAlign w:val="center"/>
+          </w:tcPr>
+          <w:p>
+            <w:pPr>
+              <w:spacing w:before="20" w:after="20" w:line="240" w:lineRule="auto"/>
+            </w:pPr>
+            <w:r>
+              <w:rPr>
+                <w:sz w:val="22"/>
+              </w:rPr>
+              <w:t>SUNAT y modalidades</w:t>
+            </w:r>
+          </w:p>
+        </w:tc>
+        <w:tc>
+          <w:tcPr>
+            <w:tcW w:w="6860" w:type="dxa"/>
+            <w:tcMar>
+              <w:top w:w="60" w:type="dxa"/>
+              <w:left w:w="90" w:type="dxa"/>
+              <w:bottom w:w="60" w:type="dxa"/>
+              <w:right w:w="90" w:type="dxa"/>
+            </w:tcMar>
+            <w:vAlign w:val="center"/>
+          </w:tcPr>
+          <w:p>
+            <w:pPr>
+              <w:spacing w:before="20" w:after="20" w:line="240" w:lineRule="auto"/>
+            </w:pPr>
+            <w:r>
+              <w:rPr>
+                <w:sz w:val="22"/>
+              </w:rPr>
+              <w:t>RUC observado bloquea solicitar por ese RUC, pero no un préstamo personal DNI elegible ni el pago de deudas. Un fallo técnico no se guarda como rechazo.</w:t>
+            </w:r>
+          </w:p>
+        </w:tc>
+      </w:tr>
+      <w:tr>
+        <w:trPr>
+          <w:cantSplit/>
+          <w:cantSplit/>
+        </w:trPr>
+        <w:tc>
+          <w:tcPr>
+            <w:tcW w:w="2494" w:type="dxa"/>
+            <w:tcMar>
+              <w:top w:w="60" w:type="dxa"/>
+              <w:left w:w="90" w:type="dxa"/>
+              <w:bottom w:w="60" w:type="dxa"/>
+              <w:right w:w="90" w:type="dxa"/>
+            </w:tcMar>
+            <w:vAlign w:val="center"/>
+          </w:tcPr>
+          <w:p>
+            <w:pPr>
+              <w:spacing w:before="20" w:after="20" w:line="240" w:lineRule="auto"/>
+            </w:pPr>
+            <w:r>
+              <w:rPr>
+                <w:sz w:val="22"/>
+              </w:rPr>
+              <w:t>Pagos con contexto</w:t>
+            </w:r>
+          </w:p>
+        </w:tc>
+        <w:tc>
+          <w:tcPr>
+            <w:tcW w:w="6860" w:type="dxa"/>
+            <w:tcMar>
+              <w:top w:w="60" w:type="dxa"/>
+              <w:left w:w="90" w:type="dxa"/>
+              <w:bottom w:w="60" w:type="dxa"/>
+              <w:right w:w="90" w:type="dxa"/>
+            </w:tcMar>
+            <w:vAlign w:val="center"/>
+          </w:tcPr>
+          <w:p>
+            <w:pPr>
+              <w:spacing w:before="20" w:after="20" w:line="240" w:lineRule="auto"/>
+            </w:pPr>
+            <w:r>
+              <w:rPr>
+                <w:sz w:val="22"/>
+              </w:rPr>
+              <w:t>Desde ficha o detalle los campos quedan fijos y el regreso conserva el origen; en Pagos general cambiar documento o tipo elimina resultados anteriores.</w:t>
+            </w:r>
+          </w:p>
+        </w:tc>
+      </w:tr>
+      <w:tr>
+        <w:trPr>
+          <w:cantSplit/>
+          <w:cantSplit/>
+        </w:trPr>
+        <w:tc>
+          <w:tcPr>
+            <w:tcW w:w="2494" w:type="dxa"/>
+            <w:tcMar>
+              <w:top w:w="60" w:type="dxa"/>
+              <w:left w:w="90" w:type="dxa"/>
+              <w:bottom w:w="60" w:type="dxa"/>
+              <w:right w:w="90" w:type="dxa"/>
+            </w:tcMar>
+            <w:vAlign w:val="center"/>
+          </w:tcPr>
+          <w:p>
+            <w:pPr>
+              <w:spacing w:before="20" w:after="20" w:line="240" w:lineRule="auto"/>
+            </w:pPr>
+            <w:r>
+              <w:rPr>
+                <w:sz w:val="22"/>
+              </w:rPr>
+              <w:t>Ficha e historiales</w:t>
+            </w:r>
+          </w:p>
+        </w:tc>
+        <w:tc>
+          <w:tcPr>
+            <w:tcW w:w="6860" w:type="dxa"/>
+            <w:tcMar>
+              <w:top w:w="60" w:type="dxa"/>
+              <w:left w:w="90" w:type="dxa"/>
+              <w:bottom w:w="60" w:type="dxa"/>
+              <w:right w:w="90" w:type="dxa"/>
+            </w:tcMar>
+            <w:vAlign w:val="center"/>
+          </w:tcPr>
+          <w:p>
+            <w:pPr>
+              <w:spacing w:before="20" w:after="20" w:line="240" w:lineRule="auto"/>
+            </w:pPr>
+            <w:r>
+              <w:rPr>
+                <w:sz w:val="22"/>
+              </w:rPr>
+              <w:t>La ficha queda resumida, los vínculos respetan permisos y Ver historial abre DNI, RUC o su menú sin tabla de préstamos en la ficha.</w:t>
             </w:r>
           </w:p>
         </w:tc>
@@ -7617,7 +8187,7 @@
     </w:p>
     <w:p>
       <w:r>
-        <w:t>Se mantiene el flujo Cliente, Condiciones y Cronograma. El paso 1 ofrece DNI o RUC; RUC 10 conserva la ficha de su DNI. Para RUC 20 se identifica por separado al propietario para el límite y al representante que firma. Se validan once números, prefijo 10 o 20 y dígito verificador; la consulta externa exige coincidencia, ACTIVO y HABIDO. Un RUC observado no impide pagar deudas existentes.</w:t>
+        <w:t>Se mantiene el flujo Cliente, Condiciones y Cronograma. El paso 1 ofrece DNI o RUC; RUC 10 conserva la ficha de su DNI. Para RUC 20 se identifica por separado al propietario para el límite y al representante que firma. Se validan once números, prefijo 10 o 20 y dígito verificador; la consulta externa debe coincidir con el número solicitado y exige ACTIVO y HABIDO para una nueva solicitud por RUC. Un RUC observado no impide pagar deudas existentes.</w:t>
       </w:r>
     </w:p>
     <w:p>
@@ -7643,7 +8213,7 @@
     </w:p>
     <w:p>
       <w:r>
-        <w:t>El detalle del préstamo confirmado permite descargar el contrato en Word y abrir una vista de impresión o guardar como PDF desde el navegador. La plantilla conserva el texto, estructura y diseño del Word del profesor; completa cliente, documento, representante, fecha y agencia. Un anexo incluye monto, plazo, tasas, totales, vencimientos y las personas vinculadas. El cronograma se descarga por separado. Los préstamos nuevos congelan sus datos contractuales de identidad.</w:t>
+        <w:t>El detalle del préstamo confirmado permite descargar el contrato en Word y abrir una vista de impresión o guardar como PDF desde el navegador. La plantilla conserva el texto, estructura y diseño del Word del profesor; completa cliente, documento, representante, fecha y agencia. Un anexo incluye monto, plazo, tasas, totales, vencimientos y las personas vinculadas. El cronograma tiene descarga PDF e impresión separadas; los menús Cronograma y Contrato agrupan sus acciones en el detalle. Los préstamos nuevos congelan sus datos contractuales de identidad.</w:t>
       </w:r>
     </w:p>
     <w:p>
@@ -7696,6 +8266,78 @@
     <w:p>
       <w:r>
         <w:t>La plantilla original se conserva en Contrato_profesor.docx. Se identificaron denominaciones Préstamos Castillo y EFS, una referencia a la cláusula décimo sexta ausente y conceptos de penalidad, pagaré, intermediación y pagos externos no desarrollados en el sprint. Su mención no implementa esos módulos ni establece una tasa. El texto original no se modifica automáticamente; las condiciones particulares y el alcance académico se documentan en el anexo.</w:t>
+      </w:r>
+    </w:p>
+    <w:p>
+      <w:pPr>
+        <w:pStyle w:val="Ttulo2"/>
+      </w:pPr>
+      <w:r>
+        <w:t>Revalidación y representación por empresa</w:t>
+      </w:r>
+    </w:p>
+    <w:p>
+      <w:r>
+        <w:t>Revalidar identidad desde la ficha consulta automáticamente el DNI fijo, permite reintentar si falla y requiere confirmar la revisión antes de guardar. Al guardar vuelve a la ficha. No se crea una pantalla/plantilla independiente ni se inicia un préstamo.</w:t>
+      </w:r>
+    </w:p>
+    <w:p>
+      <w:r>
+        <w:t>En RUC 20 se distingue quién firma y la asistencia del propietario. Un propietario ausente conserva su identidad previamente aprobada y vigente, sin una verificación presencial nueva; si falta esa verificación, queda pendiente revisión y no se confirma la solicitud. El firmante debe estar presente y tener identidad y facultades verificadas. La referencia de propiedad y la de facultades documentan las personas y asistencia. No se confunde la vinculación al límite global con responsabilidad personal por deuda de la sociedad.</w:t>
+      </w:r>
+    </w:p>
+    <w:p>
+      <w:pPr>
+        <w:pStyle w:val="Ttulo2"/>
+      </w:pPr>
+      <w:r>
+        <w:t>Fichas compartidas listados y pagos con contexto</w:t>
+      </w:r>
+    </w:p>
+    <w:p>
+      <w:r>
+        <w:t>Clientes muestra titulares con préstamos confirmados en la agencia actual, incluidos los ya pagados. El acceso permitido a una ficha vinculada no la incorpora al listado local. DNI y RUC 10 comparten identidad; RUC 20 conserva razón social y ficha independiente. El bloque Personas y empresas vinculadas permite abrir las fichas autorizadas en ambas direcciones. La ficha termina con Consultar para pagar y Ver historial; la cartera local se consulta en Préstamos y las revisiones se muestran en su página propia.</w:t>
+      </w:r>
+    </w:p>
+    <w:p>
+      <w:r>
+        <w:t>Por DNI, RUC 10 o RUC 20, Pagos reúne las mismas obligaciones del propietario y sus empresas en todas las agencias. Se selecciona y cobra un préstamo a la vez, sin mezclar cuotas. Desde ficha se fija su documento y se vuelve a esa misma ficha; desde detalle se fija el UUID del préstamo autorizado y se vuelve a ese mismo detalle. En ambos casos no aparece Cambiar cliente. La entrada general mantiene búsqueda editable y limpia inmediatamente la atención anterior al cambiarla.</w:t>
+      </w:r>
+    </w:p>
+    <w:p>
+      <w:pPr>
+        <w:pStyle w:val="Ttulo2"/>
+      </w:pPr>
+      <w:r>
+        <w:t>Control de sesiones y continuidad</w:t>
+      </w:r>
+    </w:p>
+    <w:p>
+      <w:r>
+        <w:t>La cabecera muestra nombre y rol, agencia, fecha de Perú y contador de sesión. El cierre se produce a los 15 minutos sin interacción o al reemplazar la sesión con un inicio posterior. El aviso del último minuto permite continuar mientras la sesión siga válida. La validación del servidor y de la base protege préstamos y pagos aun si una pantalla permanece abierta; la consulta periódica no renueva la actividad.</w:t>
+      </w:r>
+    </w:p>
+    <w:p>
+      <w:r>
+        <w:t>Las operaciones confirmadas permanecen al cerrar la sesión; los borradores sin guardar se descartan. Si se interrumpe la respuesta de una confirmación, debe revisarse el préstamo o el historial de pagos antes de iniciar otra operación. Las claves de idempotencia protegen el reintento de la misma operación; no convierten una nueva solicitud independiente en el mismo cobro.</w:t>
+      </w:r>
+    </w:p>
+    <w:p>
+      <w:pPr>
+        <w:pStyle w:val="Ttulo2"/>
+      </w:pPr>
+      <w:r>
+        <w:t>Alcance de la verificación y funciones pendientes</w:t>
+      </w:r>
+    </w:p>
+    <w:p>
+      <w:r>
+        <w:t>La consulta de nombres por DNI no consulta automáticamente vigencia ni fallecimiento oficial. La fecha de caducidad y las casillas documentan la revisión presencial del asesor. SUNAT se consulta al ejecutar el flujo correspondiente; no existe un barrido periódico externo que actualice todos los RUC. Un fallo técnico no se registra como rechazo de identidad ni impide cobrar deudas existentes; una nueva solicitud que necesite esa consulta espera un resultado válido.</w:t>
+      </w:r>
+    </w:p>
+    <w:p>
+      <w:r>
+        <w:t>Se mantienen fuera del incremento los abonos parciales, refinanciación, reversos, gestión judicial, documentos extranjeros y prefijos RUC distintos de 10 y 20, evaluación automática de riesgo por monto/plazo y aprobación documental remota de un propietario no verificado. La vinculación académica para el límite no constituye por sí misma garantía personal de la deuda de una sociedad.</w:t>
       </w:r>
     </w:p>
     <w:sectPr>

</xml_diff>

<commit_message>
Consolidar requisitos y manuales
</commit_message>
<xml_diff>
--- a/docs/Sprint_1_Sistema_Prestamos.docx
+++ b/docs/Sprint_1_Sistema_Prestamos.docx
@@ -38,7 +38,7 @@
     </w:p>
     <w:p>
       <w:r>
-        <w:t>El registro en hojas de cálculo provoca errores de identidad y dificulta conocer las cuotas pendientes. El sistema debe conservar datos confiables, distinguir la cartera de cada agencia y registrar los pagos para evitar cobros duplicados y nuevos préstamos a clientes con mora.</w:t>
+        <w:t>El sistema sustituye el registro en hojas de cálculo para conservar identidad, cartera por agencia y pagos trazables, evitando cobros duplicados y nuevos préstamos con mora.</w:t>
       </w:r>
     </w:p>
     <w:p>
@@ -416,7 +416,7 @@
               <w:rPr>
                 <w:sz w:val="22"/>
               </w:rPr>
-              <w:t>Cliente, fecha de operación, monto positivo en soles y plazo entero de 1 a 60 meses. Sin monto mínimo adicional para las pruebas.</w:t>
+              <w:t>Cliente, fecha de operación, monto positivo en soles y plazo entero de 1 a 60 meses. Mínimo S/ 0.01 y máximo según el capital disponible.</w:t>
             </w:r>
           </w:p>
         </w:tc>
@@ -697,7 +697,7 @@
     </w:p>
     <w:p>
       <w:r>
-        <w:t>Se atiende a personas naturales con DNI, personas naturales con negocio (RUC 10) y empresas (RUC 20). DNI y RUC 10 comparten ficha; la empresa conserva titular propio y se vincula al propietario responsable del límite global. Clientes lista solo a los titulares con préstamos confirmados en la agencia actual, incluidos los ya pagados; Préstamos lista solo operaciones originadas en esa agencia. Sus búsquedas respetan estos límites. La verificación y los saldos globales se reutilizan para evaluar nuevos préstamos, sin habilitar la consulta ordinaria de carteras ajenas.</w:t>
+        <w:t>Se atiende a personas naturales con DNI, personas naturales con negocio (RUC 10) y empresas (RUC 20). DNI y RUC 10 comparten ficha; la empresa conserva titular propio y se vincula al propietario responsable del límite global. Clientes lista solo a los titulares con préstamos confirmados en la agencia actual, incluidos los ya pagados; Préstamos lista solo operaciones originadas en esa agencia. Las fichas autorizadas comparten identidad y saldos globales, sin ampliar la cartera local.</w:t>
       </w:r>
     </w:p>
     <w:tbl>
@@ -1257,6 +1257,11 @@
       </w:r>
     </w:p>
     <w:p>
+      <w:r>
+        <w:t>No incluye abonos parciales, reversos, refinanciación, gestión judicial, panel gerencial, evaluación automática de riesgo, documentos extranjeros ni aprobación remota de un propietario no verificado. La vinculación para el límite es una regla académica; no constituye por sí sola garantía personal de una deuda empresarial.</w:t>
+      </w:r>
+    </w:p>
+    <w:p>
       <w:pPr>
         <w:pStyle w:val="Ttulo2"/>
       </w:pPr>
@@ -1266,7 +1271,7 @@
     </w:p>
     <w:p>
       <w:r>
-        <w:t>Las observaciones del profesor establecen la consulta por agencia, el pago entre agencias y la condición automática de moroso o extrajudicial. Para que estas reglas sean implementables, se adoptan las siguientes precisiones del proyecto, que se revisarán con el profesor si indica otro criterio.</w:t>
+        <w:t>Se adoptan las siguientes precisiones para la consulta por agencia, el pago entre agencias y los estados automáticos del caso académico.</w:t>
       </w:r>
     </w:p>
     <w:tbl>
@@ -1620,7 +1625,7 @@
     </w:p>
     <w:p>
       <w:r>
-        <w:t>Las cuentas y las cinco agencias están preconfiguradas. Se retiran del entorno operativo la agencia General y la cuenta Ana Morales. La depuración respeta las referencias y la trazabilidad de operaciones existentes; no borra préstamos ni pagos históricos. Un registro ficticio sin referencias puede eliminarse; si tiene referencias, se regulariza antes de retirarlo y se bloquea su acceso.</w:t>
+        <w:t>Las cuentas y las cinco agencias están preconfiguradas; General y Ana Morales permanecen fuera de operación, sin borrar datos históricos.</w:t>
       </w:r>
     </w:p>
     <w:p>
@@ -1758,7 +1763,7 @@
               <w:rPr>
                 <w:sz w:val="22"/>
               </w:rPr>
-              <w:t>Correo, contraseña y acceso. Sin credenciales de demostración. La agencia proviene de la cuenta. La sesión anterior se reemplaza al iniciar en otro navegador; la cabecera muestra el tiempo restante sin actividad.</w:t>
+              <w:t>Correo y contraseña. Agencia asignada por cuenta, sin credenciales de demostración; contador y sesión única.</w:t>
             </w:r>
           </w:p>
         </w:tc>
@@ -1810,7 +1815,7 @@
               <w:rPr>
                 <w:sz w:val="22"/>
               </w:rPr>
-              <w:t>Solo cartera de la agencia actual. Activos por defecto y filtro Activos, Cancelados o Todos. Código, documento del titular, cliente o razón social, fecha, monto original, plazo, estado y Ver detalle; sin columna Deuda pendiente ni botón Nuevo préstamo. Selector DNI exacto, RUC exacto o Código de préstamo con validación de formato.</w:t>
+              <w:t>Cartera local; estado, tipo de titular y búsqueda exacta por DNI/RUC/PR-. Documento, cliente o razón social, fecha, monto, plazo, estado y detalle.</w:t>
             </w:r>
           </w:p>
         </w:tc>
@@ -1862,7 +1867,7 @@
               <w:rPr>
                 <w:sz w:val="22"/>
               </w:rPr>
-              <w:t>Listado y búsqueda limitados a titulares con préstamos confirmados en la agencia actual, incluidos los ya pagados. Filtros Todos, Personas y Empresas; DNI para personas y RUC para empresas, nombre, verificación y condición de pago. Cobrar un préstamo ajeno no incorpora al cliente al listado. Sin botón Validar cliente ni búsqueda global.</w:t>
+              <w:t>Titulares con préstamos confirmados locales, incluidos pagados. Filtros Todos/Personas/Empresas; DNI personal y RUC empresarial.</w:t>
             </w:r>
           </w:p>
         </w:tc>
@@ -1914,7 +1919,7 @@
               <w:rPr>
                 <w:sz w:val="22"/>
               </w:rPr>
-              <w:t>Identidad compartida, datos SUNAT cuando corresponda, condición de pago, capital global y personas y empresas vinculadas. Solicitar préstamo y Revalidar datos ofrecen DNI/RUC 10 en la misma ficha. Consultar para pagar abre el grupo; Ver historial abre las revisiones en una página aparte. No contiene la tabla Préstamos en tu agencia ni selectores manuales de condición.</w:t>
+              <w:t>Identificación, condición, capital global y vínculos. Solicitar préstamo, Revalidar datos, Consultar para pagar y Ver historial. Historial en página aparte, sin tabla de préstamos.</w:t>
             </w:r>
           </w:p>
         </w:tc>
@@ -1966,7 +1971,7 @@
               <w:rPr>
                 <w:sz w:val="22"/>
               </w:rPr>
-              <w:t>Paso 1: elegir DNI o RUC 10/20, comprobar identidad y representación, reutilizar ficha vigente o preparar borrador del nuevo. El tipo queda fijo en los pasos 2 y 3. Paso 2: monto y plazo. Paso 3: confirmar conjuntamente cliente nuevo, evidencia, préstamo y cronograma. La revalidación del existente se guarda aparte aunque no concluya el préstamo.</w:t>
+              <w:t>Cliente → Condiciones → Cronograma. Tipo fijo después del paso 1; cliente nuevo se guarda al confirmar. Revalidación guardada del existente permanece.</w:t>
             </w:r>
           </w:p>
         </w:tc>
@@ -2018,7 +2023,7 @@
               <w:rPr>
                 <w:sz w:val="22"/>
               </w:rPr>
-              <w:t>Tres cuadros: Total a pagar, Total pagado y Saldo por pagar, en una fila en escritorio y adaptables en móvil. Estado junto al título; TEA, TEM e interés total en Datos del préstamo. Cronograma e historial de cobros. Registrar pago abre Pagos con las cuotas cargadas automáticamente.</w:t>
+              <w:t>Total a pagar, pagado y saldo; tasas, estado, cuotas e historial. Menús Cronograma y Contrato. Registrar pago carga ese préstamo fijo.</w:t>
             </w:r>
           </w:p>
         </w:tc>
@@ -2070,7 +2075,7 @@
               <w:rPr>
                 <w:sz w:val="22"/>
               </w:rPr>
-              <w:t>Selector DNI exacto, RUC exacto o Código de préstamo para cobrar en cualquiera de las cinco agencias. DNI de ocho números; código con prefijo PR- fijo y ocho caracteres hexadecimales. Por DNI o RUC se reúne el grupo del propietario y sus empresas entre agencias; por código se carga un préstamo. Desde ficha el documento queda fijo; desde detalle quedan fijos el código y el préstamo. Conserva agencia de origen y registra agencia de cobro, sin ofrecer una cartera completa sin búsqueda dirigida.</w:t>
+              <w:t>Consulta dirigida al grupo entre agencias por DNI/RUC o a un préstamo por PR-. Desde ficha fija documento; desde detalle fija préstamo. Regreso al origen y cobro individual.</w:t>
             </w:r>
           </w:p>
         </w:tc>
@@ -2096,17 +2101,17 @@
     </w:p>
     <w:p>
       <w:r>
-        <w:t>Nuevo préstamo: elegir DNI o RUC → comprobar si existe en las cinco agencias → reutilizar ficha vigente, revalidar al existente o preparar datos del nuevo → completar monto y plazo → revisar cronograma → confirmar. El nuevo permanece como borrador en memoria hasta el paso 3: no se registra ni aparece en Clientes antes de confirmar. La detección por DNI no es un buscador global y una identidad vigente no repite consulta externa por cambiar de agencia.</w:t>
+        <w:t>Nuevo préstamo: elegir DNI o RUC → recuperar ficha, revalidar o preparar identidad nueva → monto y plazo → cronograma → confirmar. El alta nueva permanece en memoria hasta confirmar; cambiar de agencia no duplica ficha ni exige repetir una revisión vigente de DNI.</w:t>
       </w:r>
     </w:p>
     <w:p>
       <w:r>
-        <w:t>Cliente del listado propio: Clientes → abrir ficha → Solicitar préstamo. Cliente de otra agencia: Nuevo préstamo → ingresar DNI y recuperar ficha. Si requiere revalidación, Guardar verificación y continuar actualiza su identidad para las cinco agencias aunque no termine el préstamo; no genera crédito ni elimina mora. Una verificación rechazada o fallecimiento acreditado no se omiten. La respuesta verbal no sustituye la comprobación por DNI.</w:t>
+        <w:t>Desde Clientes se abre la ficha y Solicitar préstamo. Un cliente de otra agencia se recupera en Nuevo préstamo. La revalidación guardada actualiza la ficha compartida sin generar crédito ni eliminar mora.</w:t>
       </w:r>
     </w:p>
     <w:p>
       <w:r>
-        <w:t>Cobranza desde el menú: Pagos → elegir DNI exacto, RUC exacto o Código de préstamo → consultar → elegir préstamo si corresponde → revisar cuotas y agencia de origen → seleccionar cuotas consecutivas → confirmar cobro → entregar constancia. Desde Registrar pago en el detalle se cargan automáticamente el préstamo y sus cuotas, sin pulsar Consultar cuotas. Un DNI vencido o la mora no impiden pagar; bloquean únicamente nuevas colocaciones.</w:t>
+        <w:t>Cobranza: Pagos → consultar DNI/RUC/PR- → elegir préstamo → revisar cuotas y origen → confirmar dinero recibido y cobro → constancia. Desde ficha o detalle consulta automáticamente y conserva el contexto.</w:t>
       </w:r>
     </w:p>
     <w:p>
@@ -2408,12 +2413,12 @@
     </w:p>
     <w:p>
       <w:r>
-        <w:t>La condición de pago no cambia la verificación de identidad. Un cliente puede tener verificación Aprobada y condición Moroso, o condición Sin atrasos y DNI Caducado. En ambos casos se bloquea un nuevo préstamo. Cambiar un saldo nunca borra la fecha, la fuente o la evidencia de una verificación.</w:t>
+        <w:t>Identidad y condición de pago son independientes: la mora o el DNI caducado bloquean nuevos préstamos, pero no cobros. Pagar no borra verificaciones.</w:t>
       </w:r>
     </w:p>
     <w:p>
       <w:r>
-        <w:t>Fallecido deja de ser una opción editable de condición financiera. La información acreditada sobre fallecimiento pertenece a la verificación de identidad y bloquea nuevos préstamos; el asesor no declara ni revierte ese hecho mediante un selector. La revisión de un DNI físico, por sí sola, no acredita la condición de no fallecido.</w:t>
+        <w:t>El fallecimiento acreditado bloquea nuevas colocaciones y no se modifica con un selector financiero. Revisar el DNI físico no acredita una consulta oficial de fallecimiento.</w:t>
       </w:r>
     </w:p>
     <w:p>
@@ -2546,7 +2551,7 @@
               <w:rPr>
                 <w:sz w:val="22"/>
               </w:rPr>
-              <w:t>DNI único y ficha compartida; nombres y apellidos exactos; agencia de registro inicial; fecha de caducidad; resultado, evidencia, fuente, fecha, asesor y agencia de cada revisión. La renovación agrega una revisión y conserva las anteriores. Una revalidación actualiza la misma ficha para todas las agencias.</w:t>
+              <w:t>DNI único para la persona y RUC de la empresa; ficha personal compartida con RUC 10, propietario y representante vinculados; nombres y apellidos exactos; agencia de registro inicial; fecha de caducidad; resultado, evidencia, fuente, fecha, asesor y agencia de cada revisión. La renovación agrega una revisión y conserva las anteriores. Una revalidación actualiza la misma ficha para todas las agencias.</w:t>
             </w:r>
           </w:p>
         </w:tc>
@@ -3217,10 +3222,67 @@
           </w:p>
         </w:tc>
       </w:tr>
+      <w:tr>
+        <w:trPr>
+          <w:cantSplit/>
+          <w:cantSplit/>
+        </w:trPr>
+        <w:tc>
+          <w:tcPr>
+            <w:tcW w:w="4514" w:type="dxa"/>
+            <w:tcMar>
+              <w:top w:w="60" w:type="dxa"/>
+              <w:left w:w="90" w:type="dxa"/>
+              <w:bottom w:w="60" w:type="dxa"/>
+              <w:right w:w="90" w:type="dxa"/>
+            </w:tcMar>
+            <w:vAlign w:val="center"/>
+          </w:tcPr>
+          <w:p>
+            <w:pPr>
+              <w:spacing w:before="20" w:after="20" w:line="240" w:lineRule="auto"/>
+            </w:pPr>
+            <w:r>
+              <w:rPr>
+                <w:sz w:val="22"/>
+              </w:rPr>
+              <w:t>Mora pactada</w:t>
+            </w:r>
+          </w:p>
+        </w:tc>
+        <w:tc>
+          <w:tcPr>
+            <w:tcW w:w="4974" w:type="dxa"/>
+            <w:tcMar>
+              <w:top w:w="60" w:type="dxa"/>
+              <w:left w:w="90" w:type="dxa"/>
+              <w:bottom w:w="60" w:type="dxa"/>
+              <w:right w:w="90" w:type="dxa"/>
+            </w:tcMar>
+            <w:vAlign w:val="center"/>
+          </w:tcPr>
+          <w:p>
+            <w:pPr>
+              <w:spacing w:before="20" w:after="20" w:line="240" w:lineRule="auto"/>
+            </w:pPr>
+            <w:r>
+              <w:rPr>
+                <w:sz w:val="22"/>
+              </w:rPr>
+              <w:t>Capital vencido impago × [(1 + tasa efectiva anual moratoria)^(días de atraso / base anual) − 1], redondeada por cuota a dos decimales. Base 360 o 365. Sin tasa pactada no se agrega mora; no se cobra sobre intereses ni cuotas futuras.</w:t>
+            </w:r>
+          </w:p>
+        </w:tc>
+      </w:tr>
     </w:tbl>
     <w:p>
       <w:r>
         <w:t xml:space="preserve"/>
+      </w:r>
+    </w:p>
+    <w:p>
+      <w:r>
+        <w:t>La configuración de mora corresponde a un asesor con permiso específico y motivo registrado. Solo afecta préstamos nuevos; cada préstamo conserva tasa y base pactadas. La confirmación rechaza condiciones o cotizaciones que hayan cambiado durante la revisión. No se establece una tasa moratoria predeterminada.</w:t>
       </w:r>
     </w:p>
     <w:p>
@@ -4292,7 +4354,7 @@
     </w:p>
     <w:p>
       <w:r>
-        <w:t>Días 1 y 2: ajustar acceso, permisos por agencia, identidad y datos. Días 3 y 4: integrar cronograma, pagos y estados automáticos. Día 5: probar el flujo completo, desplegar y preparar la demostración. Los cobros y estados automáticos amplían el alcance anterior y se incorporan como HU-07 y HU-08.</w:t>
+        <w:t>Días 1 y 2: ajustar acceso, permisos por agencia, identidad y datos. Días 3 y 4: integrar cronograma, pagos y estados automáticos. Día 5: probar el flujo completo, desplegar y preparar la demostración.</w:t>
       </w:r>
     </w:p>
     <w:p>
@@ -4441,7 +4503,7 @@
                 <w:b w:val="0"/>
                 <w:sz w:val="20"/>
               </w:rPr>
-              <w:t>Se solicita correo y contraseña; los campos vacíos impiden continuar.</w:t>
+              <w:t>Solicita correo y contraseña; los campos vacíos impiden continuar.</w:t>
             </w:r>
           </w:p>
           <w:p>
@@ -4463,7 +4525,7 @@
                 <w:b w:val="0"/>
                 <w:sz w:val="20"/>
               </w:rPr>
-              <w:t>Solo ingresa una cuenta válida y activa. El mensaje de rechazo no revela cuál credencial falló.</w:t>
+              <w:t>Solo ingresa una cuenta válida y activa. El rechazo de credenciales no identifica cuál falló.</w:t>
             </w:r>
           </w:p>
           <w:p>
@@ -4485,7 +4547,7 @@
                 <w:b w:val="0"/>
                 <w:sz w:val="20"/>
               </w:rPr>
-              <w:t>El sistema obtiene asesor y agencia de la cuenta. No permite elegir otra agencia ni operar con General.</w:t>
+              <w:t>Obtiene asesor y agencia de la cuenta; no permite elegir otra agencia ni usar General.</w:t>
             </w:r>
           </w:p>
           <w:p>
@@ -4507,7 +4569,7 @@
                 <w:b w:val="0"/>
                 <w:sz w:val="20"/>
               </w:rPr>
-              <w:t>Pantallas, consultas y operaciones requieren sesión y permisos. Abrir una dirección o alterar una solicitud no permite consultar carteras ajenas.</w:t>
+              <w:t>Pantallas y operaciones requieren sesión y permisos, incluso por URL directa o solicitudes alteradas.</w:t>
             </w:r>
           </w:p>
           <w:p>
@@ -4529,7 +4591,7 @@
                 <w:b w:val="0"/>
                 <w:sz w:val="20"/>
               </w:rPr>
-              <w:t>Se eliminan el panel y los accesos rápidos de cuentas de demostración. No se muestran ni precargan contraseñas de prueba.</w:t>
+              <w:t>No muestra accesos rápidos ni contraseñas de demostración.</w:t>
             </w:r>
           </w:p>
           <w:p>
@@ -4551,7 +4613,7 @@
                 <w:b w:val="0"/>
                 <w:sz w:val="20"/>
               </w:rPr>
-              <w:t>Se abre Préstamos con la cartera propia. La cabecera identifica nombre y rol, agencia, fecha de Perú y tiempo restante de sesión, en ese orden. Las contraseñas no se conservan en texto plano.</w:t>
+              <w:t>Abre Préstamos con cartera propia. La cabecera muestra nombre y rol, agencia, fecha de Perú y contador, en ese orden.</w:t>
             </w:r>
           </w:p>
           <w:p>
@@ -4573,7 +4635,7 @@
                 <w:b w:val="0"/>
                 <w:sz w:val="20"/>
               </w:rPr>
-              <w:t>Un nuevo inicio válido reemplaza al anterior de esa cuenta. La base rechaza operaciones de la sesión anterior y la interfaz la detecta en el siguiente control, hasta 15 segundos con conexión. Varias pestañas del mismo navegador comparten sesión.</w:t>
+              <w:t>Otro inicio válido de la misma cuenta reemplaza al anterior. La base lo bloquea y la interfaz lo detecta en hasta 15 segundos con conexión; las pestañas comparten sesión.</w:t>
             </w:r>
           </w:p>
           <w:p>
@@ -4595,7 +4657,7 @@
                 <w:b w:val="0"/>
                 <w:sz w:val="20"/>
               </w:rPr>
-              <w:t>El tiempo máximo es 15 minutos sin interacción. Teclado, puntero y desplazamiento renuevan la actividad con envíos limitados; las consultas automáticas no la renuevan. El contador usa la referencia del servidor y una sesión vencida no se reactiva con el mismo identificador.</w:t>
+              <w:t>Cierra tras 15 minutos sin interacción. Teclado, puntero y desplazamiento renuevan actividad con envíos limitados; el sondeo no renueva. Usa tiempo del servidor y no reactiva sesiones vencidas.</w:t>
             </w:r>
           </w:p>
         </w:tc>
@@ -4734,7 +4796,7 @@
                 <w:b w:val="0"/>
                 <w:sz w:val="20"/>
               </w:rPr>
-              <w:t>Cerrar sesión está visible durante una sesión activa.</w:t>
+              <w:t>Cerrar sesión permanece visible durante una sesión activa.</w:t>
             </w:r>
           </w:p>
           <w:p>
@@ -4756,7 +4818,7 @@
                 <w:b w:val="0"/>
                 <w:sz w:val="20"/>
               </w:rPr>
-              <w:t>Se invalida la sesión actual y se vuelve al acceso. Volver atrás o abrir una ruta protegida exige autenticarse otra vez. Cerrar una sesión antigua no revoca una sesión posterior en otra computadora.</w:t>
+              <w:t>Invalida la sesión actual y vuelve al acceso. Las rutas protegidas exigen nuevo ingreso; cerrar una sesión antigua no revoca una posterior de otra computadora.</w:t>
             </w:r>
           </w:p>
           <w:p>
@@ -4778,7 +4840,7 @@
                 <w:b w:val="0"/>
                 <w:sz w:val="20"/>
               </w:rPr>
-              <w:t>Se advierte antes de abandonar o cerrar manualmente con datos sin confirmar. Al vencer la sesión o ser reemplazada, el cierre es obligatorio y los borradores se pierden. Las verificaciones ya guardadas y las operaciones confirmadas permanecen.</w:t>
+              <w:t>Advierte antes de abandonar manualmente datos sin confirmar. El cierre obligatorio pierde borradores; las verificaciones guardadas y operaciones confirmadas permanecen.</w:t>
             </w:r>
           </w:p>
           <w:p>
@@ -4800,7 +4862,7 @@
                 <w:b w:val="0"/>
                 <w:sz w:val="20"/>
               </w:rPr>
-              <w:t>El contador se vuelve ámbar en los últimos dos minutos y rojo en el último. Durante el último minuto se ofrece Continuar sesión o Cerrar sesión. Continuar solo renueva una sesión que siga válida.</w:t>
+              <w:t>Contador ámbar en los últimos dos minutos y rojo en el último. El aviso ofrece Continuar sesión o Cerrar sesión; continuar exige sesión aún válida.</w:t>
             </w:r>
           </w:p>
           <w:p>
@@ -4822,7 +4884,7 @@
                 <w:b w:val="0"/>
                 <w:sz w:val="20"/>
               </w:rPr>
-              <w:t>La inactividad, una sesión reemplazada o una cuenta sin acceso bloquean las operaciones y devuelven al inicio con su motivo.</w:t>
+              <w:t>Inactividad, sesión reemplazada o cuenta sin acceso bloquean operaciones y devuelven al inicio con el motivo.</w:t>
             </w:r>
           </w:p>
         </w:tc>
@@ -4970,7 +5032,7 @@
                 <w:b w:val="0"/>
                 <w:sz w:val="20"/>
               </w:rPr>
-              <w:t>DNI de exactamente ocho dígitos numéricos para una persona natural peruana. Se conservan ceros iniciales; letras, signos e ingreso incompleto impiden consultar. Se valida en pantalla y servidor. RUC 10 y RUC 20 se admiten con validación de formato, dígito verificador y consulta externa firmada. Extranjería queda fuera del incremento.</w:t>
+              <w:t>DNI peruano de ocho dígitos; RUC de once, prefijo 10 o 20 y dígito verificador. Conserva ceros iniciales y valida en pantalla y servidor. Extranjería y otros prefijos quedan fuera.</w:t>
             </w:r>
           </w:p>
           <w:p>
@@ -4992,7 +5054,7 @@
                 <w:b w:val="0"/>
                 <w:sz w:val="20"/>
               </w:rPr>
-              <w:t>Nuevo préstamo comprueba el DNI en las cinco agencias. Reutiliza la ficha aprobada y vigente sin duplicar ni repetir consulta externa; revalida la pendiente, incompleta o caducada. El nuevo conserva identidad y evidencia solo en memoria al continuar al paso 2; se registra al confirmar el paso 3. Abandonar o recargar descarta el borrador.</w:t>
+              <w:t>Reutiliza la ficha vigente entre agencias sin duplicar consultas de DNI. El nuevo queda en memoria y se guarda junto con el préstamo en el paso 3; abandonar lo descarta.</w:t>
             </w:r>
           </w:p>
           <w:p>
@@ -5014,7 +5076,7 @@
                 <w:b w:val="0"/>
                 <w:sz w:val="20"/>
               </w:rPr>
-              <w:t>Para el registro nuevo o la revalidación necesaria se consulta la fuente de identidad seleccionada. Se conservan nombres y apellidos originales, incluidas tildes, sin edición manual. Corregir el DNI exige repetir la comprobación interna y, si corresponde, la consulta de identidad.</w:t>
+              <w:t>Consulta identidad para nuevos o revalidaciones. Nombres y apellidos originales no se editan; cambiar documento exige repetir su comprobación.</w:t>
             </w:r>
           </w:p>
           <w:p>
@@ -5036,7 +5098,7 @@
                 <w:b w:val="0"/>
                 <w:sz w:val="20"/>
               </w:rPr>
-              <w:t>Se registra la fecha de caducidad y la revisión del DNI original. El asesor confirma mediante dos casillas la revisión del DNI original y la presencia física del cliente. Las referencias se generan automáticamente y describen esa revisión presencial; no acreditan una consulta oficial de fallecimiento ni inventan datos ausentes de la API.</w:t>
+              <w:t>Registra caducidad y confirma DNI original y presencia con dos casillas. Genera referencias descriptivas; esta revisión no acredita una consulta oficial de fallecimiento.</w:t>
             </w:r>
           </w:p>
           <w:p>
@@ -5058,7 +5120,7 @@
                 <w:b w:val="0"/>
                 <w:sz w:val="20"/>
               </w:rPr>
-              <w:t>La verificación puede estar Pendiente, Aprobada, Caducada o Rechazada. No depende de que el cliente tenga mora. Fallecido no es una condición financiera seleccionable por el asesor.</w:t>
+              <w:t>Verificación Pendiente, Aprobada, Caducada o Rechazada, separada de la condición de pago. Fallecido no es una condición financiera editable.</w:t>
             </w:r>
           </w:p>
           <w:p>
@@ -5080,7 +5142,7 @@
                 <w:b w:val="0"/>
                 <w:sz w:val="20"/>
               </w:rPr>
-              <w:t>El DNI es vigente hasta su fecha de caducidad inclusive; desde el día siguiente se bloquea un nuevo préstamo. Una revalidación requiere evidencia del documento renovado, no solo pulsar Habilitar.</w:t>
+              <w:t>El DNI es vigente hasta su caducidad inclusive. Desde el día siguiente bloquea nuevos préstamos; revalidar exige revisar el documento renovado.</w:t>
             </w:r>
           </w:p>
           <w:p>
@@ -5102,7 +5164,7 @@
                 <w:b w:val="0"/>
                 <w:sz w:val="20"/>
               </w:rPr>
-              <w:t>Un documento inexistente o una consulta inconclusa impiden completar esa verificación. Un error técnico o de disponibilidad no se guarda como rechazo de identidad. Se permite reintentar; el formato por sí solo no acredita identidad.</w:t>
+              <w:t>Documento inexistente o consulta inconclusa impiden verificar. Un fallo técnico no se guarda como rechazo; permite reintentar y no bloquea pagar deudas existentes.</w:t>
             </w:r>
           </w:p>
           <w:p>
@@ -5124,7 +5186,7 @@
                 <w:b w:val="0"/>
                 <w:sz w:val="20"/>
               </w:rPr>
-              <w:t>Guardar una verificación existente actualiza la misma ficha y conserva historial, fuente, evidencia, fecha, asesor y agencia aunque no finalice otro préstamo. Desde ficha se consulta automáticamente el documento fijo y se vuelve a la ficha al guardar. La acción sigue disponible con datos vigentes; no elimina mora ni requiere crear un préstamo.</w:t>
+              <w:t>Desde ficha consulta automáticamente el documento fijo y regresa al guardar. Conserva evidencia, fecha, asesor, agencia e historial compartido; permite actualizar datos vigentes y no elimina mora.</w:t>
             </w:r>
           </w:p>
           <w:p>
@@ -5146,7 +5208,7 @@
                 <w:b w:val="0"/>
                 <w:sz w:val="20"/>
               </w:rPr>
-              <w:t>Actualizar datos SUNAT compara nombre o razón social, estado, condición y domicilio con lo guardado. Permite guardar una consulta firmada aunque no haya cambios o el RUC esté observado; conserva fecha e historial. Los datos del proveedor no se editan manualmente. No equivale a revalidar DNI, propiedad ni facultades.</w:t>
+              <w:t>SUNAT compara razón social, estado, condición y domicilio. Permite guardar consulta firmada sin cambios o con observaciones. No edita datos externos ni revalida DNI, propiedad o facultades; no hay actualización periódica.</w:t>
             </w:r>
           </w:p>
           <w:p>
@@ -5168,7 +5230,7 @@
                 <w:b w:val="0"/>
                 <w:sz w:val="20"/>
               </w:rPr>
-              <w:t>En RUC 20 el propietario puede firmar si tiene facultades, o puede acudir otro representante. El propietario ausente debe tener identidad previa aprobada y vigente; no recibe verificación presencial nueva. El firmante debe estar presente. Se revisan propiedad/designación y facultades con tipo y referencia breve; un mismo documento puede acreditar ambas, con dos confirmaciones separadas.</w:t>
+              <w:t>RUC 20 distingue propietario y firmante. El ausente requiere identidad previa vigente; el firmante debe estar presente. Registra tipo y referencia de propiedad/designación y facultades, con dos revisiones aunque compartan documento. Varios propietarios exigen designación. Recupera referencias sin aprobarlas; no reasigna propietario.</w:t>
             </w:r>
           </w:p>
         </w:tc>
@@ -5305,7 +5367,7 @@
               <w:rPr>
                 <w:b w:val="0"/>
               </w:rPr>
-              <w:t>Se reutiliza el cliente de HU-03 o de su ficha. No se vuelven a escribir DNI y nombre ni se abre un buscador general dentro del formulario del préstamo.</w:t>
+              <w:t>Reutiliza cliente y documento desde HU-03 o ficha, sin volver a escribir identidad ni abrir otro buscador.</w:t>
             </w:r>
           </w:p>
           <w:p>
@@ -5325,7 +5387,7 @@
               <w:rPr>
                 <w:b w:val="0"/>
               </w:rPr>
-              <w:t>Al iniciar y confirmar se exige identidad aprobada y vigente, ausencia de mora, historial conciliado y capital disponible. El antecedente extrajudicial requiere autorización registrada. La modalidad DNI no exige ACTIVO/HABIDO de un RUC 10 asociado; solicitar por RUC sí exige consulta válida ACTIVO/HABIDO y, en empresa, identidad y facultades del propietario y firmante.</w:t>
+              <w:t>Exige identidad vigente, sin mora, historial conciliado, capital y autorización cuando corresponda. DNI personal no exige estado SUNAT del RUC 10 asociado; solicitar por RUC sí exige ACTIVO/HABIDO y personas/facultades verificadas.</w:t>
             </w:r>
           </w:p>
           <w:p>
@@ -5345,7 +5407,7 @@
               <w:rPr>
                 <w:b w:val="0"/>
               </w:rPr>
-              <w:t>La fecha es la del día de operación en Perú. Agencia de origen y asesor se obtienen de la sesión y no son editables.</w:t>
+              <w:t>Fecha de Perú, agencia y asesor provienen de la sesión y no son editables.</w:t>
             </w:r>
           </w:p>
           <w:p>
@@ -5365,7 +5427,7 @@
               <w:rPr>
                 <w:b w:val="0"/>
               </w:rPr>
-              <w:t>Campo inicial 0.00 con soles y centavos separados por un punto fijo. Solo admite dígitos; mínimo S/ 0.01 y máximo el capital disponible del propietario, hasta S/ 10 000. No acepta signos, letras ni más de dos cifras de centavos; cero impide continuar. El servidor repite la validación.</w:t>
+              <w:t>Inicial 0.00, punto fijo y solo dígitos en soles y dos cifras de centavos. Mínimo S/ 0.01 y máximo disponible, hasta S/ 10 000; cero, signos, letras o precisión adicional impiden continuar.</w:t>
             </w:r>
           </w:p>
           <w:p>
@@ -5385,7 +5447,7 @@
               <w:rPr>
                 <w:b w:val="0"/>
               </w:rPr>
-              <w:t>El capital pendiente del propietario y todas sus empresas vinculadas entre agencias más la nueva solicitud no supera S/ 10 000. Solo la amortización efectivamente pagada libera cupo; los intereses no lo liberan. Un representante sin vínculo de propiedad no aporta su límite al grupo.</w:t>
+              <w:t>Suma capital pendiente del propietario y sus empresas entre agencias. Solo amortización pagada libera cupo. El representante sin propiedad no aporta su límite al grupo.</w:t>
             </w:r>
           </w:p>
           <w:p>
@@ -5405,7 +5467,7 @@
               <w:rPr>
                 <w:b w:val="0"/>
               </w:rPr>
-              <w:t>La validación de elegibilidad y capital se repite al confirmar mediante una operación indivisible que evita exceder el límite con solicitudes simultáneas.</w:t>
+              <w:t>Repite elegibilidad y cupo al confirmar de forma transaccional para impedir exceder el capital con solicitudes simultáneas.</w:t>
             </w:r>
           </w:p>
           <w:p>
@@ -5425,7 +5487,7 @@
               <w:rPr>
                 <w:b w:val="0"/>
               </w:rPr>
-              <w:t>Campo inicial 0 y entrada solo de dígitos enteros hasta 60. Para continuar se exige de 1 a 60 meses; no se admiten signos ni decimales. La TEA fija del 30 % es visible y no se suma como un porcentaje plano a cualquier duración.</w:t>
+              <w:t>Plazo inicial 0; solo enteros de 1 a 60 para continuar. TEA fija del 30 %, no porcentaje plano para cualquier duración.</w:t>
             </w:r>
           </w:p>
           <w:p>
@@ -5445,7 +5507,7 @@
               <w:rPr>
                 <w:b w:val="0"/>
               </w:rPr>
-              <w:t>Revisar el paso 3 no guarda datos. Al confirmar se guardan cliente nuevo, verificación, préstamo y cuotas en una sola transacción; cualquier fallo revierte todo. En el existente se conserva su ficha y la revalidación ya guardada. La clave de operación evita duplicados por doble clic o reintentos. Si la consulta firmada del nuevo supera 30 minutos, se exige volver al paso 1.</w:t>
+              <w:t>Revisar no guarda. Confirmar registra alta nueva, evidencia, empresa cuando corresponda, préstamo y cuotas conjuntamente; un fallo revierte todo. Conserva revalidaciones existentes y evita duplicados por clave. Firma mayor de 30 minutos exige nueva consulta.</w:t>
             </w:r>
           </w:p>
           <w:p>
@@ -5465,7 +5527,7 @@
               <w:rPr>
                 <w:b w:val="0"/>
               </w:rPr>
-              <w:t>El préstamo confirmado pertenece a la agencia de la sesión y solo se consulta por acceso ordinario desde ella. El cliente aparece también en su listado de Clientes, sin duplicar la ficha ni trasladar préstamos anteriores. No se editan o anulan condiciones en este sprint; los pagos se registran por HU-07.</w:t>
+              <w:t>El préstamo pertenece a la agencia de sesión y añade allí al titular sin duplicar ficha ni trasladar préstamos. No permite editar ni anular lo confirmado.</w:t>
             </w:r>
           </w:p>
           <w:p>
@@ -5485,7 +5547,7 @@
               <w:rPr>
                 <w:b w:val="0"/>
               </w:rPr>
-              <w:t>El tipo de cliente se elige solo en el paso 1, que no muestra Volver. En los pasos 2 y 3 queda fijo. Volver del cronograma conserva condiciones; volver desde condiciones a identificación requiere confirmar el descarte cuando corresponde. Hay una sola acción Continuar a condiciones y no se añade Consultar clientes dentro del flujo.</w:t>
+              <w:t>Tipo de cliente solo modificable en paso 1, sin Volver allí. Regresar de cronograma conserva condiciones; volver a identificación confirma el descarte cuando corresponde. No duplica Continuar ni Consultar clientes.</w:t>
             </w:r>
           </w:p>
         </w:tc>
@@ -5622,7 +5684,7 @@
               <w:rPr>
                 <w:b w:val="0"/>
               </w:rPr>
-              <w:t>Se utilizan monto, fecha, plazo y TEA de HU-04. Se genera una cuota por mes del plazo.</w:t>
+              <w:t>Usa monto, fecha, plazo y TEA del préstamo; genera una cuota por mes.</w:t>
             </w:r>
           </w:p>
           <w:p>
@@ -5642,7 +5704,7 @@
               <w:rPr>
                 <w:b w:val="0"/>
               </w:rPr>
-              <w:t>TEM = (1 + 0,30)^(1/12) − 1, aproximadamente 2,210445 %. Se aplica amortización francesa: interés sobre capital pendiente y amortización como diferencia entre cuota e interés. La base convencional de 360 días no convierte las fechas en intervalos fijos de 30 días.</w:t>
+              <w:t>TEM = (1 + 0,30)^(1/12) − 1, aproximadamente 2,210445 %. Sistema francés: interés sobre saldo y amortización como cuota menos interés.</w:t>
             </w:r>
           </w:p>
           <w:p>
@@ -5662,7 +5724,7 @@
               <w:rPr>
                 <w:b w:val="0"/>
               </w:rPr>
-              <w:t>Cada fecha se obtiene sumando meses a la fecha original del préstamo. Se conserva el día original; si falta, se toma el último día del mes. Se consideran bisiestos y no se desplaza por fines de semana.</w:t>
+              <w:t>Suma meses a la fecha original, conserva el día y usa el último del mes si falta. Considera bisiestos, sin ajuste por fines de semana.</w:t>
             </w:r>
           </w:p>
           <w:p>
@@ -5682,7 +5744,7 @@
               <w:rPr>
                 <w:b w:val="0"/>
               </w:rPr>
-              <w:t>Número, vencimiento, cuota, interés, amortización y saldo de capital programado. Se identifican cliente, código, agencia de origen, monto, plazo, TEA, TEM, total de intereses y total de cuotas.</w:t>
+              <w:t>Muestra número, vencimiento, cuota, interés, amortización y saldo; identifica titular, código, agencia, monto, plazo, TEA, TEM y totales.</w:t>
             </w:r>
           </w:p>
           <w:p>
@@ -5702,7 +5764,7 @@
               <w:rPr>
                 <w:b w:val="0"/>
               </w:rPr>
-              <w:t>Dos decimales; última cuota ajustada para saldo final S/ 0,00. Sin comisiones, seguros ni penalidades. La mora pactada se calcula por separado del cronograma.</w:t>
+              <w:t>Dos decimales y última cuota ajustada a saldo cero. Sin comisiones, seguros ni penalidades; la mora pactada se calcula aparte.</w:t>
             </w:r>
           </w:p>
           <w:p>
@@ -5722,7 +5784,7 @@
               <w:rPr>
                 <w:b w:val="0"/>
               </w:rPr>
-              <w:t>Se guarda el cronograma mostrado junto con el préstamo. Consultarlo o registrar pagos no lo recalcula con otra tasa o fecha; el estado de cobro se muestra por separado.</w:t>
+              <w:t>Guarda el cronograma confirmado sin recalcularlo al consultar o pagar. El contrato nuevo conserva identidad, modalidad y personas vinculadas; revalidaciones posteriores no alteran esa copia.</w:t>
             </w:r>
           </w:p>
           <w:p>
@@ -5742,7 +5804,7 @@
               <w:rPr>
                 <w:b w:val="0"/>
               </w:rPr>
-              <w:t>Después de confirmar, Cronograma ofrece descargar PDF o imprimir desde una vista protegida. Contrato ofrece Word o impresión y guardado como PDF desde el navegador. Reintentar una descarga no crea otro préstamo.</w:t>
+              <w:t>Cronograma agrupa PDF e impresión. Contrato agrupa Word e impresión/guardar PDF, con plantilla del profesor y anexo de condiciones. Descargar de nuevo no crea préstamo.</w:t>
             </w:r>
           </w:p>
           <w:p>
@@ -5762,7 +5824,7 @@
               <w:rPr>
                 <w:b w:val="0"/>
               </w:rPr>
-              <w:t>Para S/ 1 000 a seis meses con la TEM definida, las primeras cinco cuotas son S/ 179,80 y la última S/ 179,77. Capital amortizado S/ 1 000, interés total S/ 78,77 y total programado S/ 1 078,77.</w:t>
+              <w:t>Para S/ 1 000 a seis meses: primeras cinco cuotas S/ 179,80 y última S/ 179,77; capital S/ 1 000, interés S/ 78,77 y total S/ 1 078,77.</w:t>
             </w:r>
           </w:p>
           <w:p>
@@ -5782,7 +5844,7 @@
               <w:rPr>
                 <w:b w:val="0"/>
               </w:rPr>
-              <w:t>12/05/2026 → 12/06/2026. Para 31/01/2028, los siguientes vencimientos son 29/02/2028 y 31/03/2028. Estos ajustes no cambian la TEM mensual adoptada.</w:t>
+              <w:t>12/05/2026 vence el 12/06/2026. Desde 31/01/2028: 29/02/2028 y 31/03/2028; el ajuste no cambia la TEM.</w:t>
             </w:r>
           </w:p>
         </w:tc>
@@ -5921,7 +5983,7 @@
                 <w:b w:val="0"/>
                 <w:sz w:val="20"/>
               </w:rPr>
-              <w:t>Préstamos muestra exclusivamente operaciones originadas en la agencia de la sesión, de más recientes a más antiguas. El control también se aplica en el acceso directo al detalle y en las consultas al servidor.</w:t>
+              <w:t>Solo operaciones originadas en la agencia, de más recientes a antiguas; también se restringe detalle y servidor.</w:t>
             </w:r>
           </w:p>
           <w:p>
@@ -5943,7 +6005,7 @@
                 <w:b w:val="0"/>
                 <w:sz w:val="20"/>
               </w:rPr>
-              <w:t>Activos por defecto; filtros Activos, Cancelados o Todos y tipo Todos, Personas o Empresas. Búsqueda por DNI exacto, RUC exacto o Código de préstamo en la cartera propia. Documento muestra DNI en personas y RUC en empresas; se conservan fecha, monto original, plazo, estado y Ver detalle, sin columna Deuda pendiente.</w:t>
+              <w:t>Activos por defecto; filtros Activos/Cancelados/Todos y Personas/Empresas/Todos. Busca DNI, RUC o PR-. Documento muestra DNI personal o RUC empresarial, con monto, plazo, fecha, estado y detalle.</w:t>
             </w:r>
           </w:p>
           <w:p>
@@ -5965,7 +6027,7 @@
                 <w:b w:val="0"/>
                 <w:sz w:val="20"/>
               </w:rPr>
-              <w:t>Listado y búsqueda muestran solo titulares con algún préstamo confirmado en la agencia, incluidos los ya pagados. Un registro sin préstamo local, una empresa vinculada sin cartera local o un representante sin préstamo propio no se incorporan por ese motivo. Cobrar un préstamo ajeno tampoco incorpora al titular.</w:t>
+              <w:t>Solo titulares con préstamos confirmados locales, incluidos pagados. Registrar identidad, acceder a un vínculo o cobrar una deuda ajena no los incorpora al listado.</w:t>
             </w:r>
           </w:p>
           <w:p>
@@ -5987,7 +6049,7 @@
                 <w:b w:val="0"/>
                 <w:sz w:val="20"/>
               </w:rPr>
-              <w:t>DNI y RUC 10 comparten una ficha; cada RUC 20 conserva ficha propia vinculada al propietario. Las agencias con acceso al grupo ven identidad y vínculos compartidos, sin ampliar su cartera de préstamos. La ficha resumida muestra identificación, condición de pago, capital y vínculos; los historiales se abren aparte. No incluye la tabla Préstamos en tu agencia.</w:t>
+              <w:t>DNI/RUC 10 comparten ficha; RUC 20 conserva ficha separada. El grupo autorizado comparte identificación, condición, capital y vínculos. No repite préstamos; los historiales se abren aparte.</w:t>
             </w:r>
           </w:p>
           <w:p>
@@ -6009,7 +6071,7 @@
                 <w:b w:val="0"/>
                 <w:sz w:val="20"/>
               </w:rPr>
-              <w:t>Solicitar préstamo despliega Personal DNI y Negocio RUC 10 cuando existen ambos documentos; con una sola modalidad entra directamente. Sin capital o elegibilidad queda bloqueado. Revalidar datos ofrece DNI o RUC 10 en la ficha; RUC 20 abre SUNAT. Consultar para pagar conserva el titular y Ver historial ofrece DNI/RUC según corresponda.</w:t>
+              <w:t>Solicitar préstamo despliega DNI/RUC 10 cuando existen ambos; sin elegibilidad o cupo queda bloqueado. Revalidar datos ofrece DNI/RUC 10, o SUNAT directo para RUC 20. Incluye Consultar para pagar y Ver historial.</w:t>
             </w:r>
           </w:p>
           <w:p>
@@ -6031,7 +6093,7 @@
                 <w:b w:val="0"/>
                 <w:sz w:val="20"/>
               </w:rPr>
-              <w:t>Tres cuadros principales: Total a pagar (cuotas originales y mora pactada), Total pagado (cobros confirmados) y Saldo por pagar (diferencia). Se presentan en una fila en escritorio y se adaptan en móvil. El estado va junto al título; TEA, TEM e interés total programado en Datos del préstamo. El capital pendiente se consulta en el resumen del cliente. El interés no se suma otra vez como cargo adicional.</w:t>
+              <w:t>Detalle muestra Total a pagar, Total pagado y Saldo por pagar, con mora pactada, estado, TEA, TEM e interés total; diseño adaptable a móvil.</w:t>
             </w:r>
           </w:p>
           <w:p>
@@ -6053,7 +6115,7 @@
                 <w:b w:val="0"/>
                 <w:sz w:val="20"/>
               </w:rPr>
-              <w:t>Cada cuota muestra importe, interés, capital, vencimiento y estado. Registrar pago abre Pagos con el préstamo y sus cuotas cargados automáticamente, con código y tipo fijos y regreso al mismo detalle. Se desplaza al titular seleccionado; la carga no confirma el cobro.</w:t>
+              <w:t>Registrar pago carga el préstamo y cuotas automáticamente con código/tipo fijos y regreso al mismo detalle. Desplaza al titular; no confirma el cobro.</w:t>
             </w:r>
           </w:p>
           <w:p>
@@ -6075,7 +6137,7 @@
                 <w:b w:val="0"/>
                 <w:sz w:val="20"/>
               </w:rPr>
-              <w:t>Un préstamo ajeno no aparece en la cartera local ni se abre por su detalle ordinario. Pagos lo localiza por DNI, RUC o código para cobrar, conserva su agencia de origen y muestra las obligaciones del grupo del propietario cuando se consulta por documento.</w:t>
+              <w:t>Pagos localiza deudas entre agencias por DNI, RUC o código. No incorpora préstamos ajenos a la cartera ni habilita sus detalles ordinarios.</w:t>
             </w:r>
           </w:p>
           <w:p>
@@ -6097,7 +6159,7 @@
                 <w:b w:val="0"/>
                 <w:sz w:val="20"/>
               </w:rPr>
-              <w:t>Se recupera el PDF guardado sin alterar el préstamo. Una búsqueda sin coincidencias informa el resultado sin mostrar otros clientes ni registros ajenos a los permisos.</w:t>
+              <w:t>Recupera documentos sin alterar el préstamo. Una búsqueda vacía informa que no hay coincidencias, sin mostrar registros ajenos.</w:t>
             </w:r>
           </w:p>
           <w:p>
@@ -6119,7 +6181,7 @@
                 <w:b w:val="0"/>
                 <w:sz w:val="20"/>
               </w:rPr>
-              <w:t>DNI exacto acepta solo ocho dígitos numéricos y conserva ceros iniciales. Código de préstamo muestra PR- fijo y exige ocho caracteres hexadecimales (0 a 9 y A a F), convertidos a mayúsculas. Pegar el código completo no duplica el prefijo. Un valor incompleto o inválido impide consultar y muestra el motivo. Se valida en pantalla y servidor sin ampliar permisos.</w:t>
+              <w:t>DNI de ocho dígitos y RUC válido de once. PR- fijo más ocho hexadecimales en mayúsculas; pegar código completo no duplica prefijo. Entrada inválida impide consultar.</w:t>
             </w:r>
           </w:p>
         </w:tc>
@@ -6264,7 +6326,7 @@
                 <w:b w:val="0"/>
                 <w:sz w:val="22"/>
               </w:rPr>
-              <w:t>Pagos general permite DNI, RUC o código. DNI, RUC 10 o RUC 20 consultan las obligaciones del mismo propietario y sus empresas entre agencias; el representante por sí solo no une grupos. Desde ficha el documento queda fijo y desde detalle el préstamo queda fijo por su UUID autorizado. Ambos consultan automáticamente y ofrecen regreso al origen, sin Cambiar cliente.</w:t>
+              <w:t>DNI, RUC 10 o RUC 20 reúnen deudas del propietario y sus empresas entre agencias; ser representante no une grupos. Desde ficha fija documento; desde detalle fija UUID autorizado. Consulta automática y regreso al origen, sin Cambiar cliente.</w:t>
             </w:r>
           </w:p>
           <w:p>
@@ -6286,7 +6348,7 @@
                 <w:b w:val="0"/>
                 <w:sz w:val="22"/>
               </w:rPr>
-              <w:t>Se muestran titular, código, agencia de origen, deuda y cuotas pendientes del préstamo. No se exige DNI vigente ni ausencia de mora para aceptar el pago de una obligación existente.</w:t>
+              <w:t>Muestra titular, código, agencia de origen, deuda y cuotas. No exige DNI vigente, RUC habilitado ni ausencia de mora para pagar.</w:t>
             </w:r>
           </w:p>
           <w:p>
@@ -6308,7 +6370,7 @@
                 <w:b w:val="0"/>
                 <w:sz w:val="22"/>
               </w:rPr>
-              <w:t>Se selecciona una o varias cuotas completas consecutivas, comenzando por la pendiente más antigua del préstamo. Se admite cubrir la próxima cuota programada sin recalcularla; no se omiten cuotas anteriores. No se incluyen abonos parciales ni pagos extraordinarios a capital.</w:t>
+              <w:t>Cuotas completas consecutivas desde la pendiente más antigua del préstamo. Admite la próxima cuota sin recalcular; excluye abonos parciales y pagos extraordinarios a capital.</w:t>
             </w:r>
           </w:p>
           <w:p>
@@ -6330,7 +6392,7 @@
                 <w:b w:val="0"/>
                 <w:sz w:val="22"/>
               </w:rPr>
-              <w:t>El importe se obtiene sumando las cuotas seleccionadas y su mora pactada calculada a la fecha de Perú y no se escribe libremente. Se revisa el resumen y se confirma solo cuando el asesor ha recibido el dinero. No es una integración bancaria ni una casilla reversible.</w:t>
+              <w:t>Suma cuotas seleccionadas y mora a la fecha de Perú; el importe no es editable. Exige confirmar dinero recibido y aceptar el cobro; no integra un banco.</w:t>
             </w:r>
           </w:p>
           <w:p>
@@ -6352,7 +6414,7 @@
                 <w:b w:val="0"/>
                 <w:sz w:val="22"/>
               </w:rPr>
-              <w:t>Se genera identificador de pago y se guardan importe, fecha y hora, asesor, agencia de cobro, préstamo y aplicación por cuota. La agencia de origen permanece inalterada. Se emite una constancia recuperable del pago registrado.</w:t>
+              <w:t>Guarda identificador, fecha/hora, asesor, agencia de cobro, préstamo y aplicación por cuota. Conserva origen y emite constancia recuperable desde origen o agencia de cobro.</w:t>
             </w:r>
           </w:p>
           <w:p>
@@ -6374,7 +6436,7 @@
                 <w:b w:val="0"/>
                 <w:sz w:val="22"/>
               </w:rPr>
-              <w:t>Pago, aplicación y saldos se actualizan conjuntamente. El doble clic, el reintento o dos agencias cobrando la misma cuota no duplican el cobro; si falla la operación no queda un pago parcialmente aplicado.</w:t>
+              <w:t>La clave evita duplicar el mismo reintento y se rechazan cuotas ya cobradas. Un fallo no deja aplicaciones incompletas. Si se pierde la respuesta, revisar historial antes de iniciar otro cobro.</w:t>
             </w:r>
           </w:p>
           <w:p>
@@ -6396,7 +6458,7 @@
                 <w:b w:val="0"/>
                 <w:sz w:val="22"/>
               </w:rPr>
-              <w:t>Las cuotas cubiertas pasan a Pagada, disminuyen deuda y capital pendiente según su amortización y se recalcula la condición del cliente. Si todas las cuotas están pagadas, el préstamo pasa a Cancelado por pago total.</w:t>
+              <w:t>Marca cuotas pagadas, reduce deuda y capital por su amortización y recalcula condición. Pago total cancela el préstamo.</w:t>
             </w:r>
           </w:p>
           <w:p>
@@ -6418,7 +6480,7 @@
                 <w:b w:val="0"/>
                 <w:sz w:val="22"/>
               </w:rPr>
-              <w:t>No se sobrescribe el cronograma original ni se desmarca un pago confirmado. Reversos, devoluciones o correcciones de cobros quedan fuera de este sprint; la constancia no se presenta como comprobante tributario.</w:t>
+              <w:t>No modifica el cronograma ni desmarca pagos confirmados. Reversos y devoluciones quedan fuera; la constancia no es comprobante tributario.</w:t>
             </w:r>
           </w:p>
           <w:p>
@@ -6440,7 +6502,7 @@
                 <w:b w:val="0"/>
                 <w:sz w:val="22"/>
               </w:rPr>
-              <w:t>Se aplican las mismas reglas que en HU-06 CA10: DNI de ocho dígitos, RUC válido de once dígitos o PR- fijo más ocho caracteres hexadecimales. Se admite pegar el código completo sin duplicar el prefijo. Se valida en pantalla y servidor antes de consultar; un error no muestra otros registros.</w:t>
+              <w:t>Valida documento o PR- antes de consultar, según HU-06 CA10. Un error no muestra otras identidades.</w:t>
             </w:r>
           </w:p>
           <w:p>
@@ -6462,7 +6524,7 @@
                 <w:b w:val="0"/>
                 <w:sz w:val="22"/>
               </w:rPr>
-              <w:t>Cobrar un préstamo de otra agencia registra la agencia que recibió el dinero, pero no cambia la agencia de origen ni incorpora por sí solo al cliente al listado de Clientes de la agencia de cobro.</w:t>
+              <w:t>Cobrar en otra agencia registra quién recibió el dinero, sin cambiar origen ni incorporar al cliente a su listado.</w:t>
             </w:r>
           </w:p>
           <w:p>
@@ -6484,7 +6546,7 @@
                 <w:b w:val="0"/>
                 <w:sz w:val="22"/>
               </w:rPr>
-              <w:t>Solo Pagos general permite editar documento o tipo. Cualquier cambio limpia resultados, selección de préstamo, cuotas y confirmación de dinero recibido; las respuestas antiguas se descartan. Desde ficha o detalle se conservan los campos fijos y el enlace de regreso al mismo origen.</w:t>
+              <w:t>Solo la búsqueda general permite editar documento/tipo. Cualquier cambio limpia resultados, cuotas y confirmación y descarta respuestas antiguas; los flujos fijos conservan su origen.</w:t>
             </w:r>
           </w:p>
           <w:p>
@@ -6506,7 +6568,7 @@
                 <w:b w:val="0"/>
                 <w:sz w:val="22"/>
               </w:rPr>
-              <w:t>Elegir préstamo o cargar un resultado único desplaza y enfoca el recuadro del titular con margen superior de 8 px. La lista con varios resultados no fuerza el desplazamiento. Cambiar cantidad de cuotas no repite el movimiento; se respeta reducir animaciones y permanecen los indicadores de foco de controles.</w:t>
+              <w:t>Elegir préstamo o cargar resultado único enfoca y desplaza al titular. Una lista múltiple o cambiar cuotas no repiten el movimiento; respeta reducir animaciones y foco accesible.</w:t>
             </w:r>
           </w:p>
         </w:tc>
@@ -6643,7 +6705,7 @@
               <w:rPr>
                 <w:b w:val="0"/>
               </w:rPr>
-              <w:t>Se usa la fecha de Perú. Una cuota impaga con vencimiento de hoy aún no está vencida; entra en mora al día siguiente.</w:t>
+              <w:t>Fecha de Perú: una cuota impaga de hoy vence al día siguiente.</w:t>
             </w:r>
           </w:p>
           <w:p>
@@ -6663,7 +6725,7 @@
               <w:rPr>
                 <w:b w:val="0"/>
               </w:rPr>
-              <w:t>Se consideran la persona y sus empresas vinculadas entre agencias. Extrajudicial tiene prioridad a los doce meses de la cuota impaga más antigua; con atrasos menores es Moroso y sin cuotas vencidas se muestra Sin atrasos, cuyo valor interno es habilitado. Un historial incompleto se identifica como Pendiente de conciliación.</w:t>
+              <w:t>Considera persona y empresas entre agencias. Extrajudicial desde doce meses de la cuota impaga más antigua; Moroso con menor atraso; Sin atrasos sin vencidas. Historial incompleto queda Pendiente de conciliación.</w:t>
             </w:r>
           </w:p>
           <w:p>
@@ -6683,7 +6745,7 @@
               <w:rPr>
                 <w:b w:val="0"/>
               </w:rPr>
-              <w:t>Extrajudicial es la clasificación automática del caso académico; no inicia un trámite jurídico. No se necesita registrar manualmente un mes sin pago ni seleccionar el estado.</w:t>
+              <w:t>Extrajudicial es clasificación académica, sin iniciar trámite jurídico ni permitir selección manual de la condición.</w:t>
             </w:r>
           </w:p>
           <w:p>
@@ -6703,7 +6765,7 @@
               <w:rPr>
                 <w:b w:val="0"/>
               </w:rPr>
-              <w:t>El cálculo se realiza después de cada pago y en el cambio diario de fecha. Consultar o confirmar un préstamo revalida la situación actual aunque la tarea diaria no se haya ejecutado todavía.</w:t>
+              <w:t>Recalcula después de pagar, al cambiar el día y al consultar o confirmar, aunque el corte diario no se haya ejecutado.</w:t>
             </w:r>
           </w:p>
           <w:p>
@@ -6723,7 +6785,7 @@
               <w:rPr>
                 <w:b w:val="0"/>
               </w:rPr>
-              <w:t>Pagar una cuota recalcula el estado con las que continúen impagas. Puede pasar de Extrajudicial a Moroso o a Sin atrasos según corresponda. El antecedente extrajudicial se conserva y exige autorización registrada para nuevos préstamos. Se conserva la trazabilidad del atraso y del pago; no se borra la evidencia de identidad.</w:t>
+              <w:t>Cubrir lo vencido regulariza sin anticipar cuotas futuras. El antecedente permanece: nuevo crédito requiere asesor autorizado, motivo, ausencia de vencidas e historial conciliado, sin omitir identidad, RUC o cupo.</w:t>
             </w:r>
           </w:p>
           <w:p>
@@ -6743,7 +6805,7 @@
               <w:rPr>
                 <w:b w:val="0"/>
               </w:rPr>
-              <w:t>La condición financiera no cambia el resultado de verificación. Al regularizarse la deuda, una identidad aprobada y vigente sigue aprobada. Si el DNI caducó, continúa bloqueado para nuevas colocaciones hasta revalidar.</w:t>
+              <w:t>Pagar o regularizar no borra verificaciones. Un DNI caducado sigue bloqueando nuevas colocaciones hasta revalidar.</w:t>
             </w:r>
           </w:p>
           <w:p>
@@ -6763,7 +6825,7 @@
               <w:rPr>
                 <w:b w:val="0"/>
               </w:rPr>
-              <w:t>El capital disponible se obtiene del límite menos el capital pendiente global. Los intereses cobrados no liberan capital. Un préstamo queda Cancelado únicamente por pago completo; terminar el plazo no equivale a cancelar deuda.</w:t>
+              <w:t>Disponible = límite menos capital pendiente global. Los intereses no liberan cupo; terminar el plazo no cancela deuda.</w:t>
             </w:r>
           </w:p>
           <w:p>
@@ -6783,7 +6845,7 @@
               <w:rPr>
                 <w:b w:val="0"/>
               </w:rPr>
-              <w:t>Cuota impaga del 15/10/2026: Pendiente ese día, Vencida y cliente Moroso el 16/10/2026; si sigue impaga, Extrajudicial el 15/10/2027. Con otras obligaciones, manda el atraso impago más antiguo.</w:t>
+              <w:t>Cuota del 15/10/2026: pendiente ese día, vencida el 16/10/2026 y extrajudicial el 15/10/2027 si sigue impaga.</w:t>
             </w:r>
           </w:p>
           <w:p>
@@ -6803,7 +6865,7 @@
               <w:rPr>
                 <w:b w:val="0"/>
               </w:rPr>
-              <w:t>Los préstamos históricos sin conciliación no generan estados ficticios de pago. Se identifican como pendientes de conciliación y bloquean una nueva colocación hasta completar el historial.</w:t>
+              <w:t>Un historial no conciliado no se declara ficticiamente pagado o moroso y bloquea nuevos préstamos hasta completarse.</w:t>
             </w:r>
           </w:p>
         </w:tc>
@@ -6824,7 +6886,7 @@
     </w:p>
     <w:p>
       <w:r>
-        <w:t>Las ocho HU describen el incremento integrado y sus comprobaciones. Al cerrar sesión se conservan los datos confirmados, no los borradores. El despliegue debe verificarse con la versión integrada antes de declarar completada la entrega. Todos los integrantes pueden demostrar registro, consulta por agencia, cobro entre agencias y actualización automática de estados. No se presentan como implementadas funciones que solo estén descritas en este documento.</w:t>
+        <w:t>La entrega debe demostrar las ocho HU integradas, permisos por agencia, cálculo financiero, cobro sin duplicados y estados automáticos. Se conservan operaciones confirmadas e historial. Las pruebas y el despliegue se verifican sobre la misma versión; las funciones fuera del alcance no se presentan como implementadas.</w:t>
       </w:r>
     </w:p>
     <w:p>
@@ -6934,7 +6996,7 @@
               <w:rPr>
                 <w:sz w:val="22"/>
               </w:rPr>
-              <w:t>Acceso y depuración</w:t>
+              <w:t>Acceso y sesiones</w:t>
             </w:r>
           </w:p>
         </w:tc>
@@ -6957,7 +7019,7 @@
               <w:rPr>
                 <w:sz w:val="22"/>
               </w:rPr>
-              <w:t>Login sin cuentas rápidas. General y Ana Morales fuera de operación, sin pérdida de datos históricos.</w:t>
+              <w:t>Cuenta activa sin accesos de prueba; contador de 15 minutos, aviso y renovación válida. Otro navegador reemplaza la sesión anterior sin que cerrarla revoque la nueva.</w:t>
             </w:r>
           </w:p>
         </w:tc>
@@ -6986,7 +7048,7 @@
               <w:rPr>
                 <w:sz w:val="22"/>
               </w:rPr>
-              <w:t>Separación por agencia</w:t>
+              <w:t>Identidad y representación</w:t>
             </w:r>
           </w:p>
         </w:tc>
@@ -7009,7 +7071,7 @@
               <w:rPr>
                 <w:sz w:val="22"/>
               </w:rPr>
-              <w:t>Un asesor de Chimbote no lista ni abre por URL ordinaria un préstamo de Trujillo. La ficha compartida no permite eludir esta restricción.</w:t>
+              <w:t>DNI/RUC válidos y consulta firmada. Firma el propietario con facultades o un representante presente; propietario ausente solo con identidad previa vigente y evidencia documental.</w:t>
             </w:r>
           </w:p>
         </w:tc>
@@ -7038,7 +7100,7 @@
               <w:rPr>
                 <w:sz w:val="22"/>
               </w:rPr>
-              <w:t>Cliente nuevo y existente</w:t>
+              <w:t>Cliente nuevo y borradores</w:t>
             </w:r>
           </w:p>
         </w:tc>
@@ -7061,7 +7123,7 @@
               <w:rPr>
                 <w:sz w:val="22"/>
               </w:rPr>
-              <w:t>El nuevo se revisa en el paso 1 y se guarda con el préstamo al confirmar el paso 3; abandonar no crea ficha. El existente se recupera desde Clientes o por DNI en Nuevo préstamo, sin repetir una consulta externa vigente ni duplicar su ficha.</w:t>
+              <w:t>No se guarda antes del paso 3; abandono descarta el alta. Confirmación guarda todo o revierte todo. La revalidación existente guardada permanece.</w:t>
             </w:r>
           </w:p>
         </w:tc>
@@ -7090,7 +7152,7 @@
               <w:rPr>
                 <w:sz w:val="22"/>
               </w:rPr>
-              <w:t>Identidad independiente</w:t>
+              <w:t>Agencias y fichas</w:t>
             </w:r>
           </w:p>
         </w:tc>
@@ -7113,7 +7175,7 @@
               <w:rPr>
                 <w:sz w:val="22"/>
               </w:rPr>
-              <w:t>Un cliente con identidad aprobada entra en mora y luego paga: no se pierde su verificación. Si el DNI ya venció, requiere nueva evidencia antes de otro préstamo.</w:t>
+              <w:t>Préstamos y Clientes respetan cartera local; pagar deudas ajenas no incorpora titulares. DNI/RUC 10 comparten ficha y las empresas conservan la suya con vínculos autorizados.</w:t>
             </w:r>
           </w:p>
         </w:tc>
@@ -7142,7 +7204,7 @@
               <w:rPr>
                 <w:sz w:val="22"/>
               </w:rPr>
-              <w:t>DNI vencido y cobro</w:t>
+              <w:t>RUC y elegibilidad</w:t>
             </w:r>
           </w:p>
         </w:tc>
@@ -7165,7 +7227,7 @@
               <w:rPr>
                 <w:sz w:val="22"/>
               </w:rPr>
-              <w:t>Se rechaza el nuevo préstamo y se permite pagar una cuota existente.</w:t>
+              <w:t>RUC observado bloquea solicitar por ese RUC, sin bloquear DNI personal elegible ni pagos. Fallo técnico no se registra como rechazo; revalidar conserva historial y mora.</w:t>
             </w:r>
           </w:p>
         </w:tc>
@@ -7194,7 +7256,7 @@
               <w:rPr>
                 <w:sz w:val="22"/>
               </w:rPr>
-              <w:t>Capital y plazo</w:t>
+              <w:t>Monto plazo y capital</w:t>
             </w:r>
           </w:p>
         </w:tc>
@@ -7217,7 +7279,7 @@
               <w:rPr>
                 <w:sz w:val="22"/>
               </w:rPr>
-              <w:t>Se rechazan montos que excedan S/ 10 000 de capital global, cero, negativos, plazos decimales y plazos fuera de 1 a 60 meses.</w:t>
+              <w:t>Solo dígitos, S/ 0.01 hasta el disponible global de S/ 10 000 y de 1 a 60 meses. Pagar libera únicamente el capital amortizado.</w:t>
             </w:r>
           </w:p>
         </w:tc>
@@ -7246,7 +7308,7 @@
               <w:rPr>
                 <w:sz w:val="22"/>
               </w:rPr>
-              <w:t>Cálculo y calendario</w:t>
+              <w:t>Cronograma y documentos</w:t>
             </w:r>
           </w:p>
         </w:tc>
@@ -7269,7 +7331,7 @@
               <w:rPr>
                 <w:sz w:val="22"/>
               </w:rPr>
-              <w:t>Se comprueba HU-05 con S/ 1 000 a seis meses, meses de 28, 29, 30 y 31 días, y recuperación del mismo PDF.</w:t>
+              <w:t>Comprueba el ejemplo de S/ 1 000, redondeos, meses de 28 a 31 días y bisiestos. Descargas e impresión conservan las condiciones e identidad del préstamo.</w:t>
             </w:r>
           </w:p>
         </w:tc>
@@ -7298,7 +7360,7 @@
               <w:rPr>
                 <w:sz w:val="22"/>
               </w:rPr>
-              <w:t>Cobranza entre agencias</w:t>
+              <w:t>Cobro entre agencias</w:t>
             </w:r>
           </w:p>
         </w:tc>
@@ -7321,7 +7383,7 @@
               <w:rPr>
                 <w:sz w:val="22"/>
               </w:rPr>
-              <w:t>Chimbote registra una cuota de Trujillo. El pago pertenece a Chimbote y el préstamo conserva Trujillo como origen. Solo pagar allí no incorpora al cliente al listado de Clientes de Chimbote.</w:t>
+              <w:t>DNI/RUC 10/RUC 20 reúnen el grupo. Se elige un préstamo y cuotas completas consecutivas; conserva origen, registra agencia de cobro y emite constancia.</w:t>
             </w:r>
           </w:p>
         </w:tc>
@@ -7350,7 +7412,7 @@
               <w:rPr>
                 <w:sz w:val="22"/>
               </w:rPr>
-              <w:t>Concurrencia y reintento</w:t>
+              <w:t>Contexto y navegación</w:t>
             </w:r>
           </w:p>
         </w:tc>
@@ -7373,7 +7435,7 @@
               <w:rPr>
                 <w:sz w:val="22"/>
               </w:rPr>
-              <w:t>Dos confirmaciones no exceden capital disponible ni cobran dos veces una misma cuota. Un fallo no deja operaciones incompletas.</w:t>
+              <w:t>Desde ficha o detalle los campos quedan fijos y el regreso conserva el origen. Búsqueda general limpia resultados al cambiar documento/tipo; seleccionar préstamo desplaza al titular una vez.</w:t>
             </w:r>
           </w:p>
         </w:tc>
@@ -7402,7 +7464,7 @@
               <w:rPr>
                 <w:sz w:val="22"/>
               </w:rPr>
-              <w:t>Estados y cierre</w:t>
+              <w:t>Concurrencia y reintentos</w:t>
             </w:r>
           </w:p>
         </w:tc>
@@ -7425,7 +7487,7 @@
               <w:rPr>
                 <w:sz w:val="22"/>
               </w:rPr>
-              <w:t>Se prueban el día del vencimiento, el día siguiente y los 12 meses de atraso. Al pagar todas las cuotas, se cierra la deuda y queda historial consultable.</w:t>
+              <w:t>No excede capital ni cobra cuotas dos veces. Rechaza cotización o selección obsoleta y conserva la misma operación en un reintento.</w:t>
             </w:r>
           </w:p>
         </w:tc>
@@ -7454,7 +7516,7 @@
               <w:rPr>
                 <w:sz w:val="22"/>
               </w:rPr>
-              <w:t>Capital amortizado</w:t>
+              <w:t>Mora y regularización</w:t>
             </w:r>
           </w:p>
         </w:tc>
@@ -7477,7 +7539,7 @@
               <w:rPr>
                 <w:sz w:val="22"/>
               </w:rPr>
-              <w:t>Al pagar una cuota, el cupo aumenta solo por su capital. Se distinguen saldo de capital, intereses y deuda total pendiente.</w:t>
+              <w:t>Prueba vencimiento, día siguiente y doce meses. Regularizar no anticipa cuotas futuras; conserva antecedente y exige autorización especial para nuevo crédito.</w:t>
             </w:r>
           </w:p>
         </w:tc>
@@ -7506,7 +7568,7 @@
               <w:rPr>
                 <w:sz w:val="22"/>
               </w:rPr>
-              <w:t>Constancias y conciliación</w:t>
+              <w:t>Conciliación y cierre</w:t>
             </w:r>
           </w:p>
         </w:tc>
@@ -7529,817 +7591,12 @@
               <w:rPr>
                 <w:sz w:val="22"/>
               </w:rPr>
-              <w:t>La constancia puede recuperarse; un historial incompleto no se declara pagado o moroso sin conciliar.</w:t>
-            </w:r>
-          </w:p>
-        </w:tc>
-      </w:tr>
-      <w:tr>
-        <w:trPr>
-          <w:cantSplit/>
-          <w:cantSplit/>
-        </w:trPr>
-        <w:tc>
-          <w:tcPr>
-            <w:tcW w:w="2494" w:type="dxa"/>
-            <w:tcMar>
-              <w:top w:w="60" w:type="dxa"/>
-              <w:left w:w="90" w:type="dxa"/>
-              <w:bottom w:w="60" w:type="dxa"/>
-              <w:right w:w="90" w:type="dxa"/>
-            </w:tcMar>
-            <w:vAlign w:val="center"/>
-          </w:tcPr>
-          <w:p>
-            <w:pPr>
-              <w:spacing w:before="20" w:after="20" w:line="240" w:lineRule="auto"/>
-            </w:pPr>
-            <w:r>
-              <w:rPr>
-                <w:sz w:val="22"/>
-              </w:rPr>
-              <w:t>Clientes por agencia</w:t>
-            </w:r>
-          </w:p>
-        </w:tc>
-        <w:tc>
-          <w:tcPr>
-            <w:tcW w:w="6860" w:type="dxa"/>
-            <w:tcMar>
-              <w:top w:w="60" w:type="dxa"/>
-              <w:left w:w="90" w:type="dxa"/>
-              <w:bottom w:w="60" w:type="dxa"/>
-              <w:right w:w="90" w:type="dxa"/>
-            </w:tcMar>
-            <w:vAlign w:val="center"/>
-          </w:tcPr>
-          <w:p>
-            <w:pPr>
-              <w:spacing w:before="20" w:after="20" w:line="240" w:lineRule="auto"/>
-            </w:pPr>
-            <w:r>
-              <w:rPr>
-                <w:sz w:val="22"/>
-              </w:rPr>
-              <w:t>Un cliente registrado en Trujillo no aparece ni se encuentra en Clientes de Chimbote hasta recibir un préstamo allí. Entonces figura en ambas agencias con una ficha única, incluso después de cancelar sus préstamos.</w:t>
-            </w:r>
-          </w:p>
-        </w:tc>
-      </w:tr>
-      <w:tr>
-        <w:trPr>
-          <w:cantSplit/>
-          <w:cantSplit/>
-        </w:trPr>
-        <w:tc>
-          <w:tcPr>
-            <w:tcW w:w="2494" w:type="dxa"/>
-            <w:tcMar>
-              <w:top w:w="60" w:type="dxa"/>
-              <w:left w:w="90" w:type="dxa"/>
-              <w:bottom w:w="60" w:type="dxa"/>
-              <w:right w:w="90" w:type="dxa"/>
-            </w:tcMar>
-            <w:vAlign w:val="center"/>
-          </w:tcPr>
-          <w:p>
-            <w:pPr>
-              <w:spacing w:before="20" w:after="20" w:line="240" w:lineRule="auto"/>
-            </w:pPr>
-            <w:r>
-              <w:rPr>
-                <w:sz w:val="22"/>
-              </w:rPr>
-              <w:t>Revalidación entre agencias</w:t>
-            </w:r>
-          </w:p>
-        </w:tc>
-        <w:tc>
-          <w:tcPr>
-            <w:tcW w:w="6860" w:type="dxa"/>
-            <w:tcMar>
-              <w:top w:w="60" w:type="dxa"/>
-              <w:left w:w="90" w:type="dxa"/>
-              <w:bottom w:w="60" w:type="dxa"/>
-              <w:right w:w="90" w:type="dxa"/>
-            </w:tcMar>
-            <w:vAlign w:val="center"/>
-          </w:tcPr>
-          <w:p>
-            <w:pPr>
-              <w:spacing w:before="20" w:after="20" w:line="240" w:lineRule="auto"/>
-            </w:pPr>
-            <w:r>
-              <w:rPr>
-                <w:sz w:val="22"/>
-              </w:rPr>
-              <w:t>DNI vencido o verificación incompleta: se revalida en Chimbote y el resultado actualizado se refleja en Trujillo, con agencia, asesor e historial. La mora permanece hasta regularizar pagos.</w:t>
-            </w:r>
-          </w:p>
-        </w:tc>
-      </w:tr>
-      <w:tr>
-        <w:trPr>
-          <w:cantSplit/>
-          <w:cantSplit/>
-        </w:trPr>
-        <w:tc>
-          <w:tcPr>
-            <w:tcW w:w="2494" w:type="dxa"/>
-            <w:tcMar>
-              <w:top w:w="60" w:type="dxa"/>
-              <w:left w:w="90" w:type="dxa"/>
-              <w:bottom w:w="60" w:type="dxa"/>
-              <w:right w:w="90" w:type="dxa"/>
-            </w:tcMar>
-            <w:vAlign w:val="center"/>
-          </w:tcPr>
-          <w:p>
-            <w:pPr>
-              <w:spacing w:before="20" w:after="20" w:line="240" w:lineRule="auto"/>
-            </w:pPr>
-            <w:r>
-              <w:rPr>
-                <w:sz w:val="22"/>
-              </w:rPr>
-              <w:t>Buscadores y formatos</w:t>
-            </w:r>
-          </w:p>
-        </w:tc>
-        <w:tc>
-          <w:tcPr>
-            <w:tcW w:w="6860" w:type="dxa"/>
-            <w:tcMar>
-              <w:top w:w="60" w:type="dxa"/>
-              <w:left w:w="90" w:type="dxa"/>
-              <w:bottom w:w="60" w:type="dxa"/>
-              <w:right w:w="90" w:type="dxa"/>
-            </w:tcMar>
-            <w:vAlign w:val="center"/>
-          </w:tcPr>
-          <w:p>
-            <w:pPr>
-              <w:spacing w:before="20" w:after="20" w:line="240" w:lineRule="auto"/>
-            </w:pPr>
-            <w:r>
-              <w:rPr>
-                <w:sz w:val="22"/>
-              </w:rPr>
-              <w:t>DNI con letras o menos de ocho dígitos no se consulta; se conserva el cero inicial. Código con PR- fijo, ocho caracteres hexadecimales y mayúsculas; pegar PR- completo no duplica el prefijo. Préstamos y Clientes no devuelven registros ajenos al listado autorizado.</w:t>
-            </w:r>
-          </w:p>
-        </w:tc>
-      </w:tr>
-      <w:tr>
-        <w:trPr>
-          <w:cantSplit/>
-          <w:cantSplit/>
-        </w:trPr>
-        <w:tc>
-          <w:tcPr>
-            <w:tcW w:w="2494" w:type="dxa"/>
-            <w:tcMar>
-              <w:top w:w="60" w:type="dxa"/>
-              <w:left w:w="90" w:type="dxa"/>
-              <w:bottom w:w="60" w:type="dxa"/>
-              <w:right w:w="90" w:type="dxa"/>
-            </w:tcMar>
-            <w:vAlign w:val="center"/>
-          </w:tcPr>
-          <w:p>
-            <w:pPr>
-              <w:spacing w:before="20" w:after="20" w:line="240" w:lineRule="auto"/>
-            </w:pPr>
-            <w:r>
-              <w:rPr>
-                <w:sz w:val="22"/>
-              </w:rPr>
-              <w:t>Detalle y acceso al pago</w:t>
-            </w:r>
-          </w:p>
-        </w:tc>
-        <w:tc>
-          <w:tcPr>
-            <w:tcW w:w="6860" w:type="dxa"/>
-            <w:tcMar>
-              <w:top w:w="60" w:type="dxa"/>
-              <w:left w:w="90" w:type="dxa"/>
-              <w:bottom w:w="60" w:type="dxa"/>
-              <w:right w:w="90" w:type="dxa"/>
-            </w:tcMar>
-            <w:vAlign w:val="center"/>
-          </w:tcPr>
-          <w:p>
-            <w:pPr>
-              <w:spacing w:before="20" w:after="20" w:line="240" w:lineRule="auto"/>
-            </w:pPr>
-            <w:r>
-              <w:rPr>
-                <w:sz w:val="22"/>
-              </w:rPr>
-              <w:t>Tres cuadros en una fila en escritorio; estado junto al título y TEM e interés en Datos del préstamo. Registrar pago carga las cuotas automáticamente; entrar desde el menú mantiene la consulta manual y todo cobro exige confirmación.</w:t>
-            </w:r>
-          </w:p>
-        </w:tc>
-      </w:tr>
-      <w:tr>
-        <w:trPr>
-          <w:cantSplit/>
-          <w:cantSplit/>
-        </w:trPr>
-        <w:tc>
-          <w:tcPr>
-            <w:tcW w:w="2494" w:type="dxa"/>
-            <w:tcMar>
-              <w:top w:w="60" w:type="dxa"/>
-              <w:left w:w="90" w:type="dxa"/>
-              <w:bottom w:w="60" w:type="dxa"/>
-              <w:right w:w="90" w:type="dxa"/>
-            </w:tcMar>
-            <w:vAlign w:val="center"/>
-          </w:tcPr>
-          <w:p>
-            <w:pPr>
-              <w:spacing w:before="20" w:after="20" w:line="240" w:lineRule="auto"/>
-            </w:pPr>
-            <w:r>
-              <w:rPr>
-                <w:sz w:val="22"/>
-              </w:rPr>
-              <w:t>Abandono y confirmación del nuevo</w:t>
-            </w:r>
-          </w:p>
-        </w:tc>
-        <w:tc>
-          <w:tcPr>
-            <w:tcW w:w="6860" w:type="dxa"/>
-            <w:tcMar>
-              <w:top w:w="60" w:type="dxa"/>
-              <w:left w:w="90" w:type="dxa"/>
-              <w:bottom w:w="60" w:type="dxa"/>
-              <w:right w:w="90" w:type="dxa"/>
-            </w:tcMar>
-            <w:vAlign w:val="center"/>
-          </w:tcPr>
-          <w:p>
-            <w:pPr>
-              <w:spacing w:before="20" w:after="20" w:line="240" w:lineRule="auto"/>
-            </w:pPr>
-            <w:r>
-              <w:rPr>
-                <w:sz w:val="22"/>
-              </w:rPr>
-              <w:t>Continuar a condiciones y revisar el cronograma no crean cliente ni evidencia. Cancelar salida conserva el borrador; salir o recargar lo descarta. Confirmar guarda ficha, revisión, préstamo y cuotas; un fallo intermedio no deja registros parciales.</w:t>
-            </w:r>
-          </w:p>
-        </w:tc>
-      </w:tr>
-      <w:tr>
-        <w:trPr>
-          <w:cantSplit/>
-          <w:cantSplit/>
-        </w:trPr>
-        <w:tc>
-          <w:tcPr>
-            <w:tcW w:w="2494" w:type="dxa"/>
-            <w:tcMar>
-              <w:top w:w="60" w:type="dxa"/>
-              <w:left w:w="90" w:type="dxa"/>
-              <w:bottom w:w="60" w:type="dxa"/>
-              <w:right w:w="90" w:type="dxa"/>
-            </w:tcMar>
-            <w:vAlign w:val="center"/>
-          </w:tcPr>
-          <w:p>
-            <w:pPr>
-              <w:spacing w:before="20" w:after="20" w:line="240" w:lineRule="auto"/>
-            </w:pPr>
-            <w:r>
-              <w:rPr>
-                <w:sz w:val="22"/>
-              </w:rPr>
-              <w:t>Revalidación sin nuevo préstamo</w:t>
-            </w:r>
-          </w:p>
-        </w:tc>
-        <w:tc>
-          <w:tcPr>
-            <w:tcW w:w="6860" w:type="dxa"/>
-            <w:tcMar>
-              <w:top w:w="60" w:type="dxa"/>
-              <w:left w:w="90" w:type="dxa"/>
-              <w:bottom w:w="60" w:type="dxa"/>
-              <w:right w:w="90" w:type="dxa"/>
-            </w:tcMar>
-            <w:vAlign w:val="center"/>
-          </w:tcPr>
-          <w:p>
-            <w:pPr>
-              <w:spacing w:before="20" w:after="20" w:line="240" w:lineRule="auto"/>
-            </w:pPr>
-            <w:r>
-              <w:rPr>
-                <w:sz w:val="22"/>
-              </w:rPr>
-              <w:t>Guardar una revisión de un cliente existente actualiza la misma ficha y su historial para las agencias autorizadas. Abandonar luego el paso 2 no deshace esa revisión ni crea un préstamo.</w:t>
-            </w:r>
-          </w:p>
-        </w:tc>
-      </w:tr>
-      <w:tr>
-        <w:trPr>
-          <w:cantSplit/>
-          <w:cantSplit/>
-        </w:trPr>
-        <w:tc>
-          <w:tcPr>
-            <w:tcW w:w="2494" w:type="dxa"/>
-            <w:tcMar>
-              <w:top w:w="60" w:type="dxa"/>
-              <w:left w:w="90" w:type="dxa"/>
-              <w:bottom w:w="60" w:type="dxa"/>
-              <w:right w:w="90" w:type="dxa"/>
-            </w:tcMar>
-            <w:vAlign w:val="center"/>
-          </w:tcPr>
-          <w:p>
-            <w:pPr>
-              <w:spacing w:before="20" w:after="20" w:line="240" w:lineRule="auto"/>
-            </w:pPr>
-            <w:r>
-              <w:rPr>
-                <w:sz w:val="22"/>
-              </w:rPr>
-              <w:t>Reintento y DNI concurrente</w:t>
-            </w:r>
-          </w:p>
-        </w:tc>
-        <w:tc>
-          <w:tcPr>
-            <w:tcW w:w="6860" w:type="dxa"/>
-            <w:tcMar>
-              <w:top w:w="60" w:type="dxa"/>
-              <w:left w:w="90" w:type="dxa"/>
-              <w:bottom w:w="60" w:type="dxa"/>
-              <w:right w:w="90" w:type="dxa"/>
-            </w:tcMar>
-            <w:vAlign w:val="center"/>
-          </w:tcPr>
-          <w:p>
-            <w:pPr>
-              <w:spacing w:before="20" w:after="20" w:line="240" w:lineRule="auto"/>
-            </w:pPr>
-            <w:r>
-              <w:rPr>
-                <w:sz w:val="22"/>
-              </w:rPr>
-              <w:t>Repetir la confirmación devuelve el mismo préstamo. Si otro asesor registró ese DNI durante el borrador, se reutiliza la ficha vigente sin sobrescribir evidencia; de necesitar revisión, se vuelve al paso 1.</w:t>
-            </w:r>
-          </w:p>
-        </w:tc>
-      </w:tr>
-      <w:tr>
-        <w:trPr>
-          <w:cantSplit/>
-          <w:cantSplit/>
-        </w:trPr>
-        <w:tc>
-          <w:tcPr>
-            <w:tcW w:w="2494" w:type="dxa"/>
-            <w:tcMar>
-              <w:top w:w="60" w:type="dxa"/>
-              <w:left w:w="90" w:type="dxa"/>
-              <w:bottom w:w="60" w:type="dxa"/>
-              <w:right w:w="90" w:type="dxa"/>
-            </w:tcMar>
-            <w:vAlign w:val="center"/>
-          </w:tcPr>
-          <w:p>
-            <w:pPr>
-              <w:spacing w:before="20" w:after="20" w:line="240" w:lineRule="auto"/>
-            </w:pPr>
-            <w:r>
-              <w:rPr>
-                <w:sz w:val="22"/>
-              </w:rPr>
-              <w:t>Sesión e inactividad</w:t>
-            </w:r>
-          </w:p>
-        </w:tc>
-        <w:tc>
-          <w:tcPr>
-            <w:tcW w:w="6860" w:type="dxa"/>
-            <w:tcMar>
-              <w:top w:w="60" w:type="dxa"/>
-              <w:left w:w="90" w:type="dxa"/>
-              <w:bottom w:w="60" w:type="dxa"/>
-              <w:right w:w="90" w:type="dxa"/>
-            </w:tcMar>
-            <w:vAlign w:val="center"/>
-          </w:tcPr>
-          <w:p>
-            <w:pPr>
-              <w:spacing w:before="20" w:after="20" w:line="240" w:lineRule="auto"/>
-            </w:pPr>
-            <w:r>
-              <w:rPr>
-                <w:sz w:val="22"/>
-              </w:rPr>
-              <w:t>El contador aparece después de la fecha; el aviso surge en el último minuto, Continuar renueva una sesión válida y a los 15 minutos sin actividad se exige nuevo ingreso.</w:t>
-            </w:r>
-          </w:p>
-        </w:tc>
-      </w:tr>
-      <w:tr>
-        <w:trPr>
-          <w:cantSplit/>
-          <w:cantSplit/>
-        </w:trPr>
-        <w:tc>
-          <w:tcPr>
-            <w:tcW w:w="2494" w:type="dxa"/>
-            <w:tcMar>
-              <w:top w:w="60" w:type="dxa"/>
-              <w:left w:w="90" w:type="dxa"/>
-              <w:bottom w:w="60" w:type="dxa"/>
-              <w:right w:w="90" w:type="dxa"/>
-            </w:tcMar>
-            <w:vAlign w:val="center"/>
-          </w:tcPr>
-          <w:p>
-            <w:pPr>
-              <w:spacing w:before="20" w:after="20" w:line="240" w:lineRule="auto"/>
-            </w:pPr>
-            <w:r>
-              <w:rPr>
-                <w:sz w:val="22"/>
-              </w:rPr>
-              <w:t>Sesión reemplazada</w:t>
-            </w:r>
-          </w:p>
-        </w:tc>
-        <w:tc>
-          <w:tcPr>
-            <w:tcW w:w="6860" w:type="dxa"/>
-            <w:tcMar>
-              <w:top w:w="60" w:type="dxa"/>
-              <w:left w:w="90" w:type="dxa"/>
-              <w:bottom w:w="60" w:type="dxa"/>
-              <w:right w:w="90" w:type="dxa"/>
-            </w:tcMar>
-            <w:vAlign w:val="center"/>
-          </w:tcPr>
-          <w:p>
-            <w:pPr>
-              <w:spacing w:before="20" w:after="20" w:line="240" w:lineRule="auto"/>
-            </w:pPr>
-            <w:r>
-              <w:rPr>
-                <w:sz w:val="22"/>
-              </w:rPr>
-              <w:t>Iniciar la misma cuenta en otro navegador bloquea al anterior; cerrar el anterior no cierra al nuevo.</w:t>
-            </w:r>
-          </w:p>
-        </w:tc>
-      </w:tr>
-      <w:tr>
-        <w:trPr>
-          <w:cantSplit/>
-          <w:cantSplit/>
-        </w:trPr>
-        <w:tc>
-          <w:tcPr>
-            <w:tcW w:w="2494" w:type="dxa"/>
-            <w:tcMar>
-              <w:top w:w="60" w:type="dxa"/>
-              <w:left w:w="90" w:type="dxa"/>
-              <w:bottom w:w="60" w:type="dxa"/>
-              <w:right w:w="90" w:type="dxa"/>
-            </w:tcMar>
-            <w:vAlign w:val="center"/>
-          </w:tcPr>
-          <w:p>
-            <w:pPr>
-              <w:spacing w:before="20" w:after="20" w:line="240" w:lineRule="auto"/>
-            </w:pPr>
-            <w:r>
-              <w:rPr>
-                <w:sz w:val="22"/>
-              </w:rPr>
-              <w:t>SUNAT y modalidades</w:t>
-            </w:r>
-          </w:p>
-        </w:tc>
-        <w:tc>
-          <w:tcPr>
-            <w:tcW w:w="6860" w:type="dxa"/>
-            <w:tcMar>
-              <w:top w:w="60" w:type="dxa"/>
-              <w:left w:w="90" w:type="dxa"/>
-              <w:bottom w:w="60" w:type="dxa"/>
-              <w:right w:w="90" w:type="dxa"/>
-            </w:tcMar>
-            <w:vAlign w:val="center"/>
-          </w:tcPr>
-          <w:p>
-            <w:pPr>
-              <w:spacing w:before="20" w:after="20" w:line="240" w:lineRule="auto"/>
-            </w:pPr>
-            <w:r>
-              <w:rPr>
-                <w:sz w:val="22"/>
-              </w:rPr>
-              <w:t>RUC observado bloquea solicitar por ese RUC, pero no un préstamo personal DNI elegible ni el pago de deudas. Un fallo técnico no se guarda como rechazo.</w:t>
-            </w:r>
-          </w:p>
-        </w:tc>
-      </w:tr>
-      <w:tr>
-        <w:trPr>
-          <w:cantSplit/>
-          <w:cantSplit/>
-        </w:trPr>
-        <w:tc>
-          <w:tcPr>
-            <w:tcW w:w="2494" w:type="dxa"/>
-            <w:tcMar>
-              <w:top w:w="60" w:type="dxa"/>
-              <w:left w:w="90" w:type="dxa"/>
-              <w:bottom w:w="60" w:type="dxa"/>
-              <w:right w:w="90" w:type="dxa"/>
-            </w:tcMar>
-            <w:vAlign w:val="center"/>
-          </w:tcPr>
-          <w:p>
-            <w:pPr>
-              <w:spacing w:before="20" w:after="20" w:line="240" w:lineRule="auto"/>
-            </w:pPr>
-            <w:r>
-              <w:rPr>
-                <w:sz w:val="22"/>
-              </w:rPr>
-              <w:t>Pagos con contexto</w:t>
-            </w:r>
-          </w:p>
-        </w:tc>
-        <w:tc>
-          <w:tcPr>
-            <w:tcW w:w="6860" w:type="dxa"/>
-            <w:tcMar>
-              <w:top w:w="60" w:type="dxa"/>
-              <w:left w:w="90" w:type="dxa"/>
-              <w:bottom w:w="60" w:type="dxa"/>
-              <w:right w:w="90" w:type="dxa"/>
-            </w:tcMar>
-            <w:vAlign w:val="center"/>
-          </w:tcPr>
-          <w:p>
-            <w:pPr>
-              <w:spacing w:before="20" w:after="20" w:line="240" w:lineRule="auto"/>
-            </w:pPr>
-            <w:r>
-              <w:rPr>
-                <w:sz w:val="22"/>
-              </w:rPr>
-              <w:t>Desde ficha o detalle los campos quedan fijos y el regreso conserva el origen; en Pagos general cambiar documento o tipo elimina resultados anteriores.</w:t>
-            </w:r>
-          </w:p>
-        </w:tc>
-      </w:tr>
-      <w:tr>
-        <w:trPr>
-          <w:cantSplit/>
-          <w:cantSplit/>
-        </w:trPr>
-        <w:tc>
-          <w:tcPr>
-            <w:tcW w:w="2494" w:type="dxa"/>
-            <w:tcMar>
-              <w:top w:w="60" w:type="dxa"/>
-              <w:left w:w="90" w:type="dxa"/>
-              <w:bottom w:w="60" w:type="dxa"/>
-              <w:right w:w="90" w:type="dxa"/>
-            </w:tcMar>
-            <w:vAlign w:val="center"/>
-          </w:tcPr>
-          <w:p>
-            <w:pPr>
-              <w:spacing w:before="20" w:after="20" w:line="240" w:lineRule="auto"/>
-            </w:pPr>
-            <w:r>
-              <w:rPr>
-                <w:sz w:val="22"/>
-              </w:rPr>
-              <w:t>Ficha e historiales</w:t>
-            </w:r>
-          </w:p>
-        </w:tc>
-        <w:tc>
-          <w:tcPr>
-            <w:tcW w:w="6860" w:type="dxa"/>
-            <w:tcMar>
-              <w:top w:w="60" w:type="dxa"/>
-              <w:left w:w="90" w:type="dxa"/>
-              <w:bottom w:w="60" w:type="dxa"/>
-              <w:right w:w="90" w:type="dxa"/>
-            </w:tcMar>
-            <w:vAlign w:val="center"/>
-          </w:tcPr>
-          <w:p>
-            <w:pPr>
-              <w:spacing w:before="20" w:after="20" w:line="240" w:lineRule="auto"/>
-            </w:pPr>
-            <w:r>
-              <w:rPr>
-                <w:sz w:val="22"/>
-              </w:rPr>
-              <w:t>La ficha queda resumida, los vínculos respetan permisos y Ver historial abre DNI, RUC o su menú sin tabla de préstamos en la ficha.</w:t>
+              <w:t>Un historial incompleto bloquea nuevas colocaciones; cancelar exige pago total. Pagar no elimina identidad ni su caducidad, y quedan historial y constancias.</w:t>
             </w:r>
           </w:p>
         </w:tc>
       </w:tr>
     </w:tbl>
-    <w:p>
-      <w:r>
-        <w:t xml:space="preserve"/>
-      </w:r>
-    </w:p>
-    <w:p>
-      <w:r>
-        <w:br w:type="page"/>
-      </w:r>
-    </w:p>
-    <w:p>
-      <w:pPr>
-        <w:pStyle w:val="Ttulo1"/>
-      </w:pPr>
-      <w:r>
-        <w:t>Ampliación de identidad contratos y cobranza</w:t>
-      </w:r>
-    </w:p>
-    <w:p>
-      <w:pPr>
-        <w:pStyle w:val="Ttulo2"/>
-      </w:pPr>
-      <w:r>
-        <w:t>Atención por DNI y RUC</w:t>
-      </w:r>
-    </w:p>
-    <w:p>
-      <w:r>
-        <w:t>Se mantiene el flujo Cliente, Condiciones y Cronograma. El paso 1 ofrece DNI o RUC; RUC 10 conserva la ficha de su DNI. Para RUC 20 se identifica por separado al propietario para el límite y al representante que firma. Se validan once números, prefijo 10 o 20 y dígito verificador; la consulta externa debe coincidir con el número solicitado y exige ACTIVO y HABIDO para una nueva solicitud por RUC. Un RUC observado no impide pagar deudas existentes.</w:t>
-      </w:r>
-    </w:p>
-    <w:p>
-      <w:pPr>
-        <w:pStyle w:val="Ttulo2"/>
-      </w:pPr>
-      <w:r>
-        <w:t>Propiedad y capital global</w:t>
-      </w:r>
-    </w:p>
-    <w:p>
-      <w:r>
-        <w:t>Para una empresa se registra evidencia documental de propiedad y de representación. Si existen varios propietarios, se exige la designación documentada de uno como responsable del límite de este modelo académico; sin designación no se continúa. La empresa no puede reasignarse a otro propietario mediante una solicitud ordinaria. El capital de la persona y sus empresas vinculadas se suma entre agencias, con un límite de S/ 10 000 y control transaccional al confirmar.</w:t>
-      </w:r>
-    </w:p>
-    <w:p>
-      <w:pPr>
-        <w:pStyle w:val="Ttulo2"/>
-      </w:pPr>
-      <w:r>
-        <w:t>Contrato descargable e impresión</w:t>
-      </w:r>
-    </w:p>
-    <w:p>
-      <w:r>
-        <w:t>El detalle del préstamo confirmado permite descargar el contrato en Word y abrir una vista de impresión o guardar como PDF desde el navegador. La plantilla conserva el texto, estructura y diseño del Word del profesor; completa cliente, documento, representante, fecha y agencia. Un anexo incluye monto, plazo, tasas, totales, vencimientos y las personas vinculadas. El cronograma tiene descarga PDF e impresión separadas; los menús Cronograma y Contrato agrupan sus acciones en el detalle. Los préstamos nuevos congelan sus datos contractuales de identidad.</w:t>
-      </w:r>
-    </w:p>
-    <w:p>
-      <w:pPr>
-        <w:pStyle w:val="Ttulo2"/>
-      </w:pPr>
-      <w:r>
-        <w:t>Mora y aplicación de pagos</w:t>
-      </w:r>
-    </w:p>
-    <w:p>
-      <w:r>
-        <w:t>La mora comienza al día siguiente del vencimiento en la fecha de Perú. Fórmula implementada: capital vencido impago × [(1 + tasa efectiva anual moratoria)^(días de atraso / base anual) − 1], redondeada por cuota a dos decimales. La base admite 360 o 365 días. El responsable designado configura la tasa para préstamos nuevos; no existe una tasa predeterminada ni se modifican préstamos previos. Sin tasa pactada no se agrega mora. Los pagos cubren cuotas completas consecutivas desde la más antigua, incluyendo capital, interés original y mora de cada cuota seleccionada. No se incluyen abonos parciales ni penalidades.</w:t>
-      </w:r>
-    </w:p>
-    <w:p>
-      <w:pPr>
-        <w:pStyle w:val="Ttulo2"/>
-      </w:pPr>
-      <w:r>
-        <w:t>Regularización y antecedente extrajudicial</w:t>
-      </w:r>
-    </w:p>
-    <w:p>
-      <w:r>
-        <w:t>Cubrir todo lo vencido y exigible permite quedar al día sin anticipar cuotas futuras. La clasificación extrajudicial se alcanza a los doce meses calendario desde el vencimiento impago más antiguo; otro pago no reinicia el plazo. Se conserva el antecedente incluso tras cancelar el préstamo. La autorización para nuevas colocaciones corresponde a un asesor designado con permiso especial y exige motivo, ausencia de cuotas vencidas e historial conciliado. Autorizar no omite identidad, RUC ni límite de capital.</w:t>
-      </w:r>
-    </w:p>
-    <w:p>
-      <w:pPr>
-        <w:pStyle w:val="Ttulo2"/>
-      </w:pPr>
-      <w:r>
-        <w:t>Permisos y definiciones de la entrega</w:t>
-      </w:r>
-    </w:p>
-    <w:p>
-      <w:r>
-        <w:t>La tasa moratoria y la persona que autoriza deben ser definidas por el responsable del parcial. La implementación permite configurarlas, pero no asigna automáticamente privilegios ni inventa una tasa. El administrador registra los permisos de autorización y configuración. Se mantiene la visibilidad por agencia y el pago entre agencias; las personas nuevas, empresa, evidencia, préstamo y cuotas se guardan conjuntamente al confirmar. Las revalidaciones ya guardadas de personas existentes se conservan al abandonar.</w:t>
-      </w:r>
-    </w:p>
-    <w:p>
-      <w:pPr>
-        <w:pStyle w:val="Ttulo2"/>
-      </w:pPr>
-      <w:r>
-        <w:t>Observaciones del modelo del profesor</w:t>
-      </w:r>
-    </w:p>
-    <w:p>
-      <w:r>
-        <w:t>La plantilla original se conserva en Contrato_profesor.docx. Se identificaron denominaciones Préstamos Castillo y EFS, una referencia a la cláusula décimo sexta ausente y conceptos de penalidad, pagaré, intermediación y pagos externos no desarrollados en el sprint. Su mención no implementa esos módulos ni establece una tasa. El texto original no se modifica automáticamente; las condiciones particulares y el alcance académico se documentan en el anexo.</w:t>
-      </w:r>
-    </w:p>
-    <w:p>
-      <w:pPr>
-        <w:pStyle w:val="Ttulo2"/>
-      </w:pPr>
-      <w:r>
-        <w:t>Revalidación y representación por empresa</w:t>
-      </w:r>
-    </w:p>
-    <w:p>
-      <w:r>
-        <w:t>Revalidar identidad desde la ficha consulta automáticamente el DNI fijo, permite reintentar si falla y requiere confirmar la revisión antes de guardar. Al guardar vuelve a la ficha. No se crea una pantalla/plantilla independiente ni se inicia un préstamo.</w:t>
-      </w:r>
-    </w:p>
-    <w:p>
-      <w:r>
-        <w:t>En RUC 20 se distingue quién firma y la asistencia del propietario. Un propietario ausente conserva su identidad previamente aprobada y vigente, sin una verificación presencial nueva; si falta esa verificación, queda pendiente revisión y no se confirma la solicitud. El firmante debe estar presente y tener identidad y facultades verificadas. La referencia de propiedad y la de facultades documentan las personas y asistencia. No se confunde la vinculación al límite global con responsabilidad personal por deuda de la sociedad.</w:t>
-      </w:r>
-    </w:p>
-    <w:p>
-      <w:pPr>
-        <w:pStyle w:val="Ttulo2"/>
-      </w:pPr>
-      <w:r>
-        <w:t>Fichas compartidas listados y pagos con contexto</w:t>
-      </w:r>
-    </w:p>
-    <w:p>
-      <w:r>
-        <w:t>Clientes muestra titulares con préstamos confirmados en la agencia actual, incluidos los ya pagados. El acceso permitido a una ficha vinculada no la incorpora al listado local. DNI y RUC 10 comparten identidad; RUC 20 conserva razón social y ficha independiente. El bloque Personas y empresas vinculadas permite abrir las fichas autorizadas en ambas direcciones. La ficha termina con Consultar para pagar y Ver historial; la cartera local se consulta en Préstamos y las revisiones se muestran en su página propia.</w:t>
-      </w:r>
-    </w:p>
-    <w:p>
-      <w:r>
-        <w:t>Por DNI, RUC 10 o RUC 20, Pagos reúne las mismas obligaciones del propietario y sus empresas en todas las agencias. Se selecciona y cobra un préstamo a la vez, sin mezclar cuotas. Desde ficha se fija su documento y se vuelve a esa misma ficha; desde detalle se fija el UUID del préstamo autorizado y se vuelve a ese mismo detalle. En ambos casos no aparece Cambiar cliente. La entrada general mantiene búsqueda editable y limpia inmediatamente la atención anterior al cambiarla.</w:t>
-      </w:r>
-    </w:p>
-    <w:p>
-      <w:pPr>
-        <w:pStyle w:val="Ttulo2"/>
-      </w:pPr>
-      <w:r>
-        <w:t>Control de sesiones y continuidad</w:t>
-      </w:r>
-    </w:p>
-    <w:p>
-      <w:r>
-        <w:t>La cabecera muestra nombre y rol, agencia, fecha de Perú y contador de sesión. El cierre se produce a los 15 minutos sin interacción o al reemplazar la sesión con un inicio posterior. El aviso del último minuto permite continuar mientras la sesión siga válida. La validación del servidor y de la base protege préstamos y pagos aun si una pantalla permanece abierta; la consulta periódica no renueva la actividad.</w:t>
-      </w:r>
-    </w:p>
-    <w:p>
-      <w:r>
-        <w:t>Las operaciones confirmadas permanecen al cerrar la sesión; los borradores sin guardar se descartan. Si se interrumpe la respuesta de una confirmación, debe revisarse el préstamo o el historial de pagos antes de iniciar otra operación. Las claves de idempotencia protegen el reintento de la misma operación; no convierten una nueva solicitud independiente en el mismo cobro.</w:t>
-      </w:r>
-    </w:p>
-    <w:p>
-      <w:pPr>
-        <w:pStyle w:val="Ttulo2"/>
-      </w:pPr>
-      <w:r>
-        <w:t>Alcance de la verificación y funciones pendientes</w:t>
-      </w:r>
-    </w:p>
-    <w:p>
-      <w:r>
-        <w:t>La consulta de nombres por DNI no consulta automáticamente vigencia ni fallecimiento oficial. La fecha de caducidad y las casillas documentan la revisión presencial del asesor. SUNAT se consulta al ejecutar el flujo correspondiente; no existe un barrido periódico externo que actualice todos los RUC. Un fallo técnico no se registra como rechazo de identidad ni impide cobrar deudas existentes; una nueva solicitud que necesite esa consulta espera un resultado válido.</w:t>
-      </w:r>
-    </w:p>
-    <w:p>
-      <w:r>
-        <w:t>Se mantienen fuera del incremento los abonos parciales, refinanciación, reversos, gestión judicial, documentos extranjeros y prefijos RUC distintos de 10 y 20, evaluación automática de riesgo por monto/plazo y aprobación documental remota de un propietario no verificado. La vinculación académica para el límite no constituye por sí misma garantía personal de la deuda de una sociedad.</w:t>
-      </w:r>
-    </w:p>
     <w:sectPr>
       <w:pgSz w:w="11909" w:h="16834"/>
       <w:pgMar w:top="1440" w:right="1440" w:bottom="1440" w:left="1440" w:header="720" w:footer="720" w:gutter="0"/>

</xml_diff>

<commit_message>
Actualizar requisitos y manuales sin mora
</commit_message>
<xml_diff>
--- a/docs/Sprint_1_Sistema_Prestamos.docx
+++ b/docs/Sprint_1_Sistema_Prestamos.docx
@@ -38,7 +38,7 @@
     </w:p>
     <w:p>
       <w:r>
-        <w:t>El sistema sustituye el registro en hojas de cálculo para conservar identidad, cartera por agencia y pagos trazables, evitando cobros duplicados y nuevos préstamos con mora.</w:t>
+        <w:t>El sistema sustituye el registro en hojas de cálculo para conservar identidad, cartera por agencia y pagos trazables, evitando cobros duplicados y nuevos préstamos con atraso.</w:t>
       </w:r>
     </w:p>
     <w:p>
@@ -624,7 +624,7 @@
               <w:rPr>
                 <w:sz w:val="22"/>
               </w:rPr>
-              <w:t>Identidad aprobada y vigente, sin mora, historial conciliado y capital disponible; RUC ACTIVO/HABIDO cuando corresponda. El antecedente extrajudicial exige autorización.</w:t>
+              <w:t>Identidad aprobada y vigente, sin atrasos, historial conciliado y capital disponible; RUC ACTIVO/HABIDO cuando corresponda. El antecedente extrajudicial exige autorización.</w:t>
             </w:r>
           </w:p>
         </w:tc>
@@ -1373,7 +1373,7 @@
               <w:rPr>
                 <w:sz w:val="22"/>
               </w:rPr>
-              <w:t>Inicio de mora</w:t>
+              <w:t>Inicio del atraso</w:t>
             </w:r>
           </w:p>
         </w:tc>
@@ -1604,7 +1604,7 @@
               <w:rPr>
                 <w:sz w:val="22"/>
               </w:rPr>
-              <w:t>Tasa mensual constante equivalente a la TEA, separada de las fechas mensuales de calendario. El interés compensatorio mantiene la tasa mensual; la mora pactada se calcula por días sobre el capital vencido.</w:t>
+              <w:t>Tasa mensual constante equivalente a la TEA, separada de las fechas mensuales de calendario. El interés compensatorio mantiene la tasa mensual; el atraso no genera cargos adicionales.</w:t>
             </w:r>
           </w:p>
         </w:tc>
@@ -1630,7 +1630,7 @@
     </w:p>
     <w:p>
       <w:r>
-        <w:t>Los préstamos anteriores requieren capital, cronograma y pagos conciliados. La falta de un pago histórico no demuestra por sí sola que exista mora. Un cliente con historial incompleto queda identificado como pendiente de conciliación y no obtiene nuevos préstamos hasta regularizar los datos.</w:t>
+        <w:t>Los préstamos anteriores requieren capital, cronograma y pagos conciliados. La falta de un pago histórico no demuestra por sí sola que exista atraso. Un cliente con historial incompleto queda identificado como pendiente de conciliación y no obtiene nuevos préstamos hasta regularizar los datos.</w:t>
       </w:r>
     </w:p>
     <w:p>
@@ -2088,7 +2088,7 @@
     </w:p>
     <w:p>
       <w:r>
-        <w:t>El menú del asesor contiene Préstamos, Clientes, Nuevo préstamo, Pagos y Cerrar sesión. Configuración aparece solo a quien tiene el permiso específico de mora. Los accesos desde ficha o detalle llevan a esos mismos procesos, sin formularios de negocio duplicados.</w:t>
+        <w:t>El menú del asesor contiene Préstamos, Clientes, Nuevo préstamo, Pagos y Cerrar sesión. Los accesos desde ficha o detalle llevan a esos mismos procesos, sin formularios de negocio duplicados.</w:t>
       </w:r>
     </w:p>
     <w:p>
@@ -2106,7 +2106,7 @@
     </w:p>
     <w:p>
       <w:r>
-        <w:t>Desde Clientes se abre la ficha y Solicitar préstamo. Un cliente de otra agencia se recupera en Nuevo préstamo. La revalidación guardada actualiza la ficha compartida sin generar crédito ni eliminar mora.</w:t>
+        <w:t>Desde Clientes se abre la ficha y Solicitar préstamo. Un cliente de otra agencia se recupera en Nuevo préstamo. La revalidación guardada actualiza la ficha compartida sin generar crédito ni eliminar atrasos.</w:t>
       </w:r>
     </w:p>
     <w:p>
@@ -2296,7 +2296,7 @@
               <w:rPr>
                 <w:sz w:val="22"/>
               </w:rPr>
-              <w:t>Sin atrasos (valor interno habilitado) si no tiene cuotas vencidas impagas; Moroso si tiene atraso menor de 12 meses; Extrajudicial si al menos una cuota impaga cumple 12 meses de atraso. Son estados automáticos del grupo, con prioridad de Extrajudicial sobre Moroso; un historial incompleto se identifica como Pendiente de conciliación.</w:t>
+              <w:t>Sin atrasos (valor interno habilitado) si no tiene cuotas vencidas impagas; Con atrasos si tiene atraso menor de 12 meses; Extrajudicial si al menos una cuota impaga cumple 12 meses de atraso. Son estados automáticos del grupo, con prioridad de Extrajudicial sobre Con atrasos; un historial incompleto se identifica como Pendiente de conciliación.</w:t>
             </w:r>
           </w:p>
         </w:tc>
@@ -2413,7 +2413,7 @@
     </w:p>
     <w:p>
       <w:r>
-        <w:t>Identidad y condición de pago son independientes: la mora o el DNI caducado bloquean nuevos préstamos, pero no cobros. Pagar no borra verificaciones.</w:t>
+        <w:t>Identidad y condición de pago son independientes: el atraso o el DNI caducado bloquean nuevos préstamos, pero no cobros. Pagar no borra verificaciones.</w:t>
       </w:r>
     </w:p>
     <w:p>
@@ -2707,7 +2707,7 @@
               <w:rPr>
                 <w:sz w:val="22"/>
               </w:rPr>
-              <w:t>Total pagado, deuda contractual pendiente, capital pendiente, cuotas vencidas, antigüedad de la mora y fecha de actualización. Se derivan de datos conciliados y pagos confirmados.</w:t>
+              <w:t>Total pagado, deuda contractual pendiente, capital pendiente, cuotas vencidas, antigüedad del atraso y fecha de actualización. Se derivan de datos conciliados y pagos confirmados.</w:t>
             </w:r>
           </w:p>
         </w:tc>
@@ -3165,7 +3165,7 @@
               <w:rPr>
                 <w:sz w:val="22"/>
               </w:rPr>
-              <w:t>De 1 a 60 cuotas, dos decimales y saldo final cero. Sin comisiones, seguros ni penalidades. La mora se separa del interés original y solo se cobra cuando el préstamo tiene una tasa pactada.</w:t>
+              <w:t>De 1 a 60 cuotas, dos decimales y saldo final cero. Sin comisiones, seguros, penalidades ni recargos por atraso.</w:t>
             </w:r>
           </w:p>
         </w:tc>
@@ -3246,7 +3246,7 @@
               <w:rPr>
                 <w:sz w:val="22"/>
               </w:rPr>
-              <w:t>Mora pactada</w:t>
+              <w:t>Atrasos sin recargos</w:t>
             </w:r>
           </w:p>
         </w:tc>
@@ -3269,7 +3269,7 @@
               <w:rPr>
                 <w:sz w:val="22"/>
               </w:rPr>
-              <w:t>Capital vencido impago × [(1 + tasa efectiva anual moratoria)^(días de atraso / base anual) − 1], redondeada por cuota a dos decimales. Base 360 o 365. Sin tasa pactada no se agrega mora; no se cobra sobre intereses ni cuotas futuras.</w:t>
+              <w:t>El atraso no incrementa el importe de las cuotas. Se conservan vencimientos, días de atraso, condición de pago y bloqueo de nuevos préstamos.</w:t>
             </w:r>
           </w:p>
         </w:tc>
@@ -3282,7 +3282,7 @@
     </w:p>
     <w:p>
       <w:r>
-        <w:t>La configuración de mora corresponde a un asesor con permiso específico y motivo registrado. Solo afecta préstamos nuevos; cada préstamo conserva tasa y base pactadas. La confirmación rechaza condiciones o cotizaciones que hayan cambiado durante la revisión. No se establece una tasa moratoria predeterminada.</w:t>
+        <w:t>La confirmación del cobro comprueba las cuotas y el importe consultado. Si cambiaron durante la revisión, exige actualizar antes de cobrar.</w:t>
       </w:r>
     </w:p>
     <w:p>
@@ -3448,7 +3448,7 @@
               <w:rPr>
                 <w:sz w:val="22"/>
               </w:rPr>
-              <w:t>préstamos y cronogramas recuperables, pagos trazables entre agencias y bloqueo de nuevas colocaciones cuando existe mora, documento vencido o verificación insuficiente.</w:t>
+              <w:t>préstamos y cronogramas recuperables, pagos trazables entre agencias y bloqueo de nuevas colocaciones cuando existe atraso, documento vencido o verificación insuficiente.</w:t>
             </w:r>
           </w:p>
         </w:tc>
@@ -5164,7 +5164,7 @@
                 <w:b w:val="0"/>
                 <w:sz w:val="20"/>
               </w:rPr>
-              <w:t>Documento inexistente o consulta inconclusa impiden verificar. Un fallo técnico no se guarda como rechazo; permite reintentar y no bloquea pagar deudas existentes.</w:t>
+              <w:t>Documento inexistente o consulta inconclusa impiden verificar. Un fallo técnico no se guarda como rechazo; permite reintentar y no bloquea pagar deudas existentes. El aviso de Pagos exige deuda pendiente del RUC consultado.</w:t>
             </w:r>
           </w:p>
           <w:p>
@@ -5186,7 +5186,7 @@
                 <w:b w:val="0"/>
                 <w:sz w:val="20"/>
               </w:rPr>
-              <w:t>Desde ficha consulta automáticamente el documento fijo y regresa al guardar. Conserva evidencia, fecha, asesor, agencia e historial compartido; permite actualizar datos vigentes y no elimina mora.</w:t>
+              <w:t>Desde ficha consulta automáticamente el documento fijo y regresa al guardar. Conserva evidencia, fecha, asesor, agencia e historial compartido; permite actualizar datos vigentes y no elimina atrasos.</w:t>
             </w:r>
           </w:p>
           <w:p>
@@ -5387,7 +5387,7 @@
               <w:rPr>
                 <w:b w:val="0"/>
               </w:rPr>
-              <w:t>Exige identidad vigente, sin mora, historial conciliado, capital y autorización cuando corresponda. DNI personal no exige estado SUNAT del RUC 10 asociado; solicitar por RUC sí exige ACTIVO/HABIDO y personas/facultades verificadas.</w:t>
+              <w:t>Exige identidad vigente, sin atrasos, historial conciliado, capital y autorización cuando corresponda. DNI personal no exige estado SUNAT del RUC 10 asociado; solicitar por RUC sí exige ACTIVO/HABIDO y personas/facultades verificadas.</w:t>
             </w:r>
           </w:p>
           <w:p>
@@ -5764,7 +5764,7 @@
               <w:rPr>
                 <w:b w:val="0"/>
               </w:rPr>
-              <w:t>Dos decimales y última cuota ajustada a saldo cero. Sin comisiones, seguros ni penalidades; la mora pactada se calcula aparte.</w:t>
+              <w:t>Dos decimales y última cuota ajustada a saldo cero. Sin comisiones, seguros, penalidades ni recargos por atraso.</w:t>
             </w:r>
           </w:p>
           <w:p>
@@ -5804,7 +5804,7 @@
               <w:rPr>
                 <w:b w:val="0"/>
               </w:rPr>
-              <w:t>Cronograma agrupa PDF e impresión. Contrato agrupa Word e impresión/guardar PDF, con plantilla del profesor y anexo de condiciones. Descargar de nuevo no crea préstamo.</w:t>
+              <w:t>Cronograma agrupa PDF e impresión. Contrato agrupa Word e impresión/guardar PDF, con plantilla adaptada del profesor que termina en las firmas, sin anexo de condiciones. Descargar de nuevo no crea préstamo.</w:t>
             </w:r>
           </w:p>
           <w:p>
@@ -6093,7 +6093,7 @@
                 <w:b w:val="0"/>
                 <w:sz w:val="20"/>
               </w:rPr>
-              <w:t>Detalle muestra Total a pagar, Total pagado y Saldo por pagar, con mora pactada, estado, TEA, TEM e interés total; diseño adaptable a móvil.</w:t>
+              <w:t>Detalle muestra Total a pagar, Total pagado y Saldo por pagar, con estado, TEA, TEM e interés total; diseño adaptable a móvil.</w:t>
             </w:r>
           </w:p>
           <w:p>
@@ -6348,7 +6348,7 @@
                 <w:b w:val="0"/>
                 <w:sz w:val="22"/>
               </w:rPr>
-              <w:t>Muestra titular, código, agencia de origen, deuda y cuotas. No exige DNI vigente, RUC habilitado ni ausencia de mora para pagar.</w:t>
+              <w:t>Muestra titular, código, agencia de origen, deuda y cuotas. No exige DNI vigente, RUC habilitado ni ausencia de atrasos para pagar.</w:t>
             </w:r>
           </w:p>
           <w:p>
@@ -6392,7 +6392,7 @@
                 <w:b w:val="0"/>
                 <w:sz w:val="22"/>
               </w:rPr>
-              <w:t>Suma cuotas seleccionadas y mora a la fecha de Perú; el importe no es editable. Exige confirmar dinero recibido y aceptar el cobro; no integra un banco.</w:t>
+              <w:t>Suma el capital y el interés original de las cuotas seleccionadas, sin recargos por atraso; el importe no es editable. Exige confirmar dinero recibido y aceptar el cobro; no integra un banco.</w:t>
             </w:r>
           </w:p>
           <w:p>
@@ -6725,7 +6725,7 @@
               <w:rPr>
                 <w:b w:val="0"/>
               </w:rPr>
-              <w:t>Considera persona y empresas entre agencias. Extrajudicial desde doce meses de la cuota impaga más antigua; Moroso con menor atraso; Sin atrasos sin vencidas. Historial incompleto queda Pendiente de conciliación.</w:t>
+              <w:t>Considera persona y empresas entre agencias. Extrajudicial desde doce meses de la cuota impaga más antigua; Con atrasos con menor atraso; Sin atrasos sin vencidas. Historial incompleto queda Pendiente de conciliación.</w:t>
             </w:r>
           </w:p>
           <w:p>
@@ -6865,7 +6865,7 @@
               <w:rPr>
                 <w:b w:val="0"/>
               </w:rPr>
-              <w:t>Un historial no conciliado no se declara ficticiamente pagado o moroso y bloquea nuevos préstamos hasta completarse.</w:t>
+              <w:t>Un historial no conciliado no se declara ficticiamente pagado o con atrasos y bloquea nuevos préstamos hasta completarse.</w:t>
             </w:r>
           </w:p>
         </w:tc>
@@ -7227,7 +7227,7 @@
               <w:rPr>
                 <w:sz w:val="22"/>
               </w:rPr>
-              <w:t>RUC observado bloquea solicitar por ese RUC, sin bloquear DNI personal elegible ni pagos. Fallo técnico no se registra como rechazo; revalidar conserva historial y mora.</w:t>
+              <w:t>RUC observado bloquea solicitar por ese RUC, sin bloquear DNI personal elegible ni pagos. El aviso de Pagos solo aparece con deuda pendiente del RUC consultado. Fallo técnico no se registra como rechazo; revalidar conserva historial y atrasos.</w:t>
             </w:r>
           </w:p>
         </w:tc>
@@ -7516,7 +7516,7 @@
               <w:rPr>
                 <w:sz w:val="22"/>
               </w:rPr>
-              <w:t>Mora y regularización</w:t>
+              <w:t>atraso y regularización</w:t>
             </w:r>
           </w:p>
         </w:tc>

</xml_diff>

<commit_message>
Actualizar requisitos y pruebas de representacion RUC 20
</commit_message>
<xml_diff>
--- a/docs/Sprint_1_Sistema_Prestamos.docx
+++ b/docs/Sprint_1_Sistema_Prestamos.docx
@@ -1867,7 +1867,7 @@
               <w:rPr>
                 <w:sz w:val="22"/>
               </w:rPr>
-              <w:t>Titulares con préstamos confirmados locales, incluidos pagados. Filtros Todos/Personas/Empresas; DNI personal y RUC empresarial.</w:t>
+              <w:t>Titulares con préstamos confirmados locales, incluidos pagados. Filtros Todos/Personas/Negocios y empresas. DNI/RUC 10 aparece con DNI en Personas y con RUC en Negocios y empresas; Todos reúne ambos en una fila.</w:t>
             </w:r>
           </w:p>
         </w:tc>
@@ -2088,7 +2088,7 @@
     </w:p>
     <w:p>
       <w:r>
-        <w:t>El menú del asesor contiene Préstamos, Clientes, Nuevo préstamo, Pagos y Cerrar sesión. Los accesos desde ficha o detalle llevan a esos mismos procesos, sin formularios de negocio duplicados.</w:t>
+        <w:t>El menú del asesor contiene Préstamos, Clientes, Nuevo préstamo, Representación de empresas, Pagos y Cerrar sesión. Los accesos desde ficha o detalle llevan a esos mismos procesos, sin formularios de negocio duplicados.</w:t>
       </w:r>
     </w:p>
     <w:p>
@@ -2101,7 +2101,13 @@
     </w:p>
     <w:p>
       <w:r>
-        <w:t>Nuevo préstamo: elegir DNI o RUC → recuperar ficha, revalidar o preparar identidad nueva → monto y plazo → cronograma → confirmar. El alta nueva permanece en memoria hasta confirmar; cambiar de agencia no duplica ficha ni exige repetir una revisión vigente de DNI.</w:t>
+        <w:t>Nuevo préstamo: elegir DNI o RUC → recuperar ficha, revalidar o preparar identidad nueva → monto y plazo → cronograma → confirmar. El alta nueva permanece en memoria hasta confirmar; la solicitud de representación RUC 20 se guarda por separado. Cambiar de agencia no duplica ficha ni exige repetir una revisión vigente de DNI.</w:t>
+      </w:r>
+    </w:p>
+    <w:p>
+      <w:pPr/>
+      <w:r>
+        <w:t>Para RUC 20, el cliente presenta el certificado de vigencia de poder emitido por SUNARP. El asesor envía un PDF privado de hasta 5 MB; el sistema comprueba tamaño y formato, sin certificar autenticidad. Un asesor con permiso de revisión contrasta el documento y registra referencia, sustento, importe máximo y vigencia de su revisión, o deja observaciones. La política académica permite hasta 30 días de revisión, sin atribuir ese plazo al certificado. Una nueva presentación sustituye la anterior para futuras operaciones. El historial y el PDF presentado permanecen; no hay préstamo ni alta de cliente hasta confirmar. Se conservan préstamos y pagos anteriores.</w:t>
       </w:r>
     </w:p>
     <w:p>
@@ -5054,7 +5060,7 @@
                 <w:b w:val="0"/>
                 <w:sz w:val="20"/>
               </w:rPr>
-              <w:t>Reutiliza la ficha vigente entre agencias sin duplicar consultas de DNI. El nuevo queda en memoria y se guarda junto con el préstamo en el paso 3; abandonar lo descarta.</w:t>
+              <w:t>Reutiliza la ficha vigente entre agencias sin duplicar consultas de DNI. El cliente nuevo queda en memoria y se guarda con el préstamo en el paso 3; abandonar descarta el alta, pero conserva una solicitud de representación ya enviada.</w:t>
             </w:r>
           </w:p>
           <w:p>
@@ -5230,7 +5236,7 @@
                 <w:b w:val="0"/>
                 <w:sz w:val="20"/>
               </w:rPr>
-              <w:t>RUC 20 distingue propietario y firmante. El ausente requiere identidad previa vigente; el firmante debe estar presente. Registra tipo y referencia de propiedad/designación y facultades, con dos revisiones aunque compartan documento. Varios propietarios exigen designación. Recupera referencias sin aprobarlas; no reasigna propietario.</w:t>
+              <w:t>RUC 20 distingue propietario y firmante presencial; el ausente exige identidad previa vigente. Registra propiedad/designación y adjunta certificado PDF privado de hasta 5 MB para revisión autorizada de autenticidad y facultades. Pendiente u observado bloquea continuar; solo admite firma individual. No reasigna propietario ni aprueba el crédito.</w:t>
             </w:r>
           </w:p>
         </w:tc>
@@ -5387,7 +5393,7 @@
               <w:rPr>
                 <w:b w:val="0"/>
               </w:rPr>
-              <w:t>Exige identidad vigente, sin atrasos, historial conciliado, capital y autorización cuando corresponda. DNI personal no exige estado SUNAT del RUC 10 asociado; solicitar por RUC sí exige ACTIVO/HABIDO y personas/facultades verificadas.</w:t>
+              <w:t>Exige identidad vigente, sin atrasos, historial conciliado, capital y autorización cuando corresponda. DNI personal no exige estado SUNAT del RUC 10 asociado; por RUC exige ACTIVO/HABIDO e identidad vigente. RUC 20 exige la última representación revisada de la agencia para empresa, propietario, firmante e importe; repite el control al confirmar.</w:t>
             </w:r>
           </w:p>
           <w:p>
@@ -5507,7 +5513,7 @@
               <w:rPr>
                 <w:b w:val="0"/>
               </w:rPr>
-              <w:t>Revisar no guarda. Confirmar registra alta nueva, evidencia, empresa cuando corresponda, préstamo y cuotas conjuntamente; un fallo revierte todo. Conserva revalidaciones existentes y evita duplicados por clave. Firma mayor de 30 minutos exige nueva consulta.</w:t>
+              <w:t>Revisar el cronograma no guarda. La solicitud de representación se conserva aparte; confirmar registra alta nueva, evidencia, empresa, préstamo y cuotas conjuntamente o revierte todo. Conserva revalidaciones existentes y evita duplicados por clave. Firma mayor de 30 minutos exige nueva consulta.</w:t>
             </w:r>
           </w:p>
           <w:p>
@@ -6027,7 +6033,7 @@
                 <w:b w:val="0"/>
                 <w:sz w:val="20"/>
               </w:rPr>
-              <w:t>Solo titulares con préstamos confirmados locales, incluidos pagados. Registrar identidad, acceder a un vínculo o cobrar una deuda ajena no los incorpora al listado.</w:t>
+              <w:t>Solo titulares con préstamos confirmados locales, incluidos pagados. DNI/RUC 10 figura en Personas con DNI y en Negocios y empresas con RUC; Todos conserva una fila. Identidad, solicitudes y cobros ajenos no incorporan titulares.</w:t>
             </w:r>
           </w:p>
           <w:p>
@@ -7019,7 +7025,7 @@
               <w:rPr>
                 <w:sz w:val="22"/>
               </w:rPr>
-              <w:t>Cuenta activa sin accesos de prueba; contador de 15 minutos, aviso y renovación válida. Otro navegador reemplaza la sesión anterior sin que cerrarla revoque la nueva.</w:t>
+              <w:t>Cuenta activa, contador de 15 minutos y renovación válida. Otro navegador reemplaza la sesión; cerrar la anterior no revoca la nueva.</w:t>
             </w:r>
           </w:p>
         </w:tc>
@@ -7071,7 +7077,7 @@
               <w:rPr>
                 <w:sz w:val="22"/>
               </w:rPr>
-              <w:t>DNI/RUC válidos y consulta firmada. Firma el propietario con facultades o un representante presente; propietario ausente solo con identidad previa vigente y evidencia documental.</w:t>
+              <w:t>RUC 20: PDF privado hasta 5 MB y revisión autorizada. Bloquea pendiente, observado, vencido, otro firmante o importe excesivo. RUC 10 sin certificado.</w:t>
             </w:r>
           </w:p>
         </w:tc>
@@ -7123,7 +7129,7 @@
               <w:rPr>
                 <w:sz w:val="22"/>
               </w:rPr>
-              <w:t>No se guarda antes del paso 3; abandono descarta el alta. Confirmación guarda todo o revierte todo. La revalidación existente guardada permanece.</w:t>
+              <w:t>Alta en paso 3 o reversión total; solicitudes y revalidaciones guardadas permanecen. Retomar verifica datos vigentes.</w:t>
             </w:r>
           </w:p>
         </w:tc>
@@ -7175,7 +7181,7 @@
               <w:rPr>
                 <w:sz w:val="22"/>
               </w:rPr>
-              <w:t>Préstamos y Clientes respetan cartera local; pagar deudas ajenas no incorpora titulares. DNI/RUC 10 comparten ficha y las empresas conservan la suya con vínculos autorizados.</w:t>
+              <w:t>Cartera local sin incorporar titulares por cobro ajeno. DNI/RUC 10: ficha en ambos filtros, una fila en Todos. Empresa con ficha y propietario para el límite.</w:t>
             </w:r>
           </w:p>
         </w:tc>
@@ -7227,7 +7233,7 @@
               <w:rPr>
                 <w:sz w:val="22"/>
               </w:rPr>
-              <w:t>RUC observado bloquea solicitar por ese RUC, sin bloquear DNI personal elegible ni pagos. El aviso de Pagos solo aparece con deuda pendiente del RUC consultado. Fallo técnico no se registra como rechazo; revalidar conserva historial y atrasos.</w:t>
+              <w:t>RUC observado bloquea ese RUC, sin impedir DNI elegible ni pagos. Aviso de Pagos solo con deuda del RUC exacto. Fallo técnico no es rechazo; revalidar conserva historial y atrasos.</w:t>
             </w:r>
           </w:p>
         </w:tc>

</xml_diff>

<commit_message>
Actualizar flujo RUC 20 requisitos y pruebas
</commit_message>
<xml_diff>
--- a/docs/Sprint_1_Sistema_Prestamos.docx
+++ b/docs/Sprint_1_Sistema_Prestamos.docx
@@ -171,7 +171,7 @@
               <w:rPr>
                 <w:sz w:val="22"/>
               </w:rPr>
-              <w:t>Verifica clientes, registra préstamos y cobra cuotas desde su agencia asignada.</w:t>
+              <w:t>Verifica clientes, registra préstamos, evalúa solicitudes RUC 20 y cobra cuotas desde su agencia asignada.</w:t>
             </w:r>
           </w:p>
         </w:tc>
@@ -200,7 +200,7 @@
               <w:rPr>
                 <w:sz w:val="22"/>
               </w:rPr>
-              <w:t>Gerente</w:t>
+              <w:t>Administrador</w:t>
             </w:r>
           </w:p>
         </w:tc>
@@ -223,7 +223,7 @@
               <w:rPr>
                 <w:sz w:val="22"/>
               </w:rPr>
-              <w:t>Consulta la situación general en una entrega posterior; no tiene panel en este sprint.</w:t>
+              <w:t>Rol previsto para una entrega posterior; no tiene pantallas en este sprint.</w:t>
             </w:r>
           </w:p>
         </w:tc>
@@ -1971,7 +1971,7 @@
               <w:rPr>
                 <w:sz w:val="22"/>
               </w:rPr>
-              <w:t>Cliente → Condiciones → Cronograma. Tipo fijo después del paso 1; cliente nuevo se guarda al confirmar. Revalidación guardada del existente permanece.</w:t>
+              <w:t>DNI/RUC 10: Cliente → Condiciones → Cronograma. RUC 20 añade Documentación tras identificar. Tipo fijo después del paso 1; Atrás conserva el borrador.</w:t>
             </w:r>
           </w:p>
         </w:tc>
@@ -2088,7 +2088,7 @@
     </w:p>
     <w:p>
       <w:r>
-        <w:t>El menú del asesor contiene Préstamos, Clientes, Nuevo préstamo, Representación de empresas, Pagos y Cerrar sesión. Los accesos desde ficha o detalle llevan a esos mismos procesos, sin formularios de negocio duplicados.</w:t>
+        <w:t>El menú del asesor contiene Préstamos, Clientes, Nuevo préstamo, Solicitudes de préstamo, Pagos y Cerrar sesión. Los accesos desde ficha o detalle llevan a esos mismos procesos, sin formularios de negocio duplicados.</w:t>
       </w:r>
     </w:p>
     <w:p>
@@ -2101,13 +2101,13 @@
     </w:p>
     <w:p>
       <w:r>
-        <w:t>Nuevo préstamo: elegir DNI o RUC → recuperar ficha, revalidar o preparar identidad nueva → monto y plazo → cronograma → confirmar. El alta nueva permanece en memoria hasta confirmar; la solicitud de representación RUC 20 se guarda por separado. Cambiar de agencia no duplica ficha ni exige repetir una revisión vigente de DNI.</w:t>
+        <w:t>Nuevo préstamo conserva su recorrido para DNI y RUC 10. RUC 20 recorre Identificación → Documentación → Condiciones → Cronograma y envío. El borrador, incluido el PDF, permanece en memoria; Atrás conserva datos y abandonar descarta lo no enviado. Solo Enviar solicitud de préstamo guarda el expediente completo como pendiente de evaluación.</w:t>
       </w:r>
     </w:p>
     <w:p>
       <w:pPr/>
       <w:r>
-        <w:t>Para RUC 20, el cliente presenta el certificado de vigencia de poder emitido por SUNARP. El asesor envía un PDF privado de hasta 5 MB; el sistema comprueba tamaño y formato, sin certificar autenticidad. Un asesor con permiso de revisión contrasta el documento y registra referencia, sustento, importe máximo y vigencia de su revisión, o deja observaciones. La política académica permite hasta 30 días de revisión, sin atribuir ese plazo al certificado. Una nueva presentación sustituye la anterior para futuras operaciones. El historial y el PDF presentado permanecen; no hay préstamo ni alta de cliente hasta confirmar. Se conservan préstamos y pagos anteriores.</w:t>
+        <w:t>El envío RUC 20 registra empresa, personas verificadas, referencia documental, PDF privado hasta 5 MB, monto, plazo y simulación; no genera deuda ni reserva capital. El asesor evalúa después desde Solicitudes de préstamo y puede aprobar, observar o rechazar en su agencia, incluso lo enviado por él. Aprobar exige contrastar autenticidad y firma individual, consultar SUNAT y repetir identidad, elegibilidad y cupo global. Entonces se crea el préstamo y sus cuotas desde la fecha de aprobación; conserva el expediente y su historial.</w:t>
       </w:r>
     </w:p>
     <w:p>
@@ -5060,7 +5060,7 @@
                 <w:b w:val="0"/>
                 <w:sz w:val="20"/>
               </w:rPr>
-              <w:t>Reutiliza la ficha vigente entre agencias sin duplicar consultas de DNI. El cliente nuevo queda en memoria y se guarda con el préstamo en el paso 3; abandonar descarta el alta, pero conserva una solicitud de representación ya enviada.</w:t>
+              <w:t>Reutiliza la ficha vigente entre agencias sin duplicar consultas de DNI. DNI/RUC 10 guarda al confirmar; RUC 20 conserva personas y documentos en memoria hasta el envío final. Corregir DNI repite la verificación; no edita nombres. Abandonar descarta el borrador.</w:t>
             </w:r>
           </w:p>
           <w:p>
@@ -5236,7 +5236,7 @@
                 <w:b w:val="0"/>
                 <w:sz w:val="20"/>
               </w:rPr>
-              <w:t>RUC 20 distingue propietario y firmante presencial; el ausente exige identidad previa vigente. Registra propiedad/designación y adjunta certificado PDF privado de hasta 5 MB para revisión autorizada de autenticidad y facultades. Pendiente u observado bloquea continuar; solo admite firma individual. No reasigna propietario ni aprueba el crédito.</w:t>
+              <w:t>RUC 20 distingue propietario y firmante presencial; el ausente exige identidad previa vigente. Documentación va en pantalla propia, con referencia del documento y certificado SUNARP PDF hasta 5 MB. Los tipos admitidos son concretos y reconocidos. La evaluación posterior admite firma individual; no reasigna propietario.</w:t>
             </w:r>
           </w:p>
         </w:tc>
@@ -5393,7 +5393,7 @@
               <w:rPr>
                 <w:b w:val="0"/>
               </w:rPr>
-              <w:t>Exige identidad vigente, sin atrasos, historial conciliado, capital y autorización cuando corresponda. DNI personal no exige estado SUNAT del RUC 10 asociado; por RUC exige ACTIVO/HABIDO e identidad vigente. RUC 20 exige la última representación revisada de la agencia para empresa, propietario, firmante e importe; repite el control al confirmar.</w:t>
+              <w:t>Exige identidad vigente, sin atrasos, historial conciliado, capital y autorización cuando corresponda. DNI personal no exige estado SUNAT del RUC 10 asociado; por RUC exige ACTIVO/HABIDO e identidad vigente. RUC 20 permite enviar para evaluación y solo genera préstamo al aprobar el expediente de empresa, propietario, firmante e importe, con todos los controles vigentes.</w:t>
             </w:r>
           </w:p>
           <w:p>
@@ -5513,7 +5513,7 @@
               <w:rPr>
                 <w:b w:val="0"/>
               </w:rPr>
-              <w:t>Revisar el cronograma no guarda. La solicitud de representación se conserva aparte; confirmar registra alta nueva, evidencia, empresa, préstamo y cuotas conjuntamente o revierte todo. Conserva revalidaciones existentes y evita duplicados por clave. Firma mayor de 30 minutos exige nueva consulta.</w:t>
+              <w:t>Revisar el cronograma no guarda. Enviar RUC 20 registra expediente y alta conjunta o revierte todo; queda pendiente sin préstamo, contrato definitivo ni cuotas cobrables. Aprobar crea préstamo y cuotas sin duplicados. Firma de consulta mayor de 30 minutos exige renovarla.</w:t>
             </w:r>
           </w:p>
           <w:p>
@@ -5553,7 +5553,7 @@
               <w:rPr>
                 <w:b w:val="0"/>
               </w:rPr>
-              <w:t>Tipo de cliente solo modificable en paso 1, sin Volver allí. Regresar de cronograma conserva condiciones; volver a identificación confirma el descarte cuando corresponde. No duplica Continuar ni Consultar clientes.</w:t>
+              <w:t>Tipo modificable solo en identificación. RUC 20 añade Documentación sin Ver solicitudes ni Actualizar revisión; Atrás conserva el borrador. Corregir DNI descarta el PDF ligado a esa selección. DNI/RUC 10 conserva su navegación.</w:t>
             </w:r>
           </w:p>
         </w:tc>
@@ -6055,7 +6055,7 @@
                 <w:b w:val="0"/>
                 <w:sz w:val="20"/>
               </w:rPr>
-              <w:t>DNI/RUC 10 comparten ficha; RUC 20 conserva ficha separada. El grupo autorizado comparte identificación, condición, capital y vínculos. No repite préstamos; los historiales se abren aparte.</w:t>
+              <w:t>DNI/RUC 10 comparten ficha; RUC 20 conserva empresa y propietario del límite. Recupera datos previos y permite otro representante verificado en otra solicitud. Una pendiente u observada por RUC se retoma sin duplicar; el historial conserva rechazos y aprobaciones.</w:t>
             </w:r>
           </w:p>
           <w:p>
@@ -7077,7 +7077,7 @@
               <w:rPr>
                 <w:sz w:val="22"/>
               </w:rPr>
-              <w:t>RUC 20: PDF privado hasta 5 MB y revisión autorizada. Bloquea pendiente, observado, vencido, otro firmante o importe excesivo. RUC 10 sin certificado.</w:t>
+              <w:t>RUC 20: corregir DNI antes de enviar; documento concreto, referencia y PDF hasta 5 MB. Asesor evalúa después; otra agencia no accede al expediente. RUC 10 sin certificado.</w:t>
             </w:r>
           </w:p>
         </w:tc>
@@ -7129,7 +7129,7 @@
               <w:rPr>
                 <w:sz w:val="22"/>
               </w:rPr>
-              <w:t>Alta en paso 3 o reversión total; solicitudes y revalidaciones guardadas permanecen. Retomar verifica datos vigentes.</w:t>
+              <w:t>RUC 20 no guarda antes del envío final. Pendiente sin deuda; observar corrige la misma solicitud y rechazar permite otra. Aprobar crea una sola operación.</w:t>
             </w:r>
           </w:p>
         </w:tc>
@@ -7493,7 +7493,7 @@
               <w:rPr>
                 <w:sz w:val="22"/>
               </w:rPr>
-              <w:t>No excede capital ni cobra cuotas dos veces. Rechaza cotización o selección obsoleta y conserva la misma operación en un reintento.</w:t>
+              <w:t>No excede capital ni duplica cobros o solicitudes. Aprobar revalida cupo sin reservarlo al enviar y rechaza versiones obsoletas; reintentar no duplica.</w:t>
             </w:r>
           </w:p>
         </w:tc>

</xml_diff>

<commit_message>
Sincronizar requisitos y manuales con cambios del 22 de octubre
</commit_message>
<xml_diff>
--- a/docs/Sprint_1_Sistema_Prestamos.docx
+++ b/docs/Sprint_1_Sistema_Prestamos.docx
@@ -1971,7 +1971,7 @@
               <w:rPr>
                 <w:sz w:val="22"/>
               </w:rPr>
-              <w:t>DNI/RUC 10: Cliente → Condiciones → Cronograma. RUC 20 añade Documentación tras identificar. Tipo fijo después del paso 1; Atrás conserva el borrador.</w:t>
+              <w:t>DNI/RUC 10: Cliente → Condiciones → Cronograma. RUC 20 añade Documentación tras identificar. Tipo fijo después del paso 1; Atrás conserva el borrador. Sin enlace Ir a clientes dentro del formulario.</w:t>
             </w:r>
           </w:p>
         </w:tc>
@@ -2118,6 +2118,557 @@
     <w:p>
       <w:r>
         <w:t>Cobranza: Pagos → consultar DNI/RUC/PR- → elegir préstamo → revisar cuotas y origen → confirmar dinero recibido y cobro → constancia. Desde ficha o detalle consulta automáticamente y conserva el contexto.</w:t>
+      </w:r>
+    </w:p>
+    <w:p>
+      <w:pPr>
+        <w:pStyle w:val="Ttulo2"/>
+      </w:pPr>
+      <w:r>
+        <w:t>Documentación y validaciones de empresas</w:t>
+      </w:r>
+    </w:p>
+    <w:p>
+      <w:r>
+        <w:t>El asesor selecciona el documento que sustenta el vínculo e ingresa solo sus datos variables. Copia literal: partida y asiento; escritura pública: número, fecha y notaría; acto constitutivo SACS: partida y fecha; matrícula de acciones: libro, folio y asiento de titularidad. El sistema construye la referencia completa y no exige escribir sus etiquetas.</w:t>
+      </w:r>
+    </w:p>
+    <w:tbl>
+      <w:tblPr>
+        <w:tblStyle w:val="TableNormal"/>
+        <w:tblW w:w="9488" w:type="dxa"/>
+        <w:tblInd w:w="0" w:type="dxa"/>
+        <w:tblBorders>
+          <w:top w:val="single" w:sz="8" w:space="0" w:color="000000"/>
+          <w:left w:val="single" w:sz="8" w:space="0" w:color="000000"/>
+          <w:bottom w:val="single" w:sz="8" w:space="0" w:color="000000"/>
+          <w:right w:val="single" w:sz="8" w:space="0" w:color="000000"/>
+          <w:insideH w:val="single" w:sz="8" w:space="0" w:color="000000"/>
+          <w:insideV w:val="single" w:sz="8" w:space="0" w:color="000000"/>
+        </w:tblBorders>
+        <w:tblLayout w:type="fixed"/>
+        <w:tblLook w:val="04A0" w:firstRow="1" w:lastRow="0" w:firstColumn="1" w:lastColumn="0" w:noHBand="0" w:noVBand="1"/>
+      </w:tblPr>
+      <w:tblGrid>
+        <w:gridCol w:w="1806"/>
+        <w:gridCol w:w="5147"/>
+        <w:gridCol w:w="2077"/>
+      </w:tblGrid>
+      <w:tr>
+        <w:trPr>
+          <w:tblHeader/>
+        </w:trPr>
+        <w:tc>
+          <w:tcPr>
+            <w:tcW w:type="dxa" w:w="1806"/>
+            <w:tcMar>
+              <w:top w:w="60" w:type="dxa"/>
+              <w:left w:w="90" w:type="dxa"/>
+              <w:bottom w:w="60" w:type="dxa"/>
+              <w:right w:w="90" w:type="dxa"/>
+            </w:tcMar>
+            <w:vAlign w:val="center"/>
+          </w:tcPr>
+          <w:p>
+            <w:pPr>
+              <w:spacing w:before="20" w:after="20" w:line="240" w:lineRule="auto"/>
+            </w:pPr>
+            <w:r>
+              <w:rPr>
+                <w:b/>
+                <w:sz w:val="22"/>
+              </w:rPr>
+              <w:t>Campo</w:t>
+            </w:r>
+          </w:p>
+        </w:tc>
+        <w:tc>
+          <w:tcPr>
+            <w:tcW w:type="dxa" w:w="5147"/>
+            <w:tcMar>
+              <w:top w:w="60" w:type="dxa"/>
+              <w:left w:w="90" w:type="dxa"/>
+              <w:bottom w:w="60" w:type="dxa"/>
+              <w:right w:w="90" w:type="dxa"/>
+            </w:tcMar>
+            <w:vAlign w:val="center"/>
+          </w:tcPr>
+          <w:p>
+            <w:pPr>
+              <w:spacing w:before="20" w:after="20" w:line="240" w:lineRule="auto"/>
+            </w:pPr>
+            <w:r>
+              <w:rPr>
+                <w:b/>
+                <w:sz w:val="22"/>
+              </w:rPr>
+              <w:t>Entrada admitida</w:t>
+            </w:r>
+          </w:p>
+        </w:tc>
+        <w:tc>
+          <w:tcPr>
+            <w:tcW w:type="dxa" w:w="2077"/>
+            <w:tcMar>
+              <w:top w:w="60" w:type="dxa"/>
+              <w:left w:w="90" w:type="dxa"/>
+              <w:bottom w:w="60" w:type="dxa"/>
+              <w:right w:w="90" w:type="dxa"/>
+            </w:tcMar>
+            <w:vAlign w:val="center"/>
+          </w:tcPr>
+          <w:p>
+            <w:pPr>
+              <w:spacing w:before="20" w:after="20" w:line="240" w:lineRule="auto"/>
+            </w:pPr>
+            <w:r>
+              <w:rPr>
+                <w:b/>
+                <w:sz w:val="22"/>
+              </w:rPr>
+              <w:t>Máximo</w:t>
+            </w:r>
+          </w:p>
+        </w:tc>
+      </w:tr>
+      <w:tr>
+        <w:tc>
+          <w:tcPr>
+            <w:tcW w:type="dxa" w:w="1806"/>
+            <w:tcMar>
+              <w:top w:w="60" w:type="dxa"/>
+              <w:left w:w="90" w:type="dxa"/>
+              <w:bottom w:w="60" w:type="dxa"/>
+              <w:right w:w="90" w:type="dxa"/>
+            </w:tcMar>
+            <w:vAlign w:val="center"/>
+          </w:tcPr>
+          <w:p>
+            <w:pPr>
+              <w:spacing w:before="20" w:after="20" w:line="240" w:lineRule="auto"/>
+            </w:pPr>
+            <w:r>
+              <w:rPr>
+                <w:sz w:val="22"/>
+              </w:rPr>
+              <w:t>Partida</w:t>
+            </w:r>
+          </w:p>
+        </w:tc>
+        <w:tc>
+          <w:tcPr>
+            <w:tcW w:type="dxa" w:w="5147"/>
+            <w:tcMar>
+              <w:top w:w="60" w:type="dxa"/>
+              <w:left w:w="90" w:type="dxa"/>
+              <w:bottom w:w="60" w:type="dxa"/>
+              <w:right w:w="90" w:type="dxa"/>
+            </w:tcMar>
+            <w:vAlign w:val="center"/>
+          </w:tcPr>
+          <w:p>
+            <w:pPr>
+              <w:spacing w:before="20" w:after="20" w:line="240" w:lineRule="auto"/>
+            </w:pPr>
+            <w:r>
+              <w:rPr>
+                <w:sz w:val="22"/>
+              </w:rPr>
+              <w:t>Solo números; conserva ceros iniciales.</w:t>
+            </w:r>
+          </w:p>
+        </w:tc>
+        <w:tc>
+          <w:tcPr>
+            <w:tcW w:type="dxa" w:w="2077"/>
+            <w:tcMar>
+              <w:top w:w="60" w:type="dxa"/>
+              <w:left w:w="90" w:type="dxa"/>
+              <w:bottom w:w="60" w:type="dxa"/>
+              <w:right w:w="90" w:type="dxa"/>
+            </w:tcMar>
+            <w:vAlign w:val="center"/>
+          </w:tcPr>
+          <w:p>
+            <w:pPr>
+              <w:spacing w:before="20" w:after="20" w:line="240" w:lineRule="auto"/>
+            </w:pPr>
+            <w:r>
+              <w:rPr>
+                <w:sz w:val="22"/>
+              </w:rPr>
+              <w:t>12 dígitos</w:t>
+            </w:r>
+          </w:p>
+        </w:tc>
+      </w:tr>
+      <w:tr>
+        <w:tc>
+          <w:tcPr>
+            <w:tcW w:type="dxa" w:w="1806"/>
+            <w:tcMar>
+              <w:top w:w="60" w:type="dxa"/>
+              <w:left w:w="90" w:type="dxa"/>
+              <w:bottom w:w="60" w:type="dxa"/>
+              <w:right w:w="90" w:type="dxa"/>
+            </w:tcMar>
+            <w:vAlign w:val="center"/>
+          </w:tcPr>
+          <w:p>
+            <w:pPr>
+              <w:spacing w:before="20" w:after="20" w:line="240" w:lineRule="auto"/>
+            </w:pPr>
+            <w:r>
+              <w:rPr>
+                <w:sz w:val="22"/>
+              </w:rPr>
+              <w:t>Escritura</w:t>
+            </w:r>
+          </w:p>
+        </w:tc>
+        <w:tc>
+          <w:tcPr>
+            <w:tcW w:type="dxa" w:w="5147"/>
+            <w:tcMar>
+              <w:top w:w="60" w:type="dxa"/>
+              <w:left w:w="90" w:type="dxa"/>
+              <w:bottom w:w="60" w:type="dxa"/>
+              <w:right w:w="90" w:type="dxa"/>
+            </w:tcMar>
+            <w:vAlign w:val="center"/>
+          </w:tcPr>
+          <w:p>
+            <w:pPr>
+              <w:spacing w:before="20" w:after="20" w:line="240" w:lineRule="auto"/>
+            </w:pPr>
+            <w:r>
+              <w:rPr>
+                <w:sz w:val="22"/>
+              </w:rPr>
+              <w:t>Solo números; conserva ceros iniciales.</w:t>
+            </w:r>
+          </w:p>
+        </w:tc>
+        <w:tc>
+          <w:tcPr>
+            <w:tcW w:type="dxa" w:w="2077"/>
+            <w:tcMar>
+              <w:top w:w="60" w:type="dxa"/>
+              <w:left w:w="90" w:type="dxa"/>
+              <w:bottom w:w="60" w:type="dxa"/>
+              <w:right w:w="90" w:type="dxa"/>
+            </w:tcMar>
+            <w:vAlign w:val="center"/>
+          </w:tcPr>
+          <w:p>
+            <w:pPr>
+              <w:spacing w:before="20" w:after="20" w:line="240" w:lineRule="auto"/>
+            </w:pPr>
+            <w:r>
+              <w:rPr>
+                <w:sz w:val="22"/>
+              </w:rPr>
+              <w:t>10 dígitos</w:t>
+            </w:r>
+          </w:p>
+        </w:tc>
+      </w:tr>
+      <w:tr>
+        <w:tc>
+          <w:tcPr>
+            <w:tcW w:type="dxa" w:w="1806"/>
+            <w:tcMar>
+              <w:top w:w="60" w:type="dxa"/>
+              <w:left w:w="90" w:type="dxa"/>
+              <w:bottom w:w="60" w:type="dxa"/>
+              <w:right w:w="90" w:type="dxa"/>
+            </w:tcMar>
+            <w:vAlign w:val="center"/>
+          </w:tcPr>
+          <w:p>
+            <w:pPr>
+              <w:spacing w:before="20" w:after="20" w:line="240" w:lineRule="auto"/>
+            </w:pPr>
+            <w:r>
+              <w:rPr>
+                <w:sz w:val="22"/>
+              </w:rPr>
+              <w:t>Libro y folio</w:t>
+            </w:r>
+          </w:p>
+        </w:tc>
+        <w:tc>
+          <w:tcPr>
+            <w:tcW w:type="dxa" w:w="5147"/>
+            <w:tcMar>
+              <w:top w:w="60" w:type="dxa"/>
+              <w:left w:w="90" w:type="dxa"/>
+              <w:bottom w:w="60" w:type="dxa"/>
+              <w:right w:w="90" w:type="dxa"/>
+            </w:tcMar>
+            <w:vAlign w:val="center"/>
+          </w:tcPr>
+          <w:p>
+            <w:pPr>
+              <w:spacing w:before="20" w:after="20" w:line="240" w:lineRule="auto"/>
+            </w:pPr>
+            <w:r>
+              <w:rPr>
+                <w:sz w:val="22"/>
+              </w:rPr>
+              <w:t>Solo números; conserva ceros iniciales.</w:t>
+            </w:r>
+          </w:p>
+        </w:tc>
+        <w:tc>
+          <w:tcPr>
+            <w:tcW w:type="dxa" w:w="2077"/>
+            <w:tcMar>
+              <w:top w:w="60" w:type="dxa"/>
+              <w:left w:w="90" w:type="dxa"/>
+              <w:bottom w:w="60" w:type="dxa"/>
+              <w:right w:w="90" w:type="dxa"/>
+            </w:tcMar>
+            <w:vAlign w:val="center"/>
+          </w:tcPr>
+          <w:p>
+            <w:pPr>
+              <w:spacing w:before="20" w:after="20" w:line="240" w:lineRule="auto"/>
+            </w:pPr>
+            <w:r>
+              <w:rPr>
+                <w:sz w:val="22"/>
+              </w:rPr>
+              <w:t>6 dígitos cada uno</w:t>
+            </w:r>
+          </w:p>
+        </w:tc>
+      </w:tr>
+      <w:tr>
+        <w:tc>
+          <w:tcPr>
+            <w:tcW w:type="dxa" w:w="1806"/>
+            <w:tcMar>
+              <w:top w:w="60" w:type="dxa"/>
+              <w:left w:w="90" w:type="dxa"/>
+              <w:bottom w:w="60" w:type="dxa"/>
+              <w:right w:w="90" w:type="dxa"/>
+            </w:tcMar>
+            <w:vAlign w:val="center"/>
+          </w:tcPr>
+          <w:p>
+            <w:pPr>
+              <w:spacing w:before="20" w:after="20" w:line="240" w:lineRule="auto"/>
+            </w:pPr>
+            <w:r>
+              <w:rPr>
+                <w:sz w:val="22"/>
+              </w:rPr>
+              <w:t>Asiento</w:t>
+            </w:r>
+          </w:p>
+        </w:tc>
+        <w:tc>
+          <w:tcPr>
+            <w:tcW w:type="dxa" w:w="5147"/>
+            <w:tcMar>
+              <w:top w:w="60" w:type="dxa"/>
+              <w:left w:w="90" w:type="dxa"/>
+              <w:bottom w:w="60" w:type="dxa"/>
+              <w:right w:w="90" w:type="dxa"/>
+            </w:tcMar>
+            <w:vAlign w:val="center"/>
+          </w:tcPr>
+          <w:p>
+            <w:pPr>
+              <w:spacing w:before="20" w:after="20" w:line="240" w:lineRule="auto"/>
+            </w:pPr>
+            <w:r>
+              <w:rPr>
+                <w:sz w:val="22"/>
+              </w:rPr>
+              <w:t>Letras y números; se muestra en mayúsculas.</w:t>
+            </w:r>
+          </w:p>
+        </w:tc>
+        <w:tc>
+          <w:tcPr>
+            <w:tcW w:type="dxa" w:w="2077"/>
+            <w:tcMar>
+              <w:top w:w="60" w:type="dxa"/>
+              <w:left w:w="90" w:type="dxa"/>
+              <w:bottom w:w="60" w:type="dxa"/>
+              <w:right w:w="90" w:type="dxa"/>
+            </w:tcMar>
+            <w:vAlign w:val="center"/>
+          </w:tcPr>
+          <w:p>
+            <w:pPr>
+              <w:spacing w:before="20" w:after="20" w:line="240" w:lineRule="auto"/>
+            </w:pPr>
+            <w:r>
+              <w:rPr>
+                <w:sz w:val="22"/>
+              </w:rPr>
+              <w:t>10 caracteres</w:t>
+            </w:r>
+          </w:p>
+        </w:tc>
+      </w:tr>
+      <w:tr>
+        <w:tc>
+          <w:tcPr>
+            <w:tcW w:type="dxa" w:w="1806"/>
+            <w:tcMar>
+              <w:top w:w="60" w:type="dxa"/>
+              <w:left w:w="90" w:type="dxa"/>
+              <w:bottom w:w="60" w:type="dxa"/>
+              <w:right w:w="90" w:type="dxa"/>
+            </w:tcMar>
+            <w:vAlign w:val="center"/>
+          </w:tcPr>
+          <w:p>
+            <w:pPr>
+              <w:spacing w:before="20" w:after="20" w:line="240" w:lineRule="auto"/>
+            </w:pPr>
+            <w:r>
+              <w:rPr>
+                <w:sz w:val="22"/>
+              </w:rPr>
+              <w:t>Notaría</w:t>
+            </w:r>
+          </w:p>
+        </w:tc>
+        <w:tc>
+          <w:tcPr>
+            <w:tcW w:type="dxa" w:w="5147"/>
+            <w:tcMar>
+              <w:top w:w="60" w:type="dxa"/>
+              <w:left w:w="90" w:type="dxa"/>
+              <w:bottom w:w="60" w:type="dxa"/>
+              <w:right w:w="90" w:type="dxa"/>
+            </w:tcMar>
+            <w:vAlign w:val="center"/>
+          </w:tcPr>
+          <w:p>
+            <w:pPr>
+              <w:spacing w:before="20" w:after="20" w:line="240" w:lineRule="auto"/>
+            </w:pPr>
+            <w:r>
+              <w:rPr>
+                <w:sz w:val="22"/>
+              </w:rPr>
+              <w:t>Nombre con tildes, números y signos habituales; al menos una letra.</w:t>
+            </w:r>
+          </w:p>
+        </w:tc>
+        <w:tc>
+          <w:tcPr>
+            <w:tcW w:type="dxa" w:w="2077"/>
+            <w:tcMar>
+              <w:top w:w="60" w:type="dxa"/>
+              <w:left w:w="90" w:type="dxa"/>
+              <w:bottom w:w="60" w:type="dxa"/>
+              <w:right w:w="90" w:type="dxa"/>
+            </w:tcMar>
+            <w:vAlign w:val="center"/>
+          </w:tcPr>
+          <w:p>
+            <w:pPr>
+              <w:spacing w:before="20" w:after="20" w:line="240" w:lineRule="auto"/>
+            </w:pPr>
+            <w:r>
+              <w:rPr>
+                <w:sz w:val="22"/>
+              </w:rPr>
+              <w:t>80 caracteres</w:t>
+            </w:r>
+          </w:p>
+        </w:tc>
+      </w:tr>
+      <w:tr>
+        <w:tc>
+          <w:tcPr>
+            <w:tcW w:type="dxa" w:w="1806"/>
+            <w:tcMar>
+              <w:top w:w="60" w:type="dxa"/>
+              <w:left w:w="90" w:type="dxa"/>
+              <w:bottom w:w="60" w:type="dxa"/>
+              <w:right w:w="90" w:type="dxa"/>
+            </w:tcMar>
+            <w:vAlign w:val="center"/>
+          </w:tcPr>
+          <w:p>
+            <w:pPr>
+              <w:spacing w:before="20" w:after="20" w:line="240" w:lineRule="auto"/>
+            </w:pPr>
+            <w:r>
+              <w:rPr>
+                <w:sz w:val="22"/>
+              </w:rPr>
+              <w:t>Fecha</w:t>
+            </w:r>
+          </w:p>
+        </w:tc>
+        <w:tc>
+          <w:tcPr>
+            <w:tcW w:type="dxa" w:w="5147"/>
+            <w:tcMar>
+              <w:top w:w="60" w:type="dxa"/>
+              <w:left w:w="90" w:type="dxa"/>
+              <w:bottom w:w="60" w:type="dxa"/>
+              <w:right w:w="90" w:type="dxa"/>
+            </w:tcMar>
+            <w:vAlign w:val="center"/>
+          </w:tcPr>
+          <w:p>
+            <w:pPr>
+              <w:spacing w:before="20" w:after="20" w:line="240" w:lineRule="auto"/>
+            </w:pPr>
+            <w:r>
+              <w:rPr>
+                <w:sz w:val="22"/>
+              </w:rPr>
+              <w:t>Fecha real de calendario con año de cuatro dígitos.</w:t>
+            </w:r>
+          </w:p>
+        </w:tc>
+        <w:tc>
+          <w:tcPr>
+            <w:tcW w:type="dxa" w:w="2077"/>
+            <w:tcMar>
+              <w:top w:w="60" w:type="dxa"/>
+              <w:left w:w="90" w:type="dxa"/>
+              <w:bottom w:w="60" w:type="dxa"/>
+              <w:right w:w="90" w:type="dxa"/>
+            </w:tcMar>
+            <w:vAlign w:val="center"/>
+          </w:tcPr>
+          <w:p>
+            <w:pPr>
+              <w:spacing w:before="20" w:after="20" w:line="240" w:lineRule="auto"/>
+            </w:pPr>
+            <w:r>
+              <w:rPr>
+                <w:sz w:val="22"/>
+              </w:rPr>
+              <w:t>Formato de fecha</w:t>
+            </w:r>
+          </w:p>
+        </w:tc>
+      </w:tr>
+    </w:tbl>
+    <w:p>
+      <w:pPr>
+        <w:spacing w:before="160"/>
+      </w:pPr>
+      <w:r>
+        <w:t>Los límites anteriores son decisiones operativas del formulario y no describen una longitud registral universal. Escribir caracteres no admitidos o pegar un valor inválido no reemplaza el dato válido anterior; el formulario muestra el motivo. Un pegado demasiado largo se rechaza completo. Los campos vacíos o inválidos impiden continuar. Las referencias previas solo se separan en campos cuando la conversión es exacta; las demás se conservan completas y ofrecen Corregir datos del documento, sin recorte automático.</w:t>
+      </w:r>
+    </w:p>
+    <w:p>
+      <w:r>
+        <w:t>Corregir DNI del propietario y Corregir DNI del representante aparecen junto al título de su tarjeta, con lápiz, texto azul grisáceo, fondo transparente y foco de teclado visible. En móvil se acomodan debajo del título. La corrección vuelve a verificar la identidad y descarta el PDF asociado; la empresa registrada conserva el propietario del límite. Los filtros de Solicitudes de préstamo se separan de la tabla y se distribuyen en varias líneas cuando falta espacio.</w:t>
       </w:r>
     </w:p>
     <w:p>
@@ -5236,7 +5787,51 @@
                 <w:b w:val="0"/>
                 <w:sz w:val="20"/>
               </w:rPr>
-              <w:t>RUC 20 distingue propietario y firmante presencial; el ausente exige identidad previa vigente. Documentación va en pantalla propia, con referencia del documento y certificado SUNARP PDF hasta 5 MB. Los tipos admitidos son concretos y reconocidos. La evaluación posterior admite firma individual; no reasigna propietario.</w:t>
+              <w:t>RUC 20 distingue propietario y firmante presencial; el ausente exige identidad previa vigente. Documentación va en pantalla propia, con campos según el documento, referencia generada automáticamente y certificado SUNARP PDF hasta 5 MB. Los tipos admitidos son concretos y reconocidos. La evaluación posterior admite firma individual; no reasigna propietario.</w:t>
+            </w:r>
+          </w:p>
+          <w:p>
+            <w:pPr>
+              <w:spacing w:before="60" w:after="80" w:line="240" w:lineRule="auto"/>
+              <w:ind w:left="216" w:hanging="216"/>
+              <w:keepNext w:val="0"/>
+              <w:keepLines/>
+            </w:pPr>
+            <w:r>
+              <w:rPr>
+                <w:b/>
+                <w:sz w:val="20"/>
+              </w:rPr>
+              <w:t xml:space="preserve">• CA11. Referencias guiadas: </w:t>
+            </w:r>
+            <w:r>
+              <w:rPr>
+                <w:b w:val="0"/>
+                <w:sz w:val="20"/>
+              </w:rPr>
+              <w:t>Genera la referencia con campos específicos, tipos y límites de Documentación y validaciones de empresas. Rechaza escritura y pegado inválidos; los campos vacíos o inválidos bloquean continuar. Conserva referencias anteriores sin recortarlas.</w:t>
+            </w:r>
+          </w:p>
+          <w:p>
+            <w:pPr>
+              <w:spacing w:before="60" w:after="80" w:line="240" w:lineRule="auto"/>
+              <w:ind w:left="216" w:hanging="216"/>
+              <w:keepNext w:val="0"/>
+              <w:keepLines/>
+            </w:pPr>
+            <w:r>
+              <w:rPr>
+                <w:b/>
+                <w:sz w:val="20"/>
+              </w:rPr>
+              <w:t xml:space="preserve">• CA12. Corrección visible: </w:t>
+            </w:r>
+            <w:r>
+              <w:rPr>
+                <w:b w:val="0"/>
+                <w:sz w:val="20"/>
+              </w:rPr>
+              <w:t>Ubica las acciones Corregir DNI junto al título, con lápiz y estilo discreto adaptable a móvil. Repite verificación y conserva la restricción del propietario ya registrado.</w:t>
             </w:r>
           </w:p>
         </w:tc>
@@ -5553,7 +6148,7 @@
               <w:rPr>
                 <w:b w:val="0"/>
               </w:rPr>
-              <w:t>Tipo modificable solo en identificación. RUC 20 añade Documentación sin Ver solicitudes ni Actualizar revisión; Atrás conserva el borrador. Corregir DNI descarta el PDF ligado a esa selección. DNI/RUC 10 conserva su navegación.</w:t>
+              <w:t>Tipo modificable solo en identificación. RUC 20 añade Documentación sin Ver solicitudes ni Actualizar revisión; el formulario no muestra Ir a clientes. Atrás conserva el borrador y la salida voluntaria por los enlaces protegidos advierte sobre datos pendientes. Corregir DNI descarta el PDF ligado a esa selección. DNI/RUC 10 conserva su navegación.</w:t>
             </w:r>
           </w:p>
         </w:tc>
@@ -6188,6 +6783,28 @@
                 <w:sz w:val="20"/>
               </w:rPr>
               <w:t>DNI de ocho dígitos y RUC válido de once. PR- fijo más ocho hexadecimales en mayúsculas; pegar código completo no duplica prefijo. Entrada inválida impide consultar.</w:t>
+            </w:r>
+          </w:p>
+          <w:p>
+            <w:pPr>
+              <w:spacing w:before="0" w:after="40" w:line="240" w:lineRule="auto"/>
+              <w:ind w:left="216" w:hanging="216"/>
+              <w:keepNext w:val="0"/>
+              <w:keepLines/>
+            </w:pPr>
+            <w:r>
+              <w:rPr>
+                <w:b/>
+                <w:sz w:val="20"/>
+              </w:rPr>
+              <w:t xml:space="preserve">• CA11. Solicitudes de la agencia: </w:t>
+            </w:r>
+            <w:r>
+              <w:rPr>
+                <w:b w:val="0"/>
+                <w:sz w:val="20"/>
+              </w:rPr>
+              <w:t>Lista solicitudes RUC 20 por Pendientes, Observadas, Aprobadas, Rechazadas y Todas. Separa los filtros de la tabla y adapta su distribución a pantallas pequeñas; conserva la privacidad por agencia.</w:t>
             </w:r>
           </w:p>
         </w:tc>
@@ -7077,7 +7694,7 @@
               <w:rPr>
                 <w:sz w:val="22"/>
               </w:rPr>
-              <w:t>RUC 20: corregir DNI antes de enviar; documento concreto, referencia y PDF hasta 5 MB. Asesor evalúa después; otra agencia no accede al expediente. RUC 10 sin certificado.</w:t>
+              <w:t>RUC 20: corregir DNI antes de enviar; documento concreto, referencia automática y PDF hasta 5 MB. Asesor evalúa después; otra agencia no accede al expediente. RUC 10 sin certificado.</w:t>
             </w:r>
           </w:p>
         </w:tc>
@@ -7598,6 +8215,110 @@
                 <w:sz w:val="22"/>
               </w:rPr>
               <w:t>Un historial incompleto bloquea nuevas colocaciones; cancelar exige pago total. Pagar no elimina identidad ni su caducidad, y quedan historial y constancias.</w:t>
+            </w:r>
+          </w:p>
+        </w:tc>
+      </w:tr>
+      <w:tr>
+        <w:trPr>
+          <w:cantSplit/>
+          <w:cantSplit/>
+        </w:trPr>
+        <w:tc>
+          <w:tcPr>
+            <w:tcW w:w="2494" w:type="dxa"/>
+            <w:tcMar>
+              <w:top w:w="60" w:type="dxa"/>
+              <w:left w:w="90" w:type="dxa"/>
+              <w:bottom w:w="60" w:type="dxa"/>
+              <w:right w:w="90" w:type="dxa"/>
+            </w:tcMar>
+            <w:vAlign w:val="center"/>
+          </w:tcPr>
+          <w:p>
+            <w:pPr>
+              <w:spacing w:before="20" w:after="20" w:line="240" w:lineRule="auto"/>
+            </w:pPr>
+            <w:r>
+              <w:rPr>
+                <w:sz w:val="22"/>
+              </w:rPr>
+              <w:t>Referencias y restricciones</w:t>
+            </w:r>
+          </w:p>
+        </w:tc>
+        <w:tc>
+          <w:tcPr>
+            <w:tcW w:w="6860" w:type="dxa"/>
+            <w:tcMar>
+              <w:top w:w="60" w:type="dxa"/>
+              <w:left w:w="90" w:type="dxa"/>
+              <w:bottom w:w="60" w:type="dxa"/>
+              <w:right w:w="90" w:type="dxa"/>
+            </w:tcMar>
+            <w:vAlign w:val="center"/>
+          </w:tcPr>
+          <w:p>
+            <w:pPr>
+              <w:spacing w:before="20" w:after="20" w:line="240" w:lineRule="auto"/>
+            </w:pPr>
+            <w:r>
+              <w:rPr>
+                <w:sz w:val="22"/>
+              </w:rPr>
+              <w:t>Elegir los cuatro documentos, comprobar campos y límites, conservar ceros y convertir asiento a mayúsculas. Rechazar letras en números, signos en asiento y pegado excesivo; aceptar notaría con tildes y fecha real. Retomar una referencia anterior sin recortarla.</w:t>
+            </w:r>
+          </w:p>
+        </w:tc>
+      </w:tr>
+      <w:tr>
+        <w:trPr>
+          <w:cantSplit/>
+          <w:cantSplit/>
+        </w:trPr>
+        <w:tc>
+          <w:tcPr>
+            <w:tcW w:w="2494" w:type="dxa"/>
+            <w:tcMar>
+              <w:top w:w="60" w:type="dxa"/>
+              <w:left w:w="90" w:type="dxa"/>
+              <w:bottom w:w="60" w:type="dxa"/>
+              <w:right w:w="90" w:type="dxa"/>
+            </w:tcMar>
+            <w:vAlign w:val="center"/>
+          </w:tcPr>
+          <w:p>
+            <w:pPr>
+              <w:spacing w:before="20" w:after="20" w:line="240" w:lineRule="auto"/>
+            </w:pPr>
+            <w:r>
+              <w:rPr>
+                <w:sz w:val="22"/>
+              </w:rPr>
+              <w:t>Interfaz y conservación del flujo</w:t>
+            </w:r>
+          </w:p>
+        </w:tc>
+        <w:tc>
+          <w:tcPr>
+            <w:tcW w:w="6860" w:type="dxa"/>
+            <w:tcMar>
+              <w:top w:w="60" w:type="dxa"/>
+              <w:left w:w="90" w:type="dxa"/>
+              <w:bottom w:w="60" w:type="dxa"/>
+              <w:right w:w="90" w:type="dxa"/>
+            </w:tcMar>
+            <w:vAlign w:val="center"/>
+          </w:tcPr>
+          <w:p>
+            <w:pPr>
+              <w:spacing w:before="20" w:after="20" w:line="240" w:lineRule="auto"/>
+            </w:pPr>
+            <w:r>
+              <w:rPr>
+                <w:sz w:val="22"/>
+              </w:rPr>
+              <w:t>Sin Ir a clientes en Nuevo préstamo. Atrás conserva personas, documentos, PDF y condiciones; corregir DNI invalida el PDF. Botones junto al título y adaptables a móvil; filtros separados de la tabla de Solicitudes.</w:t>
             </w:r>
           </w:p>
         </w:tc>

</xml_diff>

<commit_message>
Actualizar flujo de propietario pendiente y validacion del representante
</commit_message>
<xml_diff>
--- a/docs/Sprint_1_Sistema_Prestamos.docx
+++ b/docs/Sprint_1_Sistema_Prestamos.docx
@@ -2107,7 +2107,7 @@
     <w:p>
       <w:pPr/>
       <w:r>
-        <w:t>El envío RUC 20 registra empresa, personas verificadas, referencia documental, PDF privado hasta 5 MB, monto, plazo y simulación; no genera deuda ni reserva capital. El asesor evalúa después desde Solicitudes de préstamo y puede aprobar, observar o rechazar en su agencia, incluso lo enviado por él. Aprobar exige contrastar autenticidad y firma individual, consultar SUNAT y repetir identidad, elegibilidad y cupo global. Entonces se crea el préstamo y sus cuotas desde la fecha de aprobación; conserva el expediente y su historial.</w:t>
+        <w:t>El envío RUC 20 guarda el expediente, el PDF privado hasta 5 MB, monto, plazo y simulación; no genera deuda ni reserva capital. Si el propietario ausente es nuevo o su verificación no está vigente, queda Pendiente de verificación del propietario. No crea una identidad aprobada ni una empresa nueva sin ese vínculo; registra al representante verificado y conserva el DNI declarado del propietario. Cuando este acude, el asesor completa la revisión presencial desde la misma solicitud, conserva el PDF y pasa a evaluación; las observaciones documentales previas permanecen. El asesor evalúa después desde Solicitudes de préstamo y puede aprobar, observar o rechazar en su agencia, incluso lo enviado por él. Aprobar exige contrastar autenticidad y firma individual, consultar SUNAT y repetir identidad, elegibilidad y cupo global. Entonces se crea el préstamo y sus cuotas desde la fecha de aprobación; conserva el expediente y su historial.</w:t>
       </w:r>
     </w:p>
     <w:p>
@@ -2882,6 +2882,58 @@
               <w:rPr>
                 <w:sz w:val="22"/>
               </w:rPr>
+              <w:t>Solicitud RUC 20</w:t>
+            </w:r>
+          </w:p>
+        </w:tc>
+        <w:tc>
+          <w:tcPr>
+            <w:tcW w:w="6860" w:type="dxa"/>
+            <w:tcMar>
+              <w:top w:w="60" w:type="dxa"/>
+              <w:left w:w="90" w:type="dxa"/>
+              <w:bottom w:w="60" w:type="dxa"/>
+              <w:right w:w="90" w:type="dxa"/>
+            </w:tcMar>
+            <w:vAlign w:val="center"/>
+          </w:tcPr>
+          <w:p>
+            <w:pPr>
+              <w:spacing w:before="20" w:after="20" w:line="240" w:lineRule="auto"/>
+            </w:pPr>
+            <w:r>
+              <w:rPr>
+                <w:sz w:val="22"/>
+              </w:rPr>
+              <w:t>Pendiente de verificación del propietario, Pendiente de evaluación, Observada, Rechazada o Aprobada. Una solicitud abierta por RUC entre agencias. La identidad pendiente impide aprobar; completarla no borra observaciones ni genera un préstamo.</w:t>
+            </w:r>
+          </w:p>
+        </w:tc>
+      </w:tr>
+      <w:tr>
+        <w:trPr>
+          <w:cantSplit/>
+          <w:cantSplit/>
+        </w:trPr>
+        <w:tc>
+          <w:tcPr>
+            <w:tcW w:w="2494" w:type="dxa"/>
+            <w:tcMar>
+              <w:top w:w="60" w:type="dxa"/>
+              <w:left w:w="90" w:type="dxa"/>
+              <w:bottom w:w="60" w:type="dxa"/>
+              <w:right w:w="90" w:type="dxa"/>
+            </w:tcMar>
+            <w:vAlign w:val="center"/>
+          </w:tcPr>
+          <w:p>
+            <w:pPr>
+              <w:spacing w:before="20" w:after="20" w:line="240" w:lineRule="auto"/>
+            </w:pPr>
+            <w:r>
+              <w:rPr>
+                <w:sz w:val="22"/>
+              </w:rPr>
               <w:t>Préstamo</w:t>
             </w:r>
           </w:p>
@@ -5787,7 +5839,7 @@
                 <w:b w:val="0"/>
                 <w:sz w:val="20"/>
               </w:rPr>
-              <w:t>RUC 20 distingue propietario y firmante presencial; el ausente exige identidad previa vigente. Documentación va en pantalla propia, con campos según el documento, referencia generada automáticamente y certificado SUNARP PDF hasta 5 MB. Los tipos admitidos son concretos y reconocidos. La evaluación posterior admite firma individual; no reasigna propietario.</w:t>
+              <w:t>RUC 20 distingue propietario y firmante presencial. Si el propietario ausente tiene identidad previa vigente, la reutiliza; si es nuevo o requiere revalidación, permite enviar el expediente como pendiente de verificarlo presencialmente. Ese estado bloquea aprobar y crear deuda, incluso por llamada directa. Documentación va en pantalla propia, con campos según el documento, referencia generada automáticamente y certificado SUNARP PDF hasta 5 MB. Los tipos admitidos son concretos y reconocidos. La evaluación posterior admite firma individual; no reasigna propietario.</w:t>
             </w:r>
           </w:p>
           <w:p>
@@ -5831,7 +5883,7 @@
                 <w:b w:val="0"/>
                 <w:sz w:val="20"/>
               </w:rPr>
-              <w:t>Ubica las acciones Corregir DNI junto al título, con lápiz y estilo discreto adaptable a móvil. Repite verificación y conserva la restricción del propietario ya registrado.</w:t>
+              <w:t>Ubica las acciones Corregir DNI junto al título, con lápiz y estilo discreto adaptable a móvil. Si el DNI del representante coincide con el propietario, muestra un aviso bajo el campo y deshabilita Verificar representante antes de consultar. Otro DNI válido elimina el aviso. Repite verificación y conserva la restricción del propietario ya registrado.</w:t>
             </w:r>
           </w:p>
         </w:tc>
@@ -6108,7 +6160,7 @@
               <w:rPr>
                 <w:b w:val="0"/>
               </w:rPr>
-              <w:t>Revisar el cronograma no guarda. Enviar RUC 20 registra expediente y alta conjunta o revierte todo; queda pendiente sin préstamo, contrato definitivo ni cuotas cobrables. Aprobar crea préstamo y cuotas sin duplicados. Firma de consulta mayor de 30 minutos exige renovarla.</w:t>
+              <w:t>Revisar el cronograma no guarda. Enviar RUC 20 registra expediente y las altas verificadas que correspondan, o revierte todo. Si falta verificar al propietario, conserva su DNI como declarado sin crear su ficha aprobada; queda pendiente sin préstamo, contrato definitivo ni cuotas cobrables. Aprobar crea préstamo y cuotas sin duplicados. Firma de consulta mayor de 30 minutos exige renovarla.</w:t>
             </w:r>
           </w:p>
           <w:p>
@@ -6804,7 +6856,7 @@
                 <w:b w:val="0"/>
                 <w:sz w:val="20"/>
               </w:rPr>
-              <w:t>Lista solicitudes RUC 20 por Pendientes, Observadas, Aprobadas, Rechazadas y Todas. Separa los filtros de la tabla y adapta su distribución a pantallas pequeñas; conserva la privacidad por agencia.</w:t>
+              <w:t>Lista solicitudes RUC 20 por Pendientes, Por verificar propietario, Observadas, Aprobadas, Rechazadas y Todas. Pendientes reúne las pendientes de evaluación y de identidad. Completar la identidad conserva solicitud, PDF e historial; no aprueba el crédito y respeta las observaciones previas. Separa los filtros de la tabla y adapta su distribución a pantallas pequeñas; conserva la privacidad por agencia.</w:t>
             </w:r>
           </w:p>
         </w:tc>
@@ -7746,7 +7798,7 @@
               <w:rPr>
                 <w:sz w:val="22"/>
               </w:rPr>
-              <w:t>RUC 20 no guarda antes del envío final. Pendiente sin deuda; observar corrige la misma solicitud y rechazar permite otra. Aprobar crea una sola operación.</w:t>
+              <w:t>RUC 20 no guarda antes del envío final. Propietario ausente nuevo o vencido permite enviar sin identidad ficticia ni deuda. Aprobar se bloquea hasta verificarlo presencialmente desde la misma solicitud. Se conserva el PDF; observar corrige la misma solicitud y rechazar permite otra. Aprobar crea una sola operación.</w:t>
             </w:r>
           </w:p>
         </w:tc>

</xml_diff>

<commit_message>
Actualizar evaluación y contratos RUC 20
</commit_message>
<xml_diff>
--- a/docs/Sprint_1_Sistema_Prestamos.docx
+++ b/docs/Sprint_1_Sistema_Prestamos.docx
@@ -2107,7 +2107,7 @@
     <w:p>
       <w:pPr/>
       <w:r>
-        <w:t>El envío RUC 20 guarda el expediente, el PDF privado hasta 5 MB, monto, plazo y simulación; no genera deuda ni reserva capital. Si el propietario ausente es nuevo o su verificación no está vigente, queda Pendiente de verificación del propietario. No crea una identidad aprobada ni una empresa nueva sin ese vínculo; registra al representante verificado y conserva el DNI declarado del propietario. Cuando este acude, el asesor completa la revisión presencial desde la misma solicitud, conserva el PDF y pasa a evaluación; las observaciones documentales previas permanecen. El asesor evalúa después desde Solicitudes de préstamo y puede aprobar, observar o rechazar en su agencia, incluso lo enviado por él. Aprobar exige contrastar autenticidad y firma individual, consultar SUNAT y repetir identidad, elegibilidad y cupo global. Entonces se crea el préstamo y sus cuotas desde la fecha de aprobación; conserva el expediente y su historial.</w:t>
+        <w:t>El envío RUC 20 guarda el expediente, el PDF privado hasta 5 MB, monto, plazo y simulación; no genera deuda ni reserva capital. Si el propietario ausente es nuevo o su verificación no está vigente, queda Pendiente de verificación del propietario. No crea una identidad aprobada ni una empresa nueva sin ese vínculo; registra al representante verificado y conserva el DNI declarado del propietario. Cuando este acude, el asesor completa la revisión presencial desde la misma solicitud, conserva el PDF y pasa a evaluación; las observaciones documentales previas permanecen. El asesor evalúa después desde Solicitudes de préstamo y puede aprobar, observar o rechazar en su agencia, incluso lo enviado por él. La evaluación reutiliza el documento de propiedad presentado y pide solo el código del certificado (hasta 80 caracteres: letras, números, guion o barra), conservando ceros iniciales. Es un límite operativo, no un formato registral universal. El asesor y la fecha se registran automáticamente. Aprobar permite observaciones opcionales; observar o rechazar exige un motivo de 10 a 1000 caracteres. Aprobar exige contrastar autenticidad y firma individual, consultar SUNAT y repetir identidad, elegibilidad y cupo global. Entonces se crea el préstamo y sus cuotas desde la fecha de aprobación; conserva el expediente y su historial.</w:t>
       </w:r>
     </w:p>
     <w:p>
@@ -5861,7 +5861,7 @@
                 <w:b w:val="0"/>
                 <w:sz w:val="20"/>
               </w:rPr>
-              <w:t>Genera la referencia con campos específicos, tipos y límites de Documentación y validaciones de empresas. Rechaza escritura y pegado inválidos; los campos vacíos o inválidos bloquean continuar. Conserva referencias anteriores sin recortarlas.</w:t>
+              <w:t>Genera la referencia con campos específicos, tipos y límites de Documentación y validaciones de empresas. Rechaza escritura y pegado inválidos; conserva referencias anteriores sin recortarlas. En evaluación reutiliza el documento presentado y exige solo el código del certificado. Aprobar admite observaciones opcionales; observar o rechazar requiere un motivo de 10 a 1000 caracteres. Registra asesor y fecha.</w:t>
             </w:r>
           </w:p>
           <w:p>
@@ -6437,7 +6437,7 @@
               <w:rPr>
                 <w:b w:val="0"/>
               </w:rPr>
-              <w:t>Guarda el cronograma confirmado sin recalcularlo al consultar o pagar. El contrato nuevo conserva identidad, modalidad y personas vinculadas; revalidaciones posteriores no alteran esa copia.</w:t>
+              <w:t>Guarda el cronograma confirmado sin recalcularlo al consultar o pagar. El contrato conserva identidad, modalidad y firmante originales. En RUC 20, la empresa es prestataria; firma su representante verificado, sea o no el propietario, sin atribuir aval al propietario. Solo se emite para un préstamo confirmado. Si falta la copia completa del firmante, bloquea la descarga en lugar de usar la ficha actual.</w:t>
             </w:r>
           </w:p>
           <w:p>
@@ -6457,7 +6457,7 @@
               <w:rPr>
                 <w:b w:val="0"/>
               </w:rPr>
-              <w:t>Cronograma agrupa PDF e impresión. Contrato agrupa Word e impresión/guardar PDF, con plantilla adaptada del profesor que termina en las firmas, sin anexo de condiciones. Descargar de nuevo no crea préstamo.</w:t>
+              <w:t>Cronograma agrupa PDF e impresión. Contrato agrupa Word e impresión/guardar PDF, con plantilla adaptada del profesor que termina en las firmas, con nombre, DNI y calidad del firmante, sin anexo de condiciones. Descargar de nuevo no crea préstamo.</w:t>
             </w:r>
           </w:p>
           <w:p>

</xml_diff>

<commit_message>
Integrar representantes de API Perú y cuotas cada 30 días
</commit_message>
<xml_diff>
--- a/docs/Sprint_1_Sistema_Prestamos.docx
+++ b/docs/Sprint_1_Sistema_Prestamos.docx
@@ -520,7 +520,7 @@
               <w:rPr>
                 <w:sz w:val="22"/>
               </w:rPr>
-              <w:t>Mensuales, en el día original del préstamo. Si no existe en un mes, se utiliza el último día de ese mes, considerando años bisiestos.</w:t>
+              <w:t>Cada 30 días: fecha del préstamo más 30, 60, 90 días y así sucesivamente. No se fija el día del mes. Se conservan las cuotas ya confirmadas.</w:t>
             </w:r>
           </w:p>
         </w:tc>
@@ -1072,7 +1072,7 @@
               <w:rPr>
                 <w:sz w:val="22"/>
               </w:rPr>
-              <w:t>Cuotas mensuales, desglose de interés y capital, guardado y PDF.</w:t>
+              <w:t>Cuotas cada 30 días, desglose de interés y capital, guardado y PDF.</w:t>
             </w:r>
           </w:p>
         </w:tc>
@@ -1604,7 +1604,7 @@
               <w:rPr>
                 <w:sz w:val="22"/>
               </w:rPr>
-              <w:t>Tasa mensual constante equivalente a la TEA, separada de las fechas mensuales de calendario. El interés compensatorio mantiene la tasa mensual; el atraso no genera cargos adicionales.</w:t>
+              <w:t>Tasa constante por período de 30 días equivalente a la TEA con base 360. La fecha se obtiene sumando 30 días por cuota; el atraso no genera cargos adicionales.</w:t>
             </w:r>
           </w:p>
         </w:tc>
@@ -3618,7 +3618,7 @@
               <w:rPr>
                 <w:sz w:val="22"/>
               </w:rPr>
-              <w:t>Meses calendario desde la fecha original, sin sumar intervalos fijos de 30 días. Un vencimiento ajustado a febrero no cambia el día de los meses siguientes.</w:t>
+              <w:t>Intervalos de 30 días desde la fecha de operación: fecha original más 30 por el número de cuota. Los cronogramas confirmados antes de este cambio permanecen intactos.</w:t>
             </w:r>
           </w:p>
         </w:tc>
@@ -3670,7 +3670,7 @@
               <w:rPr>
                 <w:sz w:val="22"/>
               </w:rPr>
-              <w:t>Un préstamo del 31/01/2028 vence primero el 29/02/2028 y después el 31/03/2028. Del 12/05/2026 al 12/06/2026 hay 31 días y sigue siendo una cuota mensual.</w:t>
+              <w:t>Un préstamo del 31/01/2028 vence el 01/03/2028, 31/03/2028 y 30/04/2028. Uno del 22/10/2026 vence el 21/11/2026, 21/12/2026 y 20/01/2027.</w:t>
             </w:r>
           </w:p>
         </w:tc>
@@ -3722,7 +3722,7 @@
               <w:rPr>
                 <w:sz w:val="22"/>
               </w:rPr>
-              <w:t>La base 360 sustenta la equivalencia mensual elegida; no obliga a que todas las fechas estén separadas por 30 días. No se ajustan fines de semana en este alcance.</w:t>
+              <w:t>La tasa por período usa 30/360 y los nuevos vencimientos se separan por 30 días. No se ajustan fines de semana. El umbral extrajudicial conserva los doce meses calendario.</w:t>
             </w:r>
           </w:p>
         </w:tc>
@@ -5839,7 +5839,7 @@
                 <w:b w:val="0"/>
                 <w:sz w:val="20"/>
               </w:rPr>
-              <w:t>RUC 20 distingue propietario y firmante presencial. Si el propietario ausente tiene identidad previa vigente, la reutiliza; si es nuevo o requiere revalidación, permite enviar el expediente como pendiente de verificarlo presencialmente. Ese estado bloquea aprobar y crear deuda, incluso por llamada directa. Documentación va en pantalla propia, con campos según el documento, referencia generada automáticamente y certificado SUNARP PDF hasta 5 MB. Los tipos admitidos son concretos y reconocidos. La evaluación posterior admite firma individual; no reasigna propietario.</w:t>
+              <w:t>RUC 20 distingue propietario del límite y firmante presencial. Propietario ausente nuevo o vencido: solicitud pendiente, sin identidad ficticia ni deuda; impide aprobar hasta su revisión presencial. Documentación en pantalla propia, con referencia guiada y certificado SUNARP PDF hasta 5 MB. No reasigna propietario y admite firma individual. API Perú lista varios representantes y permite elegir al firmante. Contrasta el DNI completo al enviar; datos ocultos son referencia parcial. La consulta es opcional y no reemplaza DNI original, propiedad ni facultades.</w:t>
             </w:r>
           </w:p>
           <w:p>
@@ -6371,13 +6371,13 @@
               <w:rPr>
                 <w:b/>
               </w:rPr>
-              <w:t xml:space="preserve">• CA03. Fechas mensuales: </w:t>
+              <w:t xml:space="preserve">• CA03. Fechas cada 30 días: </w:t>
             </w:r>
             <w:r>
               <w:rPr>
                 <w:b w:val="0"/>
               </w:rPr>
-              <w:t>Suma meses a la fecha original, conserva el día y usa el último del mes si falta. Considera bisiestos, sin ajuste por fines de semana.</w:t>
+              <w:t>Suma 30 días por cuota a la fecha del préstamo. Considera cambios de mes, año y bisiestos, sin ajuste por fines de semana. Conserva las fechas de cuotas ya confirmadas.</w:t>
             </w:r>
           </w:p>
           <w:p>
@@ -6497,7 +6497,7 @@
               <w:rPr>
                 <w:b w:val="0"/>
               </w:rPr>
-              <w:t>12/05/2026 vence el 12/06/2026. Desde 31/01/2028: 29/02/2028 y 31/03/2028; el ajuste no cambia la TEM.</w:t>
+              <w:t>Desde 22/10/2026 vence el 21/11/2026, 21/12/2026 y 20/01/2027. Desde 31/01/2028 usa 01/03/2028 y 31/03/2028; la tasa por período se mantiene.</w:t>
             </w:r>
           </w:p>
         </w:tc>

</xml_diff>

<commit_message>
Simplificar RUC20 con representante validado por API
</commit_message>
<xml_diff>
--- a/docs/Sprint_1_Sistema_Prestamos.docx
+++ b/docs/Sprint_1_Sistema_Prestamos.docx
@@ -171,7 +171,7 @@
               <w:rPr>
                 <w:sz w:val="22"/>
               </w:rPr>
-              <w:t>Verifica clientes, registra préstamos, evalúa solicitudes RUC 20 y cobra cuotas desde su agencia asignada.</w:t>
+              <w:t>Verifica clientes, registra préstamos y cobra cuotas desde su agencia asignada.</w:t>
             </w:r>
           </w:p>
         </w:tc>
@@ -572,7 +572,7 @@
               <w:rPr>
                 <w:sz w:val="22"/>
               </w:rPr>
-              <w:t>Hasta S/ 10 000 de capital pendiente del propietario, incluidos préstamos personales y empresas vinculadas de las cinco agencias. Solo la amortización pagada libera cupo.</w:t>
+              <w:t>Hasta S/ 10 000 de capital pendiente por persona entre las cinco agencias. Suma préstamos personales, RUC 10 y RUC 20 vinculados al representante en cada préstamo. Solo la amortización pagada libera cupo; otro representante no recibe deudas anteriores.</w:t>
             </w:r>
           </w:p>
         </w:tc>
@@ -697,7 +697,7 @@
     </w:p>
     <w:p>
       <w:r>
-        <w:t>Se atiende a personas naturales con DNI, personas naturales con negocio (RUC 10) y empresas (RUC 20). DNI y RUC 10 comparten ficha; la empresa conserva titular propio y se vincula al propietario responsable del límite global. Clientes lista solo a los titulares con préstamos confirmados en la agencia actual, incluidos los ya pagados; Préstamos lista solo operaciones originadas en esa agencia. Las fichas autorizadas comparten identidad y saldos globales, sin ampliar la cartera local.</w:t>
+        <w:t>Se atiende a personas con DNI, negocios RUC 10 y empresas RUC 20. DNI y RUC 10 comparten ficha. La empresa tiene ficha propia y cada préstamo RUC 20 conserva al representante que lo solicitó. Clientes incluye titulares y representantes con préstamos confirmados en la agencia; Préstamos conserva solo operaciones originadas allí. Identidad y límite se comparten entre las cinco agencias, sin ampliar la cartera local por un cobro ajeno.</w:t>
       </w:r>
     </w:p>
     <w:tbl>
@@ -945,7 +945,7 @@
               <w:rPr>
                 <w:sz w:val="22"/>
               </w:rPr>
-              <w:t>Otros documentos de identidad y cambios de propietario.</w:t>
+              <w:t>Otros documentos de identidad y evaluación del alcance de poderes.</w:t>
             </w:r>
           </w:p>
         </w:tc>
@@ -1258,7 +1258,7 @@
     </w:p>
     <w:p>
       <w:r>
-        <w:t>No incluye abonos parciales, reversos, refinanciación, gestión judicial, panel gerencial, evaluación automática de riesgo, documentos extranjeros ni aprobación remota de un propietario no verificado. La vinculación para el límite es una regla académica; no constituye por sí sola garantía personal de una deuda empresarial.</w:t>
+        <w:t>No incluye abonos parciales, reversos, refinanciación, gestión judicial, panel gerencial, evaluación automática de riesgo ni documentos extranjeros. El vínculo con el representante para el límite es una regla académica; no constituye por sí solo garantía personal de una deuda empresarial. La consulta API identifica representantes informados, sin certificar el alcance de sus poderes.</w:t>
       </w:r>
     </w:p>
     <w:p>
@@ -1971,7 +1971,7 @@
               <w:rPr>
                 <w:sz w:val="22"/>
               </w:rPr>
-              <w:t>DNI/RUC 10: Cliente → Condiciones → Cronograma. RUC 20 añade Documentación tras identificar. Tipo fijo después del paso 1; Atrás conserva el borrador. Sin enlace Ir a clientes dentro del formulario.</w:t>
+              <w:t>Cliente → Condiciones → Cronograma. RUC 20 verifica empresa y DNI del representante por API, sin documentación ni evaluación posterior. Tipo fijo después del paso 1; Atrás conserva el borrador. Sin Ir a clientes dentro del formulario.</w:t>
             </w:r>
           </w:p>
         </w:tc>
@@ -2088,7 +2088,7 @@
     </w:p>
     <w:p>
       <w:r>
-        <w:t>El menú del asesor contiene Préstamos, Clientes, Nuevo préstamo, Solicitudes de préstamo, Pagos y Cerrar sesión. Los accesos desde ficha o detalle llevan a esos mismos procesos, sin formularios de negocio duplicados.</w:t>
+        <w:t>El menú del asesor contiene Préstamos, Clientes, Nuevo préstamo, Pagos y Cerrar sesión. Los accesos desde ficha o detalle llevan a esos mismos procesos. Solicitudes documentales queda fuera del flujo vigente.</w:t>
       </w:r>
     </w:p>
     <w:p>
@@ -2101,13 +2101,13 @@
     </w:p>
     <w:p>
       <w:r>
-        <w:t>Nuevo préstamo conserva su recorrido para DNI y RUC 10. RUC 20 recorre Identificación → Documentación → Condiciones → Cronograma y envío. El borrador, incluido el PDF, permanece en memoria; Atrás conserva datos y abandonar descarta lo no enviado. Solo Enviar solicitud de préstamo guarda el expediente completo como pendiente de evaluación.</w:t>
+        <w:t>Nuevo préstamo usa Cliente → Condiciones → Cronograma para DNI, RUC 10 y RUC 20. Para RUC 20, consulta la empresa y comprueba el DNI del representante mediante API Perú; no pide propietario, certificados ni archivos. Atrás conserva el borrador en memoria. Solo Confirmar préstamo registra las altas y el préstamo; abandonar descarta lo no confirmado.</w:t>
       </w:r>
     </w:p>
     <w:p>
       <w:pPr/>
       <w:r>
-        <w:t>El envío RUC 20 guarda el expediente, el PDF privado hasta 5 MB, monto, plazo y simulación; no genera deuda ni reserva capital. Si el propietario ausente es nuevo o su verificación no está vigente, queda Pendiente de verificación del propietario. No crea una identidad aprobada ni una empresa nueva sin ese vínculo; registra al representante verificado y conserva el DNI declarado del propietario. Cuando este acude, el asesor completa la revisión presencial desde la misma solicitud, conserva el PDF y pasa a evaluación; las observaciones documentales previas permanecen. El asesor evalúa después desde Solicitudes de préstamo y puede aprobar, observar o rechazar en su agencia, incluso lo enviado por él. La evaluación reutiliza el documento de propiedad presentado y pide solo el código del certificado (hasta 80 caracteres: letras, números, guion o barra), conservando ceros iniciales. Es un límite operativo, no un formato registral universal. El asesor y la fecha se registran automáticamente. Aprobar permite observaciones opcionales; observar o rechazar exige un motivo de 10 a 1000 caracteres. Aprobar exige contrastar autenticidad y firma individual, consultar SUNAT y repetir identidad, elegibilidad y cupo global. Entonces se crea el préstamo y sus cuotas desde la fecha de aprobación; conserva el expediente y su historial.</w:t>
+        <w:t>La empresa debe estar ACTIVA y HABIDA. El DNI completo del firmante debe coincidir exactamente con uno de los representantes devueltos para ese RUC. Se comprueba identidad vigente y presencia, elegibilidad y capital global antes de confirmar. Una API caída, sin coincidencias o con documentos ocultos impide continuar; no se completa una identidad por deducción. Cada préstamo fija su representante y copia contractual. Elegir otra persona en un préstamo posterior no le traslada deudas anteriores. El cronograma nace al confirmar y vence cada 30 días.</w:t>
       </w:r>
     </w:p>
     <w:p>
@@ -2125,12 +2125,12 @@
         <w:pStyle w:val="Ttulo2"/>
       </w:pPr>
       <w:r>
-        <w:t>Documentación y validaciones de empresas</w:t>
+        <w:t>Validación del representante de la empresa</w:t>
       </w:r>
     </w:p>
     <w:p>
       <w:r>
-        <w:t>El asesor selecciona el documento que sustenta el vínculo e ingresa solo sus datos variables. Copia literal: partida y asiento; escritura pública: número, fecha y notaría; acto constitutivo SACS: partida y fecha; matrícula de acciones: libro, folio y asiento de titularidad. El sistema construye la referencia completa y no exige escribir sus etiquetas.</w:t>
+        <w:t>El asesor ingresa el DNI del representante que solicita y firma. La consulta expresa a API Perú puede devolver varias personas. El sistema compara el DNI completo con la lista del RUC consultado y luego verifica la identidad de quien firma. No se solicitan referencias de propiedad ni documentos adjuntos.</w:t>
       </w:r>
     </w:p>
     <w:tbl>
@@ -2226,7 +2226,7 @@
                 <w:b/>
                 <w:sz w:val="22"/>
               </w:rPr>
-              <w:t>Máximo</w:t>
+              <w:t>Validación</w:t>
             </w:r>
           </w:p>
         </w:tc>
@@ -2251,7 +2251,7 @@
               <w:rPr>
                 <w:sz w:val="22"/>
               </w:rPr>
-              <w:t>Partida</w:t>
+              <w:t>RUC de empresa</w:t>
             </w:r>
           </w:p>
         </w:tc>
@@ -2274,7 +2274,7 @@
               <w:rPr>
                 <w:sz w:val="22"/>
               </w:rPr>
-              <w:t>Solo números; conserva ceros iniciales.</w:t>
+              <w:t>Once dígitos con prefijo 20.</w:t>
             </w:r>
           </w:p>
         </w:tc>
@@ -2297,7 +2297,7 @@
               <w:rPr>
                 <w:sz w:val="22"/>
               </w:rPr>
-              <w:t>12 dígitos</w:t>
+              <w:t>Dígito verificador; ACTIVO y HABIDO.</w:t>
             </w:r>
           </w:p>
         </w:tc>
@@ -2322,7 +2322,7 @@
               <w:rPr>
                 <w:sz w:val="22"/>
               </w:rPr>
-              <w:t>Escritura</w:t>
+              <w:t>DNI del representante</w:t>
             </w:r>
           </w:p>
         </w:tc>
@@ -2345,7 +2345,7 @@
               <w:rPr>
                 <w:sz w:val="22"/>
               </w:rPr>
-              <w:t>Solo números; conserva ceros iniciales.</w:t>
+              <w:t>Ocho dígitos; conserva ceros iniciales.</w:t>
             </w:r>
           </w:p>
         </w:tc>
@@ -2368,7 +2368,7 @@
               <w:rPr>
                 <w:sz w:val="22"/>
               </w:rPr>
-              <w:t>10 dígitos</w:t>
+              <w:t>Coincidencia completa en la lista del RUC.</w:t>
             </w:r>
           </w:p>
         </w:tc>
@@ -2393,7 +2393,7 @@
               <w:rPr>
                 <w:sz w:val="22"/>
               </w:rPr>
-              <w:t>Libro y folio</w:t>
+              <w:t>Representantes API</w:t>
             </w:r>
           </w:p>
         </w:tc>
@@ -2416,7 +2416,7 @@
               <w:rPr>
                 <w:sz w:val="22"/>
               </w:rPr>
-              <w:t>Solo números; conserva ceros iniciales.</w:t>
+              <w:t>Puede incluir varias personas.</w:t>
             </w:r>
           </w:p>
         </w:tc>
@@ -2439,7 +2439,7 @@
               <w:rPr>
                 <w:sz w:val="22"/>
               </w:rPr>
-              <w:t>6 dígitos cada uno</w:t>
+              <w:t>Sin coincidencia o con datos ocultos, bloquea.</w:t>
             </w:r>
           </w:p>
         </w:tc>
@@ -2464,7 +2464,7 @@
               <w:rPr>
                 <w:sz w:val="22"/>
               </w:rPr>
-              <w:t>Asiento</w:t>
+              <w:t>Consulta firmada</w:t>
             </w:r>
           </w:p>
         </w:tc>
@@ -2487,7 +2487,7 @@
               <w:rPr>
                 <w:sz w:val="22"/>
               </w:rPr>
-              <w:t>Letras y números; se muestra en mayúsculas.</w:t>
+              <w:t>Asesor, RUC, fecha y respuesta del proveedor.</w:t>
             </w:r>
           </w:p>
         </w:tc>
@@ -2510,7 +2510,7 @@
               <w:rPr>
                 <w:sz w:val="22"/>
               </w:rPr>
-              <w:t>10 caracteres</w:t>
+              <w:t>Firma válida y antigüedad hasta 30 minutos.</w:t>
             </w:r>
           </w:p>
         </w:tc>
@@ -2535,7 +2535,7 @@
               <w:rPr>
                 <w:sz w:val="22"/>
               </w:rPr>
-              <w:t>Notaría</w:t>
+              <w:t>Identidad presencial</w:t>
             </w:r>
           </w:p>
         </w:tc>
@@ -2558,7 +2558,7 @@
               <w:rPr>
                 <w:sz w:val="22"/>
               </w:rPr>
-              <w:t>Nombre con tildes, números y signos habituales; al menos una letra.</w:t>
+              <w:t>DNI original, caducidad y presencia.</w:t>
             </w:r>
           </w:p>
         </w:tc>
@@ -2581,7 +2581,7 @@
               <w:rPr>
                 <w:sz w:val="22"/>
               </w:rPr>
-              <w:t>80 caracteres</w:t>
+              <w:t>Identidad vigente al confirmar.</w:t>
             </w:r>
           </w:p>
         </w:tc>
@@ -2606,7 +2606,7 @@
               <w:rPr>
                 <w:sz w:val="22"/>
               </w:rPr>
-              <w:t>Fecha</w:t>
+              <w:t>Capital global</w:t>
             </w:r>
           </w:p>
         </w:tc>
@@ -2629,7 +2629,7 @@
               <w:rPr>
                 <w:sz w:val="22"/>
               </w:rPr>
-              <w:t>Fecha real de calendario con año de cuatro dígitos.</w:t>
+              <w:t>Préstamos personales y por empresas.</w:t>
             </w:r>
           </w:p>
         </w:tc>
@@ -2652,7 +2652,7 @@
               <w:rPr>
                 <w:sz w:val="22"/>
               </w:rPr>
-              <w:t>Formato de fecha</w:t>
+              <w:t>Hasta S/ 10 000 por representante.</w:t>
             </w:r>
           </w:p>
         </w:tc>
@@ -2663,12 +2663,12 @@
         <w:spacing w:before="160"/>
       </w:pPr>
       <w:r>
-        <w:t>Los límites anteriores son decisiones operativas del formulario y no describen una longitud registral universal. Escribir caracteres no admitidos o pegar un valor inválido no reemplaza el dato válido anterior; el formulario muestra el motivo. Un pegado demasiado largo se rechaza completo. Los campos vacíos o inválidos impiden continuar. Las referencias previas solo se separan en campos cuando la conversión es exacta; las demás se conservan completas y ofrecen Corregir datos del documento, sin recorte automático.</w:t>
+        <w:t>El DNI admite exactamente ocho dígitos y conserva ceros iniciales. El RUC admite once dígitos, prefijo 10 o 20 y dígito verificador. Una consulta firmada pertenece al asesor y RUC consultados y vence a los 30 minutos. El servidor repite estas comprobaciones al confirmar, sin confiar en la selección del navegador.</w:t>
       </w:r>
     </w:p>
     <w:p>
       <w:r>
-        <w:t>Corregir DNI del propietario y Corregir DNI del representante aparecen junto al título de su tarjeta, con lápiz, texto azul grisáceo, fondo transparente y foco de teclado visible. En móvil se acomodan debajo del título. La corrección vuelve a verificar la identidad y descarta el PDF asociado; la empresa registrada conserva el propietario del límite. Los filtros de Solicitudes de préstamo se separan de la tabla y se distribuyen en varias líneas cuando falta espacio.</w:t>
+        <w:t>Cambiar el DNI descarta la identidad seleccionada y exige comprobar de nuevo el vínculo. Renovar consulta descarta la validación anterior. Una persona ya verificada puede reutilizar su ficha, pero el asesor confirma DNI original y presencia durante esta atención. Sin identidad vigente o capital disponible no se confirma el préstamo.</w:t>
       </w:r>
     </w:p>
     <w:p>
@@ -2882,7 +2882,7 @@
               <w:rPr>
                 <w:sz w:val="22"/>
               </w:rPr>
-              <w:t>Solicitud RUC 20</w:t>
+              <w:t>Validación RUC 20</w:t>
             </w:r>
           </w:p>
         </w:tc>
@@ -2905,7 +2905,7 @@
               <w:rPr>
                 <w:sz w:val="22"/>
               </w:rPr>
-              <w:t>Pendiente de verificación del propietario, Pendiente de evaluación, Observada, Rechazada o Aprobada. Una solicitud abierta por RUC entre agencias. La identidad pendiente impide aprobar; completarla no borra observaciones ni genera un préstamo.</w:t>
+              <w:t>Consulta en memoria hasta confirmar. Exige DNI completo coincidente e identidad presencial vigente. No genera solicitud pendiente; las solicitudes documentales anteriores quedan como historial.</w:t>
             </w:r>
           </w:p>
         </w:tc>
@@ -3160,7 +3160,7 @@
               <w:rPr>
                 <w:sz w:val="22"/>
               </w:rPr>
-              <w:t>DNI único para la persona y RUC de la empresa; ficha personal compartida con RUC 10, propietario y representante vinculados; nombres y apellidos exactos; agencia de registro inicial; fecha de caducidad; resultado, evidencia, fuente, fecha, asesor y agencia de cada revisión. La renovación agrega una revisión y conserva las anteriores. Una revalidación actualiza la misma ficha para todas las agencias.</w:t>
+              <w:t>DNI único de la persona y RUC propio de la empresa. La ficha personal se comparte con RUC 10; cada préstamo RUC 20 fija su representante. Conserva nombres exactos, agencia inicial, caducidad, resultado, evidencia, fuente, fecha, asesor y agencia de cada revisión. Renovar agrega una revisión y conserva las anteriores para todas las agencias.</w:t>
             </w:r>
           </w:p>
         </w:tc>
@@ -5112,6 +5112,12 @@
                 <w:b w:val="0"/>
                 <w:sz w:val="20"/>
               </w:rPr>
+            </w:r>
+            <w:r>
+              <w:rPr>
+                <w:b w:val="0"/>
+                <w:sz w:val="20"/>
+              </w:rPr>
               <w:t>Solicita correo y contraseña; los campos vacíos impiden continuar.</w:t>
             </w:r>
           </w:p>
@@ -5134,6 +5140,12 @@
                 <w:b w:val="0"/>
                 <w:sz w:val="20"/>
               </w:rPr>
+            </w:r>
+            <w:r>
+              <w:rPr>
+                <w:b w:val="0"/>
+                <w:sz w:val="20"/>
+              </w:rPr>
               <w:t>Solo ingresa una cuenta válida y activa. El rechazo de credenciales no identifica cuál falló.</w:t>
             </w:r>
           </w:p>
@@ -5156,6 +5168,12 @@
                 <w:b w:val="0"/>
                 <w:sz w:val="20"/>
               </w:rPr>
+            </w:r>
+            <w:r>
+              <w:rPr>
+                <w:b w:val="0"/>
+                <w:sz w:val="20"/>
+              </w:rPr>
               <w:t>Obtiene asesor y agencia de la cuenta; no permite elegir otra agencia ni usar General.</w:t>
             </w:r>
           </w:p>
@@ -5178,6 +5196,12 @@
                 <w:b w:val="0"/>
                 <w:sz w:val="20"/>
               </w:rPr>
+            </w:r>
+            <w:r>
+              <w:rPr>
+                <w:b w:val="0"/>
+                <w:sz w:val="20"/>
+              </w:rPr>
               <w:t>Pantallas y operaciones requieren sesión y permisos, incluso por URL directa o solicitudes alteradas.</w:t>
             </w:r>
           </w:p>
@@ -5200,6 +5224,12 @@
                 <w:b w:val="0"/>
                 <w:sz w:val="20"/>
               </w:rPr>
+            </w:r>
+            <w:r>
+              <w:rPr>
+                <w:b w:val="0"/>
+                <w:sz w:val="20"/>
+              </w:rPr>
               <w:t>No muestra accesos rápidos ni contraseñas de demostración.</w:t>
             </w:r>
           </w:p>
@@ -5222,6 +5252,12 @@
                 <w:b w:val="0"/>
                 <w:sz w:val="20"/>
               </w:rPr>
+            </w:r>
+            <w:r>
+              <w:rPr>
+                <w:b w:val="0"/>
+                <w:sz w:val="20"/>
+              </w:rPr>
               <w:t>Abre Préstamos con cartera propia. La cabecera muestra nombre y rol, agencia, fecha de Perú y contador, en ese orden.</w:t>
             </w:r>
           </w:p>
@@ -5244,6 +5280,12 @@
                 <w:b w:val="0"/>
                 <w:sz w:val="20"/>
               </w:rPr>
+            </w:r>
+            <w:r>
+              <w:rPr>
+                <w:b w:val="0"/>
+                <w:sz w:val="20"/>
+              </w:rPr>
               <w:t>Otro inicio válido de la misma cuenta reemplaza al anterior. La base lo bloquea y la interfaz lo detecta en hasta 15 segundos con conexión; las pestañas comparten sesión.</w:t>
             </w:r>
           </w:p>
@@ -5260,6 +5302,12 @@
                 <w:sz w:val="20"/>
               </w:rPr>
               <w:t xml:space="preserve">• CA08. Inactividad: </w:t>
+            </w:r>
+            <w:r>
+              <w:rPr>
+                <w:b w:val="0"/>
+                <w:sz w:val="20"/>
+              </w:rPr>
             </w:r>
             <w:r>
               <w:rPr>
@@ -5405,6 +5453,12 @@
                 <w:b w:val="0"/>
                 <w:sz w:val="20"/>
               </w:rPr>
+            </w:r>
+            <w:r>
+              <w:rPr>
+                <w:b w:val="0"/>
+                <w:sz w:val="20"/>
+              </w:rPr>
               <w:t>Cerrar sesión permanece visible durante una sesión activa.</w:t>
             </w:r>
           </w:p>
@@ -5427,6 +5481,12 @@
                 <w:b w:val="0"/>
                 <w:sz w:val="20"/>
               </w:rPr>
+            </w:r>
+            <w:r>
+              <w:rPr>
+                <w:b w:val="0"/>
+                <w:sz w:val="20"/>
+              </w:rPr>
               <w:t>Invalida la sesión actual y vuelve al acceso. Las rutas protegidas exigen nuevo ingreso; cerrar una sesión antigua no revoca una posterior de otra computadora.</w:t>
             </w:r>
           </w:p>
@@ -5449,6 +5509,12 @@
                 <w:b w:val="0"/>
                 <w:sz w:val="20"/>
               </w:rPr>
+            </w:r>
+            <w:r>
+              <w:rPr>
+                <w:b w:val="0"/>
+                <w:sz w:val="20"/>
+              </w:rPr>
               <w:t>Advierte antes de abandonar manualmente datos sin confirmar. El cierre obligatorio pierde borradores; las verificaciones guardadas y operaciones confirmadas permanecen.</w:t>
             </w:r>
           </w:p>
@@ -5471,6 +5537,12 @@
                 <w:b w:val="0"/>
                 <w:sz w:val="20"/>
               </w:rPr>
+            </w:r>
+            <w:r>
+              <w:rPr>
+                <w:b w:val="0"/>
+                <w:sz w:val="20"/>
+              </w:rPr>
               <w:t>Contador ámbar en los últimos dos minutos y rojo en el último. El aviso ofrece Continuar sesión o Cerrar sesión; continuar exige sesión aún válida.</w:t>
             </w:r>
           </w:p>
@@ -5487,6 +5559,12 @@
                 <w:sz w:val="20"/>
               </w:rPr>
               <w:t xml:space="preserve">• CA05. Cierre obligatorio: </w:t>
+            </w:r>
+            <w:r>
+              <w:rPr>
+                <w:b w:val="0"/>
+                <w:sz w:val="20"/>
+              </w:rPr>
             </w:r>
             <w:r>
               <w:rPr>
@@ -5641,6 +5719,12 @@
                 <w:b w:val="0"/>
                 <w:sz w:val="20"/>
               </w:rPr>
+            </w:r>
+            <w:r>
+              <w:rPr>
+                <w:b w:val="0"/>
+                <w:sz w:val="20"/>
+              </w:rPr>
               <w:t>DNI peruano de ocho dígitos; RUC de once, prefijo 10 o 20 y dígito verificador. Conserva ceros iniciales y valida en pantalla y servidor. Extranjería y otros prefijos quedan fuera.</w:t>
             </w:r>
           </w:p>
@@ -5663,7 +5747,13 @@
                 <w:b w:val="0"/>
                 <w:sz w:val="20"/>
               </w:rPr>
-              <w:t>Reutiliza la ficha vigente entre agencias sin duplicar consultas de DNI. DNI/RUC 10 guarda al confirmar; RUC 20 conserva personas y documentos en memoria hasta el envío final. Corregir DNI repite la verificación; no edita nombres. Abandonar descarta el borrador.</w:t>
+            </w:r>
+            <w:r>
+              <w:rPr>
+                <w:b w:val="0"/>
+                <w:sz w:val="20"/>
+              </w:rPr>
+              <w:t>Reutiliza la ficha vigente entre agencias sin duplicar consultas de DNI. Personas y empresa permanecen en memoria hasta confirmar el préstamo. Cambiar DNI repite vínculo e identidad; no edita nombres. Abandonar descarta el borrador.</w:t>
             </w:r>
           </w:p>
           <w:p>
@@ -5685,6 +5775,12 @@
                 <w:b w:val="0"/>
                 <w:sz w:val="20"/>
               </w:rPr>
+            </w:r>
+            <w:r>
+              <w:rPr>
+                <w:b w:val="0"/>
+                <w:sz w:val="20"/>
+              </w:rPr>
               <w:t>Consulta identidad para nuevos o revalidaciones. Nombres y apellidos originales no se editan; cambiar documento exige repetir su comprobación.</w:t>
             </w:r>
           </w:p>
@@ -5707,6 +5803,12 @@
                 <w:b w:val="0"/>
                 <w:sz w:val="20"/>
               </w:rPr>
+            </w:r>
+            <w:r>
+              <w:rPr>
+                <w:b w:val="0"/>
+                <w:sz w:val="20"/>
+              </w:rPr>
               <w:t>Registra caducidad y confirma DNI original y presencia con dos casillas. Genera referencias descriptivas; esta revisión no acredita una consulta oficial de fallecimiento.</w:t>
             </w:r>
           </w:p>
@@ -5729,6 +5831,12 @@
                 <w:b w:val="0"/>
                 <w:sz w:val="20"/>
               </w:rPr>
+            </w:r>
+            <w:r>
+              <w:rPr>
+                <w:b w:val="0"/>
+                <w:sz w:val="20"/>
+              </w:rPr>
               <w:t>Verificación Pendiente, Aprobada, Caducada o Rechazada, separada de la condición de pago. Fallecido no es una condición financiera editable.</w:t>
             </w:r>
           </w:p>
@@ -5751,6 +5859,12 @@
                 <w:b w:val="0"/>
                 <w:sz w:val="20"/>
               </w:rPr>
+            </w:r>
+            <w:r>
+              <w:rPr>
+                <w:b w:val="0"/>
+                <w:sz w:val="20"/>
+              </w:rPr>
               <w:t>El DNI es vigente hasta su caducidad inclusive. Desde el día siguiente bloquea nuevos préstamos; revalidar exige revisar el documento renovado.</w:t>
             </w:r>
           </w:p>
@@ -5773,6 +5887,12 @@
                 <w:b w:val="0"/>
                 <w:sz w:val="20"/>
               </w:rPr>
+            </w:r>
+            <w:r>
+              <w:rPr>
+                <w:b w:val="0"/>
+                <w:sz w:val="20"/>
+              </w:rPr>
               <w:t>Documento inexistente o consulta inconclusa impiden verificar. Un fallo técnico no se guarda como rechazo; permite reintentar y no bloquea pagar deudas existentes. El aviso de Pagos exige deuda pendiente del RUC consultado.</w:t>
             </w:r>
           </w:p>
@@ -5795,6 +5915,12 @@
                 <w:b w:val="0"/>
                 <w:sz w:val="20"/>
               </w:rPr>
+            </w:r>
+            <w:r>
+              <w:rPr>
+                <w:b w:val="0"/>
+                <w:sz w:val="20"/>
+              </w:rPr>
               <w:t>Desde ficha consulta automáticamente el documento fijo y regresa al guardar. Conserva evidencia, fecha, asesor, agencia e historial compartido; permite actualizar datos vigentes y no elimina atrasos.</w:t>
             </w:r>
           </w:p>
@@ -5817,6 +5943,12 @@
                 <w:b w:val="0"/>
                 <w:sz w:val="20"/>
               </w:rPr>
+            </w:r>
+            <w:r>
+              <w:rPr>
+                <w:b w:val="0"/>
+                <w:sz w:val="20"/>
+              </w:rPr>
               <w:t>SUNAT compara razón social, estado, condición y domicilio. Permite guardar consulta firmada sin cambios o con observaciones. No edita datos externos ni revalida DNI, propiedad o facultades; no hay actualización periódica.</w:t>
             </w:r>
           </w:p>
@@ -5839,7 +5971,13 @@
                 <w:b w:val="0"/>
                 <w:sz w:val="20"/>
               </w:rPr>
-              <w:t>RUC 20 distingue propietario del límite y firmante presencial. Propietario ausente nuevo o vencido: solicitud pendiente, sin identidad ficticia ni deuda; impide aprobar hasta su revisión presencial. Documentación en pantalla propia, con referencia guiada y certificado SUNARP PDF hasta 5 MB. No reasigna propietario y admite firma individual. API Perú lista varios representantes y permite elegir al firmante. Contrasta el DNI completo al enviar; datos ocultos son referencia parcial. La consulta es opcional y no reemplaza DNI original, propiedad ni facultades.</w:t>
+            </w:r>
+            <w:r>
+              <w:rPr>
+                <w:b w:val="0"/>
+                <w:sz w:val="20"/>
+              </w:rPr>
+              <w:t>RUC 20 consulta API Perú y exige DNI completo coincidente con un representante de ese RUC. Admite varias personas y elige quien solicita y firma. Documentos ocultos, respuesta vacía o fallo impiden continuar. No pide propietario ni certificados; conserva verificación de identidad y presencia.</w:t>
             </w:r>
           </w:p>
           <w:p>
@@ -5854,14 +5992,20 @@
                 <w:b/>
                 <w:sz w:val="20"/>
               </w:rPr>
-              <w:t xml:space="preserve">• CA11. Referencias guiadas: </w:t>
+              <w:t xml:space="preserve">• CA11. Consulta firmada: </w:t>
             </w:r>
             <w:r>
               <w:rPr>
                 <w:b w:val="0"/>
                 <w:sz w:val="20"/>
               </w:rPr>
-              <w:t>Genera la referencia con campos específicos, tipos y límites de Documentación y validaciones de empresas. Rechaza escritura y pegado inválidos; conserva referencias anteriores sin recortarlas. En evaluación reutiliza el documento presentado y exige solo el código del certificado. Aprobar admite observaciones opcionales; observar o rechazar requiere un motivo de 10 a 1000 caracteres. Registra asesor y fecha.</w:t>
+            </w:r>
+            <w:r>
+              <w:rPr>
+                <w:b w:val="0"/>
+                <w:sz w:val="20"/>
+              </w:rPr>
+              <w:t>El flujo vigente no exige referencias documentales ni cargas. La consulta de representantes se firma con asesor y RUC y vence a los 30 minutos. El servidor valida firma, RUC y DNI al confirmar; no acepta un vínculo declarado solo por el navegador.</w:t>
             </w:r>
           </w:p>
           <w:p>
@@ -5883,7 +6027,13 @@
                 <w:b w:val="0"/>
                 <w:sz w:val="20"/>
               </w:rPr>
-              <w:t>Ubica las acciones Corregir DNI junto al título, con lápiz y estilo discreto adaptable a móvil. Si el DNI del representante coincide con el propietario, muestra un aviso bajo el campo y deshabilita Verificar representante antes de consultar. Otro DNI válido elimina el aviso. Repite verificación y conserva la restricción del propietario ya registrado.</w:t>
+            </w:r>
+            <w:r>
+              <w:rPr>
+                <w:b w:val="0"/>
+                <w:sz w:val="20"/>
+              </w:rPr>
+              <w:t>El DNI admite ocho dígitos y conserva ceros iniciales. Cambiarlo limpia la persona y exige validar el nuevo vínculo. Renovar consulta descarta la validación previa; Atrás conserva el borrador y las condiciones.</w:t>
             </w:r>
           </w:p>
         </w:tc>
@@ -6020,6 +6170,11 @@
               <w:rPr>
                 <w:b w:val="0"/>
               </w:rPr>
+            </w:r>
+            <w:r>
+              <w:rPr>
+                <w:b w:val="0"/>
+              </w:rPr>
               <w:t>Reutiliza cliente y documento desde HU-03 o ficha, sin volver a escribir identidad ni abrir otro buscador.</w:t>
             </w:r>
           </w:p>
@@ -6040,7 +6195,12 @@
               <w:rPr>
                 <w:b w:val="0"/>
               </w:rPr>
-              <w:t>Exige identidad vigente, sin atrasos, historial conciliado, capital y autorización cuando corresponda. DNI personal no exige estado SUNAT del RUC 10 asociado; por RUC exige ACTIVO/HABIDO e identidad vigente. RUC 20 permite enviar para evaluación y solo genera préstamo al aprobar el expediente de empresa, propietario, firmante e importe, con todos los controles vigentes.</w:t>
+            </w:r>
+            <w:r>
+              <w:rPr>
+                <w:b w:val="0"/>
+              </w:rPr>
+              <w:t>Exige identidad vigente, sin atrasos, historial conciliado, capital y autorización cuando corresponda. DNI personal no exige estado SUNAT del RUC 10 asociado. Por RUC exige ACTIVO/HABIDO. RUC 20 añade coincidencia del DNI en la API y presencia del representante; confirma inmediatamente al superar los controles.</w:t>
             </w:r>
           </w:p>
           <w:p>
@@ -6060,6 +6220,11 @@
               <w:rPr>
                 <w:b w:val="0"/>
               </w:rPr>
+            </w:r>
+            <w:r>
+              <w:rPr>
+                <w:b w:val="0"/>
+              </w:rPr>
               <w:t>Fecha de Perú, agencia y asesor provienen de la sesión y no son editables.</w:t>
             </w:r>
           </w:p>
@@ -6080,6 +6245,11 @@
               <w:rPr>
                 <w:b w:val="0"/>
               </w:rPr>
+            </w:r>
+            <w:r>
+              <w:rPr>
+                <w:b w:val="0"/>
+              </w:rPr>
               <w:t>Inicial 0.00, punto fijo y solo dígitos en soles y dos cifras de centavos. Mínimo S/ 0.01 y máximo disponible, hasta S/ 10 000; cero, signos, letras o precisión adicional impiden continuar.</w:t>
             </w:r>
           </w:p>
@@ -6100,7 +6270,12 @@
               <w:rPr>
                 <w:b w:val="0"/>
               </w:rPr>
-              <w:t>Suma capital pendiente del propietario y sus empresas entre agencias. Solo amortización pagada libera cupo. El representante sin propiedad no aporta su límite al grupo.</w:t>
+            </w:r>
+            <w:r>
+              <w:rPr>
+                <w:b w:val="0"/>
+              </w:rPr>
+              <w:t>Suma préstamos personales, RUC 10 y préstamos RUC 20 de la misma persona en las cinco agencias, hasta S/ 10 000. Cada préstamo RUC 20 fija su representante; cambiarlo en otro préstamo no traslada deuda. Solo amortización pagada libera cupo.</w:t>
             </w:r>
           </w:p>
           <w:p>
@@ -6120,6 +6295,11 @@
               <w:rPr>
                 <w:b w:val="0"/>
               </w:rPr>
+            </w:r>
+            <w:r>
+              <w:rPr>
+                <w:b w:val="0"/>
+              </w:rPr>
               <w:t>Repite elegibilidad y cupo al confirmar de forma transaccional para impedir exceder el capital con solicitudes simultáneas.</w:t>
             </w:r>
           </w:p>
@@ -6140,6 +6320,11 @@
               <w:rPr>
                 <w:b w:val="0"/>
               </w:rPr>
+            </w:r>
+            <w:r>
+              <w:rPr>
+                <w:b w:val="0"/>
+              </w:rPr>
               <w:t>Plazo inicial 0; solo enteros de 1 a 60 para continuar. TEA fija del 30 %, no porcentaje plano para cualquier duración.</w:t>
             </w:r>
           </w:p>
@@ -6160,7 +6345,12 @@
               <w:rPr>
                 <w:b w:val="0"/>
               </w:rPr>
-              <w:t>Revisar el cronograma no guarda. Enviar RUC 20 registra expediente y las altas verificadas que correspondan, o revierte todo. Si falta verificar al propietario, conserva su DNI como declarado sin crear su ficha aprobada; queda pendiente sin préstamo, contrato definitivo ni cuotas cobrables. Aprobar crea préstamo y cuotas sin duplicados. Firma de consulta mayor de 30 minutos exige renovarla.</w:t>
+            </w:r>
+            <w:r>
+              <w:rPr>
+                <w:b w:val="0"/>
+              </w:rPr>
+              <w:t>Revisar cronograma no guarda. Confirmar crea personas, empresa, préstamo, copia contractual y cuotas en una transacción, o revierte todo. No crea solicitud pendiente ni pide PDF. Firma de consulta mayor de 30 minutos exige renovarla; reintentar no duplica operaciones.</w:t>
             </w:r>
           </w:p>
           <w:p>
@@ -6180,6 +6370,11 @@
               <w:rPr>
                 <w:b w:val="0"/>
               </w:rPr>
+            </w:r>
+            <w:r>
+              <w:rPr>
+                <w:b w:val="0"/>
+              </w:rPr>
               <w:t>El préstamo pertenece a la agencia de sesión y añade allí al titular sin duplicar ficha ni trasladar préstamos. No permite editar ni anular lo confirmado.</w:t>
             </w:r>
           </w:p>
@@ -6200,7 +6395,12 @@
               <w:rPr>
                 <w:b w:val="0"/>
               </w:rPr>
-              <w:t>Tipo modificable solo en identificación. RUC 20 añade Documentación sin Ver solicitudes ni Actualizar revisión; el formulario no muestra Ir a clientes. Atrás conserva el borrador y la salida voluntaria por los enlaces protegidos advierte sobre datos pendientes. Corregir DNI descarta el PDF ligado a esa selección. DNI/RUC 10 conserva su navegación.</w:t>
+            </w:r>
+            <w:r>
+              <w:rPr>
+                <w:b w:val="0"/>
+              </w:rPr>
+              <w:t>Cliente → Condiciones → Cronograma, también para RUC 20. Tipo modificable solo en identificación. Sin Documentación, Ver solicitudes, Actualizar revisión ni Ir a clientes. Atrás conserva el borrador; salir por enlaces protegidos advierte de datos pendientes. Cambiar DNI exige validar de nuevo.</w:t>
             </w:r>
           </w:p>
         </w:tc>
@@ -6337,6 +6537,11 @@
               <w:rPr>
                 <w:b w:val="0"/>
               </w:rPr>
+            </w:r>
+            <w:r>
+              <w:rPr>
+                <w:b w:val="0"/>
+              </w:rPr>
               <w:t>Usa monto, fecha, plazo y TEA del préstamo; genera una cuota por mes.</w:t>
             </w:r>
           </w:p>
@@ -6357,6 +6562,11 @@
               <w:rPr>
                 <w:b w:val="0"/>
               </w:rPr>
+            </w:r>
+            <w:r>
+              <w:rPr>
+                <w:b w:val="0"/>
+              </w:rPr>
               <w:t>TEM = (1 + 0,30)^(1/12) − 1, aproximadamente 2,210445 %. Sistema francés: interés sobre saldo y amortización como cuota menos interés.</w:t>
             </w:r>
           </w:p>
@@ -6377,6 +6587,11 @@
               <w:rPr>
                 <w:b w:val="0"/>
               </w:rPr>
+            </w:r>
+            <w:r>
+              <w:rPr>
+                <w:b w:val="0"/>
+              </w:rPr>
               <w:t>Suma 30 días por cuota a la fecha del préstamo. Considera cambios de mes, año y bisiestos, sin ajuste por fines de semana. Conserva las fechas de cuotas ya confirmadas.</w:t>
             </w:r>
           </w:p>
@@ -6397,6 +6612,11 @@
               <w:rPr>
                 <w:b w:val="0"/>
               </w:rPr>
+            </w:r>
+            <w:r>
+              <w:rPr>
+                <w:b w:val="0"/>
+              </w:rPr>
               <w:t>Muestra número, vencimiento, cuota, interés, amortización y saldo; identifica titular, código, agencia, monto, plazo, TEA, TEM y totales.</w:t>
             </w:r>
           </w:p>
@@ -6417,6 +6637,11 @@
               <w:rPr>
                 <w:b w:val="0"/>
               </w:rPr>
+            </w:r>
+            <w:r>
+              <w:rPr>
+                <w:b w:val="0"/>
+              </w:rPr>
               <w:t>Dos decimales y última cuota ajustada a saldo cero. Sin comisiones, seguros, penalidades ni recargos por atraso.</w:t>
             </w:r>
           </w:p>
@@ -6437,7 +6662,12 @@
               <w:rPr>
                 <w:b w:val="0"/>
               </w:rPr>
-              <w:t>Guarda el cronograma confirmado sin recalcularlo al consultar o pagar. El contrato conserva identidad, modalidad y firmante originales. En RUC 20, la empresa es prestataria; firma su representante verificado, sea o no el propietario, sin atribuir aval al propietario. Solo se emite para un préstamo confirmado. Si falta la copia completa del firmante, bloquea la descarga en lugar de usar la ficha actual.</w:t>
+            </w:r>
+            <w:r>
+              <w:rPr>
+                <w:b w:val="0"/>
+              </w:rPr>
+              <w:t>Guarda el cronograma confirmado sin recalcularlo al consultar o pagar. RUC 20 conserva empresa, RUC, representante y DNI originales en el préstamo; otra persona posterior no cambia el contrato ni la deuda anterior. Solo emite contrato para un préstamo confirmado y bloquea si falta la copia completa del firmante.</w:t>
             </w:r>
           </w:p>
           <w:p>
@@ -6457,6 +6687,11 @@
               <w:rPr>
                 <w:b w:val="0"/>
               </w:rPr>
+            </w:r>
+            <w:r>
+              <w:rPr>
+                <w:b w:val="0"/>
+              </w:rPr>
               <w:t>Cronograma agrupa PDF e impresión. Contrato agrupa Word e impresión/guardar PDF, con plantilla adaptada del profesor que termina en las firmas, con nombre, DNI y calidad del firmante, sin anexo de condiciones. Descargar de nuevo no crea préstamo.</w:t>
             </w:r>
           </w:p>
@@ -6477,6 +6712,11 @@
               <w:rPr>
                 <w:b w:val="0"/>
               </w:rPr>
+            </w:r>
+            <w:r>
+              <w:rPr>
+                <w:b w:val="0"/>
+              </w:rPr>
               <w:t>Para S/ 1 000 a seis meses: primeras cinco cuotas S/ 179,80 y última S/ 179,77; capital S/ 1 000, interés S/ 78,77 y total S/ 1 078,77.</w:t>
             </w:r>
           </w:p>
@@ -6492,6 +6732,11 @@
                 <w:b/>
               </w:rPr>
               <w:t xml:space="preserve">• CA09. Caso de calendario: </w:t>
+            </w:r>
+            <w:r>
+              <w:rPr>
+                <w:b w:val="0"/>
+              </w:rPr>
             </w:r>
             <w:r>
               <w:rPr>
@@ -6636,6 +6881,12 @@
                 <w:b w:val="0"/>
                 <w:sz w:val="20"/>
               </w:rPr>
+            </w:r>
+            <w:r>
+              <w:rPr>
+                <w:b w:val="0"/>
+                <w:sz w:val="20"/>
+              </w:rPr>
               <w:t>Solo operaciones originadas en la agencia, de más recientes a antiguas; también se restringe detalle y servidor.</w:t>
             </w:r>
           </w:p>
@@ -6658,6 +6909,12 @@
                 <w:b w:val="0"/>
                 <w:sz w:val="20"/>
               </w:rPr>
+            </w:r>
+            <w:r>
+              <w:rPr>
+                <w:b w:val="0"/>
+                <w:sz w:val="20"/>
+              </w:rPr>
               <w:t>Activos por defecto; filtros Activos/Cancelados/Todos y Personas/Empresas/Todos. Busca DNI, RUC o PR-. Documento muestra DNI personal o RUC empresarial, con monto, plazo, fecha, estado y detalle.</w:t>
             </w:r>
           </w:p>
@@ -6680,7 +6937,13 @@
                 <w:b w:val="0"/>
                 <w:sz w:val="20"/>
               </w:rPr>
-              <w:t>Solo titulares con préstamos confirmados locales, incluidos pagados. DNI/RUC 10 figura en Personas con DNI y en Negocios y empresas con RUC; Todos conserva una fila. Identidad, solicitudes y cobros ajenos no incorporan titulares.</w:t>
+            </w:r>
+            <w:r>
+              <w:rPr>
+                <w:b w:val="0"/>
+                <w:sz w:val="20"/>
+              </w:rPr>
+              <w:t>Titulares y representantes de préstamos confirmados locales, incluidos pagados. DNI/RUC 10 figura en Personas con DNI y en Negocios y empresas con RUC; Todos conserva una fila. Identidad y cobros ajenos no incorporan personas a la cartera.</w:t>
             </w:r>
           </w:p>
           <w:p>
@@ -6702,7 +6965,13 @@
                 <w:b w:val="0"/>
                 <w:sz w:val="20"/>
               </w:rPr>
-              <w:t>DNI/RUC 10 comparten ficha; RUC 20 conserva empresa y propietario del límite. Recupera datos previos y permite otro representante verificado en otra solicitud. Una pendiente u observada por RUC se retoma sin duplicar; el historial conserva rechazos y aprobaciones.</w:t>
+            </w:r>
+            <w:r>
+              <w:rPr>
+                <w:b w:val="0"/>
+                <w:sz w:val="20"/>
+              </w:rPr>
+              <w:t>DNI/RUC 10 comparten ficha; RUC 20 conserva su empresa y muestra el representante actual. Repetir el RUC permite otro préstamo con representante validado por API, sin alterar contratos ni responsables anteriores. El detalle mantiene privacidad por agencia.</w:t>
             </w:r>
           </w:p>
           <w:p>
@@ -6724,7 +6993,13 @@
                 <w:b w:val="0"/>
                 <w:sz w:val="20"/>
               </w:rPr>
-              <w:t>Solicitar préstamo despliega DNI/RUC 10 cuando existen ambos; sin elegibilidad o cupo queda bloqueado. Revalidar datos ofrece DNI/RUC 10, o SUNAT directo para RUC 20. Incluye Consultar para pagar y Ver historial.</w:t>
+            </w:r>
+            <w:r>
+              <w:rPr>
+                <w:b w:val="0"/>
+                <w:sz w:val="20"/>
+              </w:rPr>
+              <w:t>Solicitar préstamo ofrece DNI/RUC 10 si existen ambos y exige elegibilidad y cupo. Para RUC 20 abre la validación del representante antes de determinar su capital. Revalidar datos ofrece DNI/RUC 10 o SUNAT para RUC 20. Incluye Consultar para pagar y Ver historial.</w:t>
             </w:r>
           </w:p>
           <w:p>
@@ -6746,6 +7021,12 @@
                 <w:b w:val="0"/>
                 <w:sz w:val="20"/>
               </w:rPr>
+            </w:r>
+            <w:r>
+              <w:rPr>
+                <w:b w:val="0"/>
+                <w:sz w:val="20"/>
+              </w:rPr>
               <w:t>Detalle muestra Total a pagar, Total pagado y Saldo por pagar, con estado, TEA, TEM e interés total; diseño adaptable a móvil.</w:t>
             </w:r>
           </w:p>
@@ -6768,6 +7049,12 @@
                 <w:b w:val="0"/>
                 <w:sz w:val="20"/>
               </w:rPr>
+            </w:r>
+            <w:r>
+              <w:rPr>
+                <w:b w:val="0"/>
+                <w:sz w:val="20"/>
+              </w:rPr>
               <w:t>Registrar pago carga el préstamo y cuotas automáticamente con código/tipo fijos y regreso al mismo detalle. Desplaza al titular; no confirma el cobro.</w:t>
             </w:r>
           </w:p>
@@ -6790,6 +7077,12 @@
                 <w:b w:val="0"/>
                 <w:sz w:val="20"/>
               </w:rPr>
+            </w:r>
+            <w:r>
+              <w:rPr>
+                <w:b w:val="0"/>
+                <w:sz w:val="20"/>
+              </w:rPr>
               <w:t>Pagos localiza deudas entre agencias por DNI, RUC o código. No incorpora préstamos ajenos a la cartera ni habilita sus detalles ordinarios.</w:t>
             </w:r>
           </w:p>
@@ -6812,6 +7105,12 @@
                 <w:b w:val="0"/>
                 <w:sz w:val="20"/>
               </w:rPr>
+            </w:r>
+            <w:r>
+              <w:rPr>
+                <w:b w:val="0"/>
+                <w:sz w:val="20"/>
+              </w:rPr>
               <w:t>Recupera documentos sin alterar el préstamo. Una búsqueda vacía informa que no hay coincidencias, sin mostrar registros ajenos.</w:t>
             </w:r>
           </w:p>
@@ -6834,6 +7133,12 @@
                 <w:b w:val="0"/>
                 <w:sz w:val="20"/>
               </w:rPr>
+            </w:r>
+            <w:r>
+              <w:rPr>
+                <w:b w:val="0"/>
+                <w:sz w:val="20"/>
+              </w:rPr>
               <w:t>DNI de ocho dígitos y RUC válido de once. PR- fijo más ocho hexadecimales en mayúsculas; pegar código completo no duplica prefijo. Entrada inválida impide consultar.</w:t>
             </w:r>
           </w:p>
@@ -6849,14 +7154,20 @@
                 <w:b/>
                 <w:sz w:val="20"/>
               </w:rPr>
-              <w:t xml:space="preserve">• CA11. Solicitudes de la agencia: </w:t>
+              <w:t xml:space="preserve">• CA11. Confirmación directa: </w:t>
             </w:r>
             <w:r>
               <w:rPr>
                 <w:b w:val="0"/>
                 <w:sz w:val="20"/>
               </w:rPr>
-              <w:t>Lista solicitudes RUC 20 por Pendientes, Por verificar propietario, Observadas, Aprobadas, Rechazadas y Todas. Pendientes reúne las pendientes de evaluación y de identidad. Completar la identidad conserva solicitud, PDF e historial; no aprueba el crédito y respeta las observaciones previas. Separa los filtros de la tabla y adapta su distribución a pantallas pequeñas; conserva la privacidad por agencia.</w:t>
+            </w:r>
+            <w:r>
+              <w:rPr>
+                <w:b w:val="0"/>
+                <w:sz w:val="20"/>
+              </w:rPr>
+              <w:t>Nuevo préstamo RUC 20 confirma directamente. El menú retira Solicitudes de préstamo y la base bloquea nuevos envíos y evaluaciones documentales. Conserva solicitudes previas y sus documentos como historial; no modifica préstamos anteriores.</w:t>
             </w:r>
           </w:p>
         </w:tc>
@@ -7001,7 +7312,13 @@
                 <w:b w:val="0"/>
                 <w:sz w:val="22"/>
               </w:rPr>
-              <w:t>DNI, RUC 10 o RUC 20 reúnen deudas del propietario y sus empresas entre agencias; ser representante no une grupos. Desde ficha fija documento; desde detalle fija UUID autorizado. Consulta automática y regreso al origen, sin Cambiar cliente.</w:t>
+            </w:r>
+            <w:r>
+              <w:rPr>
+                <w:b w:val="0"/>
+                <w:sz w:val="22"/>
+              </w:rPr>
+              <w:t>DNI o RUC 10 reúne préstamos personales y los RUC 20 vinculados a esa persona al confirmar. RUC 20 reúne préstamos de esa empresa, incluso con distintos representantes. PR- identifica un préstamo. Permite cobrar entre agencias sin cambiar el responsable; desde ficha o detalle conserva contexto y regreso.</w:t>
             </w:r>
           </w:p>
           <w:p>
@@ -7023,6 +7340,12 @@
                 <w:b w:val="0"/>
                 <w:sz w:val="22"/>
               </w:rPr>
+            </w:r>
+            <w:r>
+              <w:rPr>
+                <w:b w:val="0"/>
+                <w:sz w:val="22"/>
+              </w:rPr>
               <w:t>Muestra titular, código, agencia de origen, deuda y cuotas. No exige DNI vigente, RUC habilitado ni ausencia de atrasos para pagar.</w:t>
             </w:r>
           </w:p>
@@ -7045,6 +7368,12 @@
                 <w:b w:val="0"/>
                 <w:sz w:val="22"/>
               </w:rPr>
+            </w:r>
+            <w:r>
+              <w:rPr>
+                <w:b w:val="0"/>
+                <w:sz w:val="22"/>
+              </w:rPr>
               <w:t>Cuotas completas consecutivas desde la pendiente más antigua del préstamo. Admite la próxima cuota sin recalcular; excluye abonos parciales y pagos extraordinarios a capital.</w:t>
             </w:r>
           </w:p>
@@ -7067,6 +7396,12 @@
                 <w:b w:val="0"/>
                 <w:sz w:val="22"/>
               </w:rPr>
+            </w:r>
+            <w:r>
+              <w:rPr>
+                <w:b w:val="0"/>
+                <w:sz w:val="22"/>
+              </w:rPr>
               <w:t>Suma el capital y el interés original de las cuotas seleccionadas, sin recargos por atraso; el importe no es editable. Exige confirmar dinero recibido y aceptar el cobro; no integra un banco.</w:t>
             </w:r>
           </w:p>
@@ -7089,6 +7424,12 @@
                 <w:b w:val="0"/>
                 <w:sz w:val="22"/>
               </w:rPr>
+            </w:r>
+            <w:r>
+              <w:rPr>
+                <w:b w:val="0"/>
+                <w:sz w:val="22"/>
+              </w:rPr>
               <w:t>Guarda identificador, fecha/hora, asesor, agencia de cobro, préstamo y aplicación por cuota. Conserva origen y emite constancia recuperable desde origen o agencia de cobro.</w:t>
             </w:r>
           </w:p>
@@ -7111,6 +7452,12 @@
                 <w:b w:val="0"/>
                 <w:sz w:val="22"/>
               </w:rPr>
+            </w:r>
+            <w:r>
+              <w:rPr>
+                <w:b w:val="0"/>
+                <w:sz w:val="22"/>
+              </w:rPr>
               <w:t>La clave evita duplicar el mismo reintento y se rechazan cuotas ya cobradas. Un fallo no deja aplicaciones incompletas. Si se pierde la respuesta, revisar historial antes de iniciar otro cobro.</w:t>
             </w:r>
           </w:p>
@@ -7133,6 +7480,12 @@
                 <w:b w:val="0"/>
                 <w:sz w:val="22"/>
               </w:rPr>
+            </w:r>
+            <w:r>
+              <w:rPr>
+                <w:b w:val="0"/>
+                <w:sz w:val="22"/>
+              </w:rPr>
               <w:t>Marca cuotas pagadas, reduce deuda y capital por su amortización y recalcula condición. Pago total cancela el préstamo.</w:t>
             </w:r>
           </w:p>
@@ -7155,6 +7508,12 @@
                 <w:b w:val="0"/>
                 <w:sz w:val="22"/>
               </w:rPr>
+            </w:r>
+            <w:r>
+              <w:rPr>
+                <w:b w:val="0"/>
+                <w:sz w:val="22"/>
+              </w:rPr>
               <w:t>No modifica el cronograma ni desmarca pagos confirmados. Reversos y devoluciones quedan fuera; la constancia no es comprobante tributario.</w:t>
             </w:r>
           </w:p>
@@ -7177,6 +7536,12 @@
                 <w:b w:val="0"/>
                 <w:sz w:val="22"/>
               </w:rPr>
+            </w:r>
+            <w:r>
+              <w:rPr>
+                <w:b w:val="0"/>
+                <w:sz w:val="22"/>
+              </w:rPr>
               <w:t>Valida documento o PR- antes de consultar, según HU-06 CA10. Un error no muestra otras identidades.</w:t>
             </w:r>
           </w:p>
@@ -7199,6 +7564,12 @@
                 <w:b w:val="0"/>
                 <w:sz w:val="22"/>
               </w:rPr>
+            </w:r>
+            <w:r>
+              <w:rPr>
+                <w:b w:val="0"/>
+                <w:sz w:val="22"/>
+              </w:rPr>
               <w:t>Cobrar en otra agencia registra quién recibió el dinero, sin cambiar origen ni incorporar al cliente a su listado.</w:t>
             </w:r>
           </w:p>
@@ -7221,6 +7592,12 @@
                 <w:b w:val="0"/>
                 <w:sz w:val="22"/>
               </w:rPr>
+            </w:r>
+            <w:r>
+              <w:rPr>
+                <w:b w:val="0"/>
+                <w:sz w:val="22"/>
+              </w:rPr>
               <w:t>Solo la búsqueda general permite editar documento/tipo. Cualquier cambio limpia resultados, cuotas y confirmación y descarta respuestas antiguas; los flujos fijos conservan su origen.</w:t>
             </w:r>
           </w:p>
@@ -7237,6 +7614,12 @@
                 <w:sz w:val="22"/>
               </w:rPr>
               <w:t xml:space="preserve">• CA12. Desplazamiento y revisión: </w:t>
+            </w:r>
+            <w:r>
+              <w:rPr>
+                <w:b w:val="0"/>
+                <w:sz w:val="22"/>
+              </w:rPr>
             </w:r>
             <w:r>
               <w:rPr>
@@ -7380,6 +7763,11 @@
               <w:rPr>
                 <w:b w:val="0"/>
               </w:rPr>
+            </w:r>
+            <w:r>
+              <w:rPr>
+                <w:b w:val="0"/>
+              </w:rPr>
               <w:t>Fecha de Perú: una cuota impaga de hoy vence al día siguiente.</w:t>
             </w:r>
           </w:p>
@@ -7400,6 +7788,11 @@
               <w:rPr>
                 <w:b w:val="0"/>
               </w:rPr>
+            </w:r>
+            <w:r>
+              <w:rPr>
+                <w:b w:val="0"/>
+              </w:rPr>
               <w:t>Considera persona y empresas entre agencias. Extrajudicial desde doce meses de la cuota impaga más antigua; Con atrasos con menor atraso; Sin atrasos sin vencidas. Historial incompleto queda Pendiente de conciliación.</w:t>
             </w:r>
           </w:p>
@@ -7420,6 +7813,11 @@
               <w:rPr>
                 <w:b w:val="0"/>
               </w:rPr>
+            </w:r>
+            <w:r>
+              <w:rPr>
+                <w:b w:val="0"/>
+              </w:rPr>
               <w:t>Extrajudicial es clasificación académica, sin iniciar trámite jurídico ni permitir selección manual de la condición.</w:t>
             </w:r>
           </w:p>
@@ -7440,6 +7838,11 @@
               <w:rPr>
                 <w:b w:val="0"/>
               </w:rPr>
+            </w:r>
+            <w:r>
+              <w:rPr>
+                <w:b w:val="0"/>
+              </w:rPr>
               <w:t>Recalcula después de pagar, al cambiar el día y al consultar o confirmar, aunque el corte diario no se haya ejecutado.</w:t>
             </w:r>
           </w:p>
@@ -7460,6 +7863,11 @@
               <w:rPr>
                 <w:b w:val="0"/>
               </w:rPr>
+            </w:r>
+            <w:r>
+              <w:rPr>
+                <w:b w:val="0"/>
+              </w:rPr>
               <w:t>Cubrir lo vencido regulariza sin anticipar cuotas futuras. El antecedente permanece: nuevo crédito requiere asesor autorizado, motivo, ausencia de vencidas e historial conciliado, sin omitir identidad, RUC o cupo.</w:t>
             </w:r>
           </w:p>
@@ -7480,6 +7888,11 @@
               <w:rPr>
                 <w:b w:val="0"/>
               </w:rPr>
+            </w:r>
+            <w:r>
+              <w:rPr>
+                <w:b w:val="0"/>
+              </w:rPr>
               <w:t>Pagar o regularizar no borra verificaciones. Un DNI caducado sigue bloqueando nuevas colocaciones hasta revalidar.</w:t>
             </w:r>
           </w:p>
@@ -7500,6 +7913,11 @@
               <w:rPr>
                 <w:b w:val="0"/>
               </w:rPr>
+            </w:r>
+            <w:r>
+              <w:rPr>
+                <w:b w:val="0"/>
+              </w:rPr>
               <w:t>Disponible = límite menos capital pendiente global. Los intereses no liberan cupo; terminar el plazo no cancela deuda.</w:t>
             </w:r>
           </w:p>
@@ -7520,6 +7938,11 @@
               <w:rPr>
                 <w:b w:val="0"/>
               </w:rPr>
+            </w:r>
+            <w:r>
+              <w:rPr>
+                <w:b w:val="0"/>
+              </w:rPr>
               <w:t>Cuota del 15/10/2026: pendiente ese día, vencida el 16/10/2026 y extrajudicial el 15/10/2027 si sigue impaga.</w:t>
             </w:r>
           </w:p>
@@ -7535,6 +7958,11 @@
                 <w:b/>
               </w:rPr>
               <w:t xml:space="preserve">• CA09. Datos incompletos: </w:t>
+            </w:r>
+            <w:r>
+              <w:rPr>
+                <w:b w:val="0"/>
+              </w:rPr>
             </w:r>
             <w:r>
               <w:rPr>
@@ -7746,7 +8174,7 @@
               <w:rPr>
                 <w:sz w:val="22"/>
               </w:rPr>
-              <w:t>RUC 20: corregir DNI antes de enviar; documento concreto, referencia automática y PDF hasta 5 MB. Asesor evalúa después; otra agencia no accede al expediente. RUC 10 sin certificado.</w:t>
+              <w:t>RUC 20: DNI de un representante devuelto por API, identidad y presencia verificadas. Prueba varios representantes, DNI con ceros y datos ocultos; no pide propietario, referencia ni certificado.</w:t>
             </w:r>
           </w:p>
         </w:tc>
@@ -7798,7 +8226,7 @@
               <w:rPr>
                 <w:sz w:val="22"/>
               </w:rPr>
-              <w:t>RUC 20 no guarda antes del envío final. Propietario ausente nuevo o vencido permite enviar sin identidad ficticia ni deuda. Aprobar se bloquea hasta verificarlo presencialmente desde la misma solicitud. Se conserva el PDF; observar corrige la misma solicitud y rechazar permite otra. Aprobar crea una sola operación.</w:t>
+              <w:t>Antes de confirmar no guarda personas ni empresa. Un fallo de API o DNI sin coincidencia impide continuar. Confirmar crea una sola operación; fallo transaccional revierte todo. Atrás conserva el borrador.</w:t>
             </w:r>
           </w:p>
         </w:tc>
@@ -7850,7 +8278,7 @@
               <w:rPr>
                 <w:sz w:val="22"/>
               </w:rPr>
-              <w:t>Cartera local sin incorporar titulares por cobro ajeno. DNI/RUC 10: ficha en ambos filtros, una fila en Todos. Empresa con ficha y propietario para el límite.</w:t>
+              <w:t>Cartera local sin incorporar titulares por cobro ajeno. DNI/RUC 10 en ambos filtros, una fila en Todos. Empresa y representante visibles por préstamos locales; deuda fijada por préstamo.</w:t>
             </w:r>
           </w:p>
         </w:tc>
@@ -8058,7 +8486,7 @@
               <w:rPr>
                 <w:sz w:val="22"/>
               </w:rPr>
-              <w:t>DNI/RUC 10/RUC 20 reúnen el grupo. Se elige un préstamo y cuotas completas consecutivas; conserva origen, registra agencia de cobro y emite constancia.</w:t>
+              <w:t>DNI/RUC 10 reúne préstamos de la persona y empresas donde es responsable. RUC 20 muestra solo esa empresa. Cobra cuotas consecutivas, conserva origen y libera cupo del representante original.</w:t>
             </w:r>
           </w:p>
         </w:tc>
@@ -8162,7 +8590,7 @@
               <w:rPr>
                 <w:sz w:val="22"/>
               </w:rPr>
-              <w:t>No excede capital ni duplica cobros o solicitudes. Aprobar revalida cupo sin reservarlo al enviar y rechaza versiones obsoletas; reintentar no duplica.</w:t>
+              <w:t>No excede capital ni duplica préstamos o cobros. Confirma con firma vigente y controles repetidos. Préstamos de varias empresas suman al mismo representante; cambiarlo no traslada deuda.</w:t>
             </w:r>
           </w:p>
         </w:tc>
@@ -8288,14 +8716,8 @@
             <w:vAlign w:val="center"/>
           </w:tcPr>
           <w:p>
-            <w:pPr>
-              <w:spacing w:before="20" w:after="20" w:line="240" w:lineRule="auto"/>
-            </w:pPr>
-            <w:r>
-              <w:rPr>
-                <w:sz w:val="22"/>
-              </w:rPr>
-              <w:t>Referencias y restricciones</w:t>
+            <w:r>
+              <w:t>Entradas y restricciones</w:t>
             </w:r>
           </w:p>
         </w:tc>
@@ -8311,14 +8733,8 @@
             <w:vAlign w:val="center"/>
           </w:tcPr>
           <w:p>
-            <w:pPr>
-              <w:spacing w:before="20" w:after="20" w:line="240" w:lineRule="auto"/>
-            </w:pPr>
-            <w:r>
-              <w:rPr>
-                <w:sz w:val="22"/>
-              </w:rPr>
-              <w:t>Elegir los cuatro documentos, comprobar campos y límites, conservar ceros y convertir asiento a mayúsculas. Rechazar letras en números, signos en asiento y pegado excesivo; aceptar notaría con tildes y fecha real. Retomar una referencia anterior sin recortarla.</w:t>
+            <w:r>
+              <w:t>Validar RUC y DNI, conservar ceros iniciales y rechazar caracteres o longitudes inválidas. Cambiar DNI exige nueva coincidencia. Una máscara o un fallo de API impide continuar; las consultas caducadas se renuevan.</w:t>
             </w:r>
           </w:p>
         </w:tc>
@@ -8370,7 +8786,7 @@
               <w:rPr>
                 <w:sz w:val="22"/>
               </w:rPr>
-              <w:t>Sin Ir a clientes en Nuevo préstamo. Atrás conserva personas, documentos, PDF y condiciones; corregir DNI invalida el PDF. Botones junto al título y adaptables a móvil; filtros separados de la tabla de Solicitudes.</w:t>
+              <w:t>Sin Ir a clientes ni documentación en Nuevo préstamo. Atrás conserva personas y condiciones; cambiar DNI reinicia la validación del vínculo. Revisar escritorio y móvil, foco y separación de botones.</w:t>
             </w:r>
           </w:p>
         </w:tc>

</xml_diff>